<commit_message>
Updated all doctypes and improved their genericity. Added log with bad fields call.
</commit_message>
<xml_diff>
--- a/flower_backend/doctypes/CETUDE.docx
+++ b/flower_backend/doctypes/CETUDE.docx
@@ -1,6 +1,6 @@
 
 <file path=word/document.xml><?xml version="1.0" encoding="utf-8"?>
-<w:document xmlns:wpc="http://schemas.microsoft.com/office/word/2010/wordprocessingCanvas" xmlns:cx="http://schemas.microsoft.com/office/drawing/2014/chartex" xmlns:cx1="http://schemas.microsoft.com/office/drawing/2015/9/8/chartex" xmlns:cx2="http://schemas.microsoft.com/office/drawing/2015/10/21/chartex" xmlns:cx3="http://schemas.microsoft.com/office/drawing/2016/5/9/chartex" xmlns:cx4="http://schemas.microsoft.com/office/drawing/2016/5/10/chartex" xmlns:cx5="http://schemas.microsoft.com/office/drawing/2016/5/11/chartex" xmlns:cx6="http://schemas.microsoft.com/office/drawing/2016/5/12/chartex" xmlns:cx7="http://schemas.microsoft.com/office/drawing/2016/5/13/chartex" xmlns:cx8="http://schemas.microsoft.com/office/drawing/2016/5/14/chartex" xmlns:mc="http://schemas.openxmlformats.org/markup-compatibility/2006" xmlns:aink="http://schemas.microsoft.com/office/drawing/2016/ink" xmlns:am3d="http://schemas.microsoft.com/office/drawing/2017/model3d" xmlns:o="urn:schemas-microsoft-com:office:office" xmlns:r="http://schemas.openxmlformats.org/officeDocument/2006/relationships" xmlns:m="http://schemas.openxmlformats.org/officeDocument/2006/math" xmlns:v="urn:schemas-microsoft-com:vml" xmlns:wp14="http://schemas.microsoft.com/office/word/2010/wordprocessingDrawing" xmlns:wp="http://schemas.openxmlformats.org/drawingml/2006/wordprocessingDrawing" xmlns:w10="urn:schemas-microsoft-com:office:word" xmlns:w="http://schemas.openxmlformats.org/wordprocessingml/2006/main" xmlns:w14="http://schemas.microsoft.com/office/word/2010/wordml" xmlns:w15="http://schemas.microsoft.com/office/word/2012/wordml" xmlns:w16cex="http://schemas.microsoft.com/office/word/2018/wordml/cex" xmlns:w16cid="http://schemas.microsoft.com/office/word/2016/wordml/cid" xmlns:w16="http://schemas.microsoft.com/office/word/2018/wordml" xmlns:w16se="http://schemas.microsoft.com/office/word/2015/wordml/symex" xmlns:wpg="http://schemas.microsoft.com/office/word/2010/wordprocessingGroup" xmlns:wpi="http://schemas.microsoft.com/office/word/2010/wordprocessingInk" xmlns:wne="http://schemas.microsoft.com/office/word/2006/wordml" xmlns:wps="http://schemas.microsoft.com/office/word/2010/wordprocessingShape" mc:Ignorable="w14 w15 w16se w16cid w16 w16cex wp14">
+<w:document xmlns:wpc="http://schemas.microsoft.com/office/word/2010/wordprocessingCanvas" xmlns:mc="http://schemas.openxmlformats.org/markup-compatibility/2006" xmlns:o="urn:schemas-microsoft-com:office:office" xmlns:r="http://schemas.openxmlformats.org/officeDocument/2006/relationships" xmlns:m="http://schemas.openxmlformats.org/officeDocument/2006/math" xmlns:v="urn:schemas-microsoft-com:vml" xmlns:wp14="http://schemas.microsoft.com/office/word/2010/wordprocessingDrawing" xmlns:wp="http://schemas.openxmlformats.org/drawingml/2006/wordprocessingDrawing" xmlns:w10="urn:schemas-microsoft-com:office:word" xmlns:w="http://schemas.openxmlformats.org/wordprocessingml/2006/main" xmlns:w14="http://schemas.microsoft.com/office/word/2010/wordml" xmlns:w15="http://schemas.microsoft.com/office/word/2012/wordml" xmlns:wpg="http://schemas.microsoft.com/office/word/2010/wordprocessingGroup" xmlns:wpi="http://schemas.microsoft.com/office/word/2010/wordprocessingInk" xmlns:wne="http://schemas.microsoft.com/office/word/2006/wordml" xmlns:wps="http://schemas.microsoft.com/office/word/2010/wordprocessingShape" mc:Ignorable="w14 w15 wp14">
   <w:body>
     <w:tbl>
       <w:tblPr>
@@ -141,7 +141,6 @@
                 <w:color w:val="000000" w:themeColor="text1"/>
                 <w:sz w:val="22"/>
                 <w:szCs w:val="22"/>
-                <w:lang w:val="en-US"/>
               </w:rPr>
             </w:pPr>
             <w:r>
@@ -150,7 +149,6 @@
                 <w:color w:val="000000" w:themeColor="text1"/>
                 <w:sz w:val="22"/>
                 <w:szCs w:val="22"/>
-                <w:lang w:val="en-US"/>
               </w:rPr>
               <w:t>Version :</w:t>
             </w:r>
@@ -162,32 +160,37 @@
               <w:rPr>
                 <w:rFonts w:ascii="Arial" w:eastAsia="Calibri" w:hAnsi="Arial" w:cs="Arial"/>
                 <w:color w:val="000000" w:themeColor="text1"/>
-                <w:lang w:val="en-US"/>
               </w:rPr>
             </w:pPr>
             <w:r>
               <w:rPr>
                 <w:rFonts w:ascii="Arial" w:eastAsia="Calibri" w:hAnsi="Arial" w:cs="Arial"/>
                 <w:color w:val="000000" w:themeColor="text1"/>
-                <w:lang w:val="en-US"/>
-              </w:rPr>
-              <w:t xml:space="preserve">{{ </w:t>
-            </w:r>
-            <w:proofErr w:type="spellStart"/>
+              </w:rPr>
+              <w:t>{</w:t>
+            </w:r>
+            <w:proofErr w:type="gramStart"/>
             <w:r>
               <w:rPr>
                 <w:rFonts w:ascii="Arial" w:eastAsia="Calibri" w:hAnsi="Arial" w:cs="Arial"/>
                 <w:color w:val="000000" w:themeColor="text1"/>
-                <w:lang w:val="en-US"/>
-              </w:rPr>
-              <w:t>dateShort</w:t>
-            </w:r>
-            <w:proofErr w:type="spellEnd"/>
+              </w:rPr>
+              <w:t xml:space="preserve">{ </w:t>
+            </w:r>
+            <w:proofErr w:type="spellStart"/>
             <w:r>
               <w:rPr>
                 <w:rFonts w:ascii="Arial" w:eastAsia="Calibri" w:hAnsi="Arial" w:cs="Arial"/>
                 <w:color w:val="000000" w:themeColor="text1"/>
-                <w:lang w:val="en-US"/>
+              </w:rPr>
+              <w:t>dateShort</w:t>
+            </w:r>
+            <w:proofErr w:type="spellEnd"/>
+            <w:proofErr w:type="gramEnd"/>
+            <w:r>
+              <w:rPr>
+                <w:rFonts w:ascii="Arial" w:eastAsia="Calibri" w:hAnsi="Arial" w:cs="Arial"/>
+                <w:color w:val="000000" w:themeColor="text1"/>
               </w:rPr>
               <w:t xml:space="preserve"> }}</w:t>
             </w:r>
@@ -199,7 +202,6 @@
               <w:rPr>
                 <w:rFonts w:ascii="Arial" w:eastAsia="Calibri" w:hAnsi="Arial" w:cs="Arial"/>
                 <w:color w:val="000000" w:themeColor="text1"/>
-                <w:lang w:val="en-US"/>
               </w:rPr>
             </w:pPr>
           </w:p>
@@ -291,8 +293,9 @@
                 <w:sz w:val="48"/>
                 <w:szCs w:val="48"/>
               </w:rPr>
-              <w:t>{{ etude.n</w:t>
-            </w:r>
+              <w:t>{</w:t>
+            </w:r>
+            <w:proofErr w:type="gramStart"/>
             <w:r>
               <w:rPr>
                 <w:rFonts w:ascii="Arial" w:eastAsia="Calibri" w:hAnsi="Arial" w:cs="Arial"/>
@@ -300,8 +303,18 @@
                 <w:sz w:val="48"/>
                 <w:szCs w:val="48"/>
               </w:rPr>
+              <w:t>{ etude.n</w:t>
+            </w:r>
+            <w:r>
+              <w:rPr>
+                <w:rFonts w:ascii="Arial" w:eastAsia="Calibri" w:hAnsi="Arial" w:cs="Arial"/>
+                <w:b/>
+                <w:sz w:val="48"/>
+                <w:szCs w:val="48"/>
+              </w:rPr>
               <w:t>ame</w:t>
             </w:r>
+            <w:proofErr w:type="gramEnd"/>
             <w:r>
               <w:rPr>
                 <w:rFonts w:ascii="Arial" w:eastAsia="Calibri" w:hAnsi="Arial" w:cs="Arial"/>
@@ -361,10 +374,61 @@
             </w:pPr>
             <w:r>
               <w:rPr>
-                <w:rFonts w:ascii="Arial" w:eastAsia="Calibri" w:hAnsi="Arial" w:cs="Arial"/>
-                <w:color w:val="000000" w:themeColor="text1"/>
-              </w:rPr>
-              <w:t>Ouest INSA</w:t>
+                <w:rFonts w:ascii="Arial" w:hAnsi="Arial" w:cs="Arial"/>
+                <w:szCs w:val="28"/>
+              </w:rPr>
+              <w:t>{</w:t>
+            </w:r>
+            <w:proofErr w:type="gramStart"/>
+            <w:r>
+              <w:rPr>
+                <w:rFonts w:ascii="Arial" w:hAnsi="Arial" w:cs="Arial"/>
+                <w:szCs w:val="28"/>
+              </w:rPr>
+              <w:t xml:space="preserve">{ </w:t>
+            </w:r>
+            <w:proofErr w:type="spellStart"/>
+            <w:r>
+              <w:rPr>
+                <w:rFonts w:ascii="Arial" w:hAnsi="Arial" w:cs="Arial"/>
+                <w:szCs w:val="28"/>
+              </w:rPr>
+              <w:t>param</w:t>
+            </w:r>
+            <w:proofErr w:type="spellEnd"/>
+            <w:proofErr w:type="gramEnd"/>
+            <w:r>
+              <w:rPr>
+                <w:rFonts w:ascii="Arial" w:hAnsi="Arial" w:cs="Arial"/>
+                <w:szCs w:val="28"/>
+              </w:rPr>
+              <w:t>(</w:t>
+            </w:r>
+            <w:r>
+              <w:rPr>
+                <w:rFonts w:ascii="Arial" w:eastAsia="Arial" w:hAnsi="Arial" w:cs="Arial"/>
+                <w:color w:val="000000"/>
+                <w:szCs w:val="28"/>
+              </w:rPr>
+              <w:t>'</w:t>
+            </w:r>
+            <w:proofErr w:type="spellStart"/>
+            <w:r>
+              <w:rPr>
+                <w:rFonts w:ascii="Arial" w:eastAsia="Arial" w:hAnsi="Arial" w:cs="Arial"/>
+                <w:color w:val="000000"/>
+                <w:szCs w:val="28"/>
+              </w:rPr>
+              <w:t>je_name</w:t>
+            </w:r>
+            <w:proofErr w:type="spellEnd"/>
+            <w:r>
+              <w:rPr>
+                <w:rFonts w:ascii="Arial" w:eastAsia="Arial" w:hAnsi="Arial" w:cs="Arial"/>
+                <w:color w:val="000000"/>
+                <w:szCs w:val="28"/>
+              </w:rPr>
+              <w:t>') }}</w:t>
             </w:r>
           </w:p>
           <w:p>
@@ -381,15 +445,24 @@
                 <w:rFonts w:ascii="Arial" w:eastAsia="Calibri" w:hAnsi="Arial" w:cs="Arial"/>
                 <w:color w:val="000000" w:themeColor="text1"/>
               </w:rPr>
-              <w:t>{{ etude.prospect.</w:t>
-            </w:r>
+              <w:t>{</w:t>
+            </w:r>
+            <w:proofErr w:type="gramStart"/>
             <w:r>
               <w:rPr>
                 <w:rFonts w:ascii="Arial" w:eastAsia="Calibri" w:hAnsi="Arial" w:cs="Arial"/>
                 <w:color w:val="000000" w:themeColor="text1"/>
               </w:rPr>
+              <w:t>{ etude.prospect.</w:t>
+            </w:r>
+            <w:r>
+              <w:rPr>
+                <w:rFonts w:ascii="Arial" w:eastAsia="Calibri" w:hAnsi="Arial" w:cs="Arial"/>
+                <w:color w:val="000000" w:themeColor="text1"/>
+              </w:rPr>
               <w:t>name</w:t>
             </w:r>
+            <w:proofErr w:type="gramEnd"/>
             <w:r>
               <w:rPr>
                 <w:rFonts w:ascii="Arial" w:eastAsia="Calibri" w:hAnsi="Arial" w:cs="Arial"/>
@@ -427,9 +500,9 @@
                 <w:sz w:val="32"/>
                 <w:szCs w:val="32"/>
               </w:rPr>
-              <w:t xml:space="preserve">{{ </w:t>
-            </w:r>
-            <w:proofErr w:type="spellStart"/>
+              <w:t>{</w:t>
+            </w:r>
+            <w:proofErr w:type="gramStart"/>
             <w:r>
               <w:rPr>
                 <w:rFonts w:ascii="Arial" w:eastAsia="Calibri" w:hAnsi="Arial" w:cs="Arial"/>
@@ -437,9 +510,20 @@
                 <w:sz w:val="32"/>
                 <w:szCs w:val="32"/>
               </w:rPr>
+              <w:t xml:space="preserve">{ </w:t>
+            </w:r>
+            <w:proofErr w:type="spellStart"/>
+            <w:r>
+              <w:rPr>
+                <w:rFonts w:ascii="Arial" w:eastAsia="Calibri" w:hAnsi="Arial" w:cs="Arial"/>
+                <w:b/>
+                <w:sz w:val="32"/>
+                <w:szCs w:val="32"/>
+              </w:rPr>
               <w:t>etude.prospect</w:t>
             </w:r>
             <w:proofErr w:type="spellEnd"/>
+            <w:proofErr w:type="gramEnd"/>
             <w:r>
               <w:rPr>
                 <w:rFonts w:ascii="Arial" w:eastAsia="Calibri" w:hAnsi="Arial" w:cs="Arial"/>
@@ -468,8 +552,9 @@
                 <w:sz w:val="32"/>
                 <w:szCs w:val="32"/>
               </w:rPr>
-              <w:t>{{ etude.ce.sign</w:t>
-            </w:r>
+              <w:t>{</w:t>
+            </w:r>
+            <w:proofErr w:type="gramStart"/>
             <w:r>
               <w:rPr>
                 <w:rFonts w:ascii="Arial" w:eastAsia="Calibri" w:hAnsi="Arial" w:cs="Arial"/>
@@ -477,8 +562,18 @@
                 <w:sz w:val="32"/>
                 <w:szCs w:val="32"/>
               </w:rPr>
+              <w:t>{ etude.ce.sign</w:t>
+            </w:r>
+            <w:r>
+              <w:rPr>
+                <w:rFonts w:ascii="Arial" w:eastAsia="Calibri" w:hAnsi="Arial" w:cs="Arial"/>
+                <w:b/>
+                <w:sz w:val="32"/>
+                <w:szCs w:val="32"/>
+              </w:rPr>
               <w:t>er2</w:t>
             </w:r>
+            <w:proofErr w:type="gramEnd"/>
             <w:r>
               <w:rPr>
                 <w:rFonts w:ascii="Arial" w:eastAsia="Calibri" w:hAnsi="Arial" w:cs="Arial"/>
@@ -543,34 +638,44 @@
                 <w:color w:val="000000" w:themeColor="text1"/>
                 <w:szCs w:val="28"/>
               </w:rPr>
-              <w:t>{{</w:t>
-            </w:r>
+              <w:t>{</w:t>
+            </w:r>
+            <w:proofErr w:type="gramStart"/>
             <w:r>
               <w:rPr>
                 <w:rFonts w:ascii="Arial" w:eastAsia="Calibri" w:hAnsi="Arial" w:cs="Arial"/>
                 <w:color w:val="000000" w:themeColor="text1"/>
                 <w:szCs w:val="28"/>
               </w:rPr>
-              <w:t xml:space="preserve"> </w:t>
-            </w:r>
-            <w:proofErr w:type="spellStart"/>
+              <w:t>{</w:t>
+            </w:r>
             <w:r>
               <w:rPr>
                 <w:rFonts w:ascii="Arial" w:eastAsia="Calibri" w:hAnsi="Arial" w:cs="Arial"/>
                 <w:color w:val="000000" w:themeColor="text1"/>
                 <w:szCs w:val="28"/>
               </w:rPr>
-              <w:t>etude.</w:t>
-            </w:r>
+              <w:t xml:space="preserve"> </w:t>
+            </w:r>
+            <w:proofErr w:type="spellStart"/>
             <w:r>
               <w:rPr>
                 <w:rFonts w:ascii="Arial" w:eastAsia="Calibri" w:hAnsi="Arial" w:cs="Arial"/>
                 <w:color w:val="000000" w:themeColor="text1"/>
                 <w:szCs w:val="28"/>
               </w:rPr>
+              <w:t>etude.</w:t>
+            </w:r>
+            <w:r>
+              <w:rPr>
+                <w:rFonts w:ascii="Arial" w:eastAsia="Calibri" w:hAnsi="Arial" w:cs="Arial"/>
+                <w:color w:val="000000" w:themeColor="text1"/>
+                <w:szCs w:val="28"/>
+              </w:rPr>
               <w:t>projectManager</w:t>
             </w:r>
             <w:proofErr w:type="spellEnd"/>
+            <w:proofErr w:type="gramEnd"/>
             <w:r>
               <w:rPr>
                 <w:rFonts w:ascii="Arial" w:eastAsia="Calibri" w:hAnsi="Arial" w:cs="Arial"/>
@@ -604,32 +709,33 @@
                 <w:color w:val="000000" w:themeColor="text1"/>
                 <w:szCs w:val="28"/>
               </w:rPr>
-              <w:t>{{</w:t>
-            </w:r>
+              <w:t>{</w:t>
+            </w:r>
+            <w:proofErr w:type="gramStart"/>
             <w:r>
               <w:rPr>
                 <w:rFonts w:ascii="Arial" w:eastAsia="Calibri" w:hAnsi="Arial" w:cs="Arial"/>
                 <w:color w:val="000000" w:themeColor="text1"/>
                 <w:szCs w:val="28"/>
               </w:rPr>
-              <w:t xml:space="preserve"> </w:t>
-            </w:r>
-            <w:proofErr w:type="spellStart"/>
+              <w:t>{</w:t>
+            </w:r>
             <w:r>
               <w:rPr>
                 <w:rFonts w:ascii="Arial" w:eastAsia="Calibri" w:hAnsi="Arial" w:cs="Arial"/>
                 <w:color w:val="000000" w:themeColor="text1"/>
                 <w:szCs w:val="28"/>
               </w:rPr>
-              <w:t>e</w:t>
-            </w:r>
+              <w:t xml:space="preserve"> </w:t>
+            </w:r>
+            <w:proofErr w:type="spellStart"/>
             <w:r>
               <w:rPr>
                 <w:rFonts w:ascii="Arial" w:eastAsia="Calibri" w:hAnsi="Arial" w:cs="Arial"/>
                 <w:color w:val="000000" w:themeColor="text1"/>
                 <w:szCs w:val="28"/>
               </w:rPr>
-              <w:t>tude.</w:t>
+              <w:t>e</w:t>
             </w:r>
             <w:r>
               <w:rPr>
@@ -637,7 +743,7 @@
                 <w:color w:val="000000" w:themeColor="text1"/>
                 <w:szCs w:val="28"/>
               </w:rPr>
-              <w:t>projectManager</w:t>
+              <w:t>tude.</w:t>
             </w:r>
             <w:r>
               <w:rPr>
@@ -645,9 +751,18 @@
                 <w:color w:val="000000" w:themeColor="text1"/>
                 <w:szCs w:val="28"/>
               </w:rPr>
+              <w:t>projectManager</w:t>
+            </w:r>
+            <w:r>
+              <w:rPr>
+                <w:rFonts w:ascii="Arial" w:eastAsia="Calibri" w:hAnsi="Arial" w:cs="Arial"/>
+                <w:color w:val="000000" w:themeColor="text1"/>
+                <w:szCs w:val="28"/>
+              </w:rPr>
               <w:t>.mail</w:t>
             </w:r>
             <w:proofErr w:type="spellEnd"/>
+            <w:proofErr w:type="gramEnd"/>
             <w:r>
               <w:rPr>
                 <w:rFonts w:ascii="Arial" w:eastAsia="Calibri" w:hAnsi="Arial" w:cs="Arial"/>
@@ -674,6 +789,7 @@
                 <w:color w:val="000000" w:themeColor="text1"/>
                 <w:sz w:val="22"/>
                 <w:szCs w:val="22"/>
+                <w:lang w:val="en-GB"/>
               </w:rPr>
             </w:pPr>
             <w:r>
@@ -681,58 +797,45 @@
                 <w:rFonts w:ascii="Arial" w:eastAsia="Calibri" w:hAnsi="Arial" w:cs="Arial"/>
                 <w:color w:val="000000" w:themeColor="text1"/>
                 <w:szCs w:val="28"/>
-              </w:rPr>
-              <w:t xml:space="preserve">{{ </w:t>
-            </w:r>
-            <w:proofErr w:type="spellStart"/>
+                <w:lang w:val="en-GB"/>
+              </w:rPr>
+              <w:t>{{ etude.</w:t>
+            </w:r>
             <w:r>
               <w:rPr>
                 <w:rFonts w:ascii="Arial" w:eastAsia="Calibri" w:hAnsi="Arial" w:cs="Arial"/>
                 <w:color w:val="000000" w:themeColor="text1"/>
                 <w:szCs w:val="28"/>
-              </w:rPr>
-              <w:t>etude</w:t>
-            </w:r>
-            <w:proofErr w:type="spellEnd"/>
+                <w:lang w:val="en-GB"/>
+              </w:rPr>
+              <w:t xml:space="preserve"> </w:t>
+            </w:r>
+            <w:proofErr w:type="spellStart"/>
             <w:r>
               <w:rPr>
                 <w:rFonts w:ascii="Arial" w:eastAsia="Calibri" w:hAnsi="Arial" w:cs="Arial"/>
                 <w:color w:val="000000" w:themeColor="text1"/>
                 <w:szCs w:val="28"/>
-              </w:rPr>
-              <w:t>.</w:t>
-            </w:r>
+                <w:lang w:val="en-GB"/>
+              </w:rPr>
+              <w:t>projectManager.phone</w:t>
+            </w:r>
+            <w:proofErr w:type="spellEnd"/>
             <w:r>
               <w:rPr>
                 <w:rFonts w:ascii="Arial" w:eastAsia="Calibri" w:hAnsi="Arial" w:cs="Arial"/>
                 <w:color w:val="000000" w:themeColor="text1"/>
                 <w:szCs w:val="28"/>
+                <w:lang w:val="en-GB"/>
               </w:rPr>
               <w:t xml:space="preserve"> </w:t>
             </w:r>
-            <w:proofErr w:type="spellStart"/>
             <w:r>
               <w:rPr>
                 <w:rFonts w:ascii="Arial" w:eastAsia="Calibri" w:hAnsi="Arial" w:cs="Arial"/>
                 <w:color w:val="000000" w:themeColor="text1"/>
                 <w:szCs w:val="28"/>
-              </w:rPr>
-              <w:t>projectManager.phone</w:t>
-            </w:r>
-            <w:proofErr w:type="spellEnd"/>
-            <w:r>
-              <w:rPr>
-                <w:rFonts w:ascii="Arial" w:eastAsia="Calibri" w:hAnsi="Arial" w:cs="Arial"/>
-                <w:color w:val="000000" w:themeColor="text1"/>
-                <w:szCs w:val="28"/>
-              </w:rPr>
-              <w:t xml:space="preserve"> </w:t>
-            </w:r>
-            <w:r>
-              <w:rPr>
-                <w:rFonts w:ascii="Arial" w:eastAsia="Calibri" w:hAnsi="Arial" w:cs="Arial"/>
-                <w:color w:val="000000" w:themeColor="text1"/>
-                <w:szCs w:val="28"/>
+                <w:lang w:val="en-GB"/>
               </w:rPr>
               <w:t>}}</w:t>
             </w:r>
@@ -754,35 +857,41 @@
               <w:jc w:val="right"/>
               <w:rPr>
                 <w:rFonts w:ascii="Arial" w:eastAsia="Calibri" w:hAnsi="Arial" w:cs="Arial"/>
+                <w:lang w:val="en-GB"/>
               </w:rPr>
             </w:pPr>
             <w:r>
               <w:rPr>
                 <w:rFonts w:ascii="Arial" w:eastAsia="Calibri" w:hAnsi="Arial" w:cs="Arial"/>
+                <w:lang w:val="en-GB"/>
               </w:rPr>
               <w:t>{{ etude.ce.</w:t>
             </w:r>
             <w:r>
               <w:rPr>
                 <w:rFonts w:ascii="Arial" w:eastAsia="Calibri" w:hAnsi="Arial" w:cs="Arial"/>
+                <w:lang w:val="en-GB"/>
               </w:rPr>
               <w:t>signer2</w:t>
             </w:r>
             <w:r>
               <w:rPr>
                 <w:rFonts w:ascii="Arial" w:eastAsia="Calibri" w:hAnsi="Arial" w:cs="Arial"/>
+                <w:lang w:val="en-GB"/>
               </w:rPr>
               <w:t>.</w:t>
             </w:r>
             <w:r>
               <w:rPr>
                 <w:rFonts w:ascii="Arial" w:eastAsia="Calibri" w:hAnsi="Arial" w:cs="Arial"/>
+                <w:lang w:val="en-GB"/>
               </w:rPr>
               <w:t>phone</w:t>
             </w:r>
             <w:r>
               <w:rPr>
                 <w:rFonts w:ascii="Arial" w:eastAsia="Calibri" w:hAnsi="Arial" w:cs="Arial"/>
+                <w:lang w:val="en-GB"/>
               </w:rPr>
               <w:t xml:space="preserve"> }}  </w:t>
             </w:r>
@@ -804,23 +913,27 @@
                 <w:b/>
                 <w:sz w:val="32"/>
                 <w:szCs w:val="32"/>
+                <w:lang w:val="en-GB"/>
               </w:rPr>
             </w:pPr>
             <w:r>
               <w:rPr>
                 <w:rFonts w:ascii="Arial" w:eastAsia="Calibri" w:hAnsi="Arial" w:cs="Arial"/>
+                <w:lang w:val="en-GB"/>
               </w:rPr>
               <w:t>{{ etude.ce.</w:t>
             </w:r>
             <w:r>
               <w:rPr>
                 <w:rFonts w:ascii="Arial" w:eastAsia="Calibri" w:hAnsi="Arial" w:cs="Arial"/>
+                <w:lang w:val="en-GB"/>
               </w:rPr>
               <w:t>signer2</w:t>
             </w:r>
             <w:r>
               <w:rPr>
                 <w:rFonts w:ascii="Arial" w:eastAsia="Calibri" w:hAnsi="Arial" w:cs="Arial"/>
+                <w:lang w:val="en-GB"/>
               </w:rPr>
               <w:t xml:space="preserve">.mail }}  </w:t>
             </w:r>
@@ -855,20 +968,76 @@
               <w:ind w:firstLine="0"/>
               <w:jc w:val="left"/>
               <w:rPr>
-                <w:rFonts w:ascii="Arial" w:eastAsia="Calibri" w:hAnsi="Arial" w:cs="Arial"/>
-                <w:color w:val="000000" w:themeColor="text1"/>
+                <w:rFonts w:ascii="Arial" w:eastAsia="Arial" w:hAnsi="Arial" w:cs="Arial"/>
+                <w:color w:val="000000"/>
                 <w:sz w:val="22"/>
                 <w:szCs w:val="22"/>
               </w:rPr>
             </w:pPr>
             <w:r>
               <w:rPr>
-                <w:rFonts w:ascii="Arial" w:eastAsia="Calibri" w:hAnsi="Arial" w:cs="Arial"/>
-                <w:color w:val="000000" w:themeColor="text1"/>
+                <w:rFonts w:ascii="Arial" w:hAnsi="Arial" w:cs="Arial"/>
                 <w:sz w:val="22"/>
                 <w:szCs w:val="22"/>
               </w:rPr>
-              <w:t>Ouest INSA</w:t>
+              <w:t>{</w:t>
+            </w:r>
+            <w:proofErr w:type="gramStart"/>
+            <w:r>
+              <w:rPr>
+                <w:rFonts w:ascii="Arial" w:hAnsi="Arial" w:cs="Arial"/>
+                <w:sz w:val="22"/>
+                <w:szCs w:val="22"/>
+              </w:rPr>
+              <w:t xml:space="preserve">{ </w:t>
+            </w:r>
+            <w:proofErr w:type="spellStart"/>
+            <w:r>
+              <w:rPr>
+                <w:rFonts w:ascii="Arial" w:hAnsi="Arial" w:cs="Arial"/>
+                <w:sz w:val="22"/>
+                <w:szCs w:val="22"/>
+              </w:rPr>
+              <w:t>param</w:t>
+            </w:r>
+            <w:proofErr w:type="spellEnd"/>
+            <w:proofErr w:type="gramEnd"/>
+            <w:r>
+              <w:rPr>
+                <w:rFonts w:ascii="Arial" w:hAnsi="Arial" w:cs="Arial"/>
+                <w:sz w:val="22"/>
+                <w:szCs w:val="22"/>
+              </w:rPr>
+              <w:t>(</w:t>
+            </w:r>
+            <w:r>
+              <w:rPr>
+                <w:rFonts w:ascii="Arial" w:eastAsia="Arial" w:hAnsi="Arial" w:cs="Arial"/>
+                <w:color w:val="000000"/>
+                <w:sz w:val="22"/>
+                <w:szCs w:val="22"/>
+              </w:rPr>
+              <w:t>'</w:t>
+            </w:r>
+            <w:proofErr w:type="spellStart"/>
+            <w:r>
+              <w:rPr>
+                <w:rFonts w:ascii="Arial" w:eastAsia="Arial" w:hAnsi="Arial" w:cs="Arial"/>
+                <w:color w:val="000000"/>
+                <w:sz w:val="22"/>
+                <w:szCs w:val="22"/>
+              </w:rPr>
+              <w:t>je_name</w:t>
+            </w:r>
+            <w:proofErr w:type="spellEnd"/>
+            <w:r>
+              <w:rPr>
+                <w:rFonts w:ascii="Arial" w:eastAsia="Arial" w:hAnsi="Arial" w:cs="Arial"/>
+                <w:color w:val="000000"/>
+                <w:sz w:val="22"/>
+                <w:szCs w:val="22"/>
+              </w:rPr>
+              <w:t>') }}</w:t>
             </w:r>
           </w:p>
           <w:p>
@@ -876,20 +1045,73 @@
               <w:ind w:firstLine="0"/>
               <w:jc w:val="left"/>
               <w:rPr>
-                <w:rFonts w:ascii="Arial" w:eastAsia="Calibri" w:hAnsi="Arial" w:cs="Arial"/>
-                <w:color w:val="000000" w:themeColor="text1"/>
+                <w:rFonts w:ascii="Arial" w:eastAsia="Arial" w:hAnsi="Arial" w:cs="Arial"/>
+                <w:color w:val="000000"/>
                 <w:sz w:val="22"/>
                 <w:szCs w:val="22"/>
+                <w:lang w:val="en-GB"/>
               </w:rPr>
             </w:pPr>
             <w:r>
               <w:rPr>
-                <w:rFonts w:ascii="Arial" w:eastAsia="Calibri" w:hAnsi="Arial" w:cs="Arial"/>
-                <w:color w:val="000000" w:themeColor="text1"/>
+                <w:rFonts w:ascii="Arial" w:hAnsi="Arial" w:cs="Arial"/>
                 <w:sz w:val="22"/>
                 <w:szCs w:val="22"/>
-              </w:rPr>
-              <w:t>20 avenue des Buttes de Coësmes, 35708 Rennes, CS 70839 Cedex 7</w:t>
+                <w:lang w:val="en-GB"/>
+              </w:rPr>
+              <w:t xml:space="preserve">{{ </w:t>
+            </w:r>
+            <w:proofErr w:type="spellStart"/>
+            <w:r>
+              <w:rPr>
+                <w:rFonts w:ascii="Arial" w:hAnsi="Arial" w:cs="Arial"/>
+                <w:sz w:val="22"/>
+                <w:szCs w:val="22"/>
+                <w:lang w:val="en-GB"/>
+              </w:rPr>
+              <w:t>param</w:t>
+            </w:r>
+            <w:proofErr w:type="spellEnd"/>
+            <w:r>
+              <w:rPr>
+                <w:rFonts w:ascii="Arial" w:hAnsi="Arial" w:cs="Arial"/>
+                <w:sz w:val="22"/>
+                <w:szCs w:val="22"/>
+                <w:lang w:val="en-GB"/>
+              </w:rPr>
+              <w:t>(</w:t>
+            </w:r>
+            <w:r>
+              <w:rPr>
+                <w:rFonts w:ascii="Arial" w:eastAsia="Arial" w:hAnsi="Arial" w:cs="Arial"/>
+                <w:color w:val="000000"/>
+                <w:sz w:val="22"/>
+                <w:szCs w:val="22"/>
+                <w:lang w:val="en-GB"/>
+              </w:rPr>
+              <w:t>'</w:t>
+            </w:r>
+            <w:proofErr w:type="spellStart"/>
+            <w:r>
+              <w:rPr>
+                <w:rFonts w:ascii="Arial" w:eastAsia="Arial" w:hAnsi="Arial" w:cs="Arial"/>
+                <w:color w:val="000000"/>
+                <w:sz w:val="22"/>
+                <w:szCs w:val="22"/>
+                <w:lang w:val="en-GB"/>
+              </w:rPr>
+              <w:t>je_address</w:t>
+            </w:r>
+            <w:proofErr w:type="spellEnd"/>
+            <w:r>
+              <w:rPr>
+                <w:rFonts w:ascii="Arial" w:eastAsia="Arial" w:hAnsi="Arial" w:cs="Arial"/>
+                <w:color w:val="000000"/>
+                <w:sz w:val="22"/>
+                <w:szCs w:val="22"/>
+                <w:lang w:val="en-GB"/>
+              </w:rPr>
+              <w:t>') }}</w:t>
             </w:r>
           </w:p>
           <w:p>
@@ -901,6 +1123,7 @@
                 <w:color w:val="000000" w:themeColor="text1"/>
                 <w:sz w:val="22"/>
                 <w:szCs w:val="22"/>
+                <w:lang w:val="en-GB"/>
               </w:rPr>
             </w:pPr>
             <w:r>
@@ -921,6 +1144,7 @@
                 <w:color w:val="000000" w:themeColor="text1"/>
                 <w:sz w:val="22"/>
                 <w:szCs w:val="22"/>
+                <w:lang w:val="en-GB"/>
               </w:rPr>
               <w:tab/>
             </w:r>
@@ -930,8 +1154,210 @@
                 <w:color w:val="000000" w:themeColor="text1"/>
                 <w:sz w:val="22"/>
                 <w:szCs w:val="22"/>
+                <w:lang w:val="en-GB"/>
               </w:rPr>
               <w:t>02 23 23 85 72</w:t>
+            </w:r>
+          </w:p>
+          <w:p>
+            <w:pPr>
+              <w:ind w:firstLine="0"/>
+              <w:jc w:val="left"/>
+              <w:rPr>
+                <w:rFonts w:ascii="Arial" w:eastAsia="Arial" w:hAnsi="Arial" w:cs="Arial"/>
+                <w:color w:val="000000"/>
+                <w:sz w:val="22"/>
+                <w:szCs w:val="22"/>
+              </w:rPr>
+            </w:pPr>
+            <w:r>
+              <w:rPr>
+                <w:rFonts w:ascii="Arial" w:hAnsi="Arial" w:cs="Arial"/>
+                <w:bCs/>
+                <w:color w:val="000000" w:themeColor="text1"/>
+                <w:sz w:val="22"/>
+                <w:szCs w:val="22"/>
+              </w:rPr>
+              <w:t></w:t>
+            </w:r>
+            <w:r>
+              <w:rPr>
+                <w:rFonts w:ascii="Arial" w:hAnsi="Arial" w:cs="Arial"/>
+                <w:bCs/>
+                <w:color w:val="000000" w:themeColor="text1"/>
+                <w:sz w:val="22"/>
+                <w:szCs w:val="22"/>
+              </w:rPr>
+              <w:t xml:space="preserve">  </w:t>
+            </w:r>
+            <w:r>
+              <w:rPr>
+                <w:rFonts w:ascii="Arial" w:hAnsi="Arial" w:cs="Arial"/>
+                <w:sz w:val="22"/>
+                <w:szCs w:val="22"/>
+              </w:rPr>
+              <w:t>{</w:t>
+            </w:r>
+            <w:proofErr w:type="gramStart"/>
+            <w:r>
+              <w:rPr>
+                <w:rFonts w:ascii="Arial" w:hAnsi="Arial" w:cs="Arial"/>
+                <w:sz w:val="22"/>
+                <w:szCs w:val="22"/>
+              </w:rPr>
+              <w:t xml:space="preserve">{ </w:t>
+            </w:r>
+            <w:proofErr w:type="spellStart"/>
+            <w:r>
+              <w:rPr>
+                <w:rFonts w:ascii="Arial" w:hAnsi="Arial" w:cs="Arial"/>
+                <w:sz w:val="22"/>
+                <w:szCs w:val="22"/>
+              </w:rPr>
+              <w:t>param</w:t>
+            </w:r>
+            <w:proofErr w:type="spellEnd"/>
+            <w:proofErr w:type="gramEnd"/>
+            <w:r>
+              <w:rPr>
+                <w:rFonts w:ascii="Arial" w:hAnsi="Arial" w:cs="Arial"/>
+                <w:sz w:val="22"/>
+                <w:szCs w:val="22"/>
+              </w:rPr>
+              <w:t>(</w:t>
+            </w:r>
+            <w:r>
+              <w:rPr>
+                <w:rFonts w:ascii="Arial" w:eastAsia="Arial" w:hAnsi="Arial" w:cs="Arial"/>
+                <w:color w:val="000000"/>
+                <w:sz w:val="22"/>
+                <w:szCs w:val="22"/>
+              </w:rPr>
+              <w:t>'</w:t>
+            </w:r>
+            <w:proofErr w:type="spellStart"/>
+            <w:r>
+              <w:rPr>
+                <w:rFonts w:ascii="Arial" w:eastAsia="Arial" w:hAnsi="Arial" w:cs="Arial"/>
+                <w:color w:val="000000"/>
+                <w:sz w:val="22"/>
+                <w:szCs w:val="22"/>
+              </w:rPr>
+              <w:t>je_contact</w:t>
+            </w:r>
+            <w:proofErr w:type="spellEnd"/>
+            <w:r>
+              <w:rPr>
+                <w:rFonts w:ascii="Arial" w:eastAsia="Arial" w:hAnsi="Arial" w:cs="Arial"/>
+                <w:color w:val="000000"/>
+                <w:sz w:val="22"/>
+                <w:szCs w:val="22"/>
+              </w:rPr>
+              <w:t>') }}</w:t>
+            </w:r>
+          </w:p>
+          <w:p>
+            <w:pPr>
+              <w:ind w:firstLine="0"/>
+              <w:jc w:val="left"/>
+              <w:rPr>
+                <w:rFonts w:ascii="Arial" w:eastAsia="Arial" w:hAnsi="Arial" w:cs="Arial"/>
+                <w:color w:val="000000"/>
+                <w:sz w:val="22"/>
+                <w:szCs w:val="22"/>
+              </w:rPr>
+            </w:pPr>
+            <w:r>
+              <w:rPr>
+                <w:rFonts w:ascii="Arial" w:hAnsi="Arial" w:cs="Arial"/>
+                <w:bCs/>
+                <w:color w:val="000000" w:themeColor="text1"/>
+                <w:sz w:val="22"/>
+                <w:szCs w:val="22"/>
+              </w:rPr>
+              <w:t></w:t>
+            </w:r>
+            <w:r>
+              <w:rPr>
+                <w:rFonts w:ascii="Arial" w:hAnsi="Arial" w:cs="Arial"/>
+                <w:bCs/>
+                <w:color w:val="000000" w:themeColor="text1"/>
+                <w:sz w:val="22"/>
+                <w:szCs w:val="22"/>
+              </w:rPr>
+              <w:t xml:space="preserve">  </w:t>
+            </w:r>
+            <w:r>
+              <w:rPr>
+                <w:rFonts w:ascii="Arial" w:hAnsi="Arial" w:cs="Arial"/>
+                <w:sz w:val="22"/>
+                <w:szCs w:val="22"/>
+                <w:u w:val="single"/>
+              </w:rPr>
+              <w:t>{</w:t>
+            </w:r>
+            <w:proofErr w:type="gramStart"/>
+            <w:r>
+              <w:rPr>
+                <w:rFonts w:ascii="Arial" w:hAnsi="Arial" w:cs="Arial"/>
+                <w:sz w:val="22"/>
+                <w:szCs w:val="22"/>
+                <w:u w:val="single"/>
+              </w:rPr>
+              <w:t xml:space="preserve">{ </w:t>
+            </w:r>
+            <w:proofErr w:type="spellStart"/>
+            <w:r>
+              <w:rPr>
+                <w:rFonts w:ascii="Arial" w:hAnsi="Arial" w:cs="Arial"/>
+                <w:sz w:val="22"/>
+                <w:szCs w:val="22"/>
+                <w:u w:val="single"/>
+              </w:rPr>
+              <w:t>param</w:t>
+            </w:r>
+            <w:proofErr w:type="spellEnd"/>
+            <w:proofErr w:type="gramEnd"/>
+            <w:r>
+              <w:rPr>
+                <w:rFonts w:ascii="Arial" w:hAnsi="Arial" w:cs="Arial"/>
+                <w:sz w:val="22"/>
+                <w:szCs w:val="22"/>
+                <w:u w:val="single"/>
+              </w:rPr>
+              <w:t>(</w:t>
+            </w:r>
+            <w:r>
+              <w:rPr>
+                <w:rFonts w:ascii="Arial" w:eastAsia="Arial" w:hAnsi="Arial" w:cs="Arial"/>
+                <w:color w:val="000000"/>
+                <w:sz w:val="22"/>
+                <w:szCs w:val="22"/>
+                <w:u w:val="single"/>
+              </w:rPr>
+              <w:t>'</w:t>
+            </w:r>
+            <w:proofErr w:type="spellStart"/>
+            <w:r>
+              <w:rPr>
+                <w:rFonts w:ascii="Arial" w:eastAsia="Arial" w:hAnsi="Arial" w:cs="Arial"/>
+                <w:color w:val="000000"/>
+                <w:sz w:val="22"/>
+                <w:szCs w:val="22"/>
+                <w:u w:val="single"/>
+              </w:rPr>
+              <w:t>je_url</w:t>
+            </w:r>
+            <w:proofErr w:type="spellEnd"/>
+            <w:r>
+              <w:rPr>
+                <w:rFonts w:ascii="Arial" w:eastAsia="Arial" w:hAnsi="Arial" w:cs="Arial"/>
+                <w:color w:val="000000"/>
+                <w:sz w:val="22"/>
+                <w:szCs w:val="22"/>
+                <w:u w:val="single"/>
+              </w:rPr>
+              <w:t>') }}</w:t>
             </w:r>
           </w:p>
           <w:p>
@@ -939,145 +1365,12 @@
               <w:pStyle w:val="1pagecolonnecartevisiteOuestInsa"/>
               <w:ind w:firstLine="0"/>
               <w:rPr>
-                <w:rFonts w:ascii="Arial" w:hAnsi="Arial" w:cs="Arial"/>
-                <w:color w:val="000000" w:themeColor="text1"/>
-                <w:sz w:val="22"/>
-                <w:szCs w:val="22"/>
-              </w:rPr>
-            </w:pPr>
-            <w:r>
-              <w:rPr>
-                <w:rFonts w:ascii="Arial" w:hAnsi="Arial" w:cs="Arial"/>
-                <w:bCs/>
-                <w:color w:val="000000" w:themeColor="text1"/>
-                <w:sz w:val="22"/>
-                <w:szCs w:val="22"/>
-              </w:rPr>
-              <w:t></w:t>
-            </w:r>
-            <w:r>
-              <w:rPr>
-                <w:rFonts w:ascii="Arial" w:hAnsi="Arial" w:cs="Arial"/>
-                <w:b/>
-                <w:bCs/>
-                <w:color w:val="000000" w:themeColor="text1"/>
-                <w:sz w:val="22"/>
-                <w:szCs w:val="22"/>
-              </w:rPr>
-              <w:tab/>
-            </w:r>
-            <w:r>
-              <w:rPr>
                 <w:rFonts w:ascii="Arial" w:eastAsia="Calibri" w:hAnsi="Arial" w:cs="Arial"/>
                 <w:color w:val="000000" w:themeColor="text1"/>
                 <w:sz w:val="22"/>
                 <w:szCs w:val="22"/>
               </w:rPr>
-              <w:t>contact@ouest-insa.fr</w:t>
-            </w:r>
-          </w:p>
-          <w:p>
-            <w:pPr>
-              <w:pStyle w:val="1pagecolonnecartevisiteOuestInsa"/>
-              <w:ind w:firstLine="0"/>
-              <w:rPr>
-                <w:rFonts w:ascii="Arial" w:eastAsia="Calibri" w:hAnsi="Arial" w:cs="Arial"/>
-                <w:color w:val="000000" w:themeColor="text1"/>
-                <w:sz w:val="22"/>
-                <w:szCs w:val="22"/>
-              </w:rPr>
             </w:pPr>
-            <w:r>
-              <w:rPr>
-                <w:rFonts w:ascii="Arial" w:hAnsi="Arial" w:cs="Arial"/>
-                <w:bCs/>
-                <w:color w:val="000000" w:themeColor="text1"/>
-                <w:sz w:val="22"/>
-                <w:szCs w:val="22"/>
-              </w:rPr>
-              <w:t></w:t>
-            </w:r>
-            <w:r>
-              <w:rPr>
-                <w:rFonts w:ascii="Arial" w:hAnsi="Arial" w:cs="Arial"/>
-                <w:color w:val="000000" w:themeColor="text1"/>
-                <w:sz w:val="22"/>
-                <w:szCs w:val="22"/>
-              </w:rPr>
-              <w:tab/>
-            </w:r>
-            <w:hyperlink r:id="rId9" w:history="1">
-              <w:r>
-                <w:rPr>
-                  <w:rStyle w:val="Lienhypertexte"/>
-                  <w:rFonts w:ascii="Arial" w:eastAsia="Calibri" w:hAnsi="Arial" w:cs="Arial"/>
-                  <w:color w:val="000000" w:themeColor="text1"/>
-                  <w:sz w:val="22"/>
-                  <w:szCs w:val="22"/>
-                </w:rPr>
-                <w:t>www</w:t>
-              </w:r>
-              <w:r>
-                <w:rPr>
-                  <w:rStyle w:val="Lienhypertexte"/>
-                  <w:rFonts w:ascii="Arial" w:hAnsi="Arial" w:cs="Arial"/>
-                  <w:color w:val="000000" w:themeColor="text1"/>
-                  <w:sz w:val="22"/>
-                  <w:szCs w:val="22"/>
-                </w:rPr>
-                <w:t>.</w:t>
-              </w:r>
-              <w:r>
-                <w:rPr>
-                  <w:rStyle w:val="Lienhypertexte"/>
-                  <w:rFonts w:ascii="Arial" w:eastAsia="Calibri" w:hAnsi="Arial" w:cs="Arial"/>
-                  <w:color w:val="000000" w:themeColor="text1"/>
-                  <w:sz w:val="22"/>
-                  <w:szCs w:val="22"/>
-                </w:rPr>
-                <w:t>ouest</w:t>
-              </w:r>
-              <w:r>
-                <w:rPr>
-                  <w:rStyle w:val="Lienhypertexte"/>
-                  <w:rFonts w:ascii="Arial" w:hAnsi="Arial" w:cs="Arial"/>
-                  <w:color w:val="000000" w:themeColor="text1"/>
-                  <w:sz w:val="22"/>
-                  <w:szCs w:val="22"/>
-                </w:rPr>
-                <w:t>-</w:t>
-              </w:r>
-              <w:r>
-                <w:rPr>
-                  <w:rStyle w:val="Lienhypertexte"/>
-                  <w:rFonts w:ascii="Arial" w:eastAsia="Calibri" w:hAnsi="Arial" w:cs="Arial"/>
-                  <w:color w:val="000000" w:themeColor="text1"/>
-                  <w:sz w:val="22"/>
-                  <w:szCs w:val="22"/>
-                </w:rPr>
-                <w:t>insa</w:t>
-              </w:r>
-              <w:r>
-                <w:rPr>
-                  <w:rStyle w:val="Lienhypertexte"/>
-                  <w:rFonts w:ascii="Arial" w:hAnsi="Arial" w:cs="Arial"/>
-                  <w:color w:val="000000" w:themeColor="text1"/>
-                  <w:sz w:val="22"/>
-                  <w:szCs w:val="22"/>
-                </w:rPr>
-                <w:t>.</w:t>
-              </w:r>
-              <w:r>
-                <w:rPr>
-                  <w:rStyle w:val="Lienhypertexte"/>
-                  <w:rFonts w:ascii="Arial" w:eastAsia="Calibri" w:hAnsi="Arial" w:cs="Arial"/>
-                  <w:color w:val="000000" w:themeColor="text1"/>
-                  <w:sz w:val="22"/>
-                  <w:szCs w:val="22"/>
-                </w:rPr>
-                <w:t>fr</w:t>
-              </w:r>
-            </w:hyperlink>
           </w:p>
           <w:p>
             <w:pPr>
@@ -1249,7 +1542,7 @@
                 <w:sz w:val="20"/>
                 <w:szCs w:val="20"/>
               </w:rPr>
-              <w:t xml:space="preserve">, est confidentiel. Toute diffusion auprès de personnes physiques ou morales, autres que celles précisées sur ce document, est strictement interdite. Toute reproduction, partielle ou complète, de ce document est interdite sans l’accord préalable de </w:t>
+              <w:t>, est confidentiel. Toute diffusion auprès de personnes physiques ou morales, autres que celles précisées sur ce document, est strictement interdite. Toute reproduction, partielle ou complète, de ce document est interdite sans l’accord préalable</w:t>
             </w:r>
             <w:r>
               <w:rPr>
@@ -1257,7 +1550,72 @@
                 <w:sz w:val="20"/>
                 <w:szCs w:val="20"/>
               </w:rPr>
-              <w:t>Ouest INSA</w:t>
+              <w:t xml:space="preserve"> de </w:t>
+            </w:r>
+            <w:r>
+              <w:rPr>
+                <w:rFonts w:ascii="Arial" w:hAnsi="Arial" w:cs="Arial"/>
+                <w:sz w:val="20"/>
+                <w:szCs w:val="20"/>
+              </w:rPr>
+              <w:t>{</w:t>
+            </w:r>
+            <w:proofErr w:type="gramStart"/>
+            <w:r>
+              <w:rPr>
+                <w:rFonts w:ascii="Arial" w:hAnsi="Arial" w:cs="Arial"/>
+                <w:sz w:val="20"/>
+                <w:szCs w:val="20"/>
+              </w:rPr>
+              <w:t xml:space="preserve">{ </w:t>
+            </w:r>
+            <w:proofErr w:type="spellStart"/>
+            <w:r>
+              <w:rPr>
+                <w:rFonts w:ascii="Arial" w:hAnsi="Arial" w:cs="Arial"/>
+                <w:sz w:val="20"/>
+                <w:szCs w:val="20"/>
+              </w:rPr>
+              <w:t>param</w:t>
+            </w:r>
+            <w:proofErr w:type="spellEnd"/>
+            <w:proofErr w:type="gramEnd"/>
+            <w:r>
+              <w:rPr>
+                <w:rFonts w:ascii="Arial" w:hAnsi="Arial" w:cs="Arial"/>
+                <w:sz w:val="20"/>
+                <w:szCs w:val="20"/>
+              </w:rPr>
+              <w:t>(</w:t>
+            </w:r>
+            <w:r>
+              <w:rPr>
+                <w:rFonts w:ascii="Arial" w:eastAsia="Arial" w:hAnsi="Arial" w:cs="Arial"/>
+                <w:color w:val="000000"/>
+                <w:sz w:val="20"/>
+                <w:szCs w:val="20"/>
+              </w:rPr>
+              <w:t>'</w:t>
+            </w:r>
+            <w:proofErr w:type="spellStart"/>
+            <w:r>
+              <w:rPr>
+                <w:rFonts w:ascii="Arial" w:eastAsia="Arial" w:hAnsi="Arial" w:cs="Arial"/>
+                <w:color w:val="000000"/>
+                <w:sz w:val="20"/>
+                <w:szCs w:val="20"/>
+              </w:rPr>
+              <w:t>je_name</w:t>
+            </w:r>
+            <w:proofErr w:type="spellEnd"/>
+            <w:r>
+              <w:rPr>
+                <w:rFonts w:ascii="Arial" w:eastAsia="Arial" w:hAnsi="Arial" w:cs="Arial"/>
+                <w:color w:val="000000"/>
+                <w:sz w:val="20"/>
+                <w:szCs w:val="20"/>
+              </w:rPr>
+              <w:t>') }}</w:t>
             </w:r>
             <w:r>
               <w:rPr>
@@ -1323,7 +1681,25 @@
                 <w:sz w:val="20"/>
                 <w:szCs w:val="20"/>
               </w:rPr>
-              <w:t xml:space="preserve">Référence : CE_{{ </w:t>
+              <w:t>Référence : CE</w:t>
+            </w:r>
+            <w:proofErr w:type="gramStart"/>
+            <w:r>
+              <w:rPr>
+                <w:rFonts w:ascii="Arial" w:eastAsia="Calibri" w:hAnsi="Arial" w:cs="Arial"/>
+                <w:sz w:val="20"/>
+                <w:szCs w:val="20"/>
+              </w:rPr>
+              <w:t>_{</w:t>
+            </w:r>
+            <w:proofErr w:type="gramEnd"/>
+            <w:r>
+              <w:rPr>
+                <w:rFonts w:ascii="Arial" w:eastAsia="Calibri" w:hAnsi="Arial" w:cs="Arial"/>
+                <w:sz w:val="20"/>
+                <w:szCs w:val="20"/>
+              </w:rPr>
+              <w:t xml:space="preserve">{ </w:t>
             </w:r>
             <w:proofErr w:type="spellStart"/>
             <w:r>
@@ -1455,20 +1831,39 @@
       <w:r>
         <w:rPr>
           <w:rFonts w:ascii="Arial" w:eastAsia="Calibri" w:hAnsi="Arial" w:cs="Arial"/>
-        </w:rPr>
-        <w:t>Ouest</w:t>
-      </w:r>
-      <w:r>
-        <w:rPr>
-          <w:rFonts w:ascii="Arial" w:hAnsi="Arial" w:cs="Arial"/>
-        </w:rPr>
-        <w:t xml:space="preserve"> </w:t>
-      </w:r>
-      <w:r>
-        <w:rPr>
-          <w:rFonts w:ascii="Arial" w:eastAsia="Calibri" w:hAnsi="Arial" w:cs="Arial"/>
-        </w:rPr>
-        <w:t>INSA</w:t>
+          <w:szCs w:val="26"/>
+        </w:rPr>
+        <w:t>{{ param(</w:t>
+      </w:r>
+      <w:r>
+        <w:rPr>
+          <w:rFonts w:ascii="Arial" w:eastAsia="Arial" w:hAnsi="Arial" w:cs="Arial"/>
+          <w:color w:val="000000"/>
+          <w:szCs w:val="26"/>
+        </w:rPr>
+        <w:t>'</w:t>
+      </w:r>
+      <w:r>
+        <w:rPr>
+          <w:rFonts w:ascii="Arial" w:eastAsia="Calibri" w:hAnsi="Arial" w:cs="Arial"/>
+          <w:szCs w:val="26"/>
+        </w:rPr>
+        <w:t>je_name</w:t>
+      </w:r>
+      <w:r>
+        <w:rPr>
+          <w:rFonts w:ascii="Arial" w:eastAsia="Arial" w:hAnsi="Arial" w:cs="Arial"/>
+          <w:color w:val="000000"/>
+          <w:szCs w:val="26"/>
+        </w:rPr>
+        <w:t>'</w:t>
+      </w:r>
+      <w:r>
+        <w:rPr>
+          <w:rFonts w:ascii="Arial" w:eastAsia="Calibri" w:hAnsi="Arial" w:cs="Arial"/>
+          <w:szCs w:val="26"/>
+        </w:rPr>
+        <w:t>) }}</w:t>
       </w:r>
       <w:r>
         <w:rPr>
@@ -4014,8 +4409,8 @@
           <w:rFonts w:ascii="Arial Hebrew" w:hAnsi="Arial Hebrew" w:cs="Arial Hebrew"/>
         </w:rPr>
         <w:sectPr>
-          <w:headerReference w:type="default" r:id="rId10"/>
-          <w:footerReference w:type="default" r:id="rId11"/>
+          <w:headerReference w:type="default" r:id="rId9"/>
+          <w:footerReference w:type="default" r:id="rId10"/>
           <w:type w:val="continuous"/>
           <w:pgSz w:w="11906" w:h="16838"/>
           <w:pgMar w:top="1418" w:right="1418" w:bottom="1418" w:left="1418" w:header="709" w:footer="709" w:gutter="0"/>
@@ -4065,21 +4460,65 @@
       </w:r>
       <w:r>
         <w:rPr>
-          <w:rFonts w:ascii="Arial" w:eastAsia="Calibri" w:hAnsi="Arial" w:cs="Arial"/>
-        </w:rPr>
-        <w:t>Ouest</w:t>
-      </w:r>
-      <w:r>
-        <w:rPr>
-          <w:rFonts w:ascii="Arial" w:hAnsi="Arial" w:cs="Arial"/>
-        </w:rPr>
-        <w:t xml:space="preserve"> </w:t>
-      </w:r>
-      <w:r>
-        <w:rPr>
-          <w:rFonts w:ascii="Arial" w:eastAsia="Calibri" w:hAnsi="Arial" w:cs="Arial"/>
-        </w:rPr>
-        <w:t>INSA</w:t>
+          <w:rFonts w:ascii="Arial" w:hAnsi="Arial" w:cs="Arial"/>
+        </w:rPr>
+        <w:t>{</w:t>
+      </w:r>
+      <w:proofErr w:type="gramStart"/>
+      <w:r>
+        <w:rPr>
+          <w:rFonts w:ascii="Arial" w:hAnsi="Arial" w:cs="Arial"/>
+        </w:rPr>
+        <w:t xml:space="preserve">{ </w:t>
+      </w:r>
+      <w:proofErr w:type="spellStart"/>
+      <w:r>
+        <w:rPr>
+          <w:rFonts w:ascii="Arial" w:hAnsi="Arial" w:cs="Arial"/>
+        </w:rPr>
+        <w:t>param</w:t>
+      </w:r>
+      <w:proofErr w:type="spellEnd"/>
+      <w:proofErr w:type="gramEnd"/>
+      <w:r>
+        <w:rPr>
+          <w:rFonts w:ascii="Arial" w:hAnsi="Arial" w:cs="Arial"/>
+        </w:rPr>
+        <w:t>(</w:t>
+      </w:r>
+      <w:r>
+        <w:rPr>
+          <w:rFonts w:ascii="Arial" w:eastAsia="Arial" w:hAnsi="Arial" w:cs="Arial"/>
+          <w:color w:val="000000"/>
+          <w:szCs w:val="20"/>
+        </w:rPr>
+        <w:t>'</w:t>
+      </w:r>
+      <w:proofErr w:type="spellStart"/>
+      <w:r>
+        <w:rPr>
+          <w:rFonts w:ascii="Arial" w:eastAsia="Arial" w:hAnsi="Arial" w:cs="Arial"/>
+          <w:color w:val="000000"/>
+          <w:szCs w:val="20"/>
+        </w:rPr>
+        <w:t>je_name</w:t>
+      </w:r>
+      <w:proofErr w:type="spellEnd"/>
+      <w:r>
+        <w:rPr>
+          <w:rFonts w:ascii="Arial" w:eastAsia="Arial" w:hAnsi="Arial" w:cs="Arial"/>
+          <w:color w:val="000000"/>
+          <w:szCs w:val="20"/>
+        </w:rPr>
+        <w:t>'</w:t>
+      </w:r>
+      <w:r>
+        <w:rPr>
+          <w:rFonts w:ascii="Arial" w:eastAsia="Arial" w:hAnsi="Arial" w:cs="Arial"/>
+          <w:color w:val="000000"/>
+          <w:szCs w:val="20"/>
+        </w:rPr>
+        <w:t>) }}</w:t>
       </w:r>
       <w:bookmarkEnd w:id="6"/>
       <w:bookmarkEnd w:id="7"/>
@@ -4098,23 +4537,71 @@
           <w:sz w:val="26"/>
           <w:szCs w:val="26"/>
         </w:rPr>
-        <w:t>Ouest</w:t>
-      </w:r>
-      <w:r>
-        <w:rPr>
-          <w:rFonts w:ascii="Arial" w:hAnsi="Arial" w:cs="Arial"/>
-          <w:sz w:val="26"/>
-          <w:szCs w:val="26"/>
-        </w:rPr>
-        <w:t xml:space="preserve"> </w:t>
-      </w:r>
-      <w:r>
-        <w:rPr>
-          <w:rFonts w:ascii="Arial" w:eastAsia="Calibri" w:hAnsi="Arial" w:cs="Arial"/>
-          <w:sz w:val="26"/>
-          <w:szCs w:val="26"/>
-        </w:rPr>
-        <w:t>INSA</w:t>
+        <w:t>{</w:t>
+      </w:r>
+      <w:proofErr w:type="gramStart"/>
+      <w:r>
+        <w:rPr>
+          <w:rFonts w:ascii="Arial" w:eastAsia="Calibri" w:hAnsi="Arial" w:cs="Arial"/>
+          <w:sz w:val="26"/>
+          <w:szCs w:val="26"/>
+        </w:rPr>
+        <w:t xml:space="preserve">{ </w:t>
+      </w:r>
+      <w:proofErr w:type="spellStart"/>
+      <w:r>
+        <w:rPr>
+          <w:rFonts w:ascii="Arial" w:eastAsia="Calibri" w:hAnsi="Arial" w:cs="Arial"/>
+          <w:sz w:val="26"/>
+          <w:szCs w:val="26"/>
+        </w:rPr>
+        <w:t>param</w:t>
+      </w:r>
+      <w:proofErr w:type="spellEnd"/>
+      <w:proofErr w:type="gramEnd"/>
+      <w:r>
+        <w:rPr>
+          <w:rFonts w:ascii="Arial" w:eastAsia="Calibri" w:hAnsi="Arial" w:cs="Arial"/>
+          <w:sz w:val="26"/>
+          <w:szCs w:val="26"/>
+        </w:rPr>
+        <w:t>(</w:t>
+      </w:r>
+      <w:r>
+        <w:rPr>
+          <w:rFonts w:ascii="Arial" w:eastAsia="Arial" w:hAnsi="Arial" w:cs="Arial"/>
+          <w:color w:val="000000"/>
+          <w:sz w:val="26"/>
+          <w:szCs w:val="26"/>
+        </w:rPr>
+        <w:t>'</w:t>
+      </w:r>
+      <w:proofErr w:type="spellStart"/>
+      <w:r>
+        <w:rPr>
+          <w:rFonts w:ascii="Arial" w:eastAsia="Calibri" w:hAnsi="Arial" w:cs="Arial"/>
+          <w:sz w:val="26"/>
+          <w:szCs w:val="26"/>
+        </w:rPr>
+        <w:t>je_name</w:t>
+      </w:r>
+      <w:proofErr w:type="spellEnd"/>
+      <w:r>
+        <w:rPr>
+          <w:rFonts w:ascii="Arial" w:eastAsia="Arial" w:hAnsi="Arial" w:cs="Arial"/>
+          <w:color w:val="000000"/>
+          <w:sz w:val="26"/>
+          <w:szCs w:val="26"/>
+        </w:rPr>
+        <w:t>'</w:t>
+      </w:r>
+      <w:r>
+        <w:rPr>
+          <w:rFonts w:ascii="Arial" w:eastAsia="Calibri" w:hAnsi="Arial" w:cs="Arial"/>
+          <w:sz w:val="26"/>
+          <w:szCs w:val="26"/>
+        </w:rPr>
+        <w:t>) }}</w:t>
       </w:r>
       <w:r>
         <w:rPr>
@@ -4760,31 +5247,71 @@
           <w:sz w:val="26"/>
           <w:szCs w:val="26"/>
         </w:rPr>
-        <w:t>Ouest</w:t>
-      </w:r>
-      <w:r>
-        <w:rPr>
-          <w:rFonts w:ascii="Arial" w:hAnsi="Arial" w:cs="Arial"/>
-          <w:sz w:val="26"/>
-          <w:szCs w:val="26"/>
-        </w:rPr>
-        <w:t xml:space="preserve"> </w:t>
-      </w:r>
-      <w:r>
-        <w:rPr>
-          <w:rFonts w:ascii="Arial" w:eastAsia="Calibri" w:hAnsi="Arial" w:cs="Arial"/>
-          <w:sz w:val="26"/>
-          <w:szCs w:val="26"/>
-        </w:rPr>
-        <w:t>INSA</w:t>
-      </w:r>
-      <w:r>
-        <w:rPr>
-          <w:rFonts w:ascii="Arial" w:hAnsi="Arial" w:cs="Arial"/>
-          <w:sz w:val="26"/>
-          <w:szCs w:val="26"/>
-        </w:rPr>
-        <w:t xml:space="preserve"> </w:t>
+        <w:t>{</w:t>
+      </w:r>
+      <w:proofErr w:type="gramStart"/>
+      <w:r>
+        <w:rPr>
+          <w:rFonts w:ascii="Arial" w:eastAsia="Calibri" w:hAnsi="Arial" w:cs="Arial"/>
+          <w:sz w:val="26"/>
+          <w:szCs w:val="26"/>
+        </w:rPr>
+        <w:t xml:space="preserve">{ </w:t>
+      </w:r>
+      <w:proofErr w:type="spellStart"/>
+      <w:r>
+        <w:rPr>
+          <w:rFonts w:ascii="Arial" w:eastAsia="Calibri" w:hAnsi="Arial" w:cs="Arial"/>
+          <w:sz w:val="26"/>
+          <w:szCs w:val="26"/>
+        </w:rPr>
+        <w:t>param</w:t>
+      </w:r>
+      <w:proofErr w:type="spellEnd"/>
+      <w:proofErr w:type="gramEnd"/>
+      <w:r>
+        <w:rPr>
+          <w:rFonts w:ascii="Arial" w:eastAsia="Calibri" w:hAnsi="Arial" w:cs="Arial"/>
+          <w:sz w:val="26"/>
+          <w:szCs w:val="26"/>
+        </w:rPr>
+        <w:t>(</w:t>
+      </w:r>
+      <w:r>
+        <w:rPr>
+          <w:rFonts w:ascii="Arial" w:eastAsia="Arial" w:hAnsi="Arial" w:cs="Arial"/>
+          <w:color w:val="000000"/>
+          <w:sz w:val="26"/>
+          <w:szCs w:val="26"/>
+        </w:rPr>
+        <w:t>'</w:t>
+      </w:r>
+      <w:proofErr w:type="spellStart"/>
+      <w:r>
+        <w:rPr>
+          <w:rFonts w:ascii="Arial" w:eastAsia="Calibri" w:hAnsi="Arial" w:cs="Arial"/>
+          <w:sz w:val="26"/>
+          <w:szCs w:val="26"/>
+        </w:rPr>
+        <w:t>je_name</w:t>
+      </w:r>
+      <w:proofErr w:type="spellEnd"/>
+      <w:r>
+        <w:rPr>
+          <w:rFonts w:ascii="Arial" w:eastAsia="Arial" w:hAnsi="Arial" w:cs="Arial"/>
+          <w:color w:val="000000"/>
+          <w:sz w:val="26"/>
+          <w:szCs w:val="26"/>
+        </w:rPr>
+        <w:t>'</w:t>
+      </w:r>
+      <w:r>
+        <w:rPr>
+          <w:rFonts w:ascii="Arial" w:eastAsia="Calibri" w:hAnsi="Arial" w:cs="Arial"/>
+          <w:sz w:val="26"/>
+          <w:szCs w:val="26"/>
+        </w:rPr>
+        <w:t xml:space="preserve">) }} </w:t>
       </w:r>
       <w:r>
         <w:rPr>
@@ -5144,31 +5671,71 @@
           <w:sz w:val="26"/>
           <w:szCs w:val="26"/>
         </w:rPr>
-        <w:t>Ouest</w:t>
-      </w:r>
-      <w:r>
-        <w:rPr>
-          <w:rFonts w:ascii="Arial" w:hAnsi="Arial" w:cs="Arial"/>
-          <w:sz w:val="26"/>
-          <w:szCs w:val="26"/>
-        </w:rPr>
-        <w:t xml:space="preserve"> </w:t>
-      </w:r>
-      <w:r>
-        <w:rPr>
-          <w:rFonts w:ascii="Arial" w:eastAsia="Calibri" w:hAnsi="Arial" w:cs="Arial"/>
-          <w:sz w:val="26"/>
-          <w:szCs w:val="26"/>
-        </w:rPr>
-        <w:t>INSA</w:t>
-      </w:r>
-      <w:r>
-        <w:rPr>
-          <w:rFonts w:ascii="Arial" w:hAnsi="Arial" w:cs="Arial"/>
-          <w:sz w:val="26"/>
-          <w:szCs w:val="26"/>
-        </w:rPr>
-        <w:t xml:space="preserve"> </w:t>
+        <w:t>{</w:t>
+      </w:r>
+      <w:proofErr w:type="gramStart"/>
+      <w:r>
+        <w:rPr>
+          <w:rFonts w:ascii="Arial" w:eastAsia="Calibri" w:hAnsi="Arial" w:cs="Arial"/>
+          <w:sz w:val="26"/>
+          <w:szCs w:val="26"/>
+        </w:rPr>
+        <w:t xml:space="preserve">{ </w:t>
+      </w:r>
+      <w:proofErr w:type="spellStart"/>
+      <w:r>
+        <w:rPr>
+          <w:rFonts w:ascii="Arial" w:eastAsia="Calibri" w:hAnsi="Arial" w:cs="Arial"/>
+          <w:sz w:val="26"/>
+          <w:szCs w:val="26"/>
+        </w:rPr>
+        <w:t>param</w:t>
+      </w:r>
+      <w:proofErr w:type="spellEnd"/>
+      <w:proofErr w:type="gramEnd"/>
+      <w:r>
+        <w:rPr>
+          <w:rFonts w:ascii="Arial" w:eastAsia="Calibri" w:hAnsi="Arial" w:cs="Arial"/>
+          <w:sz w:val="26"/>
+          <w:szCs w:val="26"/>
+        </w:rPr>
+        <w:t>(</w:t>
+      </w:r>
+      <w:r>
+        <w:rPr>
+          <w:rFonts w:ascii="Arial" w:eastAsia="Arial" w:hAnsi="Arial" w:cs="Arial"/>
+          <w:color w:val="000000"/>
+          <w:sz w:val="26"/>
+          <w:szCs w:val="26"/>
+        </w:rPr>
+        <w:t>'</w:t>
+      </w:r>
+      <w:proofErr w:type="spellStart"/>
+      <w:r>
+        <w:rPr>
+          <w:rFonts w:ascii="Arial" w:eastAsia="Calibri" w:hAnsi="Arial" w:cs="Arial"/>
+          <w:sz w:val="26"/>
+          <w:szCs w:val="26"/>
+        </w:rPr>
+        <w:t>je_name</w:t>
+      </w:r>
+      <w:proofErr w:type="spellEnd"/>
+      <w:r>
+        <w:rPr>
+          <w:rFonts w:ascii="Arial" w:eastAsia="Arial" w:hAnsi="Arial" w:cs="Arial"/>
+          <w:color w:val="000000"/>
+          <w:sz w:val="26"/>
+          <w:szCs w:val="26"/>
+        </w:rPr>
+        <w:t>'</w:t>
+      </w:r>
+      <w:r>
+        <w:rPr>
+          <w:rFonts w:ascii="Arial" w:eastAsia="Calibri" w:hAnsi="Arial" w:cs="Arial"/>
+          <w:sz w:val="26"/>
+          <w:szCs w:val="26"/>
+        </w:rPr>
+        <w:t xml:space="preserve">) }} </w:t>
       </w:r>
       <w:r>
         <w:rPr>
@@ -5562,31 +6129,71 @@
           <w:sz w:val="26"/>
           <w:szCs w:val="26"/>
         </w:rPr>
-        <w:t>Ouest</w:t>
-      </w:r>
-      <w:r>
-        <w:rPr>
-          <w:rFonts w:ascii="Arial" w:hAnsi="Arial" w:cs="Arial"/>
-          <w:sz w:val="26"/>
-          <w:szCs w:val="26"/>
-        </w:rPr>
-        <w:t xml:space="preserve"> </w:t>
-      </w:r>
-      <w:r>
-        <w:rPr>
-          <w:rFonts w:ascii="Arial" w:eastAsia="Calibri" w:hAnsi="Arial" w:cs="Arial"/>
-          <w:sz w:val="26"/>
-          <w:szCs w:val="26"/>
-        </w:rPr>
-        <w:t>INSA</w:t>
-      </w:r>
-      <w:r>
-        <w:rPr>
-          <w:rFonts w:ascii="Arial" w:hAnsi="Arial" w:cs="Arial"/>
-          <w:sz w:val="26"/>
-          <w:szCs w:val="26"/>
-        </w:rPr>
-        <w:t xml:space="preserve"> </w:t>
+        <w:t>{</w:t>
+      </w:r>
+      <w:proofErr w:type="gramStart"/>
+      <w:r>
+        <w:rPr>
+          <w:rFonts w:ascii="Arial" w:eastAsia="Calibri" w:hAnsi="Arial" w:cs="Arial"/>
+          <w:sz w:val="26"/>
+          <w:szCs w:val="26"/>
+        </w:rPr>
+        <w:t xml:space="preserve">{ </w:t>
+      </w:r>
+      <w:proofErr w:type="spellStart"/>
+      <w:r>
+        <w:rPr>
+          <w:rFonts w:ascii="Arial" w:eastAsia="Calibri" w:hAnsi="Arial" w:cs="Arial"/>
+          <w:sz w:val="26"/>
+          <w:szCs w:val="26"/>
+        </w:rPr>
+        <w:t>param</w:t>
+      </w:r>
+      <w:proofErr w:type="spellEnd"/>
+      <w:proofErr w:type="gramEnd"/>
+      <w:r>
+        <w:rPr>
+          <w:rFonts w:ascii="Arial" w:eastAsia="Calibri" w:hAnsi="Arial" w:cs="Arial"/>
+          <w:sz w:val="26"/>
+          <w:szCs w:val="26"/>
+        </w:rPr>
+        <w:t>(</w:t>
+      </w:r>
+      <w:r>
+        <w:rPr>
+          <w:rFonts w:ascii="Arial" w:eastAsia="Arial" w:hAnsi="Arial" w:cs="Arial"/>
+          <w:color w:val="000000"/>
+          <w:sz w:val="26"/>
+          <w:szCs w:val="26"/>
+        </w:rPr>
+        <w:t>'</w:t>
+      </w:r>
+      <w:proofErr w:type="spellStart"/>
+      <w:r>
+        <w:rPr>
+          <w:rFonts w:ascii="Arial" w:eastAsia="Calibri" w:hAnsi="Arial" w:cs="Arial"/>
+          <w:sz w:val="26"/>
+          <w:szCs w:val="26"/>
+        </w:rPr>
+        <w:t>je_name</w:t>
+      </w:r>
+      <w:proofErr w:type="spellEnd"/>
+      <w:r>
+        <w:rPr>
+          <w:rFonts w:ascii="Arial" w:eastAsia="Arial" w:hAnsi="Arial" w:cs="Arial"/>
+          <w:color w:val="000000"/>
+          <w:sz w:val="26"/>
+          <w:szCs w:val="26"/>
+        </w:rPr>
+        <w:t>'</w:t>
+      </w:r>
+      <w:r>
+        <w:rPr>
+          <w:rFonts w:ascii="Arial" w:eastAsia="Calibri" w:hAnsi="Arial" w:cs="Arial"/>
+          <w:sz w:val="26"/>
+          <w:szCs w:val="26"/>
+        </w:rPr>
+        <w:t xml:space="preserve">) }} </w:t>
       </w:r>
       <w:r>
         <w:rPr>
@@ -5839,7 +6446,16 @@
           <w:sz w:val="26"/>
           <w:szCs w:val="26"/>
         </w:rPr>
-        <w:t xml:space="preserve">{{ </w:t>
+        <w:t>{</w:t>
+      </w:r>
+      <w:proofErr w:type="gramStart"/>
+      <w:r>
+        <w:rPr>
+          <w:rFonts w:ascii="Arial" w:hAnsi="Arial" w:cs="Arial"/>
+          <w:sz w:val="26"/>
+          <w:szCs w:val="26"/>
+        </w:rPr>
+        <w:t xml:space="preserve">{ </w:t>
       </w:r>
       <w:proofErr w:type="spellStart"/>
       <w:r>
@@ -5859,6 +6475,7 @@
         <w:t>description</w:t>
       </w:r>
       <w:proofErr w:type="spellEnd"/>
+      <w:proofErr w:type="gramEnd"/>
       <w:r>
         <w:rPr>
           <w:rFonts w:ascii="Arial" w:hAnsi="Arial" w:cs="Arial"/>
@@ -6166,7 +6783,16 @@
           <w:sz w:val="26"/>
           <w:szCs w:val="26"/>
         </w:rPr>
-        <w:t xml:space="preserve"> {{</w:t>
+        <w:t xml:space="preserve"> {</w:t>
+      </w:r>
+      <w:proofErr w:type="gramStart"/>
+      <w:r>
+        <w:rPr>
+          <w:rFonts w:ascii="Arial" w:hAnsi="Arial" w:cs="Arial"/>
+          <w:sz w:val="26"/>
+          <w:szCs w:val="26"/>
+        </w:rPr>
+        <w:t>{</w:t>
       </w:r>
       <w:r>
         <w:rPr>
@@ -6190,7 +6816,16 @@
           <w:sz w:val="26"/>
           <w:szCs w:val="26"/>
         </w:rPr>
-        <w:t xml:space="preserve">name </w:t>
+        <w:t>name</w:t>
+      </w:r>
+      <w:proofErr w:type="gramEnd"/>
+      <w:r>
+        <w:rPr>
+          <w:rFonts w:ascii="Arial" w:hAnsi="Arial" w:cs="Arial"/>
+          <w:sz w:val="26"/>
+          <w:szCs w:val="26"/>
+        </w:rPr>
+        <w:t xml:space="preserve"> </w:t>
       </w:r>
       <w:r>
         <w:rPr>
@@ -6777,7 +7412,25 @@
           <w:sz w:val="26"/>
           <w:szCs w:val="26"/>
         </w:rPr>
-        <w:t xml:space="preserve"> for </w:t>
+        <w:t xml:space="preserve"> </w:t>
+      </w:r>
+      <w:proofErr w:type="gramStart"/>
+      <w:r>
+        <w:rPr>
+          <w:rFonts w:ascii="Arial" w:hAnsi="Arial" w:cs="Arial"/>
+          <w:sz w:val="26"/>
+          <w:szCs w:val="26"/>
+        </w:rPr>
+        <w:t>for</w:t>
+      </w:r>
+      <w:proofErr w:type="gramEnd"/>
+      <w:r>
+        <w:rPr>
+          <w:rFonts w:ascii="Arial" w:hAnsi="Arial" w:cs="Arial"/>
+          <w:sz w:val="26"/>
+          <w:szCs w:val="26"/>
+        </w:rPr>
+        <w:t xml:space="preserve"> </w:t>
       </w:r>
       <w:proofErr w:type="spellStart"/>
       <w:r>
@@ -7022,7 +7675,16 @@
           <w:sz w:val="26"/>
           <w:szCs w:val="26"/>
         </w:rPr>
-        <w:t xml:space="preserve"> {{</w:t>
+        <w:t xml:space="preserve"> {</w:t>
+      </w:r>
+      <w:proofErr w:type="gramStart"/>
+      <w:r>
+        <w:rPr>
+          <w:rFonts w:ascii="Arial" w:hAnsi="Arial" w:cs="Arial"/>
+          <w:sz w:val="26"/>
+          <w:szCs w:val="26"/>
+        </w:rPr>
+        <w:t>{</w:t>
       </w:r>
       <w:r>
         <w:rPr>
@@ -7047,7 +7709,16 @@
           <w:sz w:val="26"/>
           <w:szCs w:val="26"/>
         </w:rPr>
-        <w:t>groupe_set.values</w:t>
+        <w:t>groupe</w:t>
+      </w:r>
+      <w:proofErr w:type="gramEnd"/>
+      <w:r>
+        <w:rPr>
+          <w:rFonts w:ascii="Arial" w:hAnsi="Arial" w:cs="Arial"/>
+          <w:sz w:val="26"/>
+          <w:szCs w:val="26"/>
+        </w:rPr>
+        <w:t>_set.values</w:t>
       </w:r>
       <w:proofErr w:type="spellEnd"/>
       <w:r>
@@ -7228,7 +7899,29 @@
           <w:szCs w:val="26"/>
           <w:lang w:val="en-US"/>
         </w:rPr>
-        <w:t>}} : {{</w:t>
+        <w:t>}</w:t>
+      </w:r>
+      <w:proofErr w:type="gramStart"/>
+      <w:r>
+        <w:rPr>
+          <w:rFonts w:ascii="Arial" w:hAnsi="Arial" w:cs="Arial"/>
+          <w:b/>
+          <w:sz w:val="26"/>
+          <w:szCs w:val="26"/>
+          <w:lang w:val="en-US"/>
+        </w:rPr>
+        <w:t>} :</w:t>
+      </w:r>
+      <w:proofErr w:type="gramEnd"/>
+      <w:r>
+        <w:rPr>
+          <w:rFonts w:ascii="Arial" w:hAnsi="Arial" w:cs="Arial"/>
+          <w:b/>
+          <w:sz w:val="26"/>
+          <w:szCs w:val="26"/>
+          <w:lang w:val="en-US"/>
+        </w:rPr>
+        <w:t xml:space="preserve"> {{</w:t>
       </w:r>
       <w:proofErr w:type="spellStart"/>
       <w:r>
@@ -7273,6 +7966,8 @@
         </w:rPr>
         <w:tab/>
       </w:r>
+      <w:proofErr w:type="spellStart"/>
+      <w:proofErr w:type="gramStart"/>
       <w:r>
         <w:rPr>
           <w:rFonts w:ascii="Arial" w:eastAsia="Calibri" w:hAnsi="Arial" w:cs="Arial"/>
@@ -7283,6 +7978,7 @@
         </w:rPr>
         <w:t>Objectif</w:t>
       </w:r>
+      <w:proofErr w:type="spellEnd"/>
       <w:r>
         <w:rPr>
           <w:rFonts w:ascii="Arial" w:hAnsi="Arial" w:cs="Arial"/>
@@ -7293,6 +7989,7 @@
         </w:rPr>
         <w:t xml:space="preserve"> :</w:t>
       </w:r>
+      <w:proofErr w:type="gramEnd"/>
       <w:r>
         <w:rPr>
           <w:rFonts w:ascii="Arial" w:hAnsi="Arial" w:cs="Arial"/>
@@ -7343,6 +8040,7 @@
         <w:tab/>
       </w:r>
       <w:proofErr w:type="spellStart"/>
+      <w:proofErr w:type="gramStart"/>
       <w:r>
         <w:rPr>
           <w:rFonts w:ascii="Arial" w:eastAsia="Calibri" w:hAnsi="Arial" w:cs="Arial"/>
@@ -7364,6 +8062,7 @@
         </w:rPr>
         <w:t xml:space="preserve"> :</w:t>
       </w:r>
+      <w:proofErr w:type="gramEnd"/>
       <w:r>
         <w:rPr>
           <w:rFonts w:ascii="Arial" w:hAnsi="Arial" w:cs="Arial"/>
@@ -8076,7 +8775,16 @@
           <w:sz w:val="26"/>
           <w:szCs w:val="26"/>
         </w:rPr>
-        <w:t xml:space="preserve"> {{</w:t>
+        <w:t xml:space="preserve"> {</w:t>
+      </w:r>
+      <w:proofErr w:type="gramStart"/>
+      <w:r>
+        <w:rPr>
+          <w:rFonts w:ascii="Arial" w:hAnsi="Arial" w:cs="Arial"/>
+          <w:sz w:val="26"/>
+          <w:szCs w:val="26"/>
+        </w:rPr>
+        <w:t>{</w:t>
       </w:r>
       <w:r>
         <w:rPr>
@@ -8100,7 +8808,16 @@
           <w:sz w:val="26"/>
           <w:szCs w:val="26"/>
         </w:rPr>
-        <w:t xml:space="preserve">name </w:t>
+        <w:t>name</w:t>
+      </w:r>
+      <w:proofErr w:type="gramEnd"/>
+      <w:r>
+        <w:rPr>
+          <w:rFonts w:ascii="Arial" w:hAnsi="Arial" w:cs="Arial"/>
+          <w:sz w:val="26"/>
+          <w:szCs w:val="26"/>
+        </w:rPr>
+        <w:t xml:space="preserve"> </w:t>
       </w:r>
       <w:r>
         <w:rPr>
@@ -9171,7 +9888,16 @@
           <w:sz w:val="26"/>
           <w:szCs w:val="26"/>
         </w:rPr>
-        <w:t xml:space="preserve"> {{</w:t>
+        <w:t xml:space="preserve"> {</w:t>
+      </w:r>
+      <w:proofErr w:type="gramStart"/>
+      <w:r>
+        <w:rPr>
+          <w:rFonts w:ascii="Arial" w:hAnsi="Arial" w:cs="Arial"/>
+          <w:sz w:val="26"/>
+          <w:szCs w:val="26"/>
+        </w:rPr>
+        <w:t>{</w:t>
       </w:r>
       <w:r>
         <w:rPr>
@@ -9195,7 +9921,16 @@
           <w:sz w:val="26"/>
           <w:szCs w:val="26"/>
         </w:rPr>
-        <w:t xml:space="preserve">name </w:t>
+        <w:t>name</w:t>
+      </w:r>
+      <w:proofErr w:type="gramEnd"/>
+      <w:r>
+        <w:rPr>
+          <w:rFonts w:ascii="Arial" w:hAnsi="Arial" w:cs="Arial"/>
+          <w:sz w:val="26"/>
+          <w:szCs w:val="26"/>
+        </w:rPr>
+        <w:t xml:space="preserve"> </w:t>
       </w:r>
       <w:r>
         <w:rPr>
@@ -10109,7 +10844,18 @@
           <w:szCs w:val="26"/>
           <w:highlight w:val="yellow"/>
         </w:rPr>
-        <w:t xml:space="preserve">{{ </w:t>
+        <w:t>{</w:t>
+      </w:r>
+      <w:proofErr w:type="gramStart"/>
+      <w:r>
+        <w:rPr>
+          <w:rFonts w:ascii="Arial" w:hAnsi="Arial" w:cs="Arial"/>
+          <w:color w:val="000000" w:themeColor="text1"/>
+          <w:sz w:val="26"/>
+          <w:szCs w:val="26"/>
+          <w:highlight w:val="yellow"/>
+        </w:rPr>
+        <w:t xml:space="preserve">{ </w:t>
       </w:r>
       <w:proofErr w:type="spellStart"/>
       <w:r>
@@ -10123,6 +10869,7 @@
         <w:t>etude.dateLancement</w:t>
       </w:r>
       <w:proofErr w:type="spellEnd"/>
+      <w:proofErr w:type="gramEnd"/>
       <w:r>
         <w:rPr>
           <w:rFonts w:ascii="Arial" w:hAnsi="Arial" w:cs="Arial"/>
@@ -10162,9 +10909,9 @@
           <w:szCs w:val="26"/>
           <w:highlight w:val="yellow"/>
         </w:rPr>
-        <w:t xml:space="preserve">{{ </w:t>
-      </w:r>
-      <w:proofErr w:type="spellStart"/>
+        <w:t>{</w:t>
+      </w:r>
+      <w:proofErr w:type="gramStart"/>
       <w:r>
         <w:rPr>
           <w:rFonts w:ascii="Arial" w:hAnsi="Arial" w:cs="Arial"/>
@@ -10174,9 +10921,22 @@
           <w:szCs w:val="26"/>
           <w:highlight w:val="yellow"/>
         </w:rPr>
+        <w:t xml:space="preserve">{ </w:t>
+      </w:r>
+      <w:proofErr w:type="spellStart"/>
+      <w:r>
+        <w:rPr>
+          <w:rFonts w:ascii="Arial" w:hAnsi="Arial" w:cs="Arial"/>
+          <w:bCs/>
+          <w:color w:val="000000" w:themeColor="text1"/>
+          <w:sz w:val="26"/>
+          <w:szCs w:val="26"/>
+          <w:highlight w:val="yellow"/>
+        </w:rPr>
         <w:t>etude.dateFin</w:t>
       </w:r>
       <w:proofErr w:type="spellEnd"/>
+      <w:proofErr w:type="gramEnd"/>
       <w:r>
         <w:rPr>
           <w:rFonts w:ascii="Arial" w:hAnsi="Arial" w:cs="Arial"/>
@@ -10220,7 +10980,7 @@
                     <pic:cNvPicPr/>
                   </pic:nvPicPr>
                   <pic:blipFill>
-                    <a:blip r:embed="rId12">
+                    <a:blip r:embed="rId11">
                       <a:extLst>
                         <a:ext uri="{28A0092B-C50C-407E-A947-70E740481C1C}">
                           <a14:useLocalDpi xmlns:a14="http://schemas.microsoft.com/office/drawing/2010/main" val="0"/>
@@ -10273,9 +11033,9 @@
           <w:szCs w:val="26"/>
           <w:highlight w:val="yellow"/>
         </w:rPr>
-        <w:t xml:space="preserve">{{ </w:t>
-      </w:r>
-      <w:proofErr w:type="spellStart"/>
+        <w:t>{</w:t>
+      </w:r>
+      <w:proofErr w:type="gramStart"/>
       <w:r>
         <w:rPr>
           <w:rFonts w:ascii="Arial" w:hAnsi="Arial" w:cs="Arial"/>
@@ -10285,9 +11045,22 @@
           <w:szCs w:val="26"/>
           <w:highlight w:val="yellow"/>
         </w:rPr>
+        <w:t xml:space="preserve">{ </w:t>
+      </w:r>
+      <w:proofErr w:type="spellStart"/>
+      <w:r>
+        <w:rPr>
+          <w:rFonts w:ascii="Arial" w:hAnsi="Arial" w:cs="Arial"/>
+          <w:i/>
+          <w:color w:val="000000" w:themeColor="text1"/>
+          <w:sz w:val="26"/>
+          <w:szCs w:val="26"/>
+          <w:highlight w:val="yellow"/>
+        </w:rPr>
         <w:t>gantt</w:t>
       </w:r>
       <w:proofErr w:type="spellEnd"/>
+      <w:proofErr w:type="gramEnd"/>
       <w:r>
         <w:rPr>
           <w:rFonts w:ascii="Arial" w:hAnsi="Arial" w:cs="Arial"/>
@@ -11869,6 +12642,7 @@
                 <w:color w:val="FFFFFF" w:themeColor="background1"/>
                 <w:sz w:val="26"/>
                 <w:szCs w:val="26"/>
+                <w:lang w:val="en-GB"/>
               </w:rPr>
             </w:pPr>
             <w:r>
@@ -11879,6 +12653,7 @@
                 <w:color w:val="FFFFFF" w:themeColor="background1"/>
                 <w:sz w:val="26"/>
                 <w:szCs w:val="26"/>
+                <w:lang w:val="en-GB"/>
               </w:rPr>
               <w:t>{%</w:t>
             </w:r>
@@ -11890,6 +12665,7 @@
                 <w:color w:val="FFFFFF" w:themeColor="background1"/>
                 <w:sz w:val="26"/>
                 <w:szCs w:val="26"/>
+                <w:lang w:val="en-GB"/>
               </w:rPr>
               <w:t xml:space="preserve"> </w:t>
             </w:r>
@@ -11901,8 +12677,9 @@
                 <w:color w:val="FFFFFF" w:themeColor="background1"/>
                 <w:sz w:val="26"/>
                 <w:szCs w:val="26"/>
-              </w:rPr>
-              <w:t xml:space="preserve">for groupe in </w:t>
+                <w:lang w:val="en-GB"/>
+              </w:rPr>
+              <w:t xml:space="preserve">for </w:t>
             </w:r>
             <w:proofErr w:type="spellStart"/>
             <w:r>
@@ -11913,9 +12690,11 @@
                 <w:color w:val="FFFFFF" w:themeColor="background1"/>
                 <w:sz w:val="26"/>
                 <w:szCs w:val="26"/>
-              </w:rPr>
-              <w:t>etude.groupe</w:t>
-            </w:r>
+                <w:lang w:val="en-GB"/>
+              </w:rPr>
+              <w:t>groupe</w:t>
+            </w:r>
+            <w:proofErr w:type="spellEnd"/>
             <w:r>
               <w:rPr>
                 <w:rFonts w:ascii="Arial" w:hAnsi="Arial" w:cs="Arial"/>
@@ -11924,10 +12703,11 @@
                 <w:color w:val="FFFFFF" w:themeColor="background1"/>
                 <w:sz w:val="26"/>
                 <w:szCs w:val="26"/>
-              </w:rPr>
-              <w:t>_set.iterator</w:t>
-            </w:r>
-            <w:proofErr w:type="spellEnd"/>
+                <w:lang w:val="en-GB"/>
+              </w:rPr>
+              <w:t xml:space="preserve"> in </w:t>
+            </w:r>
+            <w:proofErr w:type="spellStart"/>
             <w:r>
               <w:rPr>
                 <w:rFonts w:ascii="Arial" w:hAnsi="Arial" w:cs="Arial"/>
@@ -11936,10 +12716,10 @@
                 <w:color w:val="FFFFFF" w:themeColor="background1"/>
                 <w:sz w:val="26"/>
                 <w:szCs w:val="26"/>
-              </w:rPr>
-              <w:t>() | sort(</w:t>
-            </w:r>
-            <w:proofErr w:type="spellStart"/>
+                <w:lang w:val="en-GB"/>
+              </w:rPr>
+              <w:t>etude.groupe</w:t>
+            </w:r>
             <w:r>
               <w:rPr>
                 <w:rFonts w:ascii="Arial" w:hAnsi="Arial" w:cs="Arial"/>
@@ -11948,8 +12728,9 @@
                 <w:color w:val="FFFFFF" w:themeColor="background1"/>
                 <w:sz w:val="26"/>
                 <w:szCs w:val="26"/>
-              </w:rPr>
-              <w:t>attribute</w:t>
+                <w:lang w:val="en-GB"/>
+              </w:rPr>
+              <w:t>_set.iterator</w:t>
             </w:r>
             <w:proofErr w:type="spellEnd"/>
             <w:r>
@@ -11960,8 +12741,9 @@
                 <w:color w:val="FFFFFF" w:themeColor="background1"/>
                 <w:sz w:val="26"/>
                 <w:szCs w:val="26"/>
-              </w:rPr>
-              <w:t>=’index’)</w:t>
+                <w:lang w:val="en-GB"/>
+              </w:rPr>
+              <w:t>() | sort(attribute=’index’)</w:t>
             </w:r>
             <w:r>
               <w:rPr>
@@ -11971,6 +12753,7 @@
                 <w:color w:val="FFFFFF" w:themeColor="background1"/>
                 <w:sz w:val="26"/>
                 <w:szCs w:val="26"/>
+                <w:lang w:val="en-GB"/>
               </w:rPr>
               <w:t xml:space="preserve"> %} Phase {{</w:t>
             </w:r>
@@ -11983,6 +12766,7 @@
                 <w:color w:val="FFFFFF" w:themeColor="background1"/>
                 <w:sz w:val="26"/>
                 <w:szCs w:val="26"/>
+                <w:lang w:val="en-GB"/>
               </w:rPr>
               <w:t>loop.index</w:t>
             </w:r>
@@ -11995,6 +12779,7 @@
                 <w:color w:val="FFFFFF" w:themeColor="background1"/>
                 <w:sz w:val="26"/>
                 <w:szCs w:val="26"/>
+                <w:lang w:val="en-GB"/>
               </w:rPr>
               <w:t xml:space="preserve">}} : {{ </w:t>
             </w:r>
@@ -12007,6 +12792,7 @@
                 <w:color w:val="FFFFFF" w:themeColor="background1"/>
                 <w:sz w:val="26"/>
                 <w:szCs w:val="26"/>
+                <w:lang w:val="en-GB"/>
               </w:rPr>
               <w:t>groupe.tit</w:t>
             </w:r>
@@ -12018,6 +12804,7 @@
                 <w:color w:val="FFFFFF" w:themeColor="background1"/>
                 <w:sz w:val="26"/>
                 <w:szCs w:val="26"/>
+                <w:lang w:val="en-GB"/>
               </w:rPr>
               <w:t>l</w:t>
             </w:r>
@@ -12029,6 +12816,7 @@
                 <w:color w:val="FFFFFF" w:themeColor="background1"/>
                 <w:sz w:val="26"/>
                 <w:szCs w:val="26"/>
+                <w:lang w:val="en-GB"/>
               </w:rPr>
               <w:t>e</w:t>
             </w:r>
@@ -12041,6 +12829,7 @@
                 <w:color w:val="FFFFFF" w:themeColor="background1"/>
                 <w:sz w:val="26"/>
                 <w:szCs w:val="26"/>
+                <w:lang w:val="en-GB"/>
               </w:rPr>
               <w:t xml:space="preserve"> }}</w:t>
             </w:r>
@@ -12222,24 +13011,25 @@
                 <w:sz w:val="26"/>
                 <w:szCs w:val="26"/>
               </w:rPr>
-              <w:t xml:space="preserve">{{ </w:t>
-            </w:r>
-            <w:proofErr w:type="spellStart"/>
+              <w:t>{</w:t>
+            </w:r>
+            <w:proofErr w:type="gramStart"/>
             <w:r>
               <w:rPr>
                 <w:rFonts w:ascii="Arial" w:hAnsi="Arial" w:cs="Arial"/>
                 <w:sz w:val="26"/>
                 <w:szCs w:val="26"/>
               </w:rPr>
-              <w:t>phase.pr</w:t>
-            </w:r>
+              <w:t xml:space="preserve">{ </w:t>
+            </w:r>
+            <w:proofErr w:type="spellStart"/>
             <w:r>
               <w:rPr>
                 <w:rFonts w:ascii="Arial" w:hAnsi="Arial" w:cs="Arial"/>
                 <w:sz w:val="26"/>
                 <w:szCs w:val="26"/>
               </w:rPr>
-              <w:t>ice</w:t>
+              <w:t>phase.pr</w:t>
             </w:r>
             <w:r>
               <w:rPr>
@@ -12247,9 +13037,18 @@
                 <w:sz w:val="26"/>
                 <w:szCs w:val="26"/>
               </w:rPr>
+              <w:t>ice</w:t>
+            </w:r>
+            <w:r>
+              <w:rPr>
+                <w:rFonts w:ascii="Arial" w:hAnsi="Arial" w:cs="Arial"/>
+                <w:sz w:val="26"/>
+                <w:szCs w:val="26"/>
+              </w:rPr>
               <w:t>JEH</w:t>
             </w:r>
             <w:proofErr w:type="spellEnd"/>
+            <w:proofErr w:type="gramEnd"/>
             <w:r>
               <w:rPr>
                 <w:rFonts w:ascii="Arial" w:hAnsi="Arial" w:cs="Arial"/>
@@ -12282,26 +13081,36 @@
                 <w:sz w:val="26"/>
                 <w:szCs w:val="26"/>
               </w:rPr>
-              <w:t xml:space="preserve">{{ </w:t>
-            </w:r>
-            <w:proofErr w:type="spellStart"/>
+              <w:t>{</w:t>
+            </w:r>
+            <w:proofErr w:type="gramStart"/>
             <w:r>
               <w:rPr>
                 <w:rFonts w:ascii="Arial" w:hAnsi="Arial" w:cs="Arial"/>
                 <w:sz w:val="26"/>
                 <w:szCs w:val="26"/>
               </w:rPr>
-              <w:t>phase.</w:t>
-            </w:r>
+              <w:t xml:space="preserve">{ </w:t>
+            </w:r>
+            <w:proofErr w:type="spellStart"/>
             <w:r>
               <w:rPr>
                 <w:rFonts w:ascii="Arial" w:hAnsi="Arial" w:cs="Arial"/>
                 <w:sz w:val="26"/>
                 <w:szCs w:val="26"/>
               </w:rPr>
+              <w:t>phase.</w:t>
+            </w:r>
+            <w:r>
+              <w:rPr>
+                <w:rFonts w:ascii="Arial" w:hAnsi="Arial" w:cs="Arial"/>
+                <w:sz w:val="26"/>
+                <w:szCs w:val="26"/>
+              </w:rPr>
               <w:t>totalPrice</w:t>
             </w:r>
             <w:proofErr w:type="spellEnd"/>
+            <w:proofErr w:type="gramEnd"/>
             <w:r>
               <w:rPr>
                 <w:rFonts w:ascii="Arial" w:hAnsi="Arial" w:cs="Arial"/>
@@ -12416,9 +13225,9 @@
                 <w:sz w:val="26"/>
                 <w:szCs w:val="26"/>
               </w:rPr>
-              <w:t xml:space="preserve">{{ </w:t>
-            </w:r>
-            <w:proofErr w:type="spellStart"/>
+              <w:t>{</w:t>
+            </w:r>
+            <w:proofErr w:type="gramStart"/>
             <w:r>
               <w:rPr>
                 <w:rFonts w:ascii="Arial" w:hAnsi="Arial" w:cs="Arial"/>
@@ -12427,8 +13236,9 @@
                 <w:sz w:val="26"/>
                 <w:szCs w:val="26"/>
               </w:rPr>
-              <w:t>groupe.</w:t>
-            </w:r>
+              <w:t xml:space="preserve">{ </w:t>
+            </w:r>
+            <w:proofErr w:type="spellStart"/>
             <w:r>
               <w:rPr>
                 <w:rFonts w:ascii="Arial" w:hAnsi="Arial" w:cs="Arial"/>
@@ -12437,7 +13247,7 @@
                 <w:sz w:val="26"/>
                 <w:szCs w:val="26"/>
               </w:rPr>
-              <w:t>n</w:t>
+              <w:t>groupe.</w:t>
             </w:r>
             <w:r>
               <w:rPr>
@@ -12447,7 +13257,7 @@
                 <w:sz w:val="26"/>
                 <w:szCs w:val="26"/>
               </w:rPr>
-              <w:t>b</w:t>
+              <w:t>n</w:t>
             </w:r>
             <w:r>
               <w:rPr>
@@ -12457,9 +13267,20 @@
                 <w:sz w:val="26"/>
                 <w:szCs w:val="26"/>
               </w:rPr>
+              <w:t>b</w:t>
+            </w:r>
+            <w:r>
+              <w:rPr>
+                <w:rFonts w:ascii="Arial" w:hAnsi="Arial" w:cs="Arial"/>
+                <w:b/>
+                <w:bCs/>
+                <w:sz w:val="26"/>
+                <w:szCs w:val="26"/>
+              </w:rPr>
               <w:t>JEH</w:t>
             </w:r>
             <w:proofErr w:type="spellEnd"/>
+            <w:proofErr w:type="gramEnd"/>
             <w:r>
               <w:rPr>
                 <w:rFonts w:ascii="Arial" w:hAnsi="Arial" w:cs="Arial"/>
@@ -12514,9 +13335,9 @@
                 <w:sz w:val="26"/>
                 <w:szCs w:val="26"/>
               </w:rPr>
-              <w:t xml:space="preserve">{{ </w:t>
-            </w:r>
-            <w:proofErr w:type="spellStart"/>
+              <w:t>{</w:t>
+            </w:r>
+            <w:proofErr w:type="gramStart"/>
             <w:r>
               <w:rPr>
                 <w:rFonts w:ascii="Arial" w:hAnsi="Arial" w:cs="Arial"/>
@@ -12525,9 +13346,21 @@
                 <w:sz w:val="26"/>
                 <w:szCs w:val="26"/>
               </w:rPr>
+              <w:t xml:space="preserve">{ </w:t>
+            </w:r>
+            <w:proofErr w:type="spellStart"/>
+            <w:r>
+              <w:rPr>
+                <w:rFonts w:ascii="Arial" w:hAnsi="Arial" w:cs="Arial"/>
+                <w:b/>
+                <w:bCs/>
+                <w:sz w:val="26"/>
+                <w:szCs w:val="26"/>
+              </w:rPr>
               <w:t>groupe.totalPrice</w:t>
             </w:r>
             <w:proofErr w:type="spellEnd"/>
+            <w:proofErr w:type="gramEnd"/>
             <w:r>
               <w:rPr>
                 <w:rFonts w:ascii="Arial" w:hAnsi="Arial" w:cs="Arial"/>
@@ -12828,6 +13661,7 @@
               <w:t>{{</w:t>
             </w:r>
             <w:proofErr w:type="spellStart"/>
+            <w:proofErr w:type="gramStart"/>
             <w:r>
               <w:rPr>
                 <w:rFonts w:ascii="Arial" w:hAnsi="Arial" w:cs="Arial"/>
@@ -12871,7 +13705,19 @@
                 <w:sz w:val="26"/>
                 <w:szCs w:val="26"/>
               </w:rPr>
-              <w:t>}}</w:t>
+              <w:t>}</w:t>
+            </w:r>
+            <w:proofErr w:type="gramEnd"/>
+            <w:r>
+              <w:rPr>
+                <w:rFonts w:ascii="Arial" w:hAnsi="Arial" w:cs="Arial"/>
+                <w:b/>
+                <w:bCs/>
+                <w:color w:val="FFFFFF" w:themeColor="background1"/>
+                <w:sz w:val="26"/>
+                <w:szCs w:val="26"/>
+              </w:rPr>
+              <w:t>}</w:t>
             </w:r>
             <w:r>
               <w:rPr>
@@ -12952,9 +13798,9 @@
                 <w:sz w:val="26"/>
                 <w:szCs w:val="26"/>
               </w:rPr>
-              <w:t xml:space="preserve">{{ </w:t>
-            </w:r>
-            <w:proofErr w:type="spellStart"/>
+              <w:t>{</w:t>
+            </w:r>
+            <w:proofErr w:type="gramStart"/>
             <w:r>
               <w:rPr>
                 <w:rFonts w:ascii="Arial" w:hAnsi="Arial" w:cs="Arial"/>
@@ -12963,8 +13809,9 @@
                 <w:sz w:val="26"/>
                 <w:szCs w:val="26"/>
               </w:rPr>
-              <w:t>etude.</w:t>
-            </w:r>
+              <w:t xml:space="preserve">{ </w:t>
+            </w:r>
+            <w:proofErr w:type="spellStart"/>
             <w:r>
               <w:rPr>
                 <w:rFonts w:ascii="Arial" w:hAnsi="Arial" w:cs="Arial"/>
@@ -12973,7 +13820,28 @@
                 <w:sz w:val="26"/>
                 <w:szCs w:val="26"/>
               </w:rPr>
-              <w:t>application_fees</w:t>
+              <w:t>etude.</w:t>
+            </w:r>
+            <w:r>
+              <w:rPr>
+                <w:rFonts w:ascii="Arial" w:hAnsi="Arial" w:cs="Arial"/>
+                <w:b/>
+                <w:bCs/>
+                <w:sz w:val="26"/>
+                <w:szCs w:val="26"/>
+              </w:rPr>
+              <w:t>application</w:t>
+            </w:r>
+            <w:proofErr w:type="gramEnd"/>
+            <w:r>
+              <w:rPr>
+                <w:rFonts w:ascii="Arial" w:hAnsi="Arial" w:cs="Arial"/>
+                <w:b/>
+                <w:bCs/>
+                <w:sz w:val="26"/>
+                <w:szCs w:val="26"/>
+              </w:rPr>
+              <w:t>_fees</w:t>
             </w:r>
             <w:proofErr w:type="spellEnd"/>
             <w:r>
@@ -13017,6 +13885,7 @@
                 <w:rFonts w:ascii="Arial" w:hAnsi="Arial" w:cs="Arial"/>
                 <w:sz w:val="26"/>
                 <w:szCs w:val="26"/>
+                <w:lang w:val="en-GB"/>
               </w:rPr>
             </w:pPr>
             <w:r>
@@ -13024,6 +13893,7 @@
                 <w:rFonts w:ascii="Arial" w:hAnsi="Arial" w:cs="Arial"/>
                 <w:sz w:val="26"/>
                 <w:szCs w:val="26"/>
+                <w:lang w:val="en-GB"/>
               </w:rPr>
               <w:t xml:space="preserve">{{ </w:t>
             </w:r>
@@ -13033,6 +13903,7 @@
                 <w:rFonts w:ascii="Arial" w:hAnsi="Arial" w:cs="Arial"/>
                 <w:sz w:val="26"/>
                 <w:szCs w:val="26"/>
+                <w:lang w:val="en-GB"/>
               </w:rPr>
               <w:t>etude.</w:t>
             </w:r>
@@ -13041,6 +13912,7 @@
                 <w:rFonts w:ascii="Arial" w:hAnsi="Arial" w:cs="Arial"/>
                 <w:sz w:val="26"/>
                 <w:szCs w:val="26"/>
+                <w:lang w:val="en-GB"/>
               </w:rPr>
               <w:t>application_fees</w:t>
             </w:r>
@@ -13050,6 +13922,7 @@
                 <w:rFonts w:ascii="Arial" w:hAnsi="Arial" w:cs="Arial"/>
                 <w:sz w:val="26"/>
                 <w:szCs w:val="26"/>
+                <w:lang w:val="en-GB"/>
               </w:rPr>
               <w:t xml:space="preserve"> | </w:t>
             </w:r>
@@ -13059,6 +13932,7 @@
                 <w:rFonts w:ascii="Arial" w:hAnsi="Arial" w:cs="Arial"/>
                 <w:sz w:val="26"/>
                 <w:szCs w:val="26"/>
+                <w:lang w:val="en-GB"/>
               </w:rPr>
               <w:t>nbrToLetters</w:t>
             </w:r>
@@ -13068,6 +13942,7 @@
                 <w:rFonts w:ascii="Arial" w:hAnsi="Arial" w:cs="Arial"/>
                 <w:sz w:val="26"/>
                 <w:szCs w:val="26"/>
+                <w:lang w:val="en-GB"/>
               </w:rPr>
               <w:t>() }} HT</w:t>
             </w:r>
@@ -13127,6 +14002,7 @@
                 <w:color w:val="FFFFFF" w:themeColor="background1"/>
                 <w:sz w:val="26"/>
                 <w:szCs w:val="26"/>
+                <w:lang w:val="en-GB"/>
               </w:rPr>
             </w:pPr>
             <w:r>
@@ -13137,6 +14013,7 @@
                 <w:color w:val="FFFFFF" w:themeColor="background1"/>
                 <w:sz w:val="26"/>
                 <w:szCs w:val="26"/>
+                <w:lang w:val="en-GB"/>
               </w:rPr>
               <w:t xml:space="preserve">{{ </w:t>
             </w:r>
@@ -13149,6 +14026,7 @@
                 <w:color w:val="FFFFFF" w:themeColor="background1"/>
                 <w:sz w:val="26"/>
                 <w:szCs w:val="26"/>
+                <w:lang w:val="en-GB"/>
               </w:rPr>
               <w:t>etude.totalPrice</w:t>
             </w:r>
@@ -13161,6 +14039,7 @@
                 <w:color w:val="FFFFFF" w:themeColor="background1"/>
                 <w:sz w:val="26"/>
                 <w:szCs w:val="26"/>
+                <w:lang w:val="en-GB"/>
               </w:rPr>
               <w:t xml:space="preserve"> + </w:t>
             </w:r>
@@ -13173,6 +14052,7 @@
                 <w:color w:val="FFFFFF" w:themeColor="background1"/>
                 <w:sz w:val="26"/>
                 <w:szCs w:val="26"/>
+                <w:lang w:val="en-GB"/>
               </w:rPr>
               <w:t>etude.application_fees</w:t>
             </w:r>
@@ -13185,6 +14065,7 @@
                 <w:color w:val="FFFFFF" w:themeColor="background1"/>
                 <w:sz w:val="26"/>
                 <w:szCs w:val="26"/>
+                <w:lang w:val="en-GB"/>
               </w:rPr>
               <w:t xml:space="preserve"> }} € HT</w:t>
             </w:r>
@@ -13212,6 +14093,7 @@
                 <w:bCs/>
                 <w:sz w:val="26"/>
                 <w:szCs w:val="26"/>
+                <w:lang w:val="en-GB"/>
               </w:rPr>
             </w:pPr>
             <w:r>
@@ -13222,6 +14104,7 @@
                 <w:color w:val="FFFFFF" w:themeColor="background1"/>
                 <w:sz w:val="26"/>
                 <w:szCs w:val="26"/>
+                <w:lang w:val="en-GB"/>
               </w:rPr>
               <w:t xml:space="preserve">{{ </w:t>
             </w:r>
@@ -13233,6 +14116,7 @@
                 <w:color w:val="FFFFFF" w:themeColor="background1"/>
                 <w:sz w:val="26"/>
                 <w:szCs w:val="26"/>
+                <w:lang w:val="en-GB"/>
               </w:rPr>
               <w:t>(</w:t>
             </w:r>
@@ -13245,6 +14129,7 @@
                 <w:color w:val="FFFFFF" w:themeColor="background1"/>
                 <w:sz w:val="26"/>
                 <w:szCs w:val="26"/>
+                <w:lang w:val="en-GB"/>
               </w:rPr>
               <w:t>etude.</w:t>
             </w:r>
@@ -13256,6 +14141,7 @@
                 <w:color w:val="FFFFFF" w:themeColor="background1"/>
                 <w:sz w:val="26"/>
                 <w:szCs w:val="26"/>
+                <w:lang w:val="en-GB"/>
               </w:rPr>
               <w:t>totalPrice</w:t>
             </w:r>
@@ -13268,6 +14154,7 @@
                 <w:color w:val="FFFFFF" w:themeColor="background1"/>
                 <w:sz w:val="26"/>
                 <w:szCs w:val="26"/>
+                <w:lang w:val="en-GB"/>
               </w:rPr>
               <w:t xml:space="preserve"> + </w:t>
             </w:r>
@@ -13280,6 +14167,7 @@
                 <w:color w:val="FFFFFF" w:themeColor="background1"/>
                 <w:sz w:val="26"/>
                 <w:szCs w:val="26"/>
+                <w:lang w:val="en-GB"/>
               </w:rPr>
               <w:t>etude.application_fees</w:t>
             </w:r>
@@ -13292,6 +14180,7 @@
                 <w:color w:val="FFFFFF" w:themeColor="background1"/>
                 <w:sz w:val="26"/>
                 <w:szCs w:val="26"/>
+                <w:lang w:val="en-GB"/>
               </w:rPr>
               <w:t>)</w:t>
             </w:r>
@@ -13303,6 +14192,7 @@
                 <w:color w:val="FFFFFF" w:themeColor="background1"/>
                 <w:sz w:val="26"/>
                 <w:szCs w:val="26"/>
+                <w:lang w:val="en-GB"/>
               </w:rPr>
               <w:t xml:space="preserve"> | </w:t>
             </w:r>
@@ -13315,6 +14205,7 @@
                 <w:color w:val="FFFFFF" w:themeColor="background1"/>
                 <w:sz w:val="26"/>
                 <w:szCs w:val="26"/>
+                <w:lang w:val="en-GB"/>
               </w:rPr>
               <w:t>nbrToLetters</w:t>
             </w:r>
@@ -13327,6 +14218,7 @@
                 <w:color w:val="FFFFFF" w:themeColor="background1"/>
                 <w:sz w:val="26"/>
                 <w:szCs w:val="26"/>
+                <w:lang w:val="en-GB"/>
               </w:rPr>
               <w:t xml:space="preserve">() }} </w:t>
             </w:r>
@@ -13338,6 +14230,7 @@
                 <w:color w:val="FFFFFF"/>
                 <w:sz w:val="26"/>
                 <w:szCs w:val="26"/>
+                <w:lang w:val="en-GB"/>
               </w:rPr>
               <w:t>HT</w:t>
             </w:r>
@@ -13951,7 +14844,6 @@
                 <w:b/>
                 <w:sz w:val="26"/>
                 <w:szCs w:val="26"/>
-                <w:lang w:val="en-US"/>
               </w:rPr>
             </w:pPr>
             <w:r>
@@ -13961,11 +14853,10 @@
                 <w:bCs/>
                 <w:sz w:val="26"/>
                 <w:szCs w:val="26"/>
-                <w:lang w:val="en-US"/>
-              </w:rPr>
-              <w:t xml:space="preserve">{{ </w:t>
-            </w:r>
-            <w:proofErr w:type="spellStart"/>
+              </w:rPr>
+              <w:t>{</w:t>
+            </w:r>
+            <w:proofErr w:type="gramStart"/>
             <w:r>
               <w:rPr>
                 <w:rFonts w:ascii="Arial" w:hAnsi="Arial" w:cs="Arial"/>
@@ -13973,11 +14864,10 @@
                 <w:bCs/>
                 <w:sz w:val="26"/>
                 <w:szCs w:val="26"/>
-                <w:lang w:val="en-US"/>
-              </w:rPr>
-              <w:t>etude.totalPriceTaxes</w:t>
-            </w:r>
-            <w:proofErr w:type="spellEnd"/>
+              </w:rPr>
+              <w:t xml:space="preserve">{ </w:t>
+            </w:r>
+            <w:proofErr w:type="spellStart"/>
             <w:r>
               <w:rPr>
                 <w:rFonts w:ascii="Arial" w:hAnsi="Arial" w:cs="Arial"/>
@@ -13985,17 +14875,28 @@
                 <w:bCs/>
                 <w:sz w:val="26"/>
                 <w:szCs w:val="26"/>
-                <w:lang w:val="en-US"/>
+              </w:rPr>
+              <w:t>etude.totalPriceTaxes</w:t>
+            </w:r>
+            <w:proofErr w:type="spellEnd"/>
+            <w:proofErr w:type="gramEnd"/>
+            <w:r>
+              <w:rPr>
+                <w:rFonts w:ascii="Arial" w:hAnsi="Arial" w:cs="Arial"/>
+                <w:b/>
+                <w:bCs/>
+                <w:sz w:val="26"/>
+                <w:szCs w:val="26"/>
               </w:rPr>
               <w:t xml:space="preserve"> }}</w:t>
             </w:r>
+            <w:proofErr w:type="gramStart"/>
             <w:r>
               <w:rPr>
                 <w:rFonts w:ascii="Arial" w:eastAsia="Calibri" w:hAnsi="Arial" w:cs="Arial"/>
                 <w:b/>
                 <w:sz w:val="26"/>
                 <w:szCs w:val="26"/>
-                <w:lang w:val="en-US"/>
               </w:rPr>
               <w:t>€</w:t>
             </w:r>
@@ -14004,7 +14905,15 @@
                 <w:rFonts w:ascii="Arial" w:hAnsi="Arial" w:cs="Arial"/>
                 <w:sz w:val="24"/>
               </w:rPr>
-              <w:t xml:space="preserve">{% if </w:t>
+              <w:t>{</w:t>
+            </w:r>
+            <w:proofErr w:type="gramEnd"/>
+            <w:r>
+              <w:rPr>
+                <w:rFonts w:ascii="Arial" w:hAnsi="Arial" w:cs="Arial"/>
+                <w:sz w:val="24"/>
+              </w:rPr>
+              <w:t xml:space="preserve">% if </w:t>
             </w:r>
             <w:proofErr w:type="spellStart"/>
             <w:r>
@@ -14142,8 +15051,9 @@
                 <w:bCs/>
                 <w:sz w:val="24"/>
               </w:rPr>
-              <w:t>{{</w:t>
-            </w:r>
+              <w:t>{</w:t>
+            </w:r>
+            <w:proofErr w:type="gramStart"/>
             <w:r>
               <w:rPr>
                 <w:rFonts w:ascii="Arial" w:hAnsi="Arial" w:cs="Arial"/>
@@ -14151,9 +15061,8 @@
                 <w:bCs/>
                 <w:sz w:val="24"/>
               </w:rPr>
-              <w:t xml:space="preserve"> </w:t>
-            </w:r>
-            <w:proofErr w:type="spellStart"/>
+              <w:t>{</w:t>
+            </w:r>
             <w:r>
               <w:rPr>
                 <w:rFonts w:ascii="Arial" w:hAnsi="Arial" w:cs="Arial"/>
@@ -14161,9 +15070,20 @@
                 <w:bCs/>
                 <w:sz w:val="24"/>
               </w:rPr>
+              <w:t xml:space="preserve"> </w:t>
+            </w:r>
+            <w:proofErr w:type="spellStart"/>
+            <w:r>
+              <w:rPr>
+                <w:rFonts w:ascii="Arial" w:hAnsi="Arial" w:cs="Arial"/>
+                <w:b/>
+                <w:bCs/>
+                <w:sz w:val="24"/>
+              </w:rPr>
               <w:t>etude.ce.depositAmount</w:t>
             </w:r>
             <w:proofErr w:type="spellEnd"/>
+            <w:proofErr w:type="gramEnd"/>
             <w:r>
               <w:rPr>
                 <w:rFonts w:ascii="Arial" w:hAnsi="Arial" w:cs="Arial"/>
@@ -14258,45 +15178,76 @@
         </w:tc>
       </w:tr>
     </w:tbl>
+    <w:p/>
+    <w:p/>
+    <w:p/>
+    <w:p/>
     <w:p>
       <w:pPr>
         <w:rPr>
-          <w:lang w:val="en-US"/>
+          <w:sz w:val="16"/>
+          <w:szCs w:val="16"/>
         </w:rPr>
       </w:pPr>
     </w:p>
     <w:p>
       <w:pPr>
-        <w:rPr>
-          <w:lang w:val="en-US"/>
-        </w:rPr>
-      </w:pPr>
+        <w:pStyle w:val="Tableaufacturation"/>
+        <w:jc w:val="center"/>
+        <w:rPr>
+          <w:rFonts w:ascii="Arial" w:hAnsi="Arial" w:cs="Arial"/>
+          <w:i/>
+          <w:sz w:val="24"/>
+        </w:rPr>
+      </w:pPr>
+      <w:r>
+        <w:rPr>
+          <w:rFonts w:ascii="Arial" w:hAnsi="Arial" w:cs="Arial"/>
+          <w:i/>
+          <w:sz w:val="24"/>
+        </w:rPr>
+        <w:t>A titre indicatif et</w:t>
+      </w:r>
     </w:p>
     <w:p>
       <w:pPr>
-        <w:rPr>
-          <w:lang w:val="en-US"/>
-        </w:rPr>
-      </w:pPr>
+        <w:pStyle w:val="Tableaufacturation"/>
+        <w:jc w:val="center"/>
+        <w:rPr>
+          <w:rFonts w:ascii="Arial" w:hAnsi="Arial" w:cs="Arial"/>
+          <w:i/>
+          <w:sz w:val="24"/>
+        </w:rPr>
+      </w:pPr>
+      <w:r>
+        <w:rPr>
+          <w:rFonts w:ascii="Arial" w:hAnsi="Arial" w:cs="Arial"/>
+          <w:i/>
+          <w:sz w:val="24"/>
+        </w:rPr>
+        <w:t xml:space="preserve"> </w:t>
+      </w:r>
+      <w:proofErr w:type="gramStart"/>
+      <w:r>
+        <w:rPr>
+          <w:rFonts w:ascii="Arial" w:hAnsi="Arial" w:cs="Arial"/>
+          <w:i/>
+          <w:sz w:val="24"/>
+        </w:rPr>
+        <w:t>au</w:t>
+      </w:r>
+      <w:proofErr w:type="gramEnd"/>
+      <w:r>
+        <w:rPr>
+          <w:rFonts w:ascii="Arial" w:hAnsi="Arial" w:cs="Arial"/>
+          <w:i/>
+          <w:sz w:val="24"/>
+        </w:rPr>
+        <w:t xml:space="preserve"> taux actuel</w:t>
+      </w:r>
     </w:p>
     <w:p>
       <w:pPr>
-        <w:rPr>
-          <w:lang w:val="en-US"/>
-        </w:rPr>
-      </w:pPr>
-    </w:p>
-    <w:p>
-      <w:pPr>
-        <w:rPr>
-          <w:sz w:val="16"/>
-          <w:szCs w:val="16"/>
-          <w:lang w:val="en-US"/>
-        </w:rPr>
-      </w:pPr>
-    </w:p>
-    <w:p>
-      <w:pPr>
         <w:pStyle w:val="Tableaufacturation"/>
         <w:jc w:val="center"/>
         <w:rPr>
@@ -14311,45 +15262,25 @@
           <w:i/>
           <w:sz w:val="24"/>
         </w:rPr>
-        <w:t>A titre indicatif et</w:t>
-      </w:r>
-    </w:p>
-    <w:p>
-      <w:pPr>
-        <w:pStyle w:val="Tableaufacturation"/>
-        <w:jc w:val="center"/>
+        <w:t xml:space="preserve"> </w:t>
+      </w:r>
+      <w:proofErr w:type="gramStart"/>
+      <w:r>
         <w:rPr>
           <w:rFonts w:ascii="Arial" w:hAnsi="Arial" w:cs="Arial"/>
           <w:i/>
           <w:sz w:val="24"/>
         </w:rPr>
-      </w:pPr>
+        <w:t>de</w:t>
+      </w:r>
+      <w:proofErr w:type="gramEnd"/>
       <w:r>
         <w:rPr>
           <w:rFonts w:ascii="Arial" w:hAnsi="Arial" w:cs="Arial"/>
           <w:i/>
           <w:sz w:val="24"/>
         </w:rPr>
-        <w:t xml:space="preserve"> au taux actuel</w:t>
-      </w:r>
-    </w:p>
-    <w:p>
-      <w:pPr>
-        <w:pStyle w:val="Tableaufacturation"/>
-        <w:jc w:val="center"/>
-        <w:rPr>
-          <w:rFonts w:ascii="Arial" w:hAnsi="Arial" w:cs="Arial"/>
-          <w:i/>
-          <w:sz w:val="24"/>
-        </w:rPr>
-      </w:pPr>
-      <w:r>
-        <w:rPr>
-          <w:rFonts w:ascii="Arial" w:hAnsi="Arial" w:cs="Arial"/>
-          <w:i/>
-          <w:sz w:val="24"/>
-        </w:rPr>
-        <w:t xml:space="preserve"> de la TVA</w:t>
+        <w:t xml:space="preserve"> la TVA</w:t>
       </w:r>
     </w:p>
     <w:p>
@@ -16216,7 +17147,7 @@
         <w:spacing w:line="360" w:lineRule="auto"/>
         <w:jc w:val="left"/>
         <w:rPr>
-          <w:rFonts w:ascii="Verdana" w:hAnsi="Verdana"/>
+          <w:rFonts w:ascii="Arial" w:hAnsi="Arial" w:cs="Arial"/>
           <w:b/>
           <w:color w:val="021A32"/>
           <w:sz w:val="20"/>
@@ -16234,7 +17165,7 @@
       </w:pPr>
       <w:r>
         <w:rPr>
-          <w:rFonts w:cs="Arial"/>
+          <w:rFonts w:ascii="Arial" w:hAnsi="Arial" w:cs="Arial"/>
           <w:b/>
           <w:color w:val="000000"/>
           <w:sz w:val="20"/>
@@ -16243,7 +17174,7 @@
       </w:r>
       <w:r>
         <w:rPr>
-          <w:rFonts w:cs="Arial"/>
+          <w:rFonts w:ascii="Arial" w:hAnsi="Arial" w:cs="Arial"/>
           <w:b/>
           <w:color w:val="000000"/>
           <w:sz w:val="20"/>
@@ -16252,7 +17183,7 @@
       </w:r>
       <w:r>
         <w:rPr>
-          <w:rFonts w:cs="Arial"/>
+          <w:rFonts w:ascii="Arial" w:hAnsi="Arial" w:cs="Arial"/>
           <w:b/>
           <w:color w:val="021A32"/>
           <w:sz w:val="20"/>
@@ -16267,7 +17198,86 @@
           <w:iCs/>
           <w:sz w:val="20"/>
         </w:rPr>
-        <w:t>Ouest INSA</w:t>
+        <w:t>{</w:t>
+      </w:r>
+      <w:proofErr w:type="gramStart"/>
+      <w:r>
+        <w:rPr>
+          <w:rStyle w:val="ARemplacer"/>
+          <w:rFonts w:cs="Arial"/>
+          <w:b/>
+          <w:iCs/>
+          <w:sz w:val="20"/>
+        </w:rPr>
+        <w:t xml:space="preserve">{ </w:t>
+      </w:r>
+      <w:proofErr w:type="spellStart"/>
+      <w:r>
+        <w:rPr>
+          <w:rStyle w:val="ARemplacer"/>
+          <w:rFonts w:cs="Arial"/>
+          <w:b/>
+          <w:iCs/>
+          <w:sz w:val="20"/>
+        </w:rPr>
+        <w:t>param</w:t>
+      </w:r>
+      <w:proofErr w:type="spellEnd"/>
+      <w:proofErr w:type="gramEnd"/>
+      <w:r>
+        <w:rPr>
+          <w:rStyle w:val="ARemplacer"/>
+          <w:rFonts w:cs="Arial"/>
+          <w:b/>
+          <w:iCs/>
+          <w:sz w:val="20"/>
+        </w:rPr>
+        <w:t>(</w:t>
+      </w:r>
+      <w:r>
+        <w:rPr>
+          <w:rFonts w:ascii="Arial" w:eastAsia="Arial" w:hAnsi="Arial" w:cs="Arial"/>
+          <w:b/>
+          <w:i/>
+          <w:color w:val="000000"/>
+          <w:sz w:val="20"/>
+          <w:szCs w:val="20"/>
+        </w:rPr>
+        <w:t>'</w:t>
+      </w:r>
+      <w:proofErr w:type="spellStart"/>
+      <w:r>
+        <w:rPr>
+          <w:rFonts w:ascii="Arial" w:eastAsia="Arial" w:hAnsi="Arial" w:cs="Arial"/>
+          <w:b/>
+          <w:i/>
+          <w:color w:val="000000"/>
+          <w:sz w:val="20"/>
+          <w:szCs w:val="20"/>
+        </w:rPr>
+        <w:t>je_name</w:t>
+      </w:r>
+      <w:proofErr w:type="spellEnd"/>
+      <w:r>
+        <w:rPr>
+          <w:rFonts w:ascii="Arial" w:eastAsia="Arial" w:hAnsi="Arial" w:cs="Arial"/>
+          <w:b/>
+          <w:i/>
+          <w:color w:val="000000"/>
+          <w:sz w:val="20"/>
+          <w:szCs w:val="20"/>
+        </w:rPr>
+        <w:t>'</w:t>
+      </w:r>
+      <w:r>
+        <w:rPr>
+          <w:rStyle w:val="ARemplacer"/>
+          <w:rFonts w:cs="Arial"/>
+          <w:b/>
+          <w:iCs/>
+          <w:sz w:val="20"/>
+        </w:rPr>
+        <w:t>) }}</w:t>
       </w:r>
     </w:p>
     <w:p>
@@ -16276,7 +17286,7 @@
         <w:ind w:left="708" w:firstLine="708"/>
         <w:jc w:val="left"/>
         <w:rPr>
-          <w:rFonts w:cs="Arial"/>
+          <w:rFonts w:ascii="Arial" w:hAnsi="Arial" w:cs="Arial"/>
           <w:iCs/>
           <w:sz w:val="20"/>
         </w:rPr>
@@ -16309,7 +17319,96 @@
           <w:color w:val="021A32"/>
           <w:sz w:val="20"/>
         </w:rPr>
-        <w:t>20 avenue des Buttes de Coësmes, 35708 Rennes, CS 70839 Cedex 7</w:t>
+        <w:t>{</w:t>
+      </w:r>
+      <w:proofErr w:type="gramStart"/>
+      <w:r>
+        <w:rPr>
+          <w:rStyle w:val="ARemplacer"/>
+          <w:rFonts w:cs="Arial"/>
+          <w:iCs/>
+          <w:color w:val="021A32"/>
+          <w:sz w:val="20"/>
+        </w:rPr>
+        <w:t xml:space="preserve">{ </w:t>
+      </w:r>
+      <w:proofErr w:type="spellStart"/>
+      <w:r>
+        <w:rPr>
+          <w:rStyle w:val="ARemplacer"/>
+          <w:rFonts w:cs="Arial"/>
+          <w:iCs/>
+          <w:color w:val="021A32"/>
+          <w:sz w:val="20"/>
+          <w:szCs w:val="20"/>
+        </w:rPr>
+        <w:t>param</w:t>
+      </w:r>
+      <w:proofErr w:type="spellEnd"/>
+      <w:proofErr w:type="gramEnd"/>
+      <w:r>
+        <w:rPr>
+          <w:rStyle w:val="ARemplacer"/>
+          <w:rFonts w:cs="Arial"/>
+          <w:iCs/>
+          <w:color w:val="021A32"/>
+          <w:sz w:val="20"/>
+          <w:szCs w:val="20"/>
+        </w:rPr>
+        <w:t>(</w:t>
+      </w:r>
+      <w:r>
+        <w:rPr>
+          <w:rStyle w:val="ARemplacer"/>
+          <w:iCs/>
+          <w:color w:val="021A32"/>
+          <w:sz w:val="20"/>
+          <w:szCs w:val="20"/>
+        </w:rPr>
+        <w:t>'</w:t>
+      </w:r>
+      <w:proofErr w:type="spellStart"/>
+      <w:r>
+        <w:rPr>
+          <w:rStyle w:val="ARemplacer"/>
+          <w:iCs/>
+          <w:color w:val="021A32"/>
+          <w:sz w:val="20"/>
+          <w:szCs w:val="20"/>
+        </w:rPr>
+        <w:t>je_name</w:t>
+      </w:r>
+      <w:proofErr w:type="spellEnd"/>
+      <w:r>
+        <w:rPr>
+          <w:rStyle w:val="ARemplacer"/>
+          <w:iCs/>
+          <w:color w:val="021A32"/>
+          <w:sz w:val="20"/>
+          <w:szCs w:val="20"/>
+        </w:rPr>
+        <w:t>'</w:t>
+      </w:r>
+      <w:r>
+        <w:rPr>
+          <w:rStyle w:val="ARemplacer"/>
+          <w:rFonts w:cs="Arial"/>
+          <w:iCs/>
+          <w:color w:val="021A32"/>
+          <w:sz w:val="20"/>
+          <w:szCs w:val="20"/>
+        </w:rPr>
+        <w:t>) }}</w:t>
+      </w:r>
+      <w:r>
+        <w:rPr>
+          <w:rStyle w:val="ARemplacer"/>
+          <w:rFonts w:cs="Arial"/>
+          <w:iCs/>
+          <w:color w:val="021A32"/>
+          <w:sz w:val="20"/>
+        </w:rPr>
+        <w:t xml:space="preserve"> </w:t>
       </w:r>
     </w:p>
     <w:p>
@@ -16318,48 +17417,112 @@
         <w:ind w:firstLine="1418"/>
         <w:jc w:val="left"/>
         <w:rPr>
+          <w:rFonts w:ascii="Arial" w:hAnsi="Arial" w:cs="Arial"/>
+          <w:color w:val="021A32"/>
+          <w:sz w:val="20"/>
+        </w:rPr>
+      </w:pPr>
+      <w:r>
+        <w:rPr>
+          <w:rFonts w:ascii="Arial" w:hAnsi="Arial" w:cs="Arial"/>
+          <w:color w:val="000000"/>
+          <w:sz w:val="20"/>
+        </w:rPr>
+        <w:t>représentée par</w:t>
+      </w:r>
+      <w:r>
+        <w:rPr>
+          <w:rFonts w:ascii="Arial" w:hAnsi="Arial" w:cs="Arial"/>
+          <w:color w:val="021A32"/>
+          <w:sz w:val="20"/>
+        </w:rPr>
+        <w:t xml:space="preserve"> </w:t>
+      </w:r>
+      <w:r>
+        <w:rPr>
+          <w:rStyle w:val="ARemplacer"/>
           <w:rFonts w:cs="Arial"/>
-          <w:color w:val="021A32"/>
-          <w:sz w:val="20"/>
-        </w:rPr>
-      </w:pPr>
-      <w:r>
-        <w:rPr>
+          <w:i w:val="0"/>
+          <w:iCs/>
+          <w:sz w:val="20"/>
+        </w:rPr>
+        <w:t>{</w:t>
+      </w:r>
+      <w:proofErr w:type="gramStart"/>
+      <w:r>
+        <w:rPr>
+          <w:rStyle w:val="ARemplacer"/>
           <w:rFonts w:cs="Arial"/>
+          <w:i w:val="0"/>
+          <w:iCs/>
+          <w:sz w:val="20"/>
+        </w:rPr>
+        <w:t xml:space="preserve">{ </w:t>
+      </w:r>
+      <w:proofErr w:type="spellStart"/>
+      <w:r>
+        <w:rPr>
+          <w:rStyle w:val="ARemplacer"/>
+          <w:rFonts w:cs="Arial"/>
+          <w:i w:val="0"/>
+          <w:iCs/>
+          <w:sz w:val="20"/>
+        </w:rPr>
+        <w:t>param</w:t>
+      </w:r>
+      <w:proofErr w:type="spellEnd"/>
+      <w:proofErr w:type="gramEnd"/>
+      <w:r>
+        <w:rPr>
+          <w:rStyle w:val="ARemplacer"/>
+          <w:rFonts w:cs="Arial"/>
+          <w:i w:val="0"/>
+          <w:iCs/>
+          <w:sz w:val="20"/>
+        </w:rPr>
+        <w:t>(</w:t>
+      </w:r>
+      <w:r>
+        <w:rPr>
+          <w:rFonts w:ascii="Arial" w:eastAsia="Arial" w:hAnsi="Arial" w:cs="Arial"/>
+          <w:i/>
           <w:color w:val="000000"/>
           <w:sz w:val="20"/>
-        </w:rPr>
-        <w:t>représentée par</w:t>
-      </w:r>
-      <w:r>
-        <w:rPr>
+          <w:szCs w:val="20"/>
+        </w:rPr>
+        <w:t>'</w:t>
+      </w:r>
+      <w:proofErr w:type="spellStart"/>
+      <w:r>
+        <w:rPr>
+          <w:rFonts w:ascii="Arial" w:eastAsia="Arial" w:hAnsi="Arial" w:cs="Arial"/>
+          <w:i/>
+          <w:color w:val="000000"/>
+          <w:sz w:val="20"/>
+          <w:szCs w:val="20"/>
+        </w:rPr>
+        <w:t>president_text</w:t>
+      </w:r>
+      <w:proofErr w:type="spellEnd"/>
+      <w:r>
+        <w:rPr>
+          <w:rFonts w:ascii="Arial" w:eastAsia="Arial" w:hAnsi="Arial" w:cs="Arial"/>
+          <w:i/>
+          <w:color w:val="000000"/>
+          <w:sz w:val="20"/>
+          <w:szCs w:val="20"/>
+        </w:rPr>
+        <w:t>'</w:t>
+      </w:r>
+      <w:r>
+        <w:rPr>
+          <w:rStyle w:val="ARemplacer"/>
           <w:rFonts w:cs="Arial"/>
-          <w:color w:val="021A32"/>
-          <w:sz w:val="20"/>
-        </w:rPr>
-        <w:t xml:space="preserve"> </w:t>
-      </w:r>
-      <w:r>
-        <w:rPr>
-          <w:rFonts w:cs="Arial"/>
-          <w:sz w:val="20"/>
-        </w:rPr>
-        <w:t xml:space="preserve">son </w:t>
-      </w:r>
-      <w:r>
-        <w:rPr>
-          <w:rFonts w:cs="Arial"/>
-          <w:sz w:val="20"/>
-          <w:highlight w:val="yellow"/>
-        </w:rPr>
-        <w:t>président</w:t>
-      </w:r>
-      <w:r>
-        <w:rPr>
-          <w:rFonts w:cs="Arial"/>
-          <w:sz w:val="20"/>
-        </w:rPr>
-        <w:t xml:space="preserve"> </w:t>
+          <w:i w:val="0"/>
+          <w:iCs/>
+          <w:sz w:val="20"/>
+        </w:rPr>
+        <w:t>) }}</w:t>
       </w:r>
     </w:p>
     <w:p>
@@ -16368,7 +17531,7 @@
         <w:ind w:firstLine="1418"/>
         <w:jc w:val="left"/>
         <w:rPr>
-          <w:rFonts w:cs="Arial"/>
+          <w:rFonts w:ascii="Arial" w:hAnsi="Arial" w:cs="Arial"/>
           <w:i/>
           <w:iCs/>
           <w:color w:val="021A32"/>
@@ -16377,7 +17540,7 @@
       </w:pPr>
       <w:r>
         <w:rPr>
-          <w:rFonts w:cs="Arial"/>
+          <w:rFonts w:ascii="Arial" w:hAnsi="Arial" w:cs="Arial"/>
           <w:color w:val="000000"/>
           <w:sz w:val="20"/>
         </w:rPr>
@@ -16385,7 +17548,7 @@
       </w:r>
       <w:r>
         <w:rPr>
-          <w:rFonts w:cs="Arial"/>
+          <w:rFonts w:ascii="Arial" w:hAnsi="Arial" w:cs="Arial"/>
           <w:color w:val="021A32"/>
           <w:sz w:val="20"/>
         </w:rPr>
@@ -16395,10 +17558,87 @@
         <w:rPr>
           <w:rStyle w:val="ARemplacer"/>
           <w:rFonts w:cs="Arial"/>
+          <w:i w:val="0"/>
           <w:iCs/>
           <w:sz w:val="20"/>
         </w:rPr>
-        <w:t>Ouest INSA</w:t>
+        <w:t>{</w:t>
+      </w:r>
+      <w:proofErr w:type="gramStart"/>
+      <w:r>
+        <w:rPr>
+          <w:rStyle w:val="ARemplacer"/>
+          <w:rFonts w:cs="Arial"/>
+          <w:i w:val="0"/>
+          <w:iCs/>
+          <w:sz w:val="20"/>
+        </w:rPr>
+        <w:t xml:space="preserve">{ </w:t>
+      </w:r>
+      <w:proofErr w:type="spellStart"/>
+      <w:r>
+        <w:rPr>
+          <w:rStyle w:val="ARemplacer"/>
+          <w:rFonts w:cs="Arial"/>
+          <w:i w:val="0"/>
+          <w:iCs/>
+          <w:sz w:val="20"/>
+        </w:rPr>
+        <w:t>param</w:t>
+      </w:r>
+      <w:proofErr w:type="spellEnd"/>
+      <w:proofErr w:type="gramEnd"/>
+      <w:r>
+        <w:rPr>
+          <w:rStyle w:val="ARemplacer"/>
+          <w:rFonts w:cs="Arial"/>
+          <w:i w:val="0"/>
+          <w:iCs/>
+          <w:sz w:val="20"/>
+        </w:rPr>
+        <w:t>(</w:t>
+      </w:r>
+      <w:r>
+        <w:rPr>
+          <w:rFonts w:ascii="Arial" w:eastAsia="Arial" w:hAnsi="Arial" w:cs="Arial"/>
+          <w:i/>
+          <w:color w:val="000000"/>
+          <w:sz w:val="20"/>
+          <w:szCs w:val="20"/>
+        </w:rPr>
+        <w:t>'</w:t>
+      </w:r>
+      <w:proofErr w:type="spellStart"/>
+      <w:r>
+        <w:rPr>
+          <w:rFonts w:ascii="Arial" w:eastAsia="Arial" w:hAnsi="Arial" w:cs="Arial"/>
+          <w:i/>
+          <w:color w:val="000000"/>
+          <w:sz w:val="20"/>
+          <w:szCs w:val="20"/>
+        </w:rPr>
+        <w:t>je_name</w:t>
+      </w:r>
+      <w:proofErr w:type="spellEnd"/>
+      <w:r>
+        <w:rPr>
+          <w:rFonts w:ascii="Arial" w:eastAsia="Arial" w:hAnsi="Arial" w:cs="Arial"/>
+          <w:i/>
+          <w:color w:val="000000"/>
+          <w:sz w:val="20"/>
+          <w:szCs w:val="20"/>
+        </w:rPr>
+        <w:t>'</w:t>
+      </w:r>
+      <w:r>
+        <w:rPr>
+          <w:rStyle w:val="ARemplacer"/>
+          <w:rFonts w:cs="Arial"/>
+          <w:i w:val="0"/>
+          <w:iCs/>
+          <w:sz w:val="20"/>
+        </w:rPr>
+        <w:t>) }}</w:t>
       </w:r>
     </w:p>
     <w:p>
@@ -16407,14 +17647,14 @@
         <w:ind w:firstLine="1418"/>
         <w:jc w:val="left"/>
         <w:rPr>
-          <w:rFonts w:cs="Arial"/>
+          <w:rFonts w:ascii="Arial" w:hAnsi="Arial" w:cs="Arial"/>
           <w:color w:val="000000"/>
           <w:sz w:val="20"/>
         </w:rPr>
       </w:pPr>
       <w:r>
         <w:rPr>
-          <w:rFonts w:cs="Arial"/>
+          <w:rFonts w:ascii="Arial" w:hAnsi="Arial" w:cs="Arial"/>
           <w:color w:val="000000"/>
           <w:sz w:val="20"/>
         </w:rPr>
@@ -16427,7 +17667,7 @@
         <w:ind w:left="-851" w:firstLine="851"/>
         <w:jc w:val="left"/>
         <w:rPr>
-          <w:rFonts w:cs="Arial"/>
+          <w:rFonts w:ascii="Arial" w:hAnsi="Arial" w:cs="Arial"/>
           <w:color w:val="021A32"/>
           <w:sz w:val="20"/>
         </w:rPr>
@@ -16444,7 +17684,7 @@
       </w:pPr>
       <w:r>
         <w:rPr>
-          <w:rFonts w:cs="Arial"/>
+          <w:rFonts w:ascii="Arial" w:hAnsi="Arial" w:cs="Arial"/>
           <w:b/>
           <w:bCs/>
           <w:color w:val="000000"/>
@@ -16454,7 +17694,7 @@
       </w:r>
       <w:r>
         <w:rPr>
-          <w:rFonts w:cs="Arial"/>
+          <w:rFonts w:ascii="Arial" w:hAnsi="Arial" w:cs="Arial"/>
           <w:color w:val="021A32"/>
           <w:sz w:val="20"/>
         </w:rPr>
@@ -16462,7 +17702,7 @@
       </w:r>
       <w:r>
         <w:rPr>
-          <w:rFonts w:cs="Arial"/>
+          <w:rFonts w:ascii="Arial" w:hAnsi="Arial" w:cs="Arial"/>
           <w:color w:val="021A32"/>
           <w:sz w:val="20"/>
         </w:rPr>
@@ -16476,8 +17716,9 @@
           <w:iCs/>
           <w:sz w:val="20"/>
         </w:rPr>
-        <w:t>{{ etude.prospect.n</w:t>
-      </w:r>
+        <w:t>{</w:t>
+      </w:r>
+      <w:proofErr w:type="gramStart"/>
       <w:r>
         <w:rPr>
           <w:rStyle w:val="ARemplacer"/>
@@ -16486,7 +17727,7 @@
           <w:iCs/>
           <w:sz w:val="20"/>
         </w:rPr>
-        <w:t>ame</w:t>
+        <w:t>{ etude.prospect.n</w:t>
       </w:r>
       <w:r>
         <w:rPr>
@@ -16496,6 +17737,17 @@
           <w:iCs/>
           <w:sz w:val="20"/>
         </w:rPr>
+        <w:t>ame</w:t>
+      </w:r>
+      <w:proofErr w:type="gramEnd"/>
+      <w:r>
+        <w:rPr>
+          <w:rStyle w:val="ARemplacer"/>
+          <w:rFonts w:cs="Arial"/>
+          <w:b/>
+          <w:iCs/>
+          <w:sz w:val="20"/>
+        </w:rPr>
         <w:t xml:space="preserve"> }}</w:t>
       </w:r>
     </w:p>
@@ -16505,12 +17757,13 @@
         <w:ind w:left="708" w:firstLine="708"/>
         <w:jc w:val="left"/>
         <w:rPr>
-          <w:sz w:val="20"/>
-        </w:rPr>
-      </w:pPr>
-      <w:r>
-        <w:rPr>
-          <w:rFonts w:cs="Arial"/>
+          <w:rFonts w:ascii="Arial" w:hAnsi="Arial" w:cs="Arial"/>
+          <w:sz w:val="20"/>
+        </w:rPr>
+      </w:pPr>
+      <w:r>
+        <w:rPr>
+          <w:rFonts w:ascii="Arial" w:hAnsi="Arial" w:cs="Arial"/>
           <w:color w:val="000000"/>
           <w:sz w:val="20"/>
         </w:rPr>
@@ -16518,39 +17771,46 @@
       </w:r>
       <w:r>
         <w:rPr>
-          <w:rFonts w:cs="Arial"/>
-          <w:sz w:val="20"/>
-        </w:rPr>
-        <w:t xml:space="preserve"> </w:t>
-      </w:r>
-      <w:r>
-        <w:rPr>
-          <w:sz w:val="20"/>
-        </w:rPr>
-        <w:t xml:space="preserve">{{ </w:t>
+          <w:rFonts w:ascii="Arial" w:hAnsi="Arial" w:cs="Arial"/>
+          <w:sz w:val="20"/>
+        </w:rPr>
+        <w:t xml:space="preserve"> {</w:t>
+      </w:r>
+      <w:proofErr w:type="gramStart"/>
+      <w:r>
+        <w:rPr>
+          <w:rFonts w:ascii="Arial" w:hAnsi="Arial" w:cs="Arial"/>
+          <w:sz w:val="20"/>
+        </w:rPr>
+        <w:t xml:space="preserve">{ </w:t>
       </w:r>
       <w:proofErr w:type="spellStart"/>
       <w:r>
         <w:rPr>
+          <w:rFonts w:ascii="Arial" w:hAnsi="Arial" w:cs="Arial"/>
           <w:sz w:val="20"/>
         </w:rPr>
         <w:t>etude.prospect.ad</w:t>
       </w:r>
       <w:r>
         <w:rPr>
+          <w:rFonts w:ascii="Arial" w:hAnsi="Arial" w:cs="Arial"/>
           <w:sz w:val="20"/>
         </w:rPr>
         <w:t>d</w:t>
       </w:r>
       <w:r>
         <w:rPr>
+          <w:rFonts w:ascii="Arial" w:hAnsi="Arial" w:cs="Arial"/>
           <w:sz w:val="20"/>
         </w:rPr>
         <w:t>ress</w:t>
       </w:r>
       <w:proofErr w:type="spellEnd"/>
-      <w:r>
-        <w:rPr>
+      <w:proofErr w:type="gramEnd"/>
+      <w:r>
+        <w:rPr>
+          <w:rFonts w:ascii="Arial" w:hAnsi="Arial" w:cs="Arial"/>
           <w:sz w:val="20"/>
         </w:rPr>
         <w:t xml:space="preserve"> }}</w:t>
@@ -16562,32 +17822,45 @@
         <w:ind w:left="708" w:firstLine="708"/>
         <w:jc w:val="left"/>
         <w:rPr>
-          <w:rFonts w:cs="Arial"/>
-          <w:sz w:val="20"/>
-        </w:rPr>
-      </w:pPr>
-      <w:r>
-        <w:rPr>
-          <w:sz w:val="20"/>
-        </w:rPr>
-        <w:t xml:space="preserve">{{ </w:t>
+          <w:rFonts w:ascii="Arial" w:hAnsi="Arial" w:cs="Arial"/>
+          <w:sz w:val="20"/>
+        </w:rPr>
+      </w:pPr>
+      <w:r>
+        <w:rPr>
+          <w:rFonts w:ascii="Arial" w:hAnsi="Arial" w:cs="Arial"/>
+          <w:sz w:val="20"/>
+        </w:rPr>
+        <w:t>{</w:t>
+      </w:r>
+      <w:proofErr w:type="gramStart"/>
+      <w:r>
+        <w:rPr>
+          <w:rFonts w:ascii="Arial" w:hAnsi="Arial" w:cs="Arial"/>
+          <w:sz w:val="20"/>
+        </w:rPr>
+        <w:t xml:space="preserve">{ </w:t>
       </w:r>
       <w:proofErr w:type="spellStart"/>
       <w:r>
         <w:rPr>
+          <w:rFonts w:ascii="Arial" w:hAnsi="Arial" w:cs="Arial"/>
           <w:sz w:val="20"/>
         </w:rPr>
         <w:t>etude.prospect.</w:t>
       </w:r>
       <w:r>
         <w:rPr>
+          <w:rFonts w:ascii="Arial" w:hAnsi="Arial" w:cs="Arial"/>
           <w:sz w:val="20"/>
         </w:rPr>
         <w:t>postcode</w:t>
       </w:r>
       <w:proofErr w:type="spellEnd"/>
-      <w:r>
-        <w:rPr>
+      <w:proofErr w:type="gramEnd"/>
+      <w:r>
+        <w:rPr>
+          <w:rFonts w:ascii="Arial" w:hAnsi="Arial" w:cs="Arial"/>
           <w:sz w:val="20"/>
         </w:rPr>
         <w:t xml:space="preserve"> }} {{ </w:t>
@@ -16595,12 +17868,14 @@
       <w:proofErr w:type="spellStart"/>
       <w:r>
         <w:rPr>
+          <w:rFonts w:ascii="Arial" w:hAnsi="Arial" w:cs="Arial"/>
           <w:sz w:val="20"/>
         </w:rPr>
         <w:t>etude.prospect.</w:t>
       </w:r>
       <w:r>
         <w:rPr>
+          <w:rFonts w:ascii="Arial" w:hAnsi="Arial" w:cs="Arial"/>
           <w:sz w:val="20"/>
         </w:rPr>
         <w:t>town</w:t>
@@ -16608,6 +17883,7 @@
       <w:proofErr w:type="spellEnd"/>
       <w:r>
         <w:rPr>
+          <w:rFonts w:ascii="Arial" w:hAnsi="Arial" w:cs="Arial"/>
           <w:sz w:val="20"/>
         </w:rPr>
         <w:t xml:space="preserve"> }}</w:t>
@@ -16628,7 +17904,7 @@
       </w:pPr>
       <w:r>
         <w:rPr>
-          <w:rFonts w:cs="Arial"/>
+          <w:rFonts w:ascii="Arial" w:hAnsi="Arial" w:cs="Arial"/>
           <w:color w:val="000000"/>
           <w:sz w:val="20"/>
         </w:rPr>
@@ -16636,23 +17912,33 @@
       </w:r>
       <w:r>
         <w:rPr>
-          <w:rFonts w:cs="Arial"/>
+          <w:rFonts w:ascii="Arial" w:hAnsi="Arial" w:cs="Arial"/>
           <w:color w:val="021A32"/>
           <w:sz w:val="20"/>
         </w:rPr>
-        <w:t xml:space="preserve"> {{ etude.c</w:t>
-      </w:r>
-      <w:r>
-        <w:rPr>
-          <w:rFonts w:cs="Arial"/>
+        <w:t xml:space="preserve"> {</w:t>
+      </w:r>
+      <w:proofErr w:type="gramStart"/>
+      <w:r>
+        <w:rPr>
+          <w:rFonts w:ascii="Arial" w:hAnsi="Arial" w:cs="Arial"/>
           <w:color w:val="021A32"/>
           <w:sz w:val="20"/>
         </w:rPr>
+        <w:t>{ etude.c</w:t>
+      </w:r>
+      <w:r>
+        <w:rPr>
+          <w:rFonts w:ascii="Arial" w:hAnsi="Arial" w:cs="Arial"/>
+          <w:color w:val="021A32"/>
+          <w:sz w:val="20"/>
+        </w:rPr>
         <w:t>e.signer2</w:t>
       </w:r>
-      <w:r>
-        <w:rPr>
-          <w:rFonts w:cs="Arial"/>
+      <w:proofErr w:type="gramEnd"/>
+      <w:r>
+        <w:rPr>
+          <w:rFonts w:ascii="Arial" w:hAnsi="Arial" w:cs="Arial"/>
           <w:color w:val="021A32"/>
           <w:sz w:val="20"/>
         </w:rPr>
@@ -16735,11 +18021,12 @@
         <w:ind w:firstLine="1418"/>
         <w:jc w:val="left"/>
         <w:rPr>
-          <w:rFonts w:cs="Arial"/>
+          <w:rFonts w:ascii="Arial" w:hAnsi="Arial" w:cs="Arial"/>
           <w:color w:val="000000"/>
           <w:sz w:val="20"/>
         </w:rPr>
       </w:pPr>
+      <w:proofErr w:type="gramStart"/>
       <w:r>
         <w:rPr>
           <w:rStyle w:val="ARemplacer"/>
@@ -16748,7 +18035,18 @@
           <w:color w:val="000000"/>
           <w:sz w:val="20"/>
         </w:rPr>
-        <w:t>ci-après dénommée le client</w:t>
+        <w:t>ci-après</w:t>
+      </w:r>
+      <w:proofErr w:type="gramEnd"/>
+      <w:r>
+        <w:rPr>
+          <w:rStyle w:val="ARemplacer"/>
+          <w:rFonts w:cs="Arial"/>
+          <w:iCs/>
+          <w:color w:val="000000"/>
+          <w:sz w:val="20"/>
+        </w:rPr>
+        <w:t xml:space="preserve"> dénommée le client</w:t>
       </w:r>
     </w:p>
     <w:p>
@@ -16757,14 +18055,14 @@
         <w:ind w:firstLine="1418"/>
         <w:jc w:val="left"/>
         <w:rPr>
-          <w:rFonts w:cs="Arial"/>
+          <w:rFonts w:ascii="Arial" w:hAnsi="Arial" w:cs="Arial"/>
           <w:color w:val="000000"/>
           <w:sz w:val="20"/>
         </w:rPr>
       </w:pPr>
       <w:r>
         <w:rPr>
-          <w:rFonts w:cs="Arial"/>
+          <w:rFonts w:ascii="Arial" w:hAnsi="Arial" w:cs="Arial"/>
           <w:color w:val="000000"/>
           <w:sz w:val="20"/>
         </w:rPr>
@@ -16807,20 +18105,36 @@
           <w:color w:val="000000"/>
           <w:sz w:val="20"/>
         </w:rPr>
-        <w:t xml:space="preserve">Il a été préalablement rappelé que </w:t>
+        <w:t xml:space="preserve">Il a été préalablement rappelé </w:t>
+      </w:r>
+      <w:proofErr w:type="gramStart"/>
+      <w:r>
+        <w:rPr>
+          <w:color w:val="000000"/>
+          <w:sz w:val="20"/>
+        </w:rPr>
+        <w:t xml:space="preserve">que </w:t>
       </w:r>
       <w:r>
         <w:rPr>
           <w:sz w:val="20"/>
           <w:szCs w:val="20"/>
         </w:rPr>
-        <w:t>Ouest INSA</w:t>
-      </w:r>
+        <w:t>Ouest</w:t>
+      </w:r>
+      <w:proofErr w:type="gramEnd"/>
       <w:r>
         <w:rPr>
           <w:sz w:val="20"/>
           <w:szCs w:val="20"/>
         </w:rPr>
+        <w:t xml:space="preserve"> INSA</w:t>
+      </w:r>
+      <w:r>
+        <w:rPr>
+          <w:sz w:val="20"/>
+          <w:szCs w:val="20"/>
+        </w:rPr>
         <w:t xml:space="preserve"> </w:t>
       </w:r>
       <w:r>
@@ -16856,7 +18170,16 @@
           <w:color w:val="000000"/>
           <w:sz w:val="20"/>
         </w:rPr>
-        <w:t xml:space="preserve">, et membre de la Confédération Nationale des Junior-Entreprises. Elle a pour vocation de compléter la formation théorique dispensée dans son établissement d’enseignement supérieur par des applications pratiques à vocation pédagogique dans un contexte professionnel. C’est dans cet esprit que le Client a confié à </w:t>
+        <w:t>, et membre de la C</w:t>
+      </w:r>
+      <w:bookmarkStart w:id="36" w:name="_GoBack"/>
+      <w:bookmarkEnd w:id="36"/>
+      <w:r>
+        <w:rPr>
+          <w:color w:val="000000"/>
+          <w:sz w:val="20"/>
+        </w:rPr>
+        <w:t xml:space="preserve">onfédération Nationale des Junior-Entreprises. Elle a pour vocation de compléter la formation théorique dispensée dans son établissement d’enseignement supérieur par des applications pratiques à vocation pédagogique dans un contexte professionnel. C’est dans cet esprit que le Client a confié à </w:t>
       </w:r>
       <w:r>
         <w:rPr>
@@ -17123,14 +18446,31 @@
           <w:sz w:val="20"/>
           <w:szCs w:val="20"/>
         </w:rPr>
-        <w:t xml:space="preserve">Toute inexécution de l’une des obligations visées à la présente Convention engage la responsabilité de son auteur. Compte tenu tant de la nature de la mission que de la spécificité de </w:t>
+        <w:t xml:space="preserve">Toute inexécution de l’une des obligations visées à la présente Convention engage la responsabilité de son auteur. Compte tenu tant de la nature de la mission que de la spécificité </w:t>
+      </w:r>
+      <w:proofErr w:type="gramStart"/>
+      <w:r>
+        <w:rPr>
+          <w:color w:val="000000"/>
+          <w:sz w:val="20"/>
+          <w:szCs w:val="20"/>
+        </w:rPr>
+        <w:t xml:space="preserve">de </w:t>
       </w:r>
       <w:r>
         <w:rPr>
           <w:rFonts w:cs="Arial"/>
           <w:sz w:val="20"/>
         </w:rPr>
-        <w:t>Ouest INSA</w:t>
+        <w:t>Ouest</w:t>
+      </w:r>
+      <w:proofErr w:type="gramEnd"/>
+      <w:r>
+        <w:rPr>
+          <w:rFonts w:cs="Arial"/>
+          <w:sz w:val="20"/>
+        </w:rPr>
+        <w:t xml:space="preserve"> INSA</w:t>
       </w:r>
       <w:r>
         <w:rPr>
@@ -17460,14 +18800,30 @@
           <w:sz w:val="20"/>
           <w:szCs w:val="20"/>
         </w:rPr>
-        <w:t>Dans l'hypothèse où la mission confiée par le client cesserait à la seule initiative de</w:t>
-      </w:r>
+        <w:t xml:space="preserve">Dans l'hypothèse où la mission confiée par le client cesserait à la seule initiative </w:t>
+      </w:r>
+      <w:proofErr w:type="gramStart"/>
       <w:r>
         <w:rPr>
           <w:sz w:val="20"/>
           <w:szCs w:val="20"/>
         </w:rPr>
-        <w:t xml:space="preserve"> Ouest INSA</w:t>
+        <w:t>de</w:t>
+      </w:r>
+      <w:r>
+        <w:rPr>
+          <w:sz w:val="20"/>
+          <w:szCs w:val="20"/>
+        </w:rPr>
+        <w:t xml:space="preserve"> Ouest</w:t>
+      </w:r>
+      <w:proofErr w:type="gramEnd"/>
+      <w:r>
+        <w:rPr>
+          <w:sz w:val="20"/>
+          <w:szCs w:val="20"/>
+        </w:rPr>
+        <w:t xml:space="preserve"> INSA</w:t>
       </w:r>
       <w:r>
         <w:rPr>
@@ -18151,7 +19507,16 @@
           <w:sz w:val="20"/>
           <w:szCs w:val="20"/>
         </w:rPr>
-        <w:t xml:space="preserve">Le client pourra exploiter ou faire exploiter les résultats de l'étude sans aucune rémunération au profit de </w:t>
+        <w:t xml:space="preserve">Le client pourra exploiter ou faire exploiter les résultats de l'étude sans aucune rémunération au profit </w:t>
+      </w:r>
+      <w:proofErr w:type="gramStart"/>
+      <w:r>
+        <w:rPr>
+          <w:color w:val="000000"/>
+          <w:sz w:val="20"/>
+          <w:szCs w:val="20"/>
+        </w:rPr>
+        <w:t xml:space="preserve">de </w:t>
       </w:r>
       <w:r>
         <w:rPr>
@@ -18173,7 +19538,16 @@
           <w:sz w:val="20"/>
           <w:szCs w:val="20"/>
         </w:rPr>
-        <w:t xml:space="preserve"> autre que celle mentionnée dans l’article 5 de la présente Convention. </w:t>
+        <w:t xml:space="preserve"> autre que celle mentionnée dans l’article</w:t>
+      </w:r>
+      <w:proofErr w:type="gramEnd"/>
+      <w:r>
+        <w:rPr>
+          <w:color w:val="000000"/>
+          <w:sz w:val="20"/>
+          <w:szCs w:val="20"/>
+        </w:rPr>
+        <w:t xml:space="preserve"> 5 de la présente Convention. </w:t>
       </w:r>
     </w:p>
     <w:p>
@@ -18263,14 +19637,31 @@
           <w:sz w:val="20"/>
           <w:szCs w:val="20"/>
         </w:rPr>
-        <w:t xml:space="preserve">En cas de désaccord persistant, le litige sera porté devant le tribunal judiciaire dont dépend le siège de </w:t>
+        <w:t xml:space="preserve">En cas de désaccord persistant, le litige sera porté devant le tribunal judiciaire dont dépend le siège </w:t>
+      </w:r>
+      <w:proofErr w:type="gramStart"/>
+      <w:r>
+        <w:rPr>
+          <w:color w:val="000000"/>
+          <w:sz w:val="20"/>
+          <w:szCs w:val="20"/>
+        </w:rPr>
+        <w:t xml:space="preserve">de </w:t>
       </w:r>
       <w:r>
         <w:rPr>
           <w:rFonts w:cs="Arial"/>
           <w:sz w:val="20"/>
         </w:rPr>
-        <w:t>Ouest INSA.</w:t>
+        <w:t>Ouest</w:t>
+      </w:r>
+      <w:proofErr w:type="gramEnd"/>
+      <w:r>
+        <w:rPr>
+          <w:rFonts w:cs="Arial"/>
+          <w:sz w:val="20"/>
+        </w:rPr>
+        <w:t xml:space="preserve"> INSA.</w:t>
       </w:r>
     </w:p>
     <w:p>
@@ -18657,7 +20048,16 @@
           <w:sz w:val="26"/>
           <w:szCs w:val="26"/>
         </w:rPr>
-        <w:t>le {{</w:t>
+        <w:t>le {</w:t>
+      </w:r>
+      <w:proofErr w:type="gramStart"/>
+      <w:r>
+        <w:rPr>
+          <w:rFonts w:ascii="Arial" w:eastAsia="Calibri" w:hAnsi="Arial" w:cs="Arial"/>
+          <w:sz w:val="26"/>
+          <w:szCs w:val="26"/>
+        </w:rPr>
+        <w:t>{</w:t>
       </w:r>
       <w:r>
         <w:rPr>
@@ -18677,6 +20077,7 @@
         <w:t>dateShort</w:t>
       </w:r>
       <w:proofErr w:type="spellEnd"/>
+      <w:proofErr w:type="gramEnd"/>
       <w:r>
         <w:rPr>
           <w:rFonts w:ascii="Arial" w:eastAsia="Calibri" w:hAnsi="Arial" w:cs="Arial"/>
@@ -18749,15 +20150,16 @@
                 <w:sz w:val="26"/>
                 <w:szCs w:val="26"/>
               </w:rPr>
-              <w:t xml:space="preserve"> {{</w:t>
-            </w:r>
+              <w:t xml:space="preserve"> {</w:t>
+            </w:r>
+            <w:proofErr w:type="gramStart"/>
             <w:r>
               <w:rPr>
                 <w:rFonts w:ascii="Arial" w:hAnsi="Arial" w:cs="Arial"/>
                 <w:sz w:val="26"/>
                 <w:szCs w:val="26"/>
               </w:rPr>
-              <w:t xml:space="preserve"> </w:t>
+              <w:t>{</w:t>
             </w:r>
             <w:r>
               <w:rPr>
@@ -18765,7 +20167,7 @@
                 <w:sz w:val="26"/>
                 <w:szCs w:val="26"/>
               </w:rPr>
-              <w:t>etude.prospect.n</w:t>
+              <w:t xml:space="preserve"> </w:t>
             </w:r>
             <w:r>
               <w:rPr>
@@ -18773,7 +20175,24 @@
                 <w:sz w:val="26"/>
                 <w:szCs w:val="26"/>
               </w:rPr>
-              <w:t xml:space="preserve">ame </w:t>
+              <w:t>etude.prospect.n</w:t>
+            </w:r>
+            <w:r>
+              <w:rPr>
+                <w:rFonts w:ascii="Arial" w:hAnsi="Arial" w:cs="Arial"/>
+                <w:sz w:val="26"/>
+                <w:szCs w:val="26"/>
+              </w:rPr>
+              <w:t>ame</w:t>
+            </w:r>
+            <w:proofErr w:type="gramEnd"/>
+            <w:r>
+              <w:rPr>
+                <w:rFonts w:ascii="Arial" w:hAnsi="Arial" w:cs="Arial"/>
+                <w:sz w:val="26"/>
+                <w:szCs w:val="26"/>
+              </w:rPr>
+              <w:t xml:space="preserve"> </w:t>
             </w:r>
             <w:r>
               <w:rPr>
@@ -18801,8 +20220,9 @@
                 <w:sz w:val="26"/>
                 <w:szCs w:val="26"/>
               </w:rPr>
-              <w:t>{{</w:t>
-            </w:r>
+              <w:t>{</w:t>
+            </w:r>
+            <w:proofErr w:type="gramStart"/>
             <w:r>
               <w:rPr>
                 <w:rFonts w:ascii="Arial" w:hAnsi="Arial" w:cs="Arial"/>
@@ -18810,7 +20230,7 @@
                 <w:sz w:val="26"/>
                 <w:szCs w:val="26"/>
               </w:rPr>
-              <w:t xml:space="preserve"> </w:t>
+              <w:t>{</w:t>
             </w:r>
             <w:r>
               <w:rPr>
@@ -18819,7 +20239,7 @@
                 <w:sz w:val="26"/>
                 <w:szCs w:val="26"/>
               </w:rPr>
-              <w:t>etude.ce.s</w:t>
+              <w:t xml:space="preserve"> </w:t>
             </w:r>
             <w:r>
               <w:rPr>
@@ -18828,7 +20248,26 @@
                 <w:sz w:val="26"/>
                 <w:szCs w:val="26"/>
               </w:rPr>
-              <w:t xml:space="preserve">igner2 </w:t>
+              <w:t>etude.ce.s</w:t>
+            </w:r>
+            <w:r>
+              <w:rPr>
+                <w:rFonts w:ascii="Arial" w:hAnsi="Arial" w:cs="Arial"/>
+                <w:b/>
+                <w:sz w:val="26"/>
+                <w:szCs w:val="26"/>
+              </w:rPr>
+              <w:t>igner2</w:t>
+            </w:r>
+            <w:proofErr w:type="gramEnd"/>
+            <w:r>
+              <w:rPr>
+                <w:rFonts w:ascii="Arial" w:hAnsi="Arial" w:cs="Arial"/>
+                <w:b/>
+                <w:sz w:val="26"/>
+                <w:szCs w:val="26"/>
+              </w:rPr>
+              <w:t xml:space="preserve"> </w:t>
             </w:r>
             <w:r>
               <w:rPr>
@@ -18855,15 +20294,16 @@
                 <w:sz w:val="26"/>
                 <w:szCs w:val="26"/>
               </w:rPr>
-              <w:t>{{</w:t>
-            </w:r>
+              <w:t>{</w:t>
+            </w:r>
+            <w:proofErr w:type="gramStart"/>
             <w:r>
               <w:rPr>
                 <w:rFonts w:ascii="Arial" w:hAnsi="Arial" w:cs="Arial"/>
                 <w:sz w:val="26"/>
                 <w:szCs w:val="26"/>
               </w:rPr>
-              <w:t xml:space="preserve"> </w:t>
+              <w:t>{</w:t>
             </w:r>
             <w:r>
               <w:rPr>
@@ -18871,7 +20311,7 @@
                 <w:sz w:val="26"/>
                 <w:szCs w:val="26"/>
               </w:rPr>
-              <w:t>etude.ce.signe</w:t>
+              <w:t xml:space="preserve"> </w:t>
             </w:r>
             <w:r>
               <w:rPr>
@@ -18879,7 +20319,7 @@
                 <w:sz w:val="26"/>
                 <w:szCs w:val="26"/>
               </w:rPr>
-              <w:t>r</w:t>
+              <w:t>etude.ce.signe</w:t>
             </w:r>
             <w:r>
               <w:rPr>
@@ -18887,7 +20327,7 @@
                 <w:sz w:val="26"/>
                 <w:szCs w:val="26"/>
               </w:rPr>
-              <w:t>2.pos</w:t>
+              <w:t>r</w:t>
             </w:r>
             <w:r>
               <w:rPr>
@@ -18895,7 +20335,24 @@
                 <w:sz w:val="26"/>
                 <w:szCs w:val="26"/>
               </w:rPr>
-              <w:t xml:space="preserve">ition </w:t>
+              <w:t>2.pos</w:t>
+            </w:r>
+            <w:r>
+              <w:rPr>
+                <w:rFonts w:ascii="Arial" w:hAnsi="Arial" w:cs="Arial"/>
+                <w:sz w:val="26"/>
+                <w:szCs w:val="26"/>
+              </w:rPr>
+              <w:t>ition</w:t>
+            </w:r>
+            <w:proofErr w:type="gramEnd"/>
+            <w:r>
+              <w:rPr>
+                <w:rFonts w:ascii="Arial" w:hAnsi="Arial" w:cs="Arial"/>
+                <w:sz w:val="26"/>
+                <w:szCs w:val="26"/>
+              </w:rPr>
+              <w:t xml:space="preserve"> </w:t>
             </w:r>
             <w:r>
               <w:rPr>
@@ -18992,8 +20449,9 @@
                 <w:sz w:val="26"/>
                 <w:szCs w:val="26"/>
               </w:rPr>
-              <w:t>{{</w:t>
-            </w:r>
+              <w:t>{</w:t>
+            </w:r>
+            <w:proofErr w:type="gramStart"/>
             <w:r>
               <w:rPr>
                 <w:rFonts w:ascii="Arial" w:hAnsi="Arial" w:cs="Arial"/>
@@ -19001,7 +20459,7 @@
                 <w:sz w:val="26"/>
                 <w:szCs w:val="26"/>
               </w:rPr>
-              <w:t xml:space="preserve"> </w:t>
+              <w:t>{</w:t>
             </w:r>
             <w:r>
               <w:rPr>
@@ -19010,7 +20468,7 @@
                 <w:sz w:val="26"/>
                 <w:szCs w:val="26"/>
               </w:rPr>
-              <w:t>etude.ce.sign</w:t>
+              <w:t xml:space="preserve"> </w:t>
             </w:r>
             <w:r>
               <w:rPr>
@@ -19019,7 +20477,7 @@
                 <w:sz w:val="26"/>
                 <w:szCs w:val="26"/>
               </w:rPr>
-              <w:t>er</w:t>
+              <w:t>etude.ce.sign</w:t>
             </w:r>
             <w:r>
               <w:rPr>
@@ -19028,8 +20486,18 @@
                 <w:sz w:val="26"/>
                 <w:szCs w:val="26"/>
               </w:rPr>
+              <w:t>er</w:t>
+            </w:r>
+            <w:r>
+              <w:rPr>
+                <w:rFonts w:ascii="Arial" w:hAnsi="Arial" w:cs="Arial"/>
+                <w:b/>
+                <w:sz w:val="26"/>
+                <w:szCs w:val="26"/>
+              </w:rPr>
               <w:t>1</w:t>
             </w:r>
+            <w:proofErr w:type="gramEnd"/>
             <w:r>
               <w:rPr>
                 <w:rFonts w:ascii="Arial" w:hAnsi="Arial" w:cs="Arial"/>
@@ -19064,15 +20532,16 @@
                 <w:sz w:val="26"/>
                 <w:szCs w:val="26"/>
               </w:rPr>
-              <w:t>{{</w:t>
-            </w:r>
+              <w:t>{</w:t>
+            </w:r>
+            <w:proofErr w:type="gramStart"/>
             <w:r>
               <w:rPr>
                 <w:rFonts w:ascii="Arial" w:hAnsi="Arial" w:cs="Arial"/>
                 <w:sz w:val="26"/>
                 <w:szCs w:val="26"/>
               </w:rPr>
-              <w:t xml:space="preserve"> </w:t>
+              <w:t>{</w:t>
             </w:r>
             <w:r>
               <w:rPr>
@@ -19080,7 +20549,7 @@
                 <w:sz w:val="26"/>
                 <w:szCs w:val="26"/>
               </w:rPr>
-              <w:t>etude.ce.sign</w:t>
+              <w:t xml:space="preserve"> </w:t>
             </w:r>
             <w:r>
               <w:rPr>
@@ -19088,7 +20557,7 @@
                 <w:sz w:val="26"/>
                 <w:szCs w:val="26"/>
               </w:rPr>
-              <w:t>er1</w:t>
+              <w:t>etude.ce.sign</w:t>
             </w:r>
             <w:r>
               <w:rPr>
@@ -19096,8 +20565,17 @@
                 <w:sz w:val="26"/>
                 <w:szCs w:val="26"/>
               </w:rPr>
+              <w:t>er1</w:t>
+            </w:r>
+            <w:r>
+              <w:rPr>
+                <w:rFonts w:ascii="Arial" w:hAnsi="Arial" w:cs="Arial"/>
+                <w:sz w:val="26"/>
+                <w:szCs w:val="26"/>
+              </w:rPr>
               <w:t>.poste</w:t>
             </w:r>
+            <w:proofErr w:type="gramEnd"/>
             <w:r>
               <w:rPr>
                 <w:rFonts w:ascii="Arial" w:hAnsi="Arial" w:cs="Arial"/>
@@ -19157,7 +20635,7 @@
 </file>
 
 <file path=word/endnotes.xml><?xml version="1.0" encoding="utf-8"?>
-<w:endnotes xmlns:wpc="http://schemas.microsoft.com/office/word/2010/wordprocessingCanvas" xmlns:cx="http://schemas.microsoft.com/office/drawing/2014/chartex" xmlns:cx1="http://schemas.microsoft.com/office/drawing/2015/9/8/chartex" xmlns:cx2="http://schemas.microsoft.com/office/drawing/2015/10/21/chartex" xmlns:cx3="http://schemas.microsoft.com/office/drawing/2016/5/9/chartex" xmlns:cx4="http://schemas.microsoft.com/office/drawing/2016/5/10/chartex" xmlns:cx5="http://schemas.microsoft.com/office/drawing/2016/5/11/chartex" xmlns:cx6="http://schemas.microsoft.com/office/drawing/2016/5/12/chartex" xmlns:cx7="http://schemas.microsoft.com/office/drawing/2016/5/13/chartex" xmlns:cx8="http://schemas.microsoft.com/office/drawing/2016/5/14/chartex" xmlns:mc="http://schemas.openxmlformats.org/markup-compatibility/2006" xmlns:aink="http://schemas.microsoft.com/office/drawing/2016/ink" xmlns:am3d="http://schemas.microsoft.com/office/drawing/2017/model3d" xmlns:o="urn:schemas-microsoft-com:office:office" xmlns:r="http://schemas.openxmlformats.org/officeDocument/2006/relationships" xmlns:m="http://schemas.openxmlformats.org/officeDocument/2006/math" xmlns:v="urn:schemas-microsoft-com:vml" xmlns:wp14="http://schemas.microsoft.com/office/word/2010/wordprocessingDrawing" xmlns:wp="http://schemas.openxmlformats.org/drawingml/2006/wordprocessingDrawing" xmlns:w10="urn:schemas-microsoft-com:office:word" xmlns:w="http://schemas.openxmlformats.org/wordprocessingml/2006/main" xmlns:w14="http://schemas.microsoft.com/office/word/2010/wordml" xmlns:w15="http://schemas.microsoft.com/office/word/2012/wordml" xmlns:w16cex="http://schemas.microsoft.com/office/word/2018/wordml/cex" xmlns:w16cid="http://schemas.microsoft.com/office/word/2016/wordml/cid" xmlns:w16="http://schemas.microsoft.com/office/word/2018/wordml" xmlns:w16se="http://schemas.microsoft.com/office/word/2015/wordml/symex" xmlns:wpg="http://schemas.microsoft.com/office/word/2010/wordprocessingGroup" xmlns:wpi="http://schemas.microsoft.com/office/word/2010/wordprocessingInk" xmlns:wne="http://schemas.microsoft.com/office/word/2006/wordml" xmlns:wps="http://schemas.microsoft.com/office/word/2010/wordprocessingShape" mc:Ignorable="w14 w15 w16se w16cid w16 w16cex wp14">
+<w:endnotes xmlns:wpc="http://schemas.microsoft.com/office/word/2010/wordprocessingCanvas" xmlns:mc="http://schemas.openxmlformats.org/markup-compatibility/2006" xmlns:o="urn:schemas-microsoft-com:office:office" xmlns:r="http://schemas.openxmlformats.org/officeDocument/2006/relationships" xmlns:m="http://schemas.openxmlformats.org/officeDocument/2006/math" xmlns:v="urn:schemas-microsoft-com:vml" xmlns:wp14="http://schemas.microsoft.com/office/word/2010/wordprocessingDrawing" xmlns:wp="http://schemas.openxmlformats.org/drawingml/2006/wordprocessingDrawing" xmlns:w10="urn:schemas-microsoft-com:office:word" xmlns:w="http://schemas.openxmlformats.org/wordprocessingml/2006/main" xmlns:w14="http://schemas.microsoft.com/office/word/2010/wordml" xmlns:w15="http://schemas.microsoft.com/office/word/2012/wordml" xmlns:wpg="http://schemas.microsoft.com/office/word/2010/wordprocessingGroup" xmlns:wpi="http://schemas.microsoft.com/office/word/2010/wordprocessingInk" xmlns:wne="http://schemas.microsoft.com/office/word/2006/wordml" xmlns:wps="http://schemas.microsoft.com/office/word/2010/wordprocessingShape" mc:Ignorable="w14 w15 wp14">
   <w:endnote w:type="separator" w:id="-1">
     <w:p>
       <w:pPr>
@@ -19182,7 +20660,7 @@
 </file>
 
 <file path=word/footer1.xml><?xml version="1.0" encoding="utf-8"?>
-<w:ftr xmlns:wpc="http://schemas.microsoft.com/office/word/2010/wordprocessingCanvas" xmlns:cx="http://schemas.microsoft.com/office/drawing/2014/chartex" xmlns:cx1="http://schemas.microsoft.com/office/drawing/2015/9/8/chartex" xmlns:cx2="http://schemas.microsoft.com/office/drawing/2015/10/21/chartex" xmlns:cx3="http://schemas.microsoft.com/office/drawing/2016/5/9/chartex" xmlns:cx4="http://schemas.microsoft.com/office/drawing/2016/5/10/chartex" xmlns:cx5="http://schemas.microsoft.com/office/drawing/2016/5/11/chartex" xmlns:cx6="http://schemas.microsoft.com/office/drawing/2016/5/12/chartex" xmlns:cx7="http://schemas.microsoft.com/office/drawing/2016/5/13/chartex" xmlns:cx8="http://schemas.microsoft.com/office/drawing/2016/5/14/chartex" xmlns:mc="http://schemas.openxmlformats.org/markup-compatibility/2006" xmlns:aink="http://schemas.microsoft.com/office/drawing/2016/ink" xmlns:am3d="http://schemas.microsoft.com/office/drawing/2017/model3d" xmlns:o="urn:schemas-microsoft-com:office:office" xmlns:r="http://schemas.openxmlformats.org/officeDocument/2006/relationships" xmlns:m="http://schemas.openxmlformats.org/officeDocument/2006/math" xmlns:v="urn:schemas-microsoft-com:vml" xmlns:wp14="http://schemas.microsoft.com/office/word/2010/wordprocessingDrawing" xmlns:wp="http://schemas.openxmlformats.org/drawingml/2006/wordprocessingDrawing" xmlns:w10="urn:schemas-microsoft-com:office:word" xmlns:w="http://schemas.openxmlformats.org/wordprocessingml/2006/main" xmlns:w14="http://schemas.microsoft.com/office/word/2010/wordml" xmlns:w15="http://schemas.microsoft.com/office/word/2012/wordml" xmlns:w16cex="http://schemas.microsoft.com/office/word/2018/wordml/cex" xmlns:w16cid="http://schemas.microsoft.com/office/word/2016/wordml/cid" xmlns:w16="http://schemas.microsoft.com/office/word/2018/wordml" xmlns:w16se="http://schemas.microsoft.com/office/word/2015/wordml/symex" xmlns:wpg="http://schemas.microsoft.com/office/word/2010/wordprocessingGroup" xmlns:wpi="http://schemas.microsoft.com/office/word/2010/wordprocessingInk" xmlns:wne="http://schemas.microsoft.com/office/word/2006/wordml" xmlns:wps="http://schemas.microsoft.com/office/word/2010/wordprocessingShape" mc:Ignorable="w14 w15 w16se w16cid w16 w16cex wp14">
+<w:ftr xmlns:wpc="http://schemas.microsoft.com/office/word/2010/wordprocessingCanvas" xmlns:mc="http://schemas.openxmlformats.org/markup-compatibility/2006" xmlns:o="urn:schemas-microsoft-com:office:office" xmlns:r="http://schemas.openxmlformats.org/officeDocument/2006/relationships" xmlns:m="http://schemas.openxmlformats.org/officeDocument/2006/math" xmlns:v="urn:schemas-microsoft-com:vml" xmlns:wp14="http://schemas.microsoft.com/office/word/2010/wordprocessingDrawing" xmlns:wp="http://schemas.openxmlformats.org/drawingml/2006/wordprocessingDrawing" xmlns:w10="urn:schemas-microsoft-com:office:word" xmlns:w="http://schemas.openxmlformats.org/wordprocessingml/2006/main" xmlns:w14="http://schemas.microsoft.com/office/word/2010/wordml" xmlns:w15="http://schemas.microsoft.com/office/word/2012/wordml" xmlns:wpg="http://schemas.microsoft.com/office/word/2010/wordprocessingGroup" xmlns:wpi="http://schemas.microsoft.com/office/word/2010/wordprocessingInk" xmlns:wne="http://schemas.microsoft.com/office/word/2006/wordml" xmlns:wps="http://schemas.microsoft.com/office/word/2010/wordprocessingShape" mc:Ignorable="w14 w15 wp14">
   <w:tbl>
     <w:tblPr>
       <w:tblW w:w="5084" w:type="dxa"/>
@@ -19236,7 +20714,25 @@
         <w:sz w:val="20"/>
         <w:szCs w:val="20"/>
       </w:rPr>
-      <w:t xml:space="preserve">Tous droits de reproduction réservés - </w:t>
+      <w:t xml:space="preserve">Tous droits de reproduction réservés </w:t>
+    </w:r>
+    <w:r>
+      <w:rPr>
+        <w:rFonts w:ascii="Arial" w:hAnsi="Arial" w:cs="Arial"/>
+        <w:bCs/>
+        <w:sz w:val="20"/>
+        <w:szCs w:val="20"/>
+      </w:rPr>
+      <w:t>–</w:t>
+    </w:r>
+    <w:r>
+      <w:rPr>
+        <w:rFonts w:ascii="Arial" w:hAnsi="Arial" w:cs="Arial"/>
+        <w:bCs/>
+        <w:sz w:val="20"/>
+        <w:szCs w:val="20"/>
+      </w:rPr>
+      <w:t xml:space="preserve"> </w:t>
     </w:r>
     <w:r>
       <w:rPr>
@@ -19246,7 +20742,73 @@
         <w:sz w:val="20"/>
         <w:szCs w:val="20"/>
       </w:rPr>
-      <w:t>Ouest INSA</w:t>
+      <w:t>{</w:t>
+    </w:r>
+    <w:proofErr w:type="gramStart"/>
+    <w:r>
+      <w:rPr>
+        <w:rFonts w:ascii="Arial" w:hAnsi="Arial" w:cs="Arial"/>
+        <w:b/>
+        <w:bCs/>
+        <w:sz w:val="20"/>
+        <w:szCs w:val="20"/>
+      </w:rPr>
+      <w:t xml:space="preserve">{ </w:t>
+    </w:r>
+    <w:proofErr w:type="spellStart"/>
+    <w:r>
+      <w:rPr>
+        <w:rFonts w:ascii="Arial" w:hAnsi="Arial" w:cs="Arial"/>
+        <w:b/>
+        <w:bCs/>
+        <w:sz w:val="20"/>
+        <w:szCs w:val="20"/>
+      </w:rPr>
+      <w:t>param</w:t>
+    </w:r>
+    <w:proofErr w:type="spellEnd"/>
+    <w:proofErr w:type="gramEnd"/>
+    <w:r>
+      <w:rPr>
+        <w:rFonts w:ascii="Arial" w:hAnsi="Arial" w:cs="Arial"/>
+        <w:b/>
+        <w:bCs/>
+        <w:sz w:val="20"/>
+        <w:szCs w:val="20"/>
+      </w:rPr>
+      <w:t>(</w:t>
+    </w:r>
+    <w:r>
+      <w:rPr>
+        <w:rFonts w:ascii="Arial" w:eastAsia="Arial" w:hAnsi="Arial" w:cs="Arial"/>
+        <w:b/>
+        <w:color w:val="000000"/>
+        <w:sz w:val="20"/>
+        <w:szCs w:val="20"/>
+      </w:rPr>
+      <w:t>'</w:t>
+    </w:r>
+    <w:proofErr w:type="spellStart"/>
+    <w:r>
+      <w:rPr>
+        <w:rFonts w:ascii="Arial" w:eastAsia="Arial" w:hAnsi="Arial" w:cs="Arial"/>
+        <w:b/>
+        <w:color w:val="000000"/>
+        <w:sz w:val="20"/>
+        <w:szCs w:val="20"/>
+      </w:rPr>
+      <w:t>je_name</w:t>
+    </w:r>
+    <w:proofErr w:type="spellEnd"/>
+    <w:r>
+      <w:rPr>
+        <w:rFonts w:ascii="Arial" w:eastAsia="Arial" w:hAnsi="Arial" w:cs="Arial"/>
+        <w:b/>
+        <w:color w:val="000000"/>
+        <w:sz w:val="20"/>
+        <w:szCs w:val="20"/>
+      </w:rPr>
+      <w:t>') }}</w:t>
     </w:r>
     <w:r>
       <w:rPr>
@@ -19293,7 +20855,7 @@
 </file>
 
 <file path=word/footnotes.xml><?xml version="1.0" encoding="utf-8"?>
-<w:footnotes xmlns:wpc="http://schemas.microsoft.com/office/word/2010/wordprocessingCanvas" xmlns:cx="http://schemas.microsoft.com/office/drawing/2014/chartex" xmlns:cx1="http://schemas.microsoft.com/office/drawing/2015/9/8/chartex" xmlns:cx2="http://schemas.microsoft.com/office/drawing/2015/10/21/chartex" xmlns:cx3="http://schemas.microsoft.com/office/drawing/2016/5/9/chartex" xmlns:cx4="http://schemas.microsoft.com/office/drawing/2016/5/10/chartex" xmlns:cx5="http://schemas.microsoft.com/office/drawing/2016/5/11/chartex" xmlns:cx6="http://schemas.microsoft.com/office/drawing/2016/5/12/chartex" xmlns:cx7="http://schemas.microsoft.com/office/drawing/2016/5/13/chartex" xmlns:cx8="http://schemas.microsoft.com/office/drawing/2016/5/14/chartex" xmlns:mc="http://schemas.openxmlformats.org/markup-compatibility/2006" xmlns:aink="http://schemas.microsoft.com/office/drawing/2016/ink" xmlns:am3d="http://schemas.microsoft.com/office/drawing/2017/model3d" xmlns:o="urn:schemas-microsoft-com:office:office" xmlns:r="http://schemas.openxmlformats.org/officeDocument/2006/relationships" xmlns:m="http://schemas.openxmlformats.org/officeDocument/2006/math" xmlns:v="urn:schemas-microsoft-com:vml" xmlns:wp14="http://schemas.microsoft.com/office/word/2010/wordprocessingDrawing" xmlns:wp="http://schemas.openxmlformats.org/drawingml/2006/wordprocessingDrawing" xmlns:w10="urn:schemas-microsoft-com:office:word" xmlns:w="http://schemas.openxmlformats.org/wordprocessingml/2006/main" xmlns:w14="http://schemas.microsoft.com/office/word/2010/wordml" xmlns:w15="http://schemas.microsoft.com/office/word/2012/wordml" xmlns:w16cex="http://schemas.microsoft.com/office/word/2018/wordml/cex" xmlns:w16cid="http://schemas.microsoft.com/office/word/2016/wordml/cid" xmlns:w16="http://schemas.microsoft.com/office/word/2018/wordml" xmlns:w16se="http://schemas.microsoft.com/office/word/2015/wordml/symex" xmlns:wpg="http://schemas.microsoft.com/office/word/2010/wordprocessingGroup" xmlns:wpi="http://schemas.microsoft.com/office/word/2010/wordprocessingInk" xmlns:wne="http://schemas.microsoft.com/office/word/2006/wordml" xmlns:wps="http://schemas.microsoft.com/office/word/2010/wordprocessingShape" mc:Ignorable="w14 w15 w16se w16cid w16 w16cex wp14">
+<w:footnotes xmlns:wpc="http://schemas.microsoft.com/office/word/2010/wordprocessingCanvas" xmlns:mc="http://schemas.openxmlformats.org/markup-compatibility/2006" xmlns:o="urn:schemas-microsoft-com:office:office" xmlns:r="http://schemas.openxmlformats.org/officeDocument/2006/relationships" xmlns:m="http://schemas.openxmlformats.org/officeDocument/2006/math" xmlns:v="urn:schemas-microsoft-com:vml" xmlns:wp14="http://schemas.microsoft.com/office/word/2010/wordprocessingDrawing" xmlns:wp="http://schemas.openxmlformats.org/drawingml/2006/wordprocessingDrawing" xmlns:w10="urn:schemas-microsoft-com:office:word" xmlns:w="http://schemas.openxmlformats.org/wordprocessingml/2006/main" xmlns:w14="http://schemas.microsoft.com/office/word/2010/wordml" xmlns:w15="http://schemas.microsoft.com/office/word/2012/wordml" xmlns:wpg="http://schemas.microsoft.com/office/word/2010/wordprocessingGroup" xmlns:wpi="http://schemas.microsoft.com/office/word/2010/wordprocessingInk" xmlns:wne="http://schemas.microsoft.com/office/word/2006/wordml" xmlns:wps="http://schemas.microsoft.com/office/word/2010/wordprocessingShape" mc:Ignorable="w14 w15 wp14">
   <w:footnote w:type="separator" w:id="-1">
     <w:p>
       <w:pPr>
@@ -19318,7 +20880,7 @@
 </file>
 
 <file path=word/header1.xml><?xml version="1.0" encoding="utf-8"?>
-<w:hdr xmlns:wpc="http://schemas.microsoft.com/office/word/2010/wordprocessingCanvas" xmlns:cx="http://schemas.microsoft.com/office/drawing/2014/chartex" xmlns:cx1="http://schemas.microsoft.com/office/drawing/2015/9/8/chartex" xmlns:cx2="http://schemas.microsoft.com/office/drawing/2015/10/21/chartex" xmlns:cx3="http://schemas.microsoft.com/office/drawing/2016/5/9/chartex" xmlns:cx4="http://schemas.microsoft.com/office/drawing/2016/5/10/chartex" xmlns:cx5="http://schemas.microsoft.com/office/drawing/2016/5/11/chartex" xmlns:cx6="http://schemas.microsoft.com/office/drawing/2016/5/12/chartex" xmlns:cx7="http://schemas.microsoft.com/office/drawing/2016/5/13/chartex" xmlns:cx8="http://schemas.microsoft.com/office/drawing/2016/5/14/chartex" xmlns:mc="http://schemas.openxmlformats.org/markup-compatibility/2006" xmlns:aink="http://schemas.microsoft.com/office/drawing/2016/ink" xmlns:am3d="http://schemas.microsoft.com/office/drawing/2017/model3d" xmlns:o="urn:schemas-microsoft-com:office:office" xmlns:r="http://schemas.openxmlformats.org/officeDocument/2006/relationships" xmlns:m="http://schemas.openxmlformats.org/officeDocument/2006/math" xmlns:v="urn:schemas-microsoft-com:vml" xmlns:wp14="http://schemas.microsoft.com/office/word/2010/wordprocessingDrawing" xmlns:wp="http://schemas.openxmlformats.org/drawingml/2006/wordprocessingDrawing" xmlns:w10="urn:schemas-microsoft-com:office:word" xmlns:w="http://schemas.openxmlformats.org/wordprocessingml/2006/main" xmlns:w14="http://schemas.microsoft.com/office/word/2010/wordml" xmlns:w15="http://schemas.microsoft.com/office/word/2012/wordml" xmlns:w16cex="http://schemas.microsoft.com/office/word/2018/wordml/cex" xmlns:w16cid="http://schemas.microsoft.com/office/word/2016/wordml/cid" xmlns:w16="http://schemas.microsoft.com/office/word/2018/wordml" xmlns:w16se="http://schemas.microsoft.com/office/word/2015/wordml/symex" xmlns:wpg="http://schemas.microsoft.com/office/word/2010/wordprocessingGroup" xmlns:wpi="http://schemas.microsoft.com/office/word/2010/wordprocessingInk" xmlns:wne="http://schemas.microsoft.com/office/word/2006/wordml" xmlns:wps="http://schemas.microsoft.com/office/word/2010/wordprocessingShape" mc:Ignorable="w14 w15 w16se w16cid w16 w16cex wp14">
+<w:hdr xmlns:wpc="http://schemas.microsoft.com/office/word/2010/wordprocessingCanvas" xmlns:mc="http://schemas.openxmlformats.org/markup-compatibility/2006" xmlns:o="urn:schemas-microsoft-com:office:office" xmlns:r="http://schemas.openxmlformats.org/officeDocument/2006/relationships" xmlns:m="http://schemas.openxmlformats.org/officeDocument/2006/math" xmlns:v="urn:schemas-microsoft-com:vml" xmlns:wp14="http://schemas.microsoft.com/office/word/2010/wordprocessingDrawing" xmlns:wp="http://schemas.openxmlformats.org/drawingml/2006/wordprocessingDrawing" xmlns:w10="urn:schemas-microsoft-com:office:word" xmlns:w="http://schemas.openxmlformats.org/wordprocessingml/2006/main" xmlns:w14="http://schemas.microsoft.com/office/word/2010/wordml" xmlns:w15="http://schemas.microsoft.com/office/word/2012/wordml" xmlns:wpg="http://schemas.microsoft.com/office/word/2010/wordprocessingGroup" xmlns:wpi="http://schemas.microsoft.com/office/word/2010/wordprocessingInk" xmlns:wne="http://schemas.microsoft.com/office/word/2006/wordml" xmlns:wps="http://schemas.microsoft.com/office/word/2010/wordprocessingShape" mc:Ignorable="w14 w15 wp14">
   <w:tbl>
     <w:tblPr>
       <w:tblW w:w="9074" w:type="dxa"/>
@@ -19366,7 +20928,21 @@
             <w:rPr>
               <w:rFonts w:ascii="Arial" w:hAnsi="Arial" w:cs="Arial"/>
             </w:rPr>
-            <w:t xml:space="preserve">CE_{{ </w:t>
+            <w:t>CE</w:t>
+          </w:r>
+          <w:proofErr w:type="gramStart"/>
+          <w:r>
+            <w:rPr>
+              <w:rFonts w:ascii="Arial" w:hAnsi="Arial" w:cs="Arial"/>
+            </w:rPr>
+            <w:t>_{</w:t>
+          </w:r>
+          <w:proofErr w:type="gramEnd"/>
+          <w:r>
+            <w:rPr>
+              <w:rFonts w:ascii="Arial" w:hAnsi="Arial" w:cs="Arial"/>
+            </w:rPr>
+            <w:t xml:space="preserve">{ </w:t>
           </w:r>
           <w:proofErr w:type="spellStart"/>
           <w:r>
@@ -19453,7 +21029,15 @@
               <w:rFonts w:ascii="Arial" w:hAnsi="Arial" w:cs="Arial"/>
               <w:sz w:val="24"/>
             </w:rPr>
-            <w:t xml:space="preserve">{{ </w:t>
+            <w:t>{</w:t>
+          </w:r>
+          <w:proofErr w:type="gramStart"/>
+          <w:r>
+            <w:rPr>
+              <w:rFonts w:ascii="Arial" w:hAnsi="Arial" w:cs="Arial"/>
+              <w:sz w:val="24"/>
+            </w:rPr>
+            <w:t xml:space="preserve">{ </w:t>
           </w:r>
           <w:proofErr w:type="spellStart"/>
           <w:r>
@@ -19464,6 +21048,7 @@
             <w:t>dateShort</w:t>
           </w:r>
           <w:proofErr w:type="spellEnd"/>
+          <w:proofErr w:type="gramEnd"/>
           <w:r>
             <w:rPr>
               <w:rFonts w:ascii="Arial" w:hAnsi="Arial" w:cs="Arial"/>
@@ -19515,7 +21100,16 @@
               <w:sz w:val="28"/>
               <w:szCs w:val="28"/>
             </w:rPr>
-            <w:t>{{ etude.n</w:t>
+            <w:t>{</w:t>
+          </w:r>
+          <w:proofErr w:type="gramStart"/>
+          <w:r>
+            <w:rPr>
+              <w:rFonts w:ascii="Arial" w:hAnsi="Arial" w:cs="Arial"/>
+              <w:sz w:val="28"/>
+              <w:szCs w:val="28"/>
+            </w:rPr>
+            <w:t>{ etude.n</w:t>
           </w:r>
           <w:r>
             <w:rPr>
@@ -19525,6 +21119,7 @@
             </w:rPr>
             <w:t>ame</w:t>
           </w:r>
+          <w:proofErr w:type="gramEnd"/>
           <w:r>
             <w:rPr>
               <w:rFonts w:ascii="Arial" w:hAnsi="Arial" w:cs="Arial"/>
@@ -19608,9 +21203,10 @@
           <w:r>
             <w:rPr>
               <w:rFonts w:ascii="Arial" w:eastAsia="Calibri" w:hAnsi="Arial" w:cs="Arial"/>
+              <w:noProof/>
               <w:sz w:val="24"/>
             </w:rPr>
-            <w:t>6</w:t>
+            <w:t>14</w:t>
           </w:r>
           <w:r>
             <w:rPr>
@@ -19664,9 +21260,10 @@
           <w:r>
             <w:rPr>
               <w:rFonts w:ascii="Arial" w:eastAsia="Calibri" w:hAnsi="Arial" w:cs="Arial"/>
+              <w:noProof/>
               <w:sz w:val="24"/>
             </w:rPr>
-            <w:t>15</w:t>
+            <w:t>19</w:t>
           </w:r>
           <w:r>
             <w:rPr>
@@ -19688,8 +21285,8 @@
 </file>
 
 <file path=word/numbering.xml><?xml version="1.0" encoding="utf-8"?>
-<w:numbering xmlns:wpc="http://schemas.microsoft.com/office/word/2010/wordprocessingCanvas" xmlns:cx="http://schemas.microsoft.com/office/drawing/2014/chartex" xmlns:cx1="http://schemas.microsoft.com/office/drawing/2015/9/8/chartex" xmlns:cx2="http://schemas.microsoft.com/office/drawing/2015/10/21/chartex" xmlns:cx3="http://schemas.microsoft.com/office/drawing/2016/5/9/chartex" xmlns:cx4="http://schemas.microsoft.com/office/drawing/2016/5/10/chartex" xmlns:cx5="http://schemas.microsoft.com/office/drawing/2016/5/11/chartex" xmlns:cx6="http://schemas.microsoft.com/office/drawing/2016/5/12/chartex" xmlns:cx7="http://schemas.microsoft.com/office/drawing/2016/5/13/chartex" xmlns:cx8="http://schemas.microsoft.com/office/drawing/2016/5/14/chartex" xmlns:mc="http://schemas.openxmlformats.org/markup-compatibility/2006" xmlns:aink="http://schemas.microsoft.com/office/drawing/2016/ink" xmlns:am3d="http://schemas.microsoft.com/office/drawing/2017/model3d" xmlns:o="urn:schemas-microsoft-com:office:office" xmlns:r="http://schemas.openxmlformats.org/officeDocument/2006/relationships" xmlns:m="http://schemas.openxmlformats.org/officeDocument/2006/math" xmlns:v="urn:schemas-microsoft-com:vml" xmlns:wp14="http://schemas.microsoft.com/office/word/2010/wordprocessingDrawing" xmlns:wp="http://schemas.openxmlformats.org/drawingml/2006/wordprocessingDrawing" xmlns:w10="urn:schemas-microsoft-com:office:word" xmlns:w="http://schemas.openxmlformats.org/wordprocessingml/2006/main" xmlns:w14="http://schemas.microsoft.com/office/word/2010/wordml" xmlns:w15="http://schemas.microsoft.com/office/word/2012/wordml" xmlns:w16cex="http://schemas.microsoft.com/office/word/2018/wordml/cex" xmlns:w16cid="http://schemas.microsoft.com/office/word/2016/wordml/cid" xmlns:w16="http://schemas.microsoft.com/office/word/2018/wordml" xmlns:w16se="http://schemas.microsoft.com/office/word/2015/wordml/symex" xmlns:wpg="http://schemas.microsoft.com/office/word/2010/wordprocessingGroup" xmlns:wpi="http://schemas.microsoft.com/office/word/2010/wordprocessingInk" xmlns:wne="http://schemas.microsoft.com/office/word/2006/wordml" xmlns:wps="http://schemas.microsoft.com/office/word/2010/wordprocessingShape" mc:Ignorable="w14 w15 w16se w16cid w16 w16cex wp14">
-  <w:abstractNum w:abstractNumId="0" w15:restartNumberingAfterBreak="0">
+<w:numbering xmlns:wpc="http://schemas.microsoft.com/office/word/2010/wordprocessingCanvas" xmlns:mc="http://schemas.openxmlformats.org/markup-compatibility/2006" xmlns:o="urn:schemas-microsoft-com:office:office" xmlns:r="http://schemas.openxmlformats.org/officeDocument/2006/relationships" xmlns:m="http://schemas.openxmlformats.org/officeDocument/2006/math" xmlns:v="urn:schemas-microsoft-com:vml" xmlns:wp14="http://schemas.microsoft.com/office/word/2010/wordprocessingDrawing" xmlns:wp="http://schemas.openxmlformats.org/drawingml/2006/wordprocessingDrawing" xmlns:w10="urn:schemas-microsoft-com:office:word" xmlns:w="http://schemas.openxmlformats.org/wordprocessingml/2006/main" xmlns:w14="http://schemas.microsoft.com/office/word/2010/wordml" xmlns:w15="http://schemas.microsoft.com/office/word/2012/wordml" xmlns:wpg="http://schemas.microsoft.com/office/word/2010/wordprocessingGroup" xmlns:wpi="http://schemas.microsoft.com/office/word/2010/wordprocessingInk" xmlns:wne="http://schemas.microsoft.com/office/word/2006/wordml" xmlns:wps="http://schemas.microsoft.com/office/word/2010/wordprocessingShape" mc:Ignorable="w14 w15 wp14">
+  <w:abstractNum w:abstractNumId="0">
     <w:nsid w:val="472F0F92"/>
     <w:multiLevelType w:val="multilevel"/>
     <w:tmpl w:val="472F0F92"/>
@@ -19801,7 +21398,7 @@
       </w:rPr>
     </w:lvl>
   </w:abstractNum>
-  <w:abstractNum w:abstractNumId="1" w15:restartNumberingAfterBreak="0">
+  <w:abstractNum w:abstractNumId="1">
     <w:nsid w:val="581B3D11"/>
     <w:multiLevelType w:val="multilevel"/>
     <w:tmpl w:val="581B3D11"/>
@@ -19960,7 +21557,7 @@
       </w:pPr>
     </w:lvl>
   </w:abstractNum>
-  <w:abstractNum w:abstractNumId="2" w15:restartNumberingAfterBreak="0">
+  <w:abstractNum w:abstractNumId="2">
     <w:nsid w:val="670625D8"/>
     <w:multiLevelType w:val="multilevel"/>
     <w:tmpl w:val="670625D8"/>
@@ -20086,7 +21683,7 @@
 </file>
 
 <file path=word/styles.xml><?xml version="1.0" encoding="utf-8"?>
-<w:styles xmlns:mc="http://schemas.openxmlformats.org/markup-compatibility/2006" xmlns:r="http://schemas.openxmlformats.org/officeDocument/2006/relationships" xmlns:w="http://schemas.openxmlformats.org/wordprocessingml/2006/main" xmlns:w14="http://schemas.microsoft.com/office/word/2010/wordml" xmlns:w15="http://schemas.microsoft.com/office/word/2012/wordml" xmlns:w16cex="http://schemas.microsoft.com/office/word/2018/wordml/cex" xmlns:w16cid="http://schemas.microsoft.com/office/word/2016/wordml/cid" xmlns:w16="http://schemas.microsoft.com/office/word/2018/wordml" xmlns:w16se="http://schemas.microsoft.com/office/word/2015/wordml/symex" mc:Ignorable="w14 w15 w16se w16cid w16 w16cex">
+<w:styles xmlns:mc="http://schemas.openxmlformats.org/markup-compatibility/2006" xmlns:r="http://schemas.openxmlformats.org/officeDocument/2006/relationships" xmlns:w="http://schemas.openxmlformats.org/wordprocessingml/2006/main" xmlns:w14="http://schemas.microsoft.com/office/word/2010/wordml" xmlns:w15="http://schemas.microsoft.com/office/word/2012/wordml" mc:Ignorable="w14 w15">
   <w:docDefaults>
     <w:rPrDefault>
       <w:rPr>
@@ -20100,7 +21697,7 @@
       </w:pPr>
     </w:pPrDefault>
   </w:docDefaults>
-  <w:latentStyles w:defLockedState="0" w:defUIPriority="0" w:defSemiHidden="0" w:defUnhideWhenUsed="0" w:defQFormat="0" w:count="376">
+  <w:latentStyles w:defLockedState="0" w:defUIPriority="0" w:defSemiHidden="0" w:defUnhideWhenUsed="0" w:defQFormat="0" w:count="371">
     <w:lsdException w:name="Normal" w:qFormat="1"/>
     <w:lsdException w:name="heading 1" w:qFormat="1"/>
     <w:lsdException w:name="heading 2" w:qFormat="1"/>
@@ -20463,11 +22060,6 @@
     <w:lsdException w:name="List Table 5 Dark Accent 6" w:uiPriority="50"/>
     <w:lsdException w:name="List Table 6 Colorful Accent 6" w:uiPriority="51"/>
     <w:lsdException w:name="List Table 7 Colorful Accent 6" w:uiPriority="52"/>
-    <w:lsdException w:name="Mention" w:semiHidden="1" w:uiPriority="99" w:unhideWhenUsed="1"/>
-    <w:lsdException w:name="Smart Hyperlink" w:semiHidden="1" w:uiPriority="99" w:unhideWhenUsed="1"/>
-    <w:lsdException w:name="Hashtag" w:semiHidden="1" w:uiPriority="99" w:unhideWhenUsed="1"/>
-    <w:lsdException w:name="Unresolved Mention" w:semiHidden="1" w:uiPriority="99" w:unhideWhenUsed="1"/>
-    <w:lsdException w:name="Smart Link" w:semiHidden="1" w:uiPriority="99" w:unhideWhenUsed="1"/>
   </w:latentStyles>
   <w:style w:type="paragraph" w:default="1" w:styleId="Normal">
     <w:name w:val="Normal"/>
@@ -20835,6 +22427,7 @@
       <w:jc w:val="both"/>
     </w:pPr>
     <w:tblPr>
+      <w:tblInd w:w="0" w:type="dxa"/>
       <w:tblBorders>
         <w:top w:val="single" w:sz="4" w:space="0" w:color="auto"/>
         <w:left w:val="single" w:sz="4" w:space="0" w:color="auto"/>
@@ -20843,6 +22436,12 @@
         <w:insideH w:val="single" w:sz="4" w:space="0" w:color="auto"/>
         <w:insideV w:val="single" w:sz="4" w:space="0" w:color="auto"/>
       </w:tblBorders>
+      <w:tblCellMar>
+        <w:top w:w="0" w:type="dxa"/>
+        <w:left w:w="108" w:type="dxa"/>
+        <w:bottom w:w="0" w:type="dxa"/>
+        <w:right w:w="108" w:type="dxa"/>
+      </w:tblCellMar>
     </w:tblPr>
   </w:style>
   <w:style w:type="paragraph" w:styleId="Titre">

</xml_diff>

<commit_message>
Fixed the gantt in the CE generation
</commit_message>
<xml_diff>
--- a/flower_backend/doctypes/CETUDE.docx
+++ b/flower_backend/doctypes/CETUDE.docx
@@ -701,6 +701,7 @@
                 <w:rFonts w:ascii="Arial" w:eastAsia="Calibri" w:hAnsi="Arial" w:cs="Arial"/>
                 <w:color w:val="000000" w:themeColor="text1"/>
                 <w:szCs w:val="28"/>
+                <w:lang w:val="en-GB"/>
               </w:rPr>
             </w:pPr>
             <w:r>
@@ -708,74 +709,72 @@
                 <w:rFonts w:ascii="Arial" w:eastAsia="Calibri" w:hAnsi="Arial" w:cs="Arial"/>
                 <w:color w:val="000000" w:themeColor="text1"/>
                 <w:szCs w:val="28"/>
-              </w:rPr>
-              <w:t>{</w:t>
-            </w:r>
-            <w:proofErr w:type="gramStart"/>
+                <w:lang w:val="en-GB"/>
+              </w:rPr>
+              <w:t>{{</w:t>
+            </w:r>
             <w:r>
               <w:rPr>
                 <w:rFonts w:ascii="Arial" w:eastAsia="Calibri" w:hAnsi="Arial" w:cs="Arial"/>
                 <w:color w:val="000000" w:themeColor="text1"/>
                 <w:szCs w:val="28"/>
-              </w:rPr>
-              <w:t>{</w:t>
-            </w:r>
+                <w:lang w:val="en-GB"/>
+              </w:rPr>
+              <w:t xml:space="preserve"> </w:t>
+            </w:r>
+            <w:proofErr w:type="spellStart"/>
             <w:r>
               <w:rPr>
                 <w:rFonts w:ascii="Arial" w:eastAsia="Calibri" w:hAnsi="Arial" w:cs="Arial"/>
                 <w:color w:val="000000" w:themeColor="text1"/>
                 <w:szCs w:val="28"/>
-              </w:rPr>
-              <w:t xml:space="preserve"> </w:t>
-            </w:r>
-            <w:proofErr w:type="spellStart"/>
+                <w:lang w:val="en-GB"/>
+              </w:rPr>
+              <w:t>e</w:t>
+            </w:r>
             <w:r>
               <w:rPr>
                 <w:rFonts w:ascii="Arial" w:eastAsia="Calibri" w:hAnsi="Arial" w:cs="Arial"/>
                 <w:color w:val="000000" w:themeColor="text1"/>
                 <w:szCs w:val="28"/>
-              </w:rPr>
-              <w:t>e</w:t>
+                <w:lang w:val="en-GB"/>
+              </w:rPr>
+              <w:t>tude.</w:t>
             </w:r>
             <w:r>
               <w:rPr>
                 <w:rFonts w:ascii="Arial" w:eastAsia="Calibri" w:hAnsi="Arial" w:cs="Arial"/>
                 <w:color w:val="000000" w:themeColor="text1"/>
                 <w:szCs w:val="28"/>
-              </w:rPr>
-              <w:t>tude.</w:t>
+                <w:lang w:val="en-GB"/>
+              </w:rPr>
+              <w:t>projectManager</w:t>
             </w:r>
             <w:r>
               <w:rPr>
                 <w:rFonts w:ascii="Arial" w:eastAsia="Calibri" w:hAnsi="Arial" w:cs="Arial"/>
                 <w:color w:val="000000" w:themeColor="text1"/>
                 <w:szCs w:val="28"/>
-              </w:rPr>
-              <w:t>projectManager</w:t>
-            </w:r>
+                <w:lang w:val="en-GB"/>
+              </w:rPr>
+              <w:t>.mail</w:t>
+            </w:r>
+            <w:proofErr w:type="spellEnd"/>
             <w:r>
               <w:rPr>
                 <w:rFonts w:ascii="Arial" w:eastAsia="Calibri" w:hAnsi="Arial" w:cs="Arial"/>
                 <w:color w:val="000000" w:themeColor="text1"/>
                 <w:szCs w:val="28"/>
-              </w:rPr>
-              <w:t>.mail</w:t>
-            </w:r>
-            <w:proofErr w:type="spellEnd"/>
-            <w:proofErr w:type="gramEnd"/>
+                <w:lang w:val="en-GB"/>
+              </w:rPr>
+              <w:t xml:space="preserve"> </w:t>
+            </w:r>
             <w:r>
               <w:rPr>
                 <w:rFonts w:ascii="Arial" w:eastAsia="Calibri" w:hAnsi="Arial" w:cs="Arial"/>
                 <w:color w:val="000000" w:themeColor="text1"/>
                 <w:szCs w:val="28"/>
-              </w:rPr>
-              <w:t xml:space="preserve"> </w:t>
-            </w:r>
-            <w:r>
-              <w:rPr>
-                <w:rFonts w:ascii="Arial" w:eastAsia="Calibri" w:hAnsi="Arial" w:cs="Arial"/>
-                <w:color w:val="000000" w:themeColor="text1"/>
-                <w:szCs w:val="28"/>
+                <w:lang w:val="en-GB"/>
               </w:rPr>
               <w:t>}}</w:t>
             </w:r>
@@ -972,6 +971,7 @@
                 <w:color w:val="000000"/>
                 <w:sz w:val="22"/>
                 <w:szCs w:val="22"/>
+                <w:lang w:val="en-GB"/>
               </w:rPr>
             </w:pPr>
             <w:r>
@@ -979,34 +979,27 @@
                 <w:rFonts w:ascii="Arial" w:hAnsi="Arial" w:cs="Arial"/>
                 <w:sz w:val="22"/>
                 <w:szCs w:val="22"/>
-              </w:rPr>
-              <w:t>{</w:t>
-            </w:r>
-            <w:proofErr w:type="gramStart"/>
+                <w:lang w:val="en-GB"/>
+              </w:rPr>
+              <w:t xml:space="preserve">{{ </w:t>
+            </w:r>
+            <w:proofErr w:type="spellStart"/>
             <w:r>
               <w:rPr>
                 <w:rFonts w:ascii="Arial" w:hAnsi="Arial" w:cs="Arial"/>
                 <w:sz w:val="22"/>
                 <w:szCs w:val="22"/>
-              </w:rPr>
-              <w:t xml:space="preserve">{ </w:t>
-            </w:r>
-            <w:proofErr w:type="spellStart"/>
+                <w:lang w:val="en-GB"/>
+              </w:rPr>
+              <w:t>param</w:t>
+            </w:r>
+            <w:proofErr w:type="spellEnd"/>
             <w:r>
               <w:rPr>
                 <w:rFonts w:ascii="Arial" w:hAnsi="Arial" w:cs="Arial"/>
                 <w:sz w:val="22"/>
                 <w:szCs w:val="22"/>
-              </w:rPr>
-              <w:t>param</w:t>
-            </w:r>
-            <w:proofErr w:type="spellEnd"/>
-            <w:proofErr w:type="gramEnd"/>
-            <w:r>
-              <w:rPr>
-                <w:rFonts w:ascii="Arial" w:hAnsi="Arial" w:cs="Arial"/>
-                <w:sz w:val="22"/>
-                <w:szCs w:val="22"/>
+                <w:lang w:val="en-GB"/>
               </w:rPr>
               <w:t>(</w:t>
             </w:r>
@@ -1016,6 +1009,7 @@
                 <w:color w:val="000000"/>
                 <w:sz w:val="22"/>
                 <w:szCs w:val="22"/>
+                <w:lang w:val="en-GB"/>
               </w:rPr>
               <w:t>'</w:t>
             </w:r>
@@ -1026,6 +1020,7 @@
                 <w:color w:val="000000"/>
                 <w:sz w:val="22"/>
                 <w:szCs w:val="22"/>
+                <w:lang w:val="en-GB"/>
               </w:rPr>
               <w:t>je_name</w:t>
             </w:r>
@@ -1036,6 +1031,7 @@
                 <w:color w:val="000000"/>
                 <w:sz w:val="22"/>
                 <w:szCs w:val="22"/>
+                <w:lang w:val="en-GB"/>
               </w:rPr>
               <w:t>') }}</w:t>
             </w:r>
@@ -1168,6 +1164,7 @@
                 <w:color w:val="000000"/>
                 <w:sz w:val="22"/>
                 <w:szCs w:val="22"/>
+                <w:lang w:val="en-GB"/>
               </w:rPr>
             </w:pPr>
             <w:r>
@@ -1187,6 +1184,7 @@
                 <w:color w:val="000000" w:themeColor="text1"/>
                 <w:sz w:val="22"/>
                 <w:szCs w:val="22"/>
+                <w:lang w:val="en-GB"/>
               </w:rPr>
               <w:t xml:space="preserve">  </w:t>
             </w:r>
@@ -1195,6 +1193,7 @@
                 <w:rFonts w:ascii="Arial" w:hAnsi="Arial" w:cs="Arial"/>
                 <w:sz w:val="22"/>
                 <w:szCs w:val="22"/>
+                <w:lang w:val="en-GB"/>
               </w:rPr>
               <w:t>{</w:t>
             </w:r>
@@ -1204,6 +1203,7 @@
                 <w:rFonts w:ascii="Arial" w:hAnsi="Arial" w:cs="Arial"/>
                 <w:sz w:val="22"/>
                 <w:szCs w:val="22"/>
+                <w:lang w:val="en-GB"/>
               </w:rPr>
               <w:t xml:space="preserve">{ </w:t>
             </w:r>
@@ -1213,6 +1213,7 @@
                 <w:rFonts w:ascii="Arial" w:hAnsi="Arial" w:cs="Arial"/>
                 <w:sz w:val="22"/>
                 <w:szCs w:val="22"/>
+                <w:lang w:val="en-GB"/>
               </w:rPr>
               <w:t>param</w:t>
             </w:r>
@@ -1223,6 +1224,7 @@
                 <w:rFonts w:ascii="Arial" w:hAnsi="Arial" w:cs="Arial"/>
                 <w:sz w:val="22"/>
                 <w:szCs w:val="22"/>
+                <w:lang w:val="en-GB"/>
               </w:rPr>
               <w:t>(</w:t>
             </w:r>
@@ -1232,6 +1234,7 @@
                 <w:color w:val="000000"/>
                 <w:sz w:val="22"/>
                 <w:szCs w:val="22"/>
+                <w:lang w:val="en-GB"/>
               </w:rPr>
               <w:t>'</w:t>
             </w:r>
@@ -1242,6 +1245,7 @@
                 <w:color w:val="000000"/>
                 <w:sz w:val="22"/>
                 <w:szCs w:val="22"/>
+                <w:lang w:val="en-GB"/>
               </w:rPr>
               <w:t>je_contact</w:t>
             </w:r>
@@ -1252,6 +1256,7 @@
                 <w:color w:val="000000"/>
                 <w:sz w:val="22"/>
                 <w:szCs w:val="22"/>
+                <w:lang w:val="en-GB"/>
               </w:rPr>
               <w:t>') }}</w:t>
             </w:r>
@@ -10961,77 +10966,26 @@
           <w:highlight w:val="yellow"/>
         </w:rPr>
       </w:pPr>
-      <w:r>
-        <w:rPr>
-          <w:noProof/>
-        </w:rPr>
-        <w:lastRenderedPageBreak/>
-        <w:drawing>
-          <wp:inline distT="0" distB="0" distL="0" distR="0" wp14:anchorId="011D5E03" wp14:editId="5EAC4E5D">
-            <wp:extent cx="5743575" cy="2295525"/>
-            <wp:effectExtent l="0" t="0" r="9525" b="9525"/>
-            <wp:docPr id="2" name="Image 2" descr="C:\Users\flo\Desktop\imageVARganttAP.png"/>
-            <wp:cNvGraphicFramePr/>
-            <a:graphic xmlns:a="http://schemas.openxmlformats.org/drawingml/2006/main">
-              <a:graphicData uri="http://schemas.openxmlformats.org/drawingml/2006/picture">
-                <pic:pic xmlns:pic="http://schemas.openxmlformats.org/drawingml/2006/picture">
-                  <pic:nvPicPr>
-                    <pic:cNvPr id="2" name="Image 2" descr="C:\Users\flo\Desktop\imageVARganttAP.png"/>
-                    <pic:cNvPicPr/>
-                  </pic:nvPicPr>
-                  <pic:blipFill>
-                    <a:blip r:embed="rId11">
-                      <a:extLst>
-                        <a:ext uri="{28A0092B-C50C-407E-A947-70E740481C1C}">
-                          <a14:useLocalDpi xmlns:a14="http://schemas.microsoft.com/office/drawing/2010/main" val="0"/>
-                        </a:ext>
-                      </a:extLst>
-                    </a:blip>
-                    <a:srcRect/>
-                    <a:stretch>
-                      <a:fillRect/>
-                    </a:stretch>
-                  </pic:blipFill>
-                  <pic:spPr>
-                    <a:xfrm>
-                      <a:off x="0" y="0"/>
-                      <a:ext cx="5743575" cy="2295525"/>
-                    </a:xfrm>
-                    <a:prstGeom prst="rect">
-                      <a:avLst/>
-                    </a:prstGeom>
-                    <a:noFill/>
-                    <a:ln>
-                      <a:noFill/>
-                    </a:ln>
-                  </pic:spPr>
-                </pic:pic>
-              </a:graphicData>
-            </a:graphic>
-          </wp:inline>
-        </w:drawing>
-      </w:r>
     </w:p>
     <w:p>
       <w:pPr>
+        <w:widowControl w:val="0"/>
+        <w:spacing w:line="240" w:lineRule="auto"/>
         <w:ind w:firstLine="0"/>
-        <w:rPr>
-          <w:rFonts w:ascii="Arial" w:hAnsi="Arial" w:cs="Arial"/>
-          <w:i/>
+        <w:jc w:val="center"/>
+        <w:rPr>
+          <w:rFonts w:ascii="Arial" w:hAnsi="Arial" w:cs="Arial"/>
           <w:color w:val="000000" w:themeColor="text1"/>
           <w:sz w:val="26"/>
           <w:szCs w:val="26"/>
-          <w:highlight w:val="yellow"/>
-        </w:rPr>
-      </w:pPr>
-      <w:r>
-        <w:rPr>
-          <w:rFonts w:ascii="Arial" w:hAnsi="Arial" w:cs="Arial"/>
-          <w:i/>
+        </w:rPr>
+      </w:pPr>
+      <w:r>
+        <w:rPr>
+          <w:rFonts w:ascii="Arial" w:hAnsi="Arial" w:cs="Arial"/>
           <w:color w:val="000000" w:themeColor="text1"/>
           <w:sz w:val="26"/>
           <w:szCs w:val="26"/>
-          <w:highlight w:val="yellow"/>
         </w:rPr>
         <w:t>{</w:t>
       </w:r>
@@ -11039,11 +10993,9 @@
       <w:r>
         <w:rPr>
           <w:rFonts w:ascii="Arial" w:hAnsi="Arial" w:cs="Arial"/>
-          <w:i/>
           <w:color w:val="000000" w:themeColor="text1"/>
           <w:sz w:val="26"/>
           <w:szCs w:val="26"/>
-          <w:highlight w:val="yellow"/>
         </w:rPr>
         <w:t xml:space="preserve">{ </w:t>
       </w:r>
@@ -11051,11 +11003,9 @@
       <w:r>
         <w:rPr>
           <w:rFonts w:ascii="Arial" w:hAnsi="Arial" w:cs="Arial"/>
-          <w:i/>
           <w:color w:val="000000" w:themeColor="text1"/>
           <w:sz w:val="26"/>
           <w:szCs w:val="26"/>
-          <w:highlight w:val="yellow"/>
         </w:rPr>
         <w:t>gantt</w:t>
       </w:r>
@@ -11064,11 +11014,9 @@
       <w:r>
         <w:rPr>
           <w:rFonts w:ascii="Arial" w:hAnsi="Arial" w:cs="Arial"/>
-          <w:i/>
           <w:color w:val="000000" w:themeColor="text1"/>
           <w:sz w:val="26"/>
           <w:szCs w:val="26"/>
-          <w:highlight w:val="yellow"/>
         </w:rPr>
         <w:t xml:space="preserve"> }}</w:t>
       </w:r>
@@ -11077,657 +11025,263 @@
       <w:pPr>
         <w:ind w:firstLine="0"/>
         <w:rPr>
-          <w:rFonts w:ascii="Arial" w:hAnsi="Arial" w:cs="Arial"/>
-          <w:i/>
-          <w:color w:val="000000" w:themeColor="text1"/>
-          <w:sz w:val="26"/>
-          <w:szCs w:val="26"/>
-        </w:rPr>
-      </w:pPr>
-      <w:r>
-        <w:rPr>
-          <w:rFonts w:ascii="Arial" w:hAnsi="Arial" w:cs="Arial"/>
-          <w:i/>
-          <w:color w:val="000000" w:themeColor="text1"/>
-          <w:sz w:val="26"/>
-          <w:szCs w:val="26"/>
-          <w:highlight w:val="yellow"/>
-        </w:rPr>
-        <w:t>[[Le diagramme de Gantt doit manuellement être exporté à partir de l’ERP, puis copié-collé ici.]]</w:t>
-      </w:r>
-    </w:p>
-    <w:p>
-      <w:pPr>
-        <w:ind w:firstLine="0"/>
-        <w:rPr>
-          <w:rFonts w:ascii="Arial" w:eastAsia="Calibri" w:hAnsi="Arial" w:cs="Arial"/>
-          <w:sz w:val="26"/>
-          <w:szCs w:val="26"/>
-        </w:rPr>
-      </w:pPr>
-    </w:p>
-    <w:p>
-      <w:pPr>
-        <w:rPr>
-          <w:rFonts w:ascii="Arial" w:hAnsi="Arial" w:cs="Arial"/>
-          <w:sz w:val="26"/>
-          <w:szCs w:val="26"/>
-        </w:rPr>
-      </w:pPr>
-      <w:r>
-        <w:rPr>
-          <w:rFonts w:ascii="Arial" w:eastAsia="Calibri" w:hAnsi="Arial" w:cs="Arial"/>
-          <w:sz w:val="26"/>
-          <w:szCs w:val="26"/>
-        </w:rPr>
-        <w:t>Conformément</w:t>
-      </w:r>
-      <w:r>
-        <w:rPr>
-          <w:rFonts w:ascii="Arial" w:hAnsi="Arial" w:cs="Arial"/>
-          <w:sz w:val="26"/>
-          <w:szCs w:val="26"/>
-        </w:rPr>
-        <w:t xml:space="preserve"> </w:t>
-      </w:r>
-      <w:r>
-        <w:rPr>
-          <w:rFonts w:ascii="Arial" w:eastAsia="Calibri" w:hAnsi="Arial" w:cs="Arial"/>
-          <w:sz w:val="26"/>
-          <w:szCs w:val="26"/>
-        </w:rPr>
-        <w:t>à</w:t>
-      </w:r>
-      <w:r>
-        <w:rPr>
-          <w:rFonts w:ascii="Arial" w:hAnsi="Arial" w:cs="Arial"/>
-          <w:sz w:val="26"/>
-          <w:szCs w:val="26"/>
-        </w:rPr>
-        <w:t xml:space="preserve"> </w:t>
-      </w:r>
-      <w:r>
-        <w:rPr>
-          <w:rFonts w:ascii="Arial" w:eastAsia="Calibri" w:hAnsi="Arial" w:cs="Arial"/>
-          <w:sz w:val="26"/>
-          <w:szCs w:val="26"/>
-        </w:rPr>
-        <w:t>ses</w:t>
-      </w:r>
-      <w:r>
-        <w:rPr>
-          <w:rFonts w:ascii="Arial" w:hAnsi="Arial" w:cs="Arial"/>
-          <w:sz w:val="26"/>
-          <w:szCs w:val="26"/>
-        </w:rPr>
-        <w:t xml:space="preserve"> </w:t>
-      </w:r>
-      <w:r>
-        <w:rPr>
-          <w:rFonts w:ascii="Arial" w:eastAsia="Calibri" w:hAnsi="Arial" w:cs="Arial"/>
-          <w:sz w:val="26"/>
-          <w:szCs w:val="26"/>
-        </w:rPr>
-        <w:t>engagements</w:t>
-      </w:r>
-      <w:r>
-        <w:rPr>
-          <w:rFonts w:ascii="Arial" w:hAnsi="Arial" w:cs="Arial"/>
-          <w:sz w:val="26"/>
-          <w:szCs w:val="26"/>
-        </w:rPr>
-        <w:t xml:space="preserve"> </w:t>
-      </w:r>
-      <w:r>
-        <w:rPr>
-          <w:rFonts w:ascii="Arial" w:eastAsia="Calibri" w:hAnsi="Arial" w:cs="Arial"/>
-          <w:sz w:val="26"/>
-          <w:szCs w:val="26"/>
-        </w:rPr>
-        <w:t>de</w:t>
-      </w:r>
-      <w:r>
-        <w:rPr>
-          <w:rFonts w:ascii="Arial" w:hAnsi="Arial" w:cs="Arial"/>
-          <w:sz w:val="26"/>
-          <w:szCs w:val="26"/>
-        </w:rPr>
-        <w:t xml:space="preserve"> </w:t>
-      </w:r>
-      <w:r>
-        <w:rPr>
-          <w:rFonts w:ascii="Arial" w:eastAsia="Calibri" w:hAnsi="Arial" w:cs="Arial"/>
-          <w:sz w:val="26"/>
-          <w:szCs w:val="26"/>
-        </w:rPr>
-        <w:t>qualité</w:t>
-      </w:r>
-      <w:r>
-        <w:rPr>
-          <w:rFonts w:ascii="Arial" w:hAnsi="Arial" w:cs="Arial"/>
-          <w:sz w:val="26"/>
-          <w:szCs w:val="26"/>
-        </w:rPr>
-        <w:t xml:space="preserve">, </w:t>
-      </w:r>
-      <w:r>
-        <w:rPr>
-          <w:rFonts w:ascii="Arial" w:eastAsia="Calibri" w:hAnsi="Arial" w:cs="Arial"/>
-          <w:sz w:val="26"/>
-          <w:szCs w:val="26"/>
-        </w:rPr>
-        <w:t>Ouest</w:t>
-      </w:r>
-      <w:r>
-        <w:rPr>
-          <w:rFonts w:ascii="Arial" w:hAnsi="Arial" w:cs="Arial"/>
-          <w:sz w:val="26"/>
-          <w:szCs w:val="26"/>
-        </w:rPr>
-        <w:t xml:space="preserve"> </w:t>
-      </w:r>
-      <w:r>
-        <w:rPr>
-          <w:rFonts w:ascii="Arial" w:eastAsia="Calibri" w:hAnsi="Arial" w:cs="Arial"/>
-          <w:sz w:val="26"/>
-          <w:szCs w:val="26"/>
-        </w:rPr>
-        <w:t>INSA</w:t>
-      </w:r>
-      <w:r>
-        <w:rPr>
-          <w:rFonts w:ascii="Arial" w:hAnsi="Arial" w:cs="Arial"/>
-          <w:sz w:val="26"/>
-          <w:szCs w:val="26"/>
-        </w:rPr>
-        <w:t xml:space="preserve"> </w:t>
-      </w:r>
-      <w:r>
-        <w:rPr>
-          <w:rFonts w:ascii="Arial" w:eastAsia="Calibri" w:hAnsi="Arial" w:cs="Arial"/>
-          <w:sz w:val="26"/>
-          <w:szCs w:val="26"/>
-        </w:rPr>
-        <w:t>communiquera</w:t>
-      </w:r>
-      <w:r>
-        <w:rPr>
-          <w:rFonts w:ascii="Arial" w:hAnsi="Arial" w:cs="Arial"/>
-          <w:sz w:val="26"/>
-          <w:szCs w:val="26"/>
-        </w:rPr>
-        <w:t xml:space="preserve"> </w:t>
-      </w:r>
-      <w:r>
-        <w:rPr>
-          <w:rFonts w:ascii="Arial" w:eastAsia="Calibri" w:hAnsi="Arial" w:cs="Arial"/>
-          <w:sz w:val="26"/>
-          <w:szCs w:val="26"/>
-        </w:rPr>
-        <w:t>au</w:t>
-      </w:r>
-      <w:r>
-        <w:rPr>
-          <w:rFonts w:ascii="Arial" w:hAnsi="Arial" w:cs="Arial"/>
-          <w:sz w:val="26"/>
-          <w:szCs w:val="26"/>
-        </w:rPr>
-        <w:t xml:space="preserve"> </w:t>
-      </w:r>
-      <w:r>
-        <w:rPr>
-          <w:rFonts w:ascii="Arial" w:eastAsia="Calibri" w:hAnsi="Arial" w:cs="Arial"/>
-          <w:sz w:val="26"/>
-          <w:szCs w:val="26"/>
-        </w:rPr>
-        <w:t>client</w:t>
-      </w:r>
-      <w:r>
-        <w:rPr>
-          <w:rFonts w:ascii="Arial" w:hAnsi="Arial" w:cs="Arial"/>
-          <w:sz w:val="26"/>
-          <w:szCs w:val="26"/>
-        </w:rPr>
-        <w:t xml:space="preserve"> </w:t>
-      </w:r>
-      <w:r>
-        <w:rPr>
-          <w:rFonts w:ascii="Arial" w:eastAsia="Calibri" w:hAnsi="Arial" w:cs="Arial"/>
-          <w:sz w:val="26"/>
-          <w:szCs w:val="26"/>
-        </w:rPr>
-        <w:t>l</w:t>
-      </w:r>
-      <w:r>
-        <w:rPr>
-          <w:rFonts w:ascii="Arial" w:hAnsi="Arial" w:cs="Arial"/>
-          <w:sz w:val="26"/>
-          <w:szCs w:val="26"/>
-        </w:rPr>
-        <w:t>’</w:t>
-      </w:r>
-      <w:r>
-        <w:rPr>
-          <w:rFonts w:ascii="Arial" w:eastAsia="Calibri" w:hAnsi="Arial" w:cs="Arial"/>
-          <w:sz w:val="26"/>
-          <w:szCs w:val="26"/>
-        </w:rPr>
-        <w:t>avancement</w:t>
-      </w:r>
-      <w:r>
-        <w:rPr>
-          <w:rFonts w:ascii="Arial" w:hAnsi="Arial" w:cs="Arial"/>
-          <w:sz w:val="26"/>
-          <w:szCs w:val="26"/>
-        </w:rPr>
-        <w:t xml:space="preserve"> </w:t>
-      </w:r>
-      <w:r>
-        <w:rPr>
-          <w:rFonts w:ascii="Arial" w:eastAsia="Calibri" w:hAnsi="Arial" w:cs="Arial"/>
-          <w:sz w:val="26"/>
-          <w:szCs w:val="26"/>
-        </w:rPr>
-        <w:t>du</w:t>
-      </w:r>
-      <w:r>
-        <w:rPr>
-          <w:rFonts w:ascii="Arial" w:hAnsi="Arial" w:cs="Arial"/>
-          <w:sz w:val="26"/>
-          <w:szCs w:val="26"/>
-        </w:rPr>
-        <w:t xml:space="preserve"> </w:t>
-      </w:r>
-      <w:r>
-        <w:rPr>
-          <w:rFonts w:ascii="Arial" w:eastAsia="Calibri" w:hAnsi="Arial" w:cs="Arial"/>
-          <w:sz w:val="26"/>
-          <w:szCs w:val="26"/>
-        </w:rPr>
-        <w:t>projet</w:t>
-      </w:r>
-      <w:r>
-        <w:rPr>
-          <w:rFonts w:ascii="Arial" w:hAnsi="Arial" w:cs="Arial"/>
-          <w:sz w:val="26"/>
-          <w:szCs w:val="26"/>
-        </w:rPr>
-        <w:t xml:space="preserve"> </w:t>
-      </w:r>
-      <w:r>
-        <w:rPr>
-          <w:rFonts w:ascii="Arial" w:hAnsi="Arial" w:cs="Arial"/>
-          <w:i/>
-          <w:sz w:val="26"/>
-          <w:szCs w:val="26"/>
-          <w:highlight w:val="yellow"/>
-        </w:rPr>
-        <w:t>toutes les semaines</w:t>
-      </w:r>
-      <w:r>
-        <w:rPr>
-          <w:rFonts w:ascii="Arial" w:hAnsi="Arial" w:cs="Arial"/>
-          <w:sz w:val="26"/>
-          <w:szCs w:val="26"/>
-        </w:rPr>
-        <w:t xml:space="preserve">. </w:t>
-      </w:r>
-      <w:r>
-        <w:rPr>
-          <w:rFonts w:ascii="Arial" w:eastAsia="Calibri" w:hAnsi="Arial" w:cs="Arial"/>
-          <w:sz w:val="26"/>
-          <w:szCs w:val="26"/>
-        </w:rPr>
-        <w:t>De</w:t>
-      </w:r>
-      <w:r>
-        <w:rPr>
-          <w:rFonts w:ascii="Arial" w:hAnsi="Arial" w:cs="Arial"/>
-          <w:sz w:val="26"/>
-          <w:szCs w:val="26"/>
-        </w:rPr>
-        <w:t xml:space="preserve"> </w:t>
-      </w:r>
-      <w:r>
-        <w:rPr>
-          <w:rFonts w:ascii="Arial" w:eastAsia="Calibri" w:hAnsi="Arial" w:cs="Arial"/>
-          <w:sz w:val="26"/>
-          <w:szCs w:val="26"/>
-        </w:rPr>
-        <w:t>même</w:t>
-      </w:r>
-      <w:r>
-        <w:rPr>
-          <w:rFonts w:ascii="Arial" w:hAnsi="Arial" w:cs="Arial"/>
-          <w:sz w:val="26"/>
-          <w:szCs w:val="26"/>
-        </w:rPr>
-        <w:t xml:space="preserve">, </w:t>
-      </w:r>
-      <w:r>
-        <w:rPr>
-          <w:rFonts w:ascii="Arial" w:eastAsia="Calibri" w:hAnsi="Arial" w:cs="Arial"/>
-          <w:sz w:val="26"/>
-          <w:szCs w:val="26"/>
-        </w:rPr>
-        <w:t>Ouest</w:t>
-      </w:r>
-      <w:r>
-        <w:rPr>
-          <w:rFonts w:ascii="Arial" w:hAnsi="Arial" w:cs="Arial"/>
-          <w:sz w:val="26"/>
-          <w:szCs w:val="26"/>
-        </w:rPr>
-        <w:t xml:space="preserve"> </w:t>
-      </w:r>
-      <w:r>
-        <w:rPr>
-          <w:rFonts w:ascii="Arial" w:eastAsia="Calibri" w:hAnsi="Arial" w:cs="Arial"/>
-          <w:sz w:val="26"/>
-          <w:szCs w:val="26"/>
-        </w:rPr>
-        <w:t>INSA</w:t>
-      </w:r>
-      <w:r>
-        <w:rPr>
-          <w:rFonts w:ascii="Arial" w:hAnsi="Arial" w:cs="Arial"/>
-          <w:sz w:val="26"/>
-          <w:szCs w:val="26"/>
-        </w:rPr>
-        <w:t xml:space="preserve"> </w:t>
-      </w:r>
-      <w:r>
-        <w:rPr>
-          <w:rFonts w:ascii="Arial" w:eastAsia="Calibri" w:hAnsi="Arial" w:cs="Arial"/>
-          <w:sz w:val="26"/>
-          <w:szCs w:val="26"/>
-        </w:rPr>
-        <w:t>s</w:t>
-      </w:r>
-      <w:r>
-        <w:rPr>
-          <w:rFonts w:ascii="Arial" w:hAnsi="Arial" w:cs="Arial"/>
-          <w:sz w:val="26"/>
-          <w:szCs w:val="26"/>
-        </w:rPr>
-        <w:t>’</w:t>
-      </w:r>
-      <w:r>
-        <w:rPr>
-          <w:rFonts w:ascii="Arial" w:eastAsia="Calibri" w:hAnsi="Arial" w:cs="Arial"/>
-          <w:sz w:val="26"/>
-          <w:szCs w:val="26"/>
-        </w:rPr>
-        <w:t>engage</w:t>
-      </w:r>
-      <w:r>
-        <w:rPr>
-          <w:rFonts w:ascii="Arial" w:hAnsi="Arial" w:cs="Arial"/>
-          <w:sz w:val="26"/>
-          <w:szCs w:val="26"/>
-        </w:rPr>
-        <w:t xml:space="preserve"> </w:t>
-      </w:r>
-      <w:r>
-        <w:rPr>
-          <w:rFonts w:ascii="Arial" w:eastAsia="Calibri" w:hAnsi="Arial" w:cs="Arial"/>
-          <w:sz w:val="26"/>
-          <w:szCs w:val="26"/>
-        </w:rPr>
-        <w:t>à</w:t>
-      </w:r>
-      <w:r>
-        <w:rPr>
-          <w:rFonts w:ascii="Arial" w:hAnsi="Arial" w:cs="Arial"/>
-          <w:sz w:val="26"/>
-          <w:szCs w:val="26"/>
-        </w:rPr>
-        <w:t xml:space="preserve"> </w:t>
-      </w:r>
-      <w:r>
-        <w:rPr>
-          <w:rFonts w:ascii="Arial" w:eastAsia="Calibri" w:hAnsi="Arial" w:cs="Arial"/>
-          <w:sz w:val="26"/>
-          <w:szCs w:val="26"/>
-        </w:rPr>
-        <w:t>répondre</w:t>
-      </w:r>
-      <w:r>
-        <w:rPr>
-          <w:rFonts w:ascii="Arial" w:hAnsi="Arial" w:cs="Arial"/>
-          <w:sz w:val="26"/>
-          <w:szCs w:val="26"/>
-        </w:rPr>
-        <w:t xml:space="preserve"> </w:t>
-      </w:r>
-      <w:r>
-        <w:rPr>
-          <w:rFonts w:ascii="Arial" w:eastAsia="Calibri" w:hAnsi="Arial" w:cs="Arial"/>
-          <w:sz w:val="26"/>
-          <w:szCs w:val="26"/>
-        </w:rPr>
-        <w:t>à</w:t>
-      </w:r>
-      <w:r>
-        <w:rPr>
-          <w:rFonts w:ascii="Arial" w:hAnsi="Arial" w:cs="Arial"/>
-          <w:sz w:val="26"/>
-          <w:szCs w:val="26"/>
-        </w:rPr>
-        <w:t xml:space="preserve"> </w:t>
-      </w:r>
-      <w:r>
-        <w:rPr>
-          <w:rFonts w:ascii="Arial" w:eastAsia="Calibri" w:hAnsi="Arial" w:cs="Arial"/>
-          <w:sz w:val="26"/>
-          <w:szCs w:val="26"/>
-        </w:rPr>
-        <w:t>toute</w:t>
-      </w:r>
-      <w:r>
-        <w:rPr>
-          <w:rFonts w:ascii="Arial" w:hAnsi="Arial" w:cs="Arial"/>
-          <w:sz w:val="26"/>
-          <w:szCs w:val="26"/>
-        </w:rPr>
-        <w:t xml:space="preserve"> </w:t>
-      </w:r>
-      <w:r>
-        <w:rPr>
-          <w:rFonts w:ascii="Arial" w:eastAsia="Calibri" w:hAnsi="Arial" w:cs="Arial"/>
-          <w:sz w:val="26"/>
-          <w:szCs w:val="26"/>
-        </w:rPr>
-        <w:t>demande</w:t>
-      </w:r>
-      <w:r>
-        <w:rPr>
-          <w:rFonts w:ascii="Arial" w:hAnsi="Arial" w:cs="Arial"/>
-          <w:sz w:val="26"/>
-          <w:szCs w:val="26"/>
-        </w:rPr>
-        <w:t xml:space="preserve"> </w:t>
-      </w:r>
-      <w:r>
-        <w:rPr>
-          <w:rFonts w:ascii="Arial" w:eastAsia="Calibri" w:hAnsi="Arial" w:cs="Arial"/>
-          <w:sz w:val="26"/>
-          <w:szCs w:val="26"/>
-        </w:rPr>
-        <w:t>d</w:t>
-      </w:r>
-      <w:r>
-        <w:rPr>
-          <w:rFonts w:ascii="Arial" w:hAnsi="Arial" w:cs="Arial"/>
-          <w:sz w:val="26"/>
-          <w:szCs w:val="26"/>
-        </w:rPr>
-        <w:t>’</w:t>
-      </w:r>
-      <w:r>
-        <w:rPr>
-          <w:rFonts w:ascii="Arial" w:eastAsia="Calibri" w:hAnsi="Arial" w:cs="Arial"/>
-          <w:sz w:val="26"/>
-          <w:szCs w:val="26"/>
-        </w:rPr>
-        <w:t>information</w:t>
-      </w:r>
-      <w:r>
-        <w:rPr>
-          <w:rFonts w:ascii="Arial" w:hAnsi="Arial" w:cs="Arial"/>
-          <w:sz w:val="26"/>
-          <w:szCs w:val="26"/>
-        </w:rPr>
-        <w:t xml:space="preserve"> </w:t>
-      </w:r>
-      <w:r>
-        <w:rPr>
-          <w:rFonts w:ascii="Arial" w:eastAsia="Calibri" w:hAnsi="Arial" w:cs="Arial"/>
-          <w:sz w:val="26"/>
-          <w:szCs w:val="26"/>
-        </w:rPr>
-        <w:t>du</w:t>
-      </w:r>
-      <w:r>
-        <w:rPr>
-          <w:rFonts w:ascii="Arial" w:hAnsi="Arial" w:cs="Arial"/>
-          <w:sz w:val="26"/>
-          <w:szCs w:val="26"/>
-        </w:rPr>
-        <w:t xml:space="preserve"> </w:t>
-      </w:r>
-      <w:r>
-        <w:rPr>
-          <w:rFonts w:ascii="Arial" w:eastAsia="Calibri" w:hAnsi="Arial" w:cs="Arial"/>
-          <w:sz w:val="26"/>
-          <w:szCs w:val="26"/>
-        </w:rPr>
-        <w:t>client</w:t>
-      </w:r>
-      <w:r>
-        <w:rPr>
-          <w:rFonts w:ascii="Arial" w:hAnsi="Arial" w:cs="Arial"/>
-          <w:sz w:val="26"/>
-          <w:szCs w:val="26"/>
-        </w:rPr>
-        <w:t xml:space="preserve"> </w:t>
-      </w:r>
-      <w:r>
-        <w:rPr>
-          <w:rFonts w:ascii="Arial" w:eastAsia="Calibri" w:hAnsi="Arial" w:cs="Arial"/>
-          <w:sz w:val="26"/>
-          <w:szCs w:val="26"/>
-        </w:rPr>
-        <w:t>dans</w:t>
-      </w:r>
-      <w:r>
-        <w:rPr>
-          <w:rFonts w:ascii="Arial" w:hAnsi="Arial" w:cs="Arial"/>
-          <w:sz w:val="26"/>
-          <w:szCs w:val="26"/>
-        </w:rPr>
-        <w:t xml:space="preserve"> </w:t>
-      </w:r>
-      <w:r>
-        <w:rPr>
-          <w:rFonts w:ascii="Arial" w:eastAsia="Calibri" w:hAnsi="Arial" w:cs="Arial"/>
-          <w:sz w:val="26"/>
-          <w:szCs w:val="26"/>
-        </w:rPr>
-        <w:t>un</w:t>
-      </w:r>
-      <w:r>
-        <w:rPr>
-          <w:rFonts w:ascii="Arial" w:hAnsi="Arial" w:cs="Arial"/>
-          <w:sz w:val="26"/>
-          <w:szCs w:val="26"/>
-        </w:rPr>
-        <w:t xml:space="preserve"> </w:t>
-      </w:r>
-      <w:r>
-        <w:rPr>
-          <w:rFonts w:ascii="Arial" w:eastAsia="Calibri" w:hAnsi="Arial" w:cs="Arial"/>
-          <w:sz w:val="26"/>
-          <w:szCs w:val="26"/>
-        </w:rPr>
-        <w:t>délai</w:t>
-      </w:r>
-      <w:r>
-        <w:rPr>
-          <w:rFonts w:ascii="Arial" w:hAnsi="Arial" w:cs="Arial"/>
-          <w:sz w:val="26"/>
-          <w:szCs w:val="26"/>
-        </w:rPr>
-        <w:t xml:space="preserve"> </w:t>
-      </w:r>
-      <w:r>
-        <w:rPr>
-          <w:rFonts w:ascii="Arial" w:eastAsia="Calibri" w:hAnsi="Arial" w:cs="Arial"/>
-          <w:sz w:val="26"/>
-          <w:szCs w:val="26"/>
-        </w:rPr>
-        <w:t>de</w:t>
-      </w:r>
-      <w:r>
-        <w:rPr>
-          <w:rFonts w:ascii="Arial" w:hAnsi="Arial" w:cs="Arial"/>
-          <w:sz w:val="26"/>
-          <w:szCs w:val="26"/>
-        </w:rPr>
-        <w:t xml:space="preserve"> 24</w:t>
-      </w:r>
-      <w:r>
-        <w:rPr>
-          <w:rFonts w:ascii="Arial" w:eastAsia="Calibri" w:hAnsi="Arial" w:cs="Arial"/>
-          <w:sz w:val="26"/>
-          <w:szCs w:val="26"/>
-        </w:rPr>
-        <w:t>h</w:t>
-      </w:r>
-      <w:r>
-        <w:rPr>
-          <w:rFonts w:ascii="Arial" w:hAnsi="Arial" w:cs="Arial"/>
-          <w:sz w:val="26"/>
-          <w:szCs w:val="26"/>
-        </w:rPr>
-        <w:t xml:space="preserve"> </w:t>
-      </w:r>
-      <w:r>
-        <w:rPr>
-          <w:rFonts w:ascii="Arial" w:eastAsia="Calibri" w:hAnsi="Arial" w:cs="Arial"/>
-          <w:sz w:val="26"/>
-          <w:szCs w:val="26"/>
-        </w:rPr>
-        <w:t>ouvrées</w:t>
-      </w:r>
-      <w:r>
-        <w:rPr>
-          <w:rFonts w:ascii="Arial" w:hAnsi="Arial" w:cs="Arial"/>
-          <w:sz w:val="26"/>
-          <w:szCs w:val="26"/>
-        </w:rPr>
-        <w:t>.</w:t>
-      </w:r>
-    </w:p>
-    <w:p>
-      <w:pPr>
-        <w:pStyle w:val="Titre1"/>
-        <w:rPr>
-          <w:rFonts w:ascii="Arial" w:hAnsi="Arial" w:cs="Arial"/>
-        </w:rPr>
-      </w:pPr>
-      <w:bookmarkStart w:id="32" w:name="_Toc491964570"/>
-      <w:r>
-        <w:rPr>
-          <w:rFonts w:ascii="Arial" w:eastAsia="Calibri" w:hAnsi="Arial" w:cs="Arial"/>
-        </w:rPr>
-        <w:t>Conclusion</w:t>
-      </w:r>
+          <w:rFonts w:ascii="Arial" w:eastAsia="Calibri" w:hAnsi="Arial" w:cs="Arial"/>
+          <w:sz w:val="26"/>
+          <w:szCs w:val="26"/>
+        </w:rPr>
+      </w:pPr>
+      <w:bookmarkStart w:id="32" w:name="_GoBack"/>
       <w:bookmarkEnd w:id="32"/>
     </w:p>
     <w:p>
       <w:pPr>
-        <w:ind w:firstLine="0"/>
+        <w:rPr>
+          <w:rFonts w:ascii="Arial" w:hAnsi="Arial" w:cs="Arial"/>
+          <w:sz w:val="26"/>
+          <w:szCs w:val="26"/>
+        </w:rPr>
+      </w:pPr>
+      <w:r>
+        <w:rPr>
+          <w:rFonts w:ascii="Arial" w:eastAsia="Calibri" w:hAnsi="Arial" w:cs="Arial"/>
+          <w:sz w:val="26"/>
+          <w:szCs w:val="26"/>
+        </w:rPr>
+        <w:t>Conformément</w:t>
+      </w:r>
+      <w:r>
+        <w:rPr>
+          <w:rFonts w:ascii="Arial" w:hAnsi="Arial" w:cs="Arial"/>
+          <w:sz w:val="26"/>
+          <w:szCs w:val="26"/>
+        </w:rPr>
+        <w:t xml:space="preserve"> </w:t>
+      </w:r>
+      <w:r>
+        <w:rPr>
+          <w:rFonts w:ascii="Arial" w:eastAsia="Calibri" w:hAnsi="Arial" w:cs="Arial"/>
+          <w:sz w:val="26"/>
+          <w:szCs w:val="26"/>
+        </w:rPr>
+        <w:t>à</w:t>
+      </w:r>
+      <w:r>
+        <w:rPr>
+          <w:rFonts w:ascii="Arial" w:hAnsi="Arial" w:cs="Arial"/>
+          <w:sz w:val="26"/>
+          <w:szCs w:val="26"/>
+        </w:rPr>
+        <w:t xml:space="preserve"> </w:t>
+      </w:r>
+      <w:r>
+        <w:rPr>
+          <w:rFonts w:ascii="Arial" w:eastAsia="Calibri" w:hAnsi="Arial" w:cs="Arial"/>
+          <w:sz w:val="26"/>
+          <w:szCs w:val="26"/>
+        </w:rPr>
+        <w:t>ses</w:t>
+      </w:r>
+      <w:r>
+        <w:rPr>
+          <w:rFonts w:ascii="Arial" w:hAnsi="Arial" w:cs="Arial"/>
+          <w:sz w:val="26"/>
+          <w:szCs w:val="26"/>
+        </w:rPr>
+        <w:t xml:space="preserve"> </w:t>
+      </w:r>
+      <w:r>
+        <w:rPr>
+          <w:rFonts w:ascii="Arial" w:eastAsia="Calibri" w:hAnsi="Arial" w:cs="Arial"/>
+          <w:sz w:val="26"/>
+          <w:szCs w:val="26"/>
+        </w:rPr>
+        <w:t>engagements</w:t>
+      </w:r>
+      <w:r>
+        <w:rPr>
+          <w:rFonts w:ascii="Arial" w:hAnsi="Arial" w:cs="Arial"/>
+          <w:sz w:val="26"/>
+          <w:szCs w:val="26"/>
+        </w:rPr>
+        <w:t xml:space="preserve"> </w:t>
+      </w:r>
+      <w:r>
+        <w:rPr>
+          <w:rFonts w:ascii="Arial" w:eastAsia="Calibri" w:hAnsi="Arial" w:cs="Arial"/>
+          <w:sz w:val="26"/>
+          <w:szCs w:val="26"/>
+        </w:rPr>
+        <w:t>de</w:t>
+      </w:r>
+      <w:r>
+        <w:rPr>
+          <w:rFonts w:ascii="Arial" w:hAnsi="Arial" w:cs="Arial"/>
+          <w:sz w:val="26"/>
+          <w:szCs w:val="26"/>
+        </w:rPr>
+        <w:t xml:space="preserve"> </w:t>
+      </w:r>
+      <w:r>
+        <w:rPr>
+          <w:rFonts w:ascii="Arial" w:eastAsia="Calibri" w:hAnsi="Arial" w:cs="Arial"/>
+          <w:sz w:val="26"/>
+          <w:szCs w:val="26"/>
+        </w:rPr>
+        <w:t>qualité</w:t>
+      </w:r>
+      <w:r>
+        <w:rPr>
+          <w:rFonts w:ascii="Arial" w:hAnsi="Arial" w:cs="Arial"/>
+          <w:sz w:val="26"/>
+          <w:szCs w:val="26"/>
+        </w:rPr>
+        <w:t xml:space="preserve">, </w:t>
+      </w:r>
+      <w:r>
+        <w:rPr>
+          <w:rFonts w:ascii="Arial" w:eastAsia="Calibri" w:hAnsi="Arial" w:cs="Arial"/>
+          <w:sz w:val="26"/>
+          <w:szCs w:val="26"/>
+        </w:rPr>
+        <w:t>Ouest</w:t>
+      </w:r>
+      <w:r>
+        <w:rPr>
+          <w:rFonts w:ascii="Arial" w:hAnsi="Arial" w:cs="Arial"/>
+          <w:sz w:val="26"/>
+          <w:szCs w:val="26"/>
+        </w:rPr>
+        <w:t xml:space="preserve"> </w:t>
+      </w:r>
+      <w:r>
+        <w:rPr>
+          <w:rFonts w:ascii="Arial" w:eastAsia="Calibri" w:hAnsi="Arial" w:cs="Arial"/>
+          <w:sz w:val="26"/>
+          <w:szCs w:val="26"/>
+        </w:rPr>
+        <w:t>INSA</w:t>
+      </w:r>
+      <w:r>
+        <w:rPr>
+          <w:rFonts w:ascii="Arial" w:hAnsi="Arial" w:cs="Arial"/>
+          <w:sz w:val="26"/>
+          <w:szCs w:val="26"/>
+        </w:rPr>
+        <w:t xml:space="preserve"> </w:t>
+      </w:r>
+      <w:r>
+        <w:rPr>
+          <w:rFonts w:ascii="Arial" w:eastAsia="Calibri" w:hAnsi="Arial" w:cs="Arial"/>
+          <w:sz w:val="26"/>
+          <w:szCs w:val="26"/>
+        </w:rPr>
+        <w:t>communiquera</w:t>
+      </w:r>
+      <w:r>
+        <w:rPr>
+          <w:rFonts w:ascii="Arial" w:hAnsi="Arial" w:cs="Arial"/>
+          <w:sz w:val="26"/>
+          <w:szCs w:val="26"/>
+        </w:rPr>
+        <w:t xml:space="preserve"> </w:t>
+      </w:r>
+      <w:r>
+        <w:rPr>
+          <w:rFonts w:ascii="Arial" w:eastAsia="Calibri" w:hAnsi="Arial" w:cs="Arial"/>
+          <w:sz w:val="26"/>
+          <w:szCs w:val="26"/>
+        </w:rPr>
+        <w:t>au</w:t>
+      </w:r>
+      <w:r>
+        <w:rPr>
+          <w:rFonts w:ascii="Arial" w:hAnsi="Arial" w:cs="Arial"/>
+          <w:sz w:val="26"/>
+          <w:szCs w:val="26"/>
+        </w:rPr>
+        <w:t xml:space="preserve"> </w:t>
+      </w:r>
+      <w:r>
+        <w:rPr>
+          <w:rFonts w:ascii="Arial" w:eastAsia="Calibri" w:hAnsi="Arial" w:cs="Arial"/>
+          <w:sz w:val="26"/>
+          <w:szCs w:val="26"/>
+        </w:rPr>
+        <w:t>client</w:t>
+      </w:r>
+      <w:r>
+        <w:rPr>
+          <w:rFonts w:ascii="Arial" w:hAnsi="Arial" w:cs="Arial"/>
+          <w:sz w:val="26"/>
+          <w:szCs w:val="26"/>
+        </w:rPr>
+        <w:t xml:space="preserve"> </w:t>
+      </w:r>
+      <w:r>
+        <w:rPr>
+          <w:rFonts w:ascii="Arial" w:eastAsia="Calibri" w:hAnsi="Arial" w:cs="Arial"/>
+          <w:sz w:val="26"/>
+          <w:szCs w:val="26"/>
+        </w:rPr>
+        <w:t>l</w:t>
+      </w:r>
+      <w:r>
+        <w:rPr>
+          <w:rFonts w:ascii="Arial" w:hAnsi="Arial" w:cs="Arial"/>
+          <w:sz w:val="26"/>
+          <w:szCs w:val="26"/>
+        </w:rPr>
+        <w:t>’</w:t>
+      </w:r>
+      <w:r>
+        <w:rPr>
+          <w:rFonts w:ascii="Arial" w:eastAsia="Calibri" w:hAnsi="Arial" w:cs="Arial"/>
+          <w:sz w:val="26"/>
+          <w:szCs w:val="26"/>
+        </w:rPr>
+        <w:t>avancement</w:t>
+      </w:r>
+      <w:r>
+        <w:rPr>
+          <w:rFonts w:ascii="Arial" w:hAnsi="Arial" w:cs="Arial"/>
+          <w:sz w:val="26"/>
+          <w:szCs w:val="26"/>
+        </w:rPr>
+        <w:t xml:space="preserve"> </w:t>
+      </w:r>
+      <w:r>
+        <w:rPr>
+          <w:rFonts w:ascii="Arial" w:eastAsia="Calibri" w:hAnsi="Arial" w:cs="Arial"/>
+          <w:sz w:val="26"/>
+          <w:szCs w:val="26"/>
+        </w:rPr>
+        <w:t>du</w:t>
+      </w:r>
+      <w:r>
+        <w:rPr>
+          <w:rFonts w:ascii="Arial" w:hAnsi="Arial" w:cs="Arial"/>
+          <w:sz w:val="26"/>
+          <w:szCs w:val="26"/>
+        </w:rPr>
+        <w:t xml:space="preserve"> </w:t>
+      </w:r>
+      <w:r>
+        <w:rPr>
+          <w:rFonts w:ascii="Arial" w:eastAsia="Calibri" w:hAnsi="Arial" w:cs="Arial"/>
+          <w:sz w:val="26"/>
+          <w:szCs w:val="26"/>
+        </w:rPr>
+        <w:t>projet</w:t>
+      </w:r>
+      <w:r>
+        <w:rPr>
+          <w:rFonts w:ascii="Arial" w:hAnsi="Arial" w:cs="Arial"/>
+          <w:sz w:val="26"/>
+          <w:szCs w:val="26"/>
+        </w:rPr>
+        <w:t xml:space="preserve"> </w:t>
+      </w:r>
+      <w:r>
         <w:rPr>
           <w:rFonts w:ascii="Arial" w:hAnsi="Arial" w:cs="Arial"/>
           <w:i/>
@@ -11735,147 +11289,520 @@
           <w:szCs w:val="26"/>
           <w:highlight w:val="yellow"/>
         </w:rPr>
-      </w:pPr>
-      <w:bookmarkStart w:id="33" w:name="_Toc491964571"/>
-      <w:r>
-        <w:rPr>
-          <w:rFonts w:ascii="Arial" w:hAnsi="Arial" w:cs="Arial"/>
-          <w:i/>
-          <w:sz w:val="26"/>
-          <w:szCs w:val="26"/>
-          <w:highlight w:val="yellow"/>
-        </w:rPr>
-        <w:t xml:space="preserve">[[Résumé du projet, détail du livrable : </w:t>
+        <w:t>toutes les semaines</w:t>
+      </w:r>
+      <w:r>
+        <w:rPr>
+          <w:rFonts w:ascii="Arial" w:hAnsi="Arial" w:cs="Arial"/>
+          <w:sz w:val="26"/>
+          <w:szCs w:val="26"/>
+        </w:rPr>
+        <w:t xml:space="preserve">. </w:t>
+      </w:r>
+      <w:r>
+        <w:rPr>
+          <w:rFonts w:ascii="Arial" w:eastAsia="Calibri" w:hAnsi="Arial" w:cs="Arial"/>
+          <w:sz w:val="26"/>
+          <w:szCs w:val="26"/>
+        </w:rPr>
+        <w:t>De</w:t>
+      </w:r>
+      <w:r>
+        <w:rPr>
+          <w:rFonts w:ascii="Arial" w:hAnsi="Arial" w:cs="Arial"/>
+          <w:sz w:val="26"/>
+          <w:szCs w:val="26"/>
+        </w:rPr>
+        <w:t xml:space="preserve"> </w:t>
+      </w:r>
+      <w:r>
+        <w:rPr>
+          <w:rFonts w:ascii="Arial" w:eastAsia="Calibri" w:hAnsi="Arial" w:cs="Arial"/>
+          <w:sz w:val="26"/>
+          <w:szCs w:val="26"/>
+        </w:rPr>
+        <w:t>même</w:t>
+      </w:r>
+      <w:r>
+        <w:rPr>
+          <w:rFonts w:ascii="Arial" w:hAnsi="Arial" w:cs="Arial"/>
+          <w:sz w:val="26"/>
+          <w:szCs w:val="26"/>
+        </w:rPr>
+        <w:t xml:space="preserve">, </w:t>
+      </w:r>
+      <w:r>
+        <w:rPr>
+          <w:rFonts w:ascii="Arial" w:eastAsia="Calibri" w:hAnsi="Arial" w:cs="Arial"/>
+          <w:sz w:val="26"/>
+          <w:szCs w:val="26"/>
+        </w:rPr>
+        <w:t>Ouest</w:t>
+      </w:r>
+      <w:r>
+        <w:rPr>
+          <w:rFonts w:ascii="Arial" w:hAnsi="Arial" w:cs="Arial"/>
+          <w:sz w:val="26"/>
+          <w:szCs w:val="26"/>
+        </w:rPr>
+        <w:t xml:space="preserve"> </w:t>
+      </w:r>
+      <w:r>
+        <w:rPr>
+          <w:rFonts w:ascii="Arial" w:eastAsia="Calibri" w:hAnsi="Arial" w:cs="Arial"/>
+          <w:sz w:val="26"/>
+          <w:szCs w:val="26"/>
+        </w:rPr>
+        <w:t>INSA</w:t>
+      </w:r>
+      <w:r>
+        <w:rPr>
+          <w:rFonts w:ascii="Arial" w:hAnsi="Arial" w:cs="Arial"/>
+          <w:sz w:val="26"/>
+          <w:szCs w:val="26"/>
+        </w:rPr>
+        <w:t xml:space="preserve"> </w:t>
+      </w:r>
+      <w:r>
+        <w:rPr>
+          <w:rFonts w:ascii="Arial" w:eastAsia="Calibri" w:hAnsi="Arial" w:cs="Arial"/>
+          <w:sz w:val="26"/>
+          <w:szCs w:val="26"/>
+        </w:rPr>
+        <w:t>s</w:t>
+      </w:r>
+      <w:r>
+        <w:rPr>
+          <w:rFonts w:ascii="Arial" w:hAnsi="Arial" w:cs="Arial"/>
+          <w:sz w:val="26"/>
+          <w:szCs w:val="26"/>
+        </w:rPr>
+        <w:t>’</w:t>
+      </w:r>
+      <w:r>
+        <w:rPr>
+          <w:rFonts w:ascii="Arial" w:eastAsia="Calibri" w:hAnsi="Arial" w:cs="Arial"/>
+          <w:sz w:val="26"/>
+          <w:szCs w:val="26"/>
+        </w:rPr>
+        <w:t>engage</w:t>
+      </w:r>
+      <w:r>
+        <w:rPr>
+          <w:rFonts w:ascii="Arial" w:hAnsi="Arial" w:cs="Arial"/>
+          <w:sz w:val="26"/>
+          <w:szCs w:val="26"/>
+        </w:rPr>
+        <w:t xml:space="preserve"> </w:t>
+      </w:r>
+      <w:r>
+        <w:rPr>
+          <w:rFonts w:ascii="Arial" w:eastAsia="Calibri" w:hAnsi="Arial" w:cs="Arial"/>
+          <w:sz w:val="26"/>
+          <w:szCs w:val="26"/>
+        </w:rPr>
+        <w:t>à</w:t>
+      </w:r>
+      <w:r>
+        <w:rPr>
+          <w:rFonts w:ascii="Arial" w:hAnsi="Arial" w:cs="Arial"/>
+          <w:sz w:val="26"/>
+          <w:szCs w:val="26"/>
+        </w:rPr>
+        <w:t xml:space="preserve"> </w:t>
+      </w:r>
+      <w:r>
+        <w:rPr>
+          <w:rFonts w:ascii="Arial" w:eastAsia="Calibri" w:hAnsi="Arial" w:cs="Arial"/>
+          <w:sz w:val="26"/>
+          <w:szCs w:val="26"/>
+        </w:rPr>
+        <w:t>répondre</w:t>
+      </w:r>
+      <w:r>
+        <w:rPr>
+          <w:rFonts w:ascii="Arial" w:hAnsi="Arial" w:cs="Arial"/>
+          <w:sz w:val="26"/>
+          <w:szCs w:val="26"/>
+        </w:rPr>
+        <w:t xml:space="preserve"> </w:t>
+      </w:r>
+      <w:r>
+        <w:rPr>
+          <w:rFonts w:ascii="Arial" w:eastAsia="Calibri" w:hAnsi="Arial" w:cs="Arial"/>
+          <w:sz w:val="26"/>
+          <w:szCs w:val="26"/>
+        </w:rPr>
+        <w:t>à</w:t>
+      </w:r>
+      <w:r>
+        <w:rPr>
+          <w:rFonts w:ascii="Arial" w:hAnsi="Arial" w:cs="Arial"/>
+          <w:sz w:val="26"/>
+          <w:szCs w:val="26"/>
+        </w:rPr>
+        <w:t xml:space="preserve"> </w:t>
+      </w:r>
+      <w:r>
+        <w:rPr>
+          <w:rFonts w:ascii="Arial" w:eastAsia="Calibri" w:hAnsi="Arial" w:cs="Arial"/>
+          <w:sz w:val="26"/>
+          <w:szCs w:val="26"/>
+        </w:rPr>
+        <w:t>toute</w:t>
+      </w:r>
+      <w:r>
+        <w:rPr>
+          <w:rFonts w:ascii="Arial" w:hAnsi="Arial" w:cs="Arial"/>
+          <w:sz w:val="26"/>
+          <w:szCs w:val="26"/>
+        </w:rPr>
+        <w:t xml:space="preserve"> </w:t>
+      </w:r>
+      <w:r>
+        <w:rPr>
+          <w:rFonts w:ascii="Arial" w:eastAsia="Calibri" w:hAnsi="Arial" w:cs="Arial"/>
+          <w:sz w:val="26"/>
+          <w:szCs w:val="26"/>
+        </w:rPr>
+        <w:t>demande</w:t>
+      </w:r>
+      <w:r>
+        <w:rPr>
+          <w:rFonts w:ascii="Arial" w:hAnsi="Arial" w:cs="Arial"/>
+          <w:sz w:val="26"/>
+          <w:szCs w:val="26"/>
+        </w:rPr>
+        <w:t xml:space="preserve"> </w:t>
+      </w:r>
+      <w:r>
+        <w:rPr>
+          <w:rFonts w:ascii="Arial" w:eastAsia="Calibri" w:hAnsi="Arial" w:cs="Arial"/>
+          <w:sz w:val="26"/>
+          <w:szCs w:val="26"/>
+        </w:rPr>
+        <w:t>d</w:t>
+      </w:r>
+      <w:r>
+        <w:rPr>
+          <w:rFonts w:ascii="Arial" w:hAnsi="Arial" w:cs="Arial"/>
+          <w:sz w:val="26"/>
+          <w:szCs w:val="26"/>
+        </w:rPr>
+        <w:t>’</w:t>
+      </w:r>
+      <w:r>
+        <w:rPr>
+          <w:rFonts w:ascii="Arial" w:eastAsia="Calibri" w:hAnsi="Arial" w:cs="Arial"/>
+          <w:sz w:val="26"/>
+          <w:szCs w:val="26"/>
+        </w:rPr>
+        <w:t>information</w:t>
+      </w:r>
+      <w:r>
+        <w:rPr>
+          <w:rFonts w:ascii="Arial" w:hAnsi="Arial" w:cs="Arial"/>
+          <w:sz w:val="26"/>
+          <w:szCs w:val="26"/>
+        </w:rPr>
+        <w:t xml:space="preserve"> </w:t>
+      </w:r>
+      <w:r>
+        <w:rPr>
+          <w:rFonts w:ascii="Arial" w:eastAsia="Calibri" w:hAnsi="Arial" w:cs="Arial"/>
+          <w:sz w:val="26"/>
+          <w:szCs w:val="26"/>
+        </w:rPr>
+        <w:t>du</w:t>
+      </w:r>
+      <w:r>
+        <w:rPr>
+          <w:rFonts w:ascii="Arial" w:hAnsi="Arial" w:cs="Arial"/>
+          <w:sz w:val="26"/>
+          <w:szCs w:val="26"/>
+        </w:rPr>
+        <w:t xml:space="preserve"> </w:t>
+      </w:r>
+      <w:r>
+        <w:rPr>
+          <w:rFonts w:ascii="Arial" w:eastAsia="Calibri" w:hAnsi="Arial" w:cs="Arial"/>
+          <w:sz w:val="26"/>
+          <w:szCs w:val="26"/>
+        </w:rPr>
+        <w:t>client</w:t>
+      </w:r>
+      <w:r>
+        <w:rPr>
+          <w:rFonts w:ascii="Arial" w:hAnsi="Arial" w:cs="Arial"/>
+          <w:sz w:val="26"/>
+          <w:szCs w:val="26"/>
+        </w:rPr>
+        <w:t xml:space="preserve"> </w:t>
+      </w:r>
+      <w:r>
+        <w:rPr>
+          <w:rFonts w:ascii="Arial" w:eastAsia="Calibri" w:hAnsi="Arial" w:cs="Arial"/>
+          <w:sz w:val="26"/>
+          <w:szCs w:val="26"/>
+        </w:rPr>
+        <w:t>dans</w:t>
+      </w:r>
+      <w:r>
+        <w:rPr>
+          <w:rFonts w:ascii="Arial" w:hAnsi="Arial" w:cs="Arial"/>
+          <w:sz w:val="26"/>
+          <w:szCs w:val="26"/>
+        </w:rPr>
+        <w:t xml:space="preserve"> </w:t>
+      </w:r>
+      <w:r>
+        <w:rPr>
+          <w:rFonts w:ascii="Arial" w:eastAsia="Calibri" w:hAnsi="Arial" w:cs="Arial"/>
+          <w:sz w:val="26"/>
+          <w:szCs w:val="26"/>
+        </w:rPr>
+        <w:t>un</w:t>
+      </w:r>
+      <w:r>
+        <w:rPr>
+          <w:rFonts w:ascii="Arial" w:hAnsi="Arial" w:cs="Arial"/>
+          <w:sz w:val="26"/>
+          <w:szCs w:val="26"/>
+        </w:rPr>
+        <w:t xml:space="preserve"> </w:t>
+      </w:r>
+      <w:r>
+        <w:rPr>
+          <w:rFonts w:ascii="Arial" w:eastAsia="Calibri" w:hAnsi="Arial" w:cs="Arial"/>
+          <w:sz w:val="26"/>
+          <w:szCs w:val="26"/>
+        </w:rPr>
+        <w:t>délai</w:t>
+      </w:r>
+      <w:r>
+        <w:rPr>
+          <w:rFonts w:ascii="Arial" w:hAnsi="Arial" w:cs="Arial"/>
+          <w:sz w:val="26"/>
+          <w:szCs w:val="26"/>
+        </w:rPr>
+        <w:t xml:space="preserve"> </w:t>
+      </w:r>
+      <w:r>
+        <w:rPr>
+          <w:rFonts w:ascii="Arial" w:eastAsia="Calibri" w:hAnsi="Arial" w:cs="Arial"/>
+          <w:sz w:val="26"/>
+          <w:szCs w:val="26"/>
+        </w:rPr>
+        <w:t>de</w:t>
+      </w:r>
+      <w:r>
+        <w:rPr>
+          <w:rFonts w:ascii="Arial" w:hAnsi="Arial" w:cs="Arial"/>
+          <w:sz w:val="26"/>
+          <w:szCs w:val="26"/>
+        </w:rPr>
+        <w:t xml:space="preserve"> 24</w:t>
+      </w:r>
+      <w:r>
+        <w:rPr>
+          <w:rFonts w:ascii="Arial" w:eastAsia="Calibri" w:hAnsi="Arial" w:cs="Arial"/>
+          <w:sz w:val="26"/>
+          <w:szCs w:val="26"/>
+        </w:rPr>
+        <w:t>h</w:t>
+      </w:r>
+      <w:r>
+        <w:rPr>
+          <w:rFonts w:ascii="Arial" w:hAnsi="Arial" w:cs="Arial"/>
+          <w:sz w:val="26"/>
+          <w:szCs w:val="26"/>
+        </w:rPr>
+        <w:t xml:space="preserve"> </w:t>
+      </w:r>
+      <w:r>
+        <w:rPr>
+          <w:rFonts w:ascii="Arial" w:eastAsia="Calibri" w:hAnsi="Arial" w:cs="Arial"/>
+          <w:sz w:val="26"/>
+          <w:szCs w:val="26"/>
+        </w:rPr>
+        <w:t>ouvrées</w:t>
+      </w:r>
+      <w:r>
+        <w:rPr>
+          <w:rFonts w:ascii="Arial" w:hAnsi="Arial" w:cs="Arial"/>
+          <w:sz w:val="26"/>
+          <w:szCs w:val="26"/>
+        </w:rPr>
+        <w:t>.</w:t>
       </w:r>
     </w:p>
     <w:p>
       <w:pPr>
-        <w:rPr>
-          <w:rFonts w:ascii="Arial" w:hAnsi="Arial" w:cs="Arial"/>
-          <w:i/>
-          <w:sz w:val="26"/>
-          <w:szCs w:val="26"/>
-          <w:highlight w:val="yellow"/>
-        </w:rPr>
-      </w:pPr>
-      <w:r>
-        <w:rPr>
-          <w:rFonts w:ascii="Arial" w:hAnsi="Arial" w:cs="Arial"/>
-          <w:i/>
-          <w:sz w:val="26"/>
-          <w:szCs w:val="26"/>
-          <w:highlight w:val="yellow"/>
-        </w:rPr>
-        <w:t>- sa nature</w:t>
-      </w:r>
-    </w:p>
-    <w:p>
-      <w:pPr>
-        <w:rPr>
-          <w:rFonts w:ascii="Arial" w:hAnsi="Arial" w:cs="Arial"/>
-          <w:i/>
-          <w:sz w:val="26"/>
-          <w:szCs w:val="26"/>
-          <w:highlight w:val="yellow"/>
-        </w:rPr>
-      </w:pPr>
-      <w:r>
-        <w:rPr>
-          <w:rFonts w:ascii="Arial" w:hAnsi="Arial" w:cs="Arial"/>
-          <w:i/>
-          <w:sz w:val="26"/>
-          <w:szCs w:val="26"/>
-          <w:highlight w:val="yellow"/>
-        </w:rPr>
-        <w:t>- le nombre de livrable</w:t>
-      </w:r>
-    </w:p>
-    <w:p>
-      <w:pPr>
-        <w:rPr>
-          <w:rFonts w:ascii="Arial" w:hAnsi="Arial" w:cs="Arial"/>
-          <w:i/>
-          <w:sz w:val="26"/>
-          <w:szCs w:val="26"/>
-          <w:highlight w:val="yellow"/>
-        </w:rPr>
-      </w:pPr>
-      <w:r>
-        <w:rPr>
-          <w:rFonts w:ascii="Arial" w:hAnsi="Arial" w:cs="Arial"/>
-          <w:i/>
-          <w:sz w:val="26"/>
-          <w:szCs w:val="26"/>
-          <w:highlight w:val="yellow"/>
-        </w:rPr>
-        <w:t xml:space="preserve">- la forme (fichier zip, lien, objet …) </w:t>
-      </w:r>
-    </w:p>
-    <w:p>
-      <w:pPr>
-        <w:rPr>
-          <w:rFonts w:ascii="Arial" w:hAnsi="Arial" w:cs="Arial"/>
-          <w:i/>
-          <w:sz w:val="26"/>
-          <w:szCs w:val="26"/>
-          <w:highlight w:val="yellow"/>
-        </w:rPr>
-      </w:pPr>
-      <w:r>
-        <w:rPr>
-          <w:rFonts w:ascii="Arial" w:hAnsi="Arial" w:cs="Arial"/>
-          <w:i/>
-          <w:sz w:val="26"/>
-          <w:szCs w:val="26"/>
-          <w:highlight w:val="yellow"/>
-        </w:rPr>
-        <w:t>- la transmission au client (par mail, en main propre …)</w:t>
-      </w:r>
-    </w:p>
-    <w:p>
-      <w:pPr>
-        <w:rPr>
-          <w:rFonts w:ascii="Arial" w:hAnsi="Arial" w:cs="Arial"/>
-          <w:i/>
-          <w:sz w:val="26"/>
-          <w:szCs w:val="26"/>
-        </w:rPr>
-      </w:pPr>
-      <w:r>
-        <w:rPr>
-          <w:rFonts w:ascii="Arial" w:hAnsi="Arial" w:cs="Arial"/>
-          <w:i/>
-          <w:sz w:val="26"/>
-          <w:szCs w:val="26"/>
-          <w:highlight w:val="yellow"/>
-        </w:rPr>
-        <w:t>- existence ou non d’un guide administrateur, manuel d’utilisateur …]]</w:t>
-      </w:r>
-    </w:p>
-    <w:p>
-      <w:pPr>
         <w:pStyle w:val="Titre1"/>
         <w:rPr>
           <w:rFonts w:ascii="Arial" w:hAnsi="Arial" w:cs="Arial"/>
         </w:rPr>
       </w:pPr>
-      <w:r>
-        <w:rPr>
-          <w:rFonts w:ascii="Arial" w:hAnsi="Arial" w:cs="Arial"/>
+      <w:bookmarkStart w:id="33" w:name="_Toc491964570"/>
+      <w:r>
+        <w:rPr>
+          <w:rFonts w:ascii="Arial" w:eastAsia="Calibri" w:hAnsi="Arial" w:cs="Arial"/>
         </w:rPr>
         <w:lastRenderedPageBreak/>
-        <w:t xml:space="preserve"> </w:t>
-      </w:r>
-      <w:r>
-        <w:rPr>
-          <w:rFonts w:ascii="Arial" w:eastAsia="Calibri" w:hAnsi="Arial" w:cs="Arial"/>
-        </w:rPr>
-        <w:t>Glossaire</w:t>
+        <w:t>Conclusion</w:t>
       </w:r>
       <w:bookmarkEnd w:id="33"/>
     </w:p>
     <w:p>
       <w:pPr>
+        <w:ind w:firstLine="0"/>
+        <w:rPr>
+          <w:rFonts w:ascii="Arial" w:hAnsi="Arial" w:cs="Arial"/>
+          <w:i/>
+          <w:sz w:val="26"/>
+          <w:szCs w:val="26"/>
+          <w:highlight w:val="yellow"/>
+        </w:rPr>
+      </w:pPr>
+      <w:bookmarkStart w:id="34" w:name="_Toc491964571"/>
+      <w:r>
+        <w:rPr>
+          <w:rFonts w:ascii="Arial" w:hAnsi="Arial" w:cs="Arial"/>
+          <w:i/>
+          <w:sz w:val="26"/>
+          <w:szCs w:val="26"/>
+          <w:highlight w:val="yellow"/>
+        </w:rPr>
+        <w:t xml:space="preserve">[[Résumé du projet, détail du livrable : </w:t>
+      </w:r>
+    </w:p>
+    <w:p>
+      <w:pPr>
+        <w:rPr>
+          <w:rFonts w:ascii="Arial" w:hAnsi="Arial" w:cs="Arial"/>
+          <w:i/>
+          <w:sz w:val="26"/>
+          <w:szCs w:val="26"/>
+          <w:highlight w:val="yellow"/>
+        </w:rPr>
+      </w:pPr>
+      <w:r>
+        <w:rPr>
+          <w:rFonts w:ascii="Arial" w:hAnsi="Arial" w:cs="Arial"/>
+          <w:i/>
+          <w:sz w:val="26"/>
+          <w:szCs w:val="26"/>
+          <w:highlight w:val="yellow"/>
+        </w:rPr>
+        <w:t>- sa nature</w:t>
+      </w:r>
+    </w:p>
+    <w:p>
+      <w:pPr>
+        <w:rPr>
+          <w:rFonts w:ascii="Arial" w:hAnsi="Arial" w:cs="Arial"/>
+          <w:i/>
+          <w:sz w:val="26"/>
+          <w:szCs w:val="26"/>
+          <w:highlight w:val="yellow"/>
+        </w:rPr>
+      </w:pPr>
+      <w:r>
+        <w:rPr>
+          <w:rFonts w:ascii="Arial" w:hAnsi="Arial" w:cs="Arial"/>
+          <w:i/>
+          <w:sz w:val="26"/>
+          <w:szCs w:val="26"/>
+          <w:highlight w:val="yellow"/>
+        </w:rPr>
+        <w:t>- le nombre de livrable</w:t>
+      </w:r>
+    </w:p>
+    <w:p>
+      <w:pPr>
+        <w:rPr>
+          <w:rFonts w:ascii="Arial" w:hAnsi="Arial" w:cs="Arial"/>
+          <w:i/>
+          <w:sz w:val="26"/>
+          <w:szCs w:val="26"/>
+          <w:highlight w:val="yellow"/>
+        </w:rPr>
+      </w:pPr>
+      <w:r>
+        <w:rPr>
+          <w:rFonts w:ascii="Arial" w:hAnsi="Arial" w:cs="Arial"/>
+          <w:i/>
+          <w:sz w:val="26"/>
+          <w:szCs w:val="26"/>
+          <w:highlight w:val="yellow"/>
+        </w:rPr>
+        <w:t xml:space="preserve">- la forme (fichier zip, lien, objet …) </w:t>
+      </w:r>
+    </w:p>
+    <w:p>
+      <w:pPr>
+        <w:rPr>
+          <w:rFonts w:ascii="Arial" w:hAnsi="Arial" w:cs="Arial"/>
+          <w:i/>
+          <w:sz w:val="26"/>
+          <w:szCs w:val="26"/>
+          <w:highlight w:val="yellow"/>
+        </w:rPr>
+      </w:pPr>
+      <w:r>
+        <w:rPr>
+          <w:rFonts w:ascii="Arial" w:hAnsi="Arial" w:cs="Arial"/>
+          <w:i/>
+          <w:sz w:val="26"/>
+          <w:szCs w:val="26"/>
+          <w:highlight w:val="yellow"/>
+        </w:rPr>
+        <w:t>- la transmission au client (par mail, en main propre …)</w:t>
+      </w:r>
+    </w:p>
+    <w:p>
+      <w:pPr>
+        <w:rPr>
+          <w:rFonts w:ascii="Arial" w:hAnsi="Arial" w:cs="Arial"/>
+          <w:i/>
+          <w:sz w:val="26"/>
+          <w:szCs w:val="26"/>
+        </w:rPr>
+      </w:pPr>
+      <w:r>
+        <w:rPr>
+          <w:rFonts w:ascii="Arial" w:hAnsi="Arial" w:cs="Arial"/>
+          <w:i/>
+          <w:sz w:val="26"/>
+          <w:szCs w:val="26"/>
+          <w:highlight w:val="yellow"/>
+        </w:rPr>
+        <w:t>- existence ou non d’un guide administrateur, manuel d’utilisateur …]]</w:t>
+      </w:r>
+    </w:p>
+    <w:p>
+      <w:pPr>
+        <w:pStyle w:val="Titre1"/>
+        <w:rPr>
+          <w:rFonts w:ascii="Arial" w:hAnsi="Arial" w:cs="Arial"/>
+        </w:rPr>
+      </w:pPr>
+      <w:r>
+        <w:rPr>
+          <w:rFonts w:ascii="Arial" w:hAnsi="Arial" w:cs="Arial"/>
+        </w:rPr>
+        <w:t xml:space="preserve"> </w:t>
+      </w:r>
+      <w:r>
+        <w:rPr>
+          <w:rFonts w:ascii="Arial" w:eastAsia="Calibri" w:hAnsi="Arial" w:cs="Arial"/>
+        </w:rPr>
+        <w:t>Glossaire</w:t>
+      </w:r>
+      <w:bookmarkEnd w:id="34"/>
+    </w:p>
+    <w:p>
+      <w:pPr>
         <w:rPr>
           <w:rFonts w:ascii="Arial" w:hAnsi="Arial" w:cs="Arial"/>
           <w:sz w:val="26"/>
@@ -12468,7 +12395,7 @@
         </w:rPr>
         <w:br w:type="page"/>
       </w:r>
-      <w:bookmarkStart w:id="34" w:name="_Toc491964573"/>
+      <w:bookmarkStart w:id="35" w:name="_Toc491964573"/>
       <w:r>
         <w:rPr>
           <w:rFonts w:ascii="Arial" w:eastAsia="Calibri" w:hAnsi="Arial" w:cs="Arial"/>
@@ -12488,7 +12415,7 @@
         </w:rPr>
         <w:t>financière</w:t>
       </w:r>
-      <w:bookmarkEnd w:id="34"/>
+      <w:bookmarkEnd w:id="35"/>
     </w:p>
     <w:tbl>
       <w:tblPr>
@@ -15290,14 +15217,14 @@
           <w:rFonts w:ascii="Arial" w:hAnsi="Arial" w:cs="Arial"/>
         </w:rPr>
       </w:pPr>
-      <w:bookmarkStart w:id="35" w:name="_Toc491964574"/>
+      <w:bookmarkStart w:id="36" w:name="_Toc491964574"/>
       <w:r>
         <w:rPr>
           <w:rFonts w:ascii="Arial" w:eastAsia="Calibri" w:hAnsi="Arial" w:cs="Arial"/>
         </w:rPr>
         <w:t>Confidentialité</w:t>
       </w:r>
-      <w:bookmarkEnd w:id="35"/>
+      <w:bookmarkEnd w:id="36"/>
     </w:p>
     <w:p>
       <w:pPr>
@@ -18170,16 +18097,7 @@
           <w:color w:val="000000"/>
           <w:sz w:val="20"/>
         </w:rPr>
-        <w:t>, et membre de la C</w:t>
-      </w:r>
-      <w:bookmarkStart w:id="36" w:name="_GoBack"/>
-      <w:bookmarkEnd w:id="36"/>
-      <w:r>
-        <w:rPr>
-          <w:color w:val="000000"/>
-          <w:sz w:val="20"/>
-        </w:rPr>
-        <w:t xml:space="preserve">onfédération Nationale des Junior-Entreprises. Elle a pour vocation de compléter la formation théorique dispensée dans son établissement d’enseignement supérieur par des applications pratiques à vocation pédagogique dans un contexte professionnel. C’est dans cet esprit que le Client a confié à </w:t>
+        <w:t xml:space="preserve">, et membre de la Confédération Nationale des Junior-Entreprises. Elle a pour vocation de compléter la formation théorique dispensée dans son établissement d’enseignement supérieur par des applications pratiques à vocation pédagogique dans un contexte professionnel. C’est dans cet esprit que le Client a confié à </w:t>
       </w:r>
       <w:r>
         <w:rPr>
@@ -21206,7 +21124,7 @@
               <w:noProof/>
               <w:sz w:val="24"/>
             </w:rPr>
-            <w:t>14</w:t>
+            <w:t>18</w:t>
           </w:r>
           <w:r>
             <w:rPr>
@@ -21263,7 +21181,7 @@
               <w:noProof/>
               <w:sz w:val="24"/>
             </w:rPr>
-            <w:t>19</w:t>
+            <w:t>18</w:t>
           </w:r>
           <w:r>
             <w:rPr>

</xml_diff>

<commit_message>
Modified CE and DEVIS doctypes
</commit_message>
<xml_diff>
--- a/flower_backend/doctypes/CETUDE.docx
+++ b/flower_backend/doctypes/CETUDE.docx
@@ -510,9 +510,8 @@
                 <w:sz w:val="32"/>
                 <w:szCs w:val="32"/>
               </w:rPr>
-              <w:t xml:space="preserve">{ </w:t>
-            </w:r>
-            <w:proofErr w:type="spellStart"/>
+              <w:t>{ etude.prospect</w:t>
+            </w:r>
             <w:r>
               <w:rPr>
                 <w:rFonts w:ascii="Arial" w:eastAsia="Calibri" w:hAnsi="Arial" w:cs="Arial"/>
@@ -520,9 +519,8 @@
                 <w:sz w:val="32"/>
                 <w:szCs w:val="32"/>
               </w:rPr>
-              <w:t>etude.prospect</w:t>
-            </w:r>
-            <w:proofErr w:type="spellEnd"/>
+              <w:t>.name</w:t>
+            </w:r>
             <w:proofErr w:type="gramEnd"/>
             <w:r>
               <w:rPr>
@@ -630,6 +628,7 @@
                 <w:rFonts w:ascii="Arial" w:eastAsia="Calibri" w:hAnsi="Arial" w:cs="Arial"/>
                 <w:color w:val="000000" w:themeColor="text1"/>
                 <w:szCs w:val="28"/>
+                <w:lang w:val="en-GB"/>
               </w:rPr>
             </w:pPr>
             <w:r>
@@ -637,58 +636,54 @@
                 <w:rFonts w:ascii="Arial" w:eastAsia="Calibri" w:hAnsi="Arial" w:cs="Arial"/>
                 <w:color w:val="000000" w:themeColor="text1"/>
                 <w:szCs w:val="28"/>
-              </w:rPr>
-              <w:t>{</w:t>
-            </w:r>
-            <w:proofErr w:type="gramStart"/>
+                <w:lang w:val="en-GB"/>
+              </w:rPr>
+              <w:t>{{</w:t>
+            </w:r>
             <w:r>
               <w:rPr>
                 <w:rFonts w:ascii="Arial" w:eastAsia="Calibri" w:hAnsi="Arial" w:cs="Arial"/>
                 <w:color w:val="000000" w:themeColor="text1"/>
                 <w:szCs w:val="28"/>
-              </w:rPr>
-              <w:t>{</w:t>
-            </w:r>
+                <w:lang w:val="en-GB"/>
+              </w:rPr>
+              <w:t xml:space="preserve"> </w:t>
+            </w:r>
+            <w:proofErr w:type="spellStart"/>
             <w:r>
               <w:rPr>
                 <w:rFonts w:ascii="Arial" w:eastAsia="Calibri" w:hAnsi="Arial" w:cs="Arial"/>
                 <w:color w:val="000000" w:themeColor="text1"/>
                 <w:szCs w:val="28"/>
-              </w:rPr>
-              <w:t xml:space="preserve"> </w:t>
-            </w:r>
-            <w:proofErr w:type="spellStart"/>
+                <w:lang w:val="en-GB"/>
+              </w:rPr>
+              <w:t>etude.</w:t>
+            </w:r>
             <w:r>
               <w:rPr>
                 <w:rFonts w:ascii="Arial" w:eastAsia="Calibri" w:hAnsi="Arial" w:cs="Arial"/>
                 <w:color w:val="000000" w:themeColor="text1"/>
                 <w:szCs w:val="28"/>
-              </w:rPr>
-              <w:t>etude.</w:t>
-            </w:r>
+                <w:lang w:val="en-GB"/>
+              </w:rPr>
+              <w:t>projectManager</w:t>
+            </w:r>
+            <w:proofErr w:type="spellEnd"/>
             <w:r>
               <w:rPr>
                 <w:rFonts w:ascii="Arial" w:eastAsia="Calibri" w:hAnsi="Arial" w:cs="Arial"/>
                 <w:color w:val="000000" w:themeColor="text1"/>
                 <w:szCs w:val="28"/>
-              </w:rPr>
-              <w:t>projectManager</w:t>
-            </w:r>
-            <w:proofErr w:type="spellEnd"/>
-            <w:proofErr w:type="gramEnd"/>
+                <w:lang w:val="en-GB"/>
+              </w:rPr>
+              <w:t xml:space="preserve"> </w:t>
+            </w:r>
             <w:r>
               <w:rPr>
                 <w:rFonts w:ascii="Arial" w:eastAsia="Calibri" w:hAnsi="Arial" w:cs="Arial"/>
                 <w:color w:val="000000" w:themeColor="text1"/>
                 <w:szCs w:val="28"/>
-              </w:rPr>
-              <w:t xml:space="preserve"> </w:t>
-            </w:r>
-            <w:r>
-              <w:rPr>
-                <w:rFonts w:ascii="Arial" w:eastAsia="Calibri" w:hAnsi="Arial" w:cs="Arial"/>
-                <w:color w:val="000000" w:themeColor="text1"/>
-                <w:szCs w:val="28"/>
+                <w:lang w:val="en-GB"/>
               </w:rPr>
               <w:t>}}</w:t>
             </w:r>
@@ -864,43 +859,56 @@
                 <w:rFonts w:ascii="Arial" w:eastAsia="Calibri" w:hAnsi="Arial" w:cs="Arial"/>
                 <w:lang w:val="en-GB"/>
               </w:rPr>
-              <w:t>{{ etude.ce.</w:t>
+              <w:t>{% if etude.</w:t>
             </w:r>
             <w:r>
               <w:rPr>
                 <w:rFonts w:ascii="Arial" w:eastAsia="Calibri" w:hAnsi="Arial" w:cs="Arial"/>
                 <w:lang w:val="en-GB"/>
               </w:rPr>
-              <w:t>signer2</w:t>
+              <w:t>ce.signer2.mobile %}</w:t>
             </w:r>
             <w:r>
               <w:rPr>
                 <w:rFonts w:ascii="Arial" w:eastAsia="Calibri" w:hAnsi="Arial" w:cs="Arial"/>
                 <w:lang w:val="en-GB"/>
               </w:rPr>
-              <w:t>.</w:t>
+              <w:t>{{ etude.ce.</w:t>
             </w:r>
             <w:r>
               <w:rPr>
                 <w:rFonts w:ascii="Arial" w:eastAsia="Calibri" w:hAnsi="Arial" w:cs="Arial"/>
                 <w:lang w:val="en-GB"/>
               </w:rPr>
-              <w:t>phone</w:t>
+              <w:t>signer2</w:t>
             </w:r>
             <w:r>
               <w:rPr>
                 <w:rFonts w:ascii="Arial" w:eastAsia="Calibri" w:hAnsi="Arial" w:cs="Arial"/>
                 <w:lang w:val="en-GB"/>
               </w:rPr>
-              <w:t xml:space="preserve"> }}  </w:t>
-            </w:r>
-            <w:r>
-              <w:rPr>
-                <w:rFonts w:ascii="Arial" w:hAnsi="Arial" w:cs="Arial"/>
-                <w:bCs/>
-                <w:szCs w:val="28"/>
-              </w:rPr>
-              <w:t></w:t>
+              <w:t>.</w:t>
+            </w:r>
+            <w:r>
+              <w:rPr>
+                <w:rFonts w:ascii="Arial" w:eastAsia="Calibri" w:hAnsi="Arial" w:cs="Arial"/>
+                <w:lang w:val="en-GB"/>
+              </w:rPr>
+              <w:t>mobile</w:t>
+            </w:r>
+            <w:r>
+              <w:rPr>
+                <w:rFonts w:ascii="Arial" w:eastAsia="Calibri" w:hAnsi="Arial" w:cs="Arial"/>
+                <w:lang w:val="en-GB"/>
+              </w:rPr>
+              <w:t xml:space="preserve"> }} </w:t>
+            </w:r>
+            <w:r>
+              <w:rPr>
+                <w:rFonts w:ascii="Segoe UI Symbol" w:eastAsia="Calibri" w:hAnsi="Segoe UI Symbol" w:cs="Segoe UI Symbol"/>
+                <w:lang w:val="en-GB"/>
+              </w:rPr>
+              <w:t>📞</w:t>
             </w:r>
           </w:p>
           <w:p>
@@ -920,29 +928,72 @@
                 <w:rFonts w:ascii="Arial" w:eastAsia="Calibri" w:hAnsi="Arial" w:cs="Arial"/>
                 <w:lang w:val="en-GB"/>
               </w:rPr>
-              <w:t>{{ etude.ce.</w:t>
-            </w:r>
+              <w:t xml:space="preserve">{% </w:t>
+            </w:r>
+            <w:proofErr w:type="spellStart"/>
             <w:r>
               <w:rPr>
                 <w:rFonts w:ascii="Arial" w:eastAsia="Calibri" w:hAnsi="Arial" w:cs="Arial"/>
                 <w:lang w:val="en-GB"/>
               </w:rPr>
-              <w:t>signer2</w:t>
-            </w:r>
+              <w:t>endif</w:t>
+            </w:r>
+            <w:proofErr w:type="spellEnd"/>
             <w:r>
               <w:rPr>
                 <w:rFonts w:ascii="Arial" w:eastAsia="Calibri" w:hAnsi="Arial" w:cs="Arial"/>
                 <w:lang w:val="en-GB"/>
               </w:rPr>
-              <w:t xml:space="preserve">.mail }}  </w:t>
-            </w:r>
-            <w:r>
-              <w:rPr>
-                <w:rFonts w:ascii="Arial Hebrew" w:hAnsi="Arial Hebrew" w:cs="Arial Hebrew"/>
-                <w:bCs/>
-                <w:szCs w:val="28"/>
-              </w:rPr>
-              <w:t></w:t>
+              <w:t xml:space="preserve"> %}</w:t>
+            </w:r>
+            <w:r>
+              <w:rPr>
+                <w:rFonts w:ascii="Arial" w:eastAsia="Calibri" w:hAnsi="Arial" w:cs="Arial"/>
+                <w:lang w:val="en-GB"/>
+              </w:rPr>
+              <w:t>{{ etude.ce.</w:t>
+            </w:r>
+            <w:r>
+              <w:rPr>
+                <w:rFonts w:ascii="Arial" w:eastAsia="Calibri" w:hAnsi="Arial" w:cs="Arial"/>
+                <w:lang w:val="en-GB"/>
+              </w:rPr>
+              <w:t>signer2</w:t>
+            </w:r>
+            <w:r>
+              <w:rPr>
+                <w:rFonts w:ascii="Arial" w:eastAsia="Calibri" w:hAnsi="Arial" w:cs="Arial"/>
+                <w:lang w:val="en-GB"/>
+              </w:rPr>
+              <w:t>.</w:t>
+            </w:r>
+            <w:r>
+              <w:rPr>
+                <w:rFonts w:ascii="Arial" w:eastAsia="Calibri" w:hAnsi="Arial" w:cs="Arial"/>
+                <w:lang w:val="en-GB"/>
+              </w:rPr>
+              <w:t>e</w:t>
+            </w:r>
+            <w:r>
+              <w:rPr>
+                <w:rFonts w:ascii="Arial" w:eastAsia="Calibri" w:hAnsi="Arial" w:cs="Arial"/>
+                <w:lang w:val="en-GB"/>
+              </w:rPr>
+              <w:t>mail }}</w:t>
+            </w:r>
+            <w:r>
+              <w:rPr>
+                <w:rFonts w:ascii="Arial" w:eastAsia="Calibri" w:hAnsi="Arial" w:cs="Arial"/>
+                <w:lang w:val="en-GB"/>
+              </w:rPr>
+              <w:t xml:space="preserve"> </w:t>
+            </w:r>
+            <w:r>
+              <w:rPr>
+                <w:rFonts w:ascii="Segoe UI Symbol" w:eastAsia="Calibri" w:hAnsi="Segoe UI Symbol" w:cs="Segoe UI Symbol"/>
+                <w:lang w:val="en-GB"/>
+              </w:rPr>
+              <w:t>📧</w:t>
             </w:r>
           </w:p>
         </w:tc>
@@ -1124,13 +1175,14 @@
             </w:pPr>
             <w:r>
               <w:rPr>
-                <w:rFonts w:ascii="Arial" w:hAnsi="Arial" w:cs="Arial"/>
+                <w:rFonts w:ascii="Segoe UI Symbol" w:hAnsi="Segoe UI Symbol" w:cs="Segoe UI Symbol"/>
                 <w:bCs/>
                 <w:color w:val="000000" w:themeColor="text1"/>
                 <w:sz w:val="22"/>
                 <w:szCs w:val="22"/>
-              </w:rPr>
-              <w:t></w:t>
+                <w:lang w:val="en-GB"/>
+              </w:rPr>
+              <w:t>☎</w:t>
             </w:r>
             <w:r>
               <w:rPr>
@@ -1270,6 +1322,7 @@
                 <w:color w:val="000000"/>
                 <w:sz w:val="22"/>
                 <w:szCs w:val="22"/>
+                <w:lang w:val="en-GB"/>
               </w:rPr>
             </w:pPr>
             <w:r>
@@ -1289,6 +1342,7 @@
                 <w:color w:val="000000" w:themeColor="text1"/>
                 <w:sz w:val="22"/>
                 <w:szCs w:val="22"/>
+                <w:lang w:val="en-GB"/>
               </w:rPr>
               <w:t xml:space="preserve">  </w:t>
             </w:r>
@@ -1298,6 +1352,7 @@
                 <w:sz w:val="22"/>
                 <w:szCs w:val="22"/>
                 <w:u w:val="single"/>
+                <w:lang w:val="en-GB"/>
               </w:rPr>
               <w:t>{</w:t>
             </w:r>
@@ -1308,6 +1363,7 @@
                 <w:sz w:val="22"/>
                 <w:szCs w:val="22"/>
                 <w:u w:val="single"/>
+                <w:lang w:val="en-GB"/>
               </w:rPr>
               <w:t xml:space="preserve">{ </w:t>
             </w:r>
@@ -1318,6 +1374,7 @@
                 <w:sz w:val="22"/>
                 <w:szCs w:val="22"/>
                 <w:u w:val="single"/>
+                <w:lang w:val="en-GB"/>
               </w:rPr>
               <w:t>param</w:t>
             </w:r>
@@ -1329,6 +1386,7 @@
                 <w:sz w:val="22"/>
                 <w:szCs w:val="22"/>
                 <w:u w:val="single"/>
+                <w:lang w:val="en-GB"/>
               </w:rPr>
               <w:t>(</w:t>
             </w:r>
@@ -1339,6 +1397,7 @@
                 <w:sz w:val="22"/>
                 <w:szCs w:val="22"/>
                 <w:u w:val="single"/>
+                <w:lang w:val="en-GB"/>
               </w:rPr>
               <w:t>'</w:t>
             </w:r>
@@ -1350,6 +1409,7 @@
                 <w:sz w:val="22"/>
                 <w:szCs w:val="22"/>
                 <w:u w:val="single"/>
+                <w:lang w:val="en-GB"/>
               </w:rPr>
               <w:t>je_url</w:t>
             </w:r>
@@ -1361,6 +1421,7 @@
                 <w:sz w:val="22"/>
                 <w:szCs w:val="22"/>
                 <w:u w:val="single"/>
+                <w:lang w:val="en-GB"/>
               </w:rPr>
               <w:t>') }}</w:t>
             </w:r>
@@ -1374,6 +1435,7 @@
                 <w:color w:val="000000" w:themeColor="text1"/>
                 <w:sz w:val="22"/>
                 <w:szCs w:val="22"/>
+                <w:lang w:val="en-GB"/>
               </w:rPr>
             </w:pPr>
           </w:p>
@@ -1386,6 +1448,7 @@
                 <w:color w:val="000000" w:themeColor="text1"/>
                 <w:sz w:val="22"/>
                 <w:szCs w:val="22"/>
+                <w:lang w:val="en-GB"/>
               </w:rPr>
             </w:pPr>
           </w:p>
@@ -1406,8 +1469,18 @@
                 <w:color w:val="000000" w:themeColor="text1"/>
                 <w:sz w:val="22"/>
                 <w:szCs w:val="22"/>
-              </w:rPr>
-              <w:t>SIRET</w:t>
+                <w:lang w:val="en-GB"/>
+              </w:rPr>
+              <w:t>SIRE</w:t>
+            </w:r>
+            <w:r>
+              <w:rPr>
+                <w:rFonts w:ascii="Arial" w:eastAsia="Calibri" w:hAnsi="Arial" w:cs="Arial"/>
+                <w:color w:val="000000" w:themeColor="text1"/>
+                <w:sz w:val="22"/>
+                <w:szCs w:val="22"/>
+              </w:rPr>
+              <w:t>T</w:t>
             </w:r>
             <w:r>
               <w:rPr>
@@ -1539,7 +1612,72 @@
                 <w:sz w:val="20"/>
                 <w:szCs w:val="20"/>
               </w:rPr>
-              <w:t xml:space="preserve"> Ouest INSA</w:t>
+              <w:t xml:space="preserve"> </w:t>
+            </w:r>
+            <w:r>
+              <w:rPr>
+                <w:rFonts w:ascii="Arial" w:hAnsi="Arial" w:cs="Arial"/>
+                <w:sz w:val="20"/>
+                <w:szCs w:val="20"/>
+              </w:rPr>
+              <w:t>{</w:t>
+            </w:r>
+            <w:proofErr w:type="gramStart"/>
+            <w:r>
+              <w:rPr>
+                <w:rFonts w:ascii="Arial" w:hAnsi="Arial" w:cs="Arial"/>
+                <w:sz w:val="20"/>
+                <w:szCs w:val="20"/>
+              </w:rPr>
+              <w:t xml:space="preserve">{ </w:t>
+            </w:r>
+            <w:proofErr w:type="spellStart"/>
+            <w:r>
+              <w:rPr>
+                <w:rFonts w:ascii="Arial" w:hAnsi="Arial" w:cs="Arial"/>
+                <w:sz w:val="20"/>
+                <w:szCs w:val="20"/>
+              </w:rPr>
+              <w:t>param</w:t>
+            </w:r>
+            <w:proofErr w:type="spellEnd"/>
+            <w:proofErr w:type="gramEnd"/>
+            <w:r>
+              <w:rPr>
+                <w:rFonts w:ascii="Arial" w:hAnsi="Arial" w:cs="Arial"/>
+                <w:sz w:val="20"/>
+                <w:szCs w:val="20"/>
+              </w:rPr>
+              <w:t>(</w:t>
+            </w:r>
+            <w:r>
+              <w:rPr>
+                <w:rFonts w:ascii="Arial" w:eastAsia="Arial" w:hAnsi="Arial" w:cs="Arial"/>
+                <w:color w:val="000000"/>
+                <w:sz w:val="20"/>
+                <w:szCs w:val="20"/>
+              </w:rPr>
+              <w:t>'</w:t>
+            </w:r>
+            <w:proofErr w:type="spellStart"/>
+            <w:r>
+              <w:rPr>
+                <w:rFonts w:ascii="Arial" w:eastAsia="Arial" w:hAnsi="Arial" w:cs="Arial"/>
+                <w:color w:val="000000"/>
+                <w:sz w:val="20"/>
+                <w:szCs w:val="20"/>
+              </w:rPr>
+              <w:t>je_name</w:t>
+            </w:r>
+            <w:proofErr w:type="spellEnd"/>
+            <w:r>
+              <w:rPr>
+                <w:rFonts w:ascii="Arial" w:eastAsia="Arial" w:hAnsi="Arial" w:cs="Arial"/>
+                <w:color w:val="000000"/>
+                <w:sz w:val="20"/>
+                <w:szCs w:val="20"/>
+              </w:rPr>
+              <w:t>') }}</w:t>
             </w:r>
             <w:r>
               <w:rPr>
@@ -7723,7 +7861,15 @@
           <w:sz w:val="26"/>
           <w:szCs w:val="26"/>
         </w:rPr>
-        <w:t>_set.values</w:t>
+        <w:t>_set.</w:t>
+      </w:r>
+      <w:r>
+        <w:rPr>
+          <w:rFonts w:ascii="Arial" w:hAnsi="Arial" w:cs="Arial"/>
+          <w:sz w:val="26"/>
+          <w:szCs w:val="26"/>
+        </w:rPr>
+        <w:t>all</w:t>
       </w:r>
       <w:proofErr w:type="spellEnd"/>
       <w:r>
@@ -7817,714 +7963,769 @@
     </w:p>
     <w:p>
       <w:pPr>
-        <w:ind w:firstLine="0"/>
-        <w:rPr>
-          <w:rFonts w:ascii="Arial" w:hAnsi="Arial" w:cs="Arial"/>
+        <w:rPr>
+          <w:rFonts w:ascii="Arial" w:eastAsia="Arial" w:hAnsi="Arial" w:cs="Arial"/>
           <w:b/>
-          <w:sz w:val="26"/>
-          <w:szCs w:val="26"/>
-          <w:lang w:val="en-US"/>
-        </w:rPr>
-      </w:pPr>
-      <w:r>
-        <w:rPr>
-          <w:rFonts w:ascii="Arial" w:hAnsi="Arial" w:cs="Arial"/>
-          <w:sz w:val="26"/>
-          <w:szCs w:val="26"/>
-          <w:lang w:val="en-US"/>
-        </w:rPr>
-        <w:t xml:space="preserve">{% for phase in </w:t>
+          <w:i/>
+          <w:color w:val="021A32"/>
+          <w:sz w:val="22"/>
+          <w:szCs w:val="22"/>
+        </w:rPr>
+      </w:pPr>
+      <w:r>
+        <w:rPr>
+          <w:rFonts w:ascii="Arial" w:eastAsia="Helvetica Neue" w:hAnsi="Arial" w:cs="Arial"/>
+          <w:sz w:val="22"/>
+          <w:szCs w:val="22"/>
+        </w:rPr>
+        <w:t>La réalisation de cette étude se décompose en {</w:t>
+      </w:r>
+      <w:proofErr w:type="gramStart"/>
+      <w:r>
+        <w:rPr>
+          <w:rFonts w:ascii="Arial" w:eastAsia="Helvetica Neue" w:hAnsi="Arial" w:cs="Arial"/>
+          <w:sz w:val="22"/>
+          <w:szCs w:val="22"/>
+        </w:rPr>
+        <w:t>{</w:t>
+      </w:r>
+      <w:r>
+        <w:rPr>
+          <w:rFonts w:ascii="Arial" w:eastAsia="Helvetica Neue" w:hAnsi="Arial" w:cs="Arial"/>
+          <w:sz w:val="22"/>
+          <w:szCs w:val="22"/>
+        </w:rPr>
+        <w:t xml:space="preserve"> </w:t>
       </w:r>
       <w:proofErr w:type="spellStart"/>
       <w:r>
         <w:rPr>
-          <w:rFonts w:ascii="Arial" w:hAnsi="Arial" w:cs="Arial"/>
-          <w:sz w:val="26"/>
-          <w:szCs w:val="26"/>
-          <w:lang w:val="en-US"/>
-        </w:rPr>
-        <w:t>etude.phases</w:t>
+          <w:rFonts w:ascii="Arial" w:eastAsia="Helvetica Neue" w:hAnsi="Arial" w:cs="Arial"/>
+          <w:sz w:val="22"/>
+          <w:szCs w:val="22"/>
+        </w:rPr>
+        <w:t>etude.group</w:t>
+      </w:r>
+      <w:r>
+        <w:rPr>
+          <w:rFonts w:ascii="Arial" w:eastAsia="Helvetica Neue" w:hAnsi="Arial" w:cs="Arial"/>
+          <w:sz w:val="22"/>
+          <w:szCs w:val="22"/>
+        </w:rPr>
+        <w:t>e</w:t>
+      </w:r>
+      <w:proofErr w:type="gramEnd"/>
+      <w:r>
+        <w:rPr>
+          <w:rFonts w:ascii="Arial" w:eastAsia="Helvetica Neue" w:hAnsi="Arial" w:cs="Arial"/>
+          <w:sz w:val="22"/>
+          <w:szCs w:val="22"/>
+        </w:rPr>
+        <w:t>_set.values</w:t>
       </w:r>
       <w:proofErr w:type="spellEnd"/>
       <w:r>
         <w:rPr>
-          <w:rFonts w:ascii="Arial" w:hAnsi="Arial" w:cs="Arial"/>
-          <w:sz w:val="26"/>
-          <w:szCs w:val="26"/>
-          <w:lang w:val="en-US"/>
-        </w:rPr>
-        <w:t xml:space="preserve"> %}</w:t>
-      </w:r>
-      <w:r>
-        <w:rPr>
-          <w:rFonts w:ascii="Arial" w:hAnsi="Arial" w:cs="Arial"/>
-          <w:sz w:val="26"/>
-          <w:szCs w:val="26"/>
-          <w:lang w:val="en-US"/>
-        </w:rPr>
-        <w:tab/>
-      </w:r>
-      <w:r>
-        <w:rPr>
-          <w:rFonts w:ascii="Arial" w:eastAsia="Calibri" w:hAnsi="Arial" w:cs="Arial"/>
-          <w:b/>
-          <w:sz w:val="26"/>
-          <w:szCs w:val="26"/>
-          <w:lang w:val="en-US"/>
-        </w:rPr>
-        <w:t>Phase</w:t>
-      </w:r>
-      <w:r>
-        <w:rPr>
-          <w:rFonts w:ascii="Arial" w:hAnsi="Arial" w:cs="Arial"/>
-          <w:b/>
-          <w:sz w:val="26"/>
-          <w:szCs w:val="26"/>
-          <w:lang w:val="en-US"/>
-        </w:rPr>
-        <w:t xml:space="preserve"> {{</w:t>
+          <w:rFonts w:ascii="Arial" w:eastAsia="Helvetica Neue" w:hAnsi="Arial" w:cs="Arial"/>
+          <w:sz w:val="22"/>
+          <w:szCs w:val="22"/>
+        </w:rPr>
+        <w:t xml:space="preserve">() | </w:t>
       </w:r>
       <w:proofErr w:type="spellStart"/>
       <w:r>
         <w:rPr>
-          <w:rFonts w:ascii="Arial" w:hAnsi="Arial" w:cs="Arial"/>
-          <w:b/>
-          <w:sz w:val="26"/>
-          <w:szCs w:val="26"/>
-          <w:lang w:val="en-US"/>
-        </w:rPr>
-        <w:t>loop.index</w:t>
+          <w:rFonts w:ascii="Arial" w:eastAsia="Helvetica Neue" w:hAnsi="Arial" w:cs="Arial"/>
+          <w:sz w:val="22"/>
+          <w:szCs w:val="22"/>
+        </w:rPr>
+        <w:t>length</w:t>
       </w:r>
       <w:proofErr w:type="spellEnd"/>
       <w:r>
         <w:rPr>
-          <w:rFonts w:ascii="Arial" w:hAnsi="Arial" w:cs="Arial"/>
-          <w:b/>
-          <w:sz w:val="26"/>
-          <w:szCs w:val="26"/>
-          <w:lang w:val="en-US"/>
-        </w:rPr>
-        <w:t>}</w:t>
-      </w:r>
-      <w:proofErr w:type="gramStart"/>
-      <w:r>
-        <w:rPr>
-          <w:rFonts w:ascii="Arial" w:hAnsi="Arial" w:cs="Arial"/>
-          <w:b/>
-          <w:sz w:val="26"/>
-          <w:szCs w:val="26"/>
-          <w:lang w:val="en-US"/>
-        </w:rPr>
-        <w:t>} :</w:t>
-      </w:r>
-      <w:proofErr w:type="gramEnd"/>
-      <w:r>
-        <w:rPr>
-          <w:rFonts w:ascii="Arial" w:hAnsi="Arial" w:cs="Arial"/>
-          <w:b/>
-          <w:sz w:val="26"/>
-          <w:szCs w:val="26"/>
-          <w:lang w:val="en-US"/>
-        </w:rPr>
-        <w:t xml:space="preserve"> {{</w:t>
-      </w:r>
-      <w:proofErr w:type="spellStart"/>
-      <w:r>
-        <w:rPr>
-          <w:rFonts w:ascii="Arial" w:hAnsi="Arial" w:cs="Arial"/>
-          <w:b/>
-          <w:sz w:val="26"/>
-          <w:szCs w:val="26"/>
-          <w:lang w:val="en-US"/>
-        </w:rPr>
-        <w:t>phase.titre</w:t>
-      </w:r>
-      <w:proofErr w:type="spellEnd"/>
-      <w:r>
-        <w:rPr>
-          <w:rFonts w:ascii="Arial" w:hAnsi="Arial" w:cs="Arial"/>
-          <w:b/>
-          <w:sz w:val="26"/>
-          <w:szCs w:val="26"/>
-          <w:lang w:val="en-US"/>
-        </w:rPr>
-        <w:t>}}</w:t>
+          <w:rFonts w:ascii="Arial" w:eastAsia="Helvetica Neue" w:hAnsi="Arial" w:cs="Arial"/>
+          <w:sz w:val="22"/>
+          <w:szCs w:val="22"/>
+        </w:rPr>
+        <w:t xml:space="preserve"> </w:t>
+      </w:r>
+      <w:r>
+        <w:rPr>
+          <w:rFonts w:ascii="Arial" w:eastAsia="Helvetica Neue" w:hAnsi="Arial" w:cs="Arial"/>
+          <w:sz w:val="22"/>
+          <w:szCs w:val="22"/>
+        </w:rPr>
+        <w:t>}} phases :</w:t>
       </w:r>
     </w:p>
     <w:p>
       <w:pPr>
-        <w:ind w:firstLine="0"/>
-        <w:rPr>
-          <w:rFonts w:ascii="Arial" w:hAnsi="Arial" w:cs="Arial"/>
-          <w:sz w:val="26"/>
-          <w:szCs w:val="26"/>
-          <w:lang w:val="en-US"/>
-        </w:rPr>
-      </w:pPr>
-      <w:r>
-        <w:rPr>
-          <w:rFonts w:ascii="Arial" w:hAnsi="Arial" w:cs="Arial"/>
+        <w:rPr>
+          <w:rFonts w:ascii="Arial" w:eastAsia="Arial" w:hAnsi="Arial" w:cs="Arial"/>
           <w:b/>
-          <w:sz w:val="26"/>
-          <w:szCs w:val="26"/>
-          <w:lang w:val="en-US"/>
-        </w:rPr>
-        <w:tab/>
+          <w:sz w:val="22"/>
+          <w:szCs w:val="22"/>
+          <w:lang w:val="en-GB"/>
+        </w:rPr>
+      </w:pPr>
+      <w:r>
+        <w:rPr>
+          <w:rFonts w:ascii="Arial" w:eastAsia="Arial" w:hAnsi="Arial" w:cs="Arial"/>
+          <w:b/>
+          <w:sz w:val="22"/>
+          <w:szCs w:val="22"/>
+          <w:lang w:val="en-GB"/>
+        </w:rPr>
+        <w:t xml:space="preserve">{%for </w:t>
       </w:r>
       <w:proofErr w:type="spellStart"/>
+      <w:r>
+        <w:rPr>
+          <w:rFonts w:ascii="Arial" w:eastAsia="Arial" w:hAnsi="Arial" w:cs="Arial"/>
+          <w:b/>
+          <w:sz w:val="22"/>
+          <w:szCs w:val="22"/>
+          <w:lang w:val="en-GB"/>
+        </w:rPr>
+        <w:t>groupe</w:t>
+      </w:r>
+      <w:proofErr w:type="spellEnd"/>
+      <w:r>
+        <w:rPr>
+          <w:rFonts w:ascii="Arial" w:eastAsia="Arial" w:hAnsi="Arial" w:cs="Arial"/>
+          <w:b/>
+          <w:sz w:val="22"/>
+          <w:szCs w:val="22"/>
+          <w:lang w:val="en-GB"/>
+        </w:rPr>
+        <w:t xml:space="preserve"> in </w:t>
+      </w:r>
+      <w:proofErr w:type="spellStart"/>
+      <w:r>
+        <w:rPr>
+          <w:rFonts w:ascii="Arial" w:eastAsia="Arial" w:hAnsi="Arial" w:cs="Arial"/>
+          <w:b/>
+          <w:sz w:val="22"/>
+          <w:szCs w:val="22"/>
+          <w:lang w:val="en-GB"/>
+        </w:rPr>
+        <w:t>etude.groupe_</w:t>
+      </w:r>
       <w:proofErr w:type="gramStart"/>
       <w:r>
         <w:rPr>
-          <w:rFonts w:ascii="Arial" w:eastAsia="Calibri" w:hAnsi="Arial" w:cs="Arial"/>
+          <w:rFonts w:ascii="Arial" w:eastAsia="Arial" w:hAnsi="Arial" w:cs="Arial"/>
           <w:b/>
-          <w:sz w:val="26"/>
-          <w:szCs w:val="26"/>
-          <w:lang w:val="en-US"/>
-        </w:rPr>
-        <w:t>Objectif</w:t>
+          <w:sz w:val="22"/>
+          <w:szCs w:val="22"/>
+          <w:lang w:val="en-GB"/>
+        </w:rPr>
+        <w:t>set.iterator</w:t>
       </w:r>
       <w:proofErr w:type="spellEnd"/>
       <w:r>
         <w:rPr>
-          <w:rFonts w:ascii="Arial" w:hAnsi="Arial" w:cs="Arial"/>
+          <w:rFonts w:ascii="Arial" w:eastAsia="Arial" w:hAnsi="Arial" w:cs="Arial"/>
           <w:b/>
-          <w:sz w:val="26"/>
-          <w:szCs w:val="26"/>
-          <w:lang w:val="en-US"/>
-        </w:rPr>
-        <w:t xml:space="preserve"> :</w:t>
+          <w:sz w:val="22"/>
+          <w:szCs w:val="22"/>
+          <w:lang w:val="en-GB"/>
+        </w:rPr>
+        <w:t>(</w:t>
       </w:r>
       <w:proofErr w:type="gramEnd"/>
       <w:r>
         <w:rPr>
-          <w:rFonts w:ascii="Arial" w:hAnsi="Arial" w:cs="Arial"/>
-          <w:sz w:val="26"/>
-          <w:szCs w:val="26"/>
-          <w:lang w:val="en-US"/>
+          <w:rFonts w:ascii="Arial" w:eastAsia="Arial" w:hAnsi="Arial" w:cs="Arial"/>
+          <w:b/>
+          <w:sz w:val="22"/>
+          <w:szCs w:val="22"/>
+          <w:lang w:val="en-GB"/>
+        </w:rPr>
+        <w:t>) | sort(attribute=’index’) %}Phase {{</w:t>
+      </w:r>
+      <w:proofErr w:type="spellStart"/>
+      <w:r>
+        <w:rPr>
+          <w:rFonts w:ascii="Arial" w:eastAsia="Arial" w:hAnsi="Arial" w:cs="Arial"/>
+          <w:b/>
+          <w:sz w:val="22"/>
+          <w:szCs w:val="22"/>
+          <w:lang w:val="en-GB"/>
+        </w:rPr>
+        <w:t>loop.index</w:t>
+      </w:r>
+      <w:proofErr w:type="spellEnd"/>
+      <w:r>
+        <w:rPr>
+          <w:rFonts w:ascii="Arial" w:eastAsia="Arial" w:hAnsi="Arial" w:cs="Arial"/>
+          <w:b/>
+          <w:sz w:val="22"/>
+          <w:szCs w:val="22"/>
+          <w:lang w:val="en-GB"/>
+        </w:rPr>
+        <w:t>}</w:t>
+      </w:r>
+      <w:proofErr w:type="gramStart"/>
+      <w:r>
+        <w:rPr>
+          <w:rFonts w:ascii="Arial" w:eastAsia="Arial" w:hAnsi="Arial" w:cs="Arial"/>
+          <w:b/>
+          <w:sz w:val="22"/>
+          <w:szCs w:val="22"/>
+          <w:lang w:val="en-GB"/>
+        </w:rPr>
+        <w:t>} :</w:t>
+      </w:r>
+      <w:proofErr w:type="gramEnd"/>
+      <w:r>
+        <w:rPr>
+          <w:rFonts w:ascii="Arial" w:eastAsia="Arial" w:hAnsi="Arial" w:cs="Arial"/>
+          <w:b/>
+          <w:sz w:val="22"/>
+          <w:szCs w:val="22"/>
+          <w:lang w:val="en-GB"/>
         </w:rPr>
         <w:t xml:space="preserve"> {{ </w:t>
       </w:r>
       <w:proofErr w:type="spellStart"/>
       <w:r>
         <w:rPr>
-          <w:rFonts w:ascii="Arial" w:hAnsi="Arial" w:cs="Arial"/>
-          <w:sz w:val="26"/>
-          <w:szCs w:val="26"/>
-          <w:lang w:val="en-US"/>
-        </w:rPr>
-        <w:t>phase.objectif</w:t>
+          <w:rFonts w:ascii="Arial" w:eastAsia="Arial" w:hAnsi="Arial" w:cs="Arial"/>
+          <w:b/>
+          <w:sz w:val="22"/>
+          <w:szCs w:val="22"/>
+          <w:lang w:val="en-GB"/>
+        </w:rPr>
+        <w:t>groupe.title</w:t>
       </w:r>
       <w:proofErr w:type="spellEnd"/>
       <w:r>
         <w:rPr>
-          <w:rFonts w:ascii="Arial" w:hAnsi="Arial" w:cs="Arial"/>
-          <w:sz w:val="26"/>
-          <w:szCs w:val="26"/>
-          <w:lang w:val="en-US"/>
+          <w:rFonts w:ascii="Arial" w:eastAsia="Arial" w:hAnsi="Arial" w:cs="Arial"/>
+          <w:b/>
+          <w:sz w:val="22"/>
+          <w:szCs w:val="22"/>
+          <w:lang w:val="en-GB"/>
         </w:rPr>
         <w:t xml:space="preserve"> }}</w:t>
       </w:r>
     </w:p>
     <w:p>
       <w:pPr>
-        <w:ind w:firstLine="0"/>
-        <w:rPr>
-          <w:rFonts w:ascii="Arial" w:hAnsi="Arial" w:cs="Arial"/>
-          <w:sz w:val="26"/>
-          <w:szCs w:val="26"/>
-          <w:lang w:val="en-US"/>
-        </w:rPr>
-      </w:pPr>
-      <w:r>
-        <w:rPr>
-          <w:rFonts w:ascii="Arial" w:hAnsi="Arial" w:cs="Arial"/>
-          <w:sz w:val="26"/>
-          <w:szCs w:val="26"/>
-          <w:lang w:val="en-US"/>
-        </w:rPr>
-        <w:tab/>
-      </w:r>
-      <w:proofErr w:type="spellStart"/>
-      <w:proofErr w:type="gramStart"/>
-      <w:r>
-        <w:rPr>
-          <w:rFonts w:ascii="Arial" w:eastAsia="Calibri" w:hAnsi="Arial" w:cs="Arial"/>
+        <w:rPr>
+          <w:rFonts w:ascii="Arial" w:eastAsia="Arial" w:hAnsi="Arial" w:cs="Arial"/>
           <w:b/>
-          <w:sz w:val="26"/>
-          <w:szCs w:val="26"/>
-          <w:lang w:val="en-US"/>
-        </w:rPr>
-        <w:t>Méthodologie</w:t>
-      </w:r>
-      <w:proofErr w:type="spellEnd"/>
-      <w:r>
-        <w:rPr>
-          <w:rFonts w:ascii="Arial" w:hAnsi="Arial" w:cs="Arial"/>
-          <w:b/>
-          <w:sz w:val="26"/>
-          <w:szCs w:val="26"/>
-          <w:lang w:val="en-US"/>
-        </w:rPr>
-        <w:t xml:space="preserve"> :</w:t>
-      </w:r>
-      <w:proofErr w:type="gramEnd"/>
-      <w:r>
-        <w:rPr>
-          <w:rFonts w:ascii="Arial" w:hAnsi="Arial" w:cs="Arial"/>
-          <w:sz w:val="26"/>
-          <w:szCs w:val="26"/>
-          <w:lang w:val="en-US"/>
-        </w:rPr>
-        <w:t xml:space="preserve"> {{ </w:t>
-      </w:r>
-      <w:proofErr w:type="spellStart"/>
-      <w:r>
-        <w:rPr>
-          <w:rFonts w:ascii="Arial" w:hAnsi="Arial" w:cs="Arial"/>
-          <w:sz w:val="26"/>
-          <w:szCs w:val="26"/>
-          <w:lang w:val="en-US"/>
-        </w:rPr>
-        <w:t>phase.methodo</w:t>
-      </w:r>
-      <w:proofErr w:type="spellEnd"/>
-      <w:r>
-        <w:rPr>
-          <w:rFonts w:ascii="Arial" w:hAnsi="Arial" w:cs="Arial"/>
-          <w:sz w:val="26"/>
-          <w:szCs w:val="26"/>
-          <w:lang w:val="en-US"/>
-        </w:rPr>
-        <w:t xml:space="preserve"> }}</w:t>
-      </w:r>
+          <w:sz w:val="22"/>
+          <w:szCs w:val="22"/>
+          <w:lang w:val="en-GB"/>
+        </w:rPr>
+      </w:pPr>
     </w:p>
     <w:p>
       <w:pPr>
-        <w:ind w:firstLine="0"/>
-        <w:rPr>
-          <w:rFonts w:ascii="Arial" w:hAnsi="Arial" w:cs="Arial"/>
-          <w:sz w:val="26"/>
-          <w:szCs w:val="26"/>
-          <w:lang w:val="en-US"/>
-        </w:rPr>
-      </w:pPr>
+        <w:rPr>
+          <w:rFonts w:ascii="Arial" w:eastAsia="Arial" w:hAnsi="Arial" w:cs="Arial"/>
+          <w:sz w:val="22"/>
+          <w:szCs w:val="22"/>
+          <w:lang w:val="en-GB"/>
+        </w:rPr>
+      </w:pPr>
+      <w:proofErr w:type="gramStart"/>
+      <w:r>
+        <w:rPr>
+          <w:rFonts w:ascii="Arial" w:eastAsia="Arial" w:hAnsi="Arial" w:cs="Arial"/>
+          <w:b/>
+          <w:sz w:val="22"/>
+          <w:szCs w:val="22"/>
+          <w:lang w:val="en-GB"/>
+        </w:rPr>
+        <w:t>Description :</w:t>
+      </w:r>
+      <w:proofErr w:type="gramEnd"/>
+      <w:r>
+        <w:rPr>
+          <w:rFonts w:ascii="Arial" w:eastAsia="Arial" w:hAnsi="Arial" w:cs="Arial"/>
+          <w:sz w:val="22"/>
+          <w:szCs w:val="22"/>
+          <w:lang w:val="en-GB"/>
+        </w:rPr>
+        <w:t xml:space="preserve"> </w:t>
+      </w:r>
     </w:p>
     <w:p>
       <w:pPr>
-        <w:ind w:firstLine="0"/>
-        <w:rPr>
-          <w:rFonts w:ascii="Arial" w:hAnsi="Arial" w:cs="Arial"/>
-          <w:sz w:val="26"/>
-          <w:szCs w:val="26"/>
-        </w:rPr>
-      </w:pPr>
-      <w:r>
-        <w:rPr>
-          <w:rFonts w:ascii="Arial" w:hAnsi="Arial" w:cs="Arial"/>
-          <w:sz w:val="26"/>
-          <w:szCs w:val="26"/>
-        </w:rPr>
-        <w:t xml:space="preserve">{% </w:t>
+        <w:rPr>
+          <w:rFonts w:ascii="Arial" w:eastAsia="Arial" w:hAnsi="Arial" w:cs="Arial"/>
+          <w:sz w:val="22"/>
+          <w:szCs w:val="22"/>
+          <w:lang w:val="en-GB"/>
+        </w:rPr>
+      </w:pPr>
+      <w:r>
+        <w:rPr>
+          <w:rFonts w:ascii="Arial" w:eastAsia="Arial" w:hAnsi="Arial" w:cs="Arial"/>
+          <w:sz w:val="22"/>
+          <w:szCs w:val="22"/>
+          <w:lang w:val="en-GB"/>
+        </w:rPr>
+        <w:lastRenderedPageBreak/>
+        <w:t>{</w:t>
+      </w:r>
+      <w:proofErr w:type="gramStart"/>
+      <w:r>
+        <w:rPr>
+          <w:rFonts w:ascii="Arial" w:eastAsia="Arial" w:hAnsi="Arial" w:cs="Arial"/>
+          <w:sz w:val="22"/>
+          <w:szCs w:val="22"/>
+          <w:lang w:val="en-GB"/>
+        </w:rPr>
+        <w:t xml:space="preserve">{ </w:t>
       </w:r>
       <w:proofErr w:type="spellStart"/>
       <w:r>
         <w:rPr>
-          <w:rFonts w:ascii="Arial" w:hAnsi="Arial" w:cs="Arial"/>
-          <w:sz w:val="26"/>
-          <w:szCs w:val="26"/>
-        </w:rPr>
-        <w:t>endfor</w:t>
+          <w:rFonts w:ascii="Arial" w:eastAsia="Arial" w:hAnsi="Arial" w:cs="Arial"/>
+          <w:sz w:val="22"/>
+          <w:szCs w:val="22"/>
+          <w:lang w:val="en-GB"/>
+        </w:rPr>
+        <w:t>groupe.description</w:t>
       </w:r>
       <w:proofErr w:type="spellEnd"/>
-      <w:r>
-        <w:rPr>
-          <w:rFonts w:ascii="Arial" w:hAnsi="Arial" w:cs="Arial"/>
-          <w:sz w:val="26"/>
-          <w:szCs w:val="26"/>
-        </w:rPr>
-        <w:t xml:space="preserve"> %}</w:t>
-      </w:r>
-    </w:p>
-    <w:p>
-      <w:pPr>
-        <w:pStyle w:val="Titre2"/>
-        <w:rPr>
-          <w:rFonts w:ascii="Arial" w:hAnsi="Arial"/>
-        </w:rPr>
-      </w:pPr>
-      <w:r>
-        <w:rPr>
-          <w:rFonts w:ascii="Arial" w:hAnsi="Arial"/>
-        </w:rPr>
-        <w:lastRenderedPageBreak/>
-        <w:t xml:space="preserve"> </w:t>
-      </w:r>
-      <w:bookmarkStart w:id="16" w:name="_Toc491964562"/>
-      <w:r>
-        <w:rPr>
-          <w:rFonts w:ascii="Arial" w:eastAsia="Calibri" w:hAnsi="Arial"/>
-        </w:rPr>
-        <w:t>Garantie</w:t>
-      </w:r>
-      <w:bookmarkEnd w:id="14"/>
-      <w:bookmarkEnd w:id="15"/>
+      <w:proofErr w:type="gramEnd"/>
+      <w:r>
+        <w:rPr>
+          <w:rFonts w:ascii="Arial" w:eastAsia="Arial" w:hAnsi="Arial" w:cs="Arial"/>
+          <w:sz w:val="22"/>
+          <w:szCs w:val="22"/>
+          <w:lang w:val="en-GB"/>
+        </w:rPr>
+        <w:t xml:space="preserve"> }}</w:t>
+      </w:r>
+      <w:bookmarkStart w:id="16" w:name="_gjdgxs" w:colFirst="0" w:colLast="0"/>
       <w:bookmarkEnd w:id="16"/>
     </w:p>
     <w:p>
       <w:pPr>
         <w:rPr>
-          <w:rFonts w:ascii="Arial" w:hAnsi="Arial" w:cs="Arial"/>
-          <w:sz w:val="26"/>
-          <w:szCs w:val="26"/>
-        </w:rPr>
-      </w:pPr>
-      <w:r>
-        <w:rPr>
-          <w:rFonts w:ascii="Arial" w:eastAsia="Calibri" w:hAnsi="Arial" w:cs="Arial"/>
-          <w:sz w:val="26"/>
-          <w:szCs w:val="26"/>
-        </w:rPr>
-        <w:t>L</w:t>
-      </w:r>
-      <w:r>
-        <w:rPr>
-          <w:rFonts w:ascii="Arial" w:hAnsi="Arial" w:cs="Arial"/>
-          <w:sz w:val="26"/>
-          <w:szCs w:val="26"/>
-        </w:rPr>
-        <w:t>’</w:t>
-      </w:r>
-      <w:r>
-        <w:rPr>
-          <w:rFonts w:ascii="Arial" w:eastAsia="Calibri" w:hAnsi="Arial" w:cs="Arial"/>
-          <w:sz w:val="26"/>
-          <w:szCs w:val="26"/>
-        </w:rPr>
-        <w:t>étude</w:t>
-      </w:r>
-      <w:r>
-        <w:rPr>
-          <w:rFonts w:ascii="Arial" w:hAnsi="Arial" w:cs="Arial"/>
-          <w:sz w:val="26"/>
-          <w:szCs w:val="26"/>
-        </w:rPr>
-        <w:t xml:space="preserve"> </w:t>
-      </w:r>
-      <w:r>
-        <w:rPr>
-          <w:rFonts w:ascii="Arial" w:eastAsia="Calibri" w:hAnsi="Arial" w:cs="Arial"/>
-          <w:sz w:val="26"/>
-          <w:szCs w:val="26"/>
-        </w:rPr>
-        <w:t>est</w:t>
-      </w:r>
-      <w:r>
-        <w:rPr>
-          <w:rFonts w:ascii="Arial" w:hAnsi="Arial" w:cs="Arial"/>
-          <w:sz w:val="26"/>
-          <w:szCs w:val="26"/>
-        </w:rPr>
-        <w:t xml:space="preserve"> </w:t>
-      </w:r>
-      <w:r>
-        <w:rPr>
-          <w:rFonts w:ascii="Arial" w:eastAsia="Calibri" w:hAnsi="Arial" w:cs="Arial"/>
-          <w:sz w:val="26"/>
-          <w:szCs w:val="26"/>
-        </w:rPr>
-        <w:t>garantie</w:t>
-      </w:r>
-      <w:r>
-        <w:rPr>
-          <w:rFonts w:ascii="Arial" w:hAnsi="Arial" w:cs="Arial"/>
-          <w:sz w:val="26"/>
-          <w:szCs w:val="26"/>
-        </w:rPr>
-        <w:t xml:space="preserve"> </w:t>
-      </w:r>
-      <w:r>
-        <w:rPr>
-          <w:rFonts w:ascii="Arial" w:eastAsia="Calibri" w:hAnsi="Arial" w:cs="Arial"/>
-          <w:sz w:val="26"/>
-          <w:szCs w:val="26"/>
-        </w:rPr>
-        <w:t>90</w:t>
-      </w:r>
-      <w:r>
-        <w:rPr>
-          <w:rFonts w:ascii="Arial" w:hAnsi="Arial" w:cs="Arial"/>
-          <w:sz w:val="26"/>
-          <w:szCs w:val="26"/>
-        </w:rPr>
-        <w:t xml:space="preserve"> </w:t>
-      </w:r>
-      <w:r>
-        <w:rPr>
-          <w:rFonts w:ascii="Arial" w:eastAsia="Calibri" w:hAnsi="Arial" w:cs="Arial"/>
-          <w:sz w:val="26"/>
-          <w:szCs w:val="26"/>
-        </w:rPr>
-        <w:t>jours</w:t>
-      </w:r>
-      <w:r>
-        <w:rPr>
-          <w:rFonts w:ascii="Arial" w:hAnsi="Arial" w:cs="Arial"/>
-          <w:sz w:val="26"/>
-          <w:szCs w:val="26"/>
-        </w:rPr>
-        <w:t xml:space="preserve"> </w:t>
-      </w:r>
-      <w:r>
-        <w:rPr>
-          <w:rFonts w:ascii="Arial" w:eastAsia="Calibri" w:hAnsi="Arial" w:cs="Arial"/>
-          <w:sz w:val="26"/>
-          <w:szCs w:val="26"/>
-        </w:rPr>
-        <w:t>à</w:t>
-      </w:r>
-      <w:r>
-        <w:rPr>
-          <w:rFonts w:ascii="Arial" w:hAnsi="Arial" w:cs="Arial"/>
-          <w:sz w:val="26"/>
-          <w:szCs w:val="26"/>
-        </w:rPr>
-        <w:t xml:space="preserve"> </w:t>
-      </w:r>
-      <w:r>
-        <w:rPr>
-          <w:rFonts w:ascii="Arial" w:eastAsia="Calibri" w:hAnsi="Arial" w:cs="Arial"/>
-          <w:sz w:val="26"/>
-          <w:szCs w:val="26"/>
-        </w:rPr>
-        <w:t>compter</w:t>
-      </w:r>
-      <w:r>
-        <w:rPr>
-          <w:rFonts w:ascii="Arial" w:hAnsi="Arial" w:cs="Arial"/>
-          <w:sz w:val="26"/>
-          <w:szCs w:val="26"/>
-        </w:rPr>
-        <w:t xml:space="preserve"> </w:t>
-      </w:r>
-      <w:r>
-        <w:rPr>
-          <w:rFonts w:ascii="Arial" w:eastAsia="Calibri" w:hAnsi="Arial" w:cs="Arial"/>
-          <w:sz w:val="26"/>
-          <w:szCs w:val="26"/>
-        </w:rPr>
-        <w:t>de</w:t>
-      </w:r>
-      <w:r>
-        <w:rPr>
-          <w:rFonts w:ascii="Arial" w:hAnsi="Arial" w:cs="Arial"/>
-          <w:sz w:val="26"/>
-          <w:szCs w:val="26"/>
-        </w:rPr>
-        <w:t xml:space="preserve"> </w:t>
-      </w:r>
-      <w:r>
-        <w:rPr>
-          <w:rFonts w:ascii="Arial" w:eastAsia="Calibri" w:hAnsi="Arial" w:cs="Arial"/>
-          <w:sz w:val="26"/>
-          <w:szCs w:val="26"/>
-        </w:rPr>
-        <w:t>sa</w:t>
-      </w:r>
-      <w:r>
-        <w:rPr>
-          <w:rFonts w:ascii="Arial" w:hAnsi="Arial" w:cs="Arial"/>
-          <w:sz w:val="26"/>
-          <w:szCs w:val="26"/>
-        </w:rPr>
-        <w:t xml:space="preserve"> </w:t>
-      </w:r>
-      <w:r>
-        <w:rPr>
-          <w:rFonts w:ascii="Arial" w:eastAsia="Calibri" w:hAnsi="Arial" w:cs="Arial"/>
-          <w:sz w:val="26"/>
-          <w:szCs w:val="26"/>
-        </w:rPr>
-        <w:t>réception</w:t>
-      </w:r>
-      <w:r>
-        <w:rPr>
-          <w:rFonts w:ascii="Arial" w:hAnsi="Arial" w:cs="Arial"/>
-          <w:sz w:val="26"/>
-          <w:szCs w:val="26"/>
-        </w:rPr>
-        <w:t xml:space="preserve"> </w:t>
-      </w:r>
-      <w:r>
-        <w:rPr>
-          <w:rFonts w:ascii="Arial" w:eastAsia="Calibri" w:hAnsi="Arial" w:cs="Arial"/>
-          <w:sz w:val="26"/>
-          <w:szCs w:val="26"/>
-        </w:rPr>
-        <w:t>par</w:t>
-      </w:r>
-      <w:r>
-        <w:rPr>
-          <w:rFonts w:ascii="Arial" w:hAnsi="Arial" w:cs="Arial"/>
-          <w:sz w:val="26"/>
-          <w:szCs w:val="26"/>
-        </w:rPr>
-        <w:t xml:space="preserve"> </w:t>
-      </w:r>
-      <w:r>
-        <w:rPr>
-          <w:rFonts w:ascii="Arial" w:eastAsia="Calibri" w:hAnsi="Arial" w:cs="Arial"/>
-          <w:sz w:val="26"/>
-          <w:szCs w:val="26"/>
-        </w:rPr>
-        <w:t>le</w:t>
-      </w:r>
-      <w:r>
-        <w:rPr>
-          <w:rFonts w:ascii="Arial" w:hAnsi="Arial" w:cs="Arial"/>
-          <w:sz w:val="26"/>
-          <w:szCs w:val="26"/>
-        </w:rPr>
-        <w:t xml:space="preserve"> </w:t>
-      </w:r>
-      <w:r>
-        <w:rPr>
-          <w:rFonts w:ascii="Arial" w:eastAsia="Calibri" w:hAnsi="Arial" w:cs="Arial"/>
-          <w:sz w:val="26"/>
-          <w:szCs w:val="26"/>
-        </w:rPr>
-        <w:t>client</w:t>
-      </w:r>
-      <w:r>
-        <w:rPr>
-          <w:rFonts w:ascii="Arial" w:hAnsi="Arial" w:cs="Arial"/>
-          <w:sz w:val="26"/>
-          <w:szCs w:val="26"/>
-        </w:rPr>
-        <w:t>.</w:t>
+          <w:rFonts w:ascii="Arial" w:eastAsia="Arial" w:hAnsi="Arial" w:cs="Arial"/>
+          <w:sz w:val="22"/>
+          <w:szCs w:val="22"/>
+        </w:rPr>
+      </w:pPr>
+      <w:proofErr w:type="spellStart"/>
+      <w:proofErr w:type="gramStart"/>
+      <w:r>
+        <w:rPr>
+          <w:rFonts w:ascii="Arial" w:eastAsia="Arial" w:hAnsi="Arial" w:cs="Arial"/>
+          <w:b/>
+          <w:sz w:val="22"/>
+          <w:szCs w:val="22"/>
+          <w:lang w:val="en-GB"/>
+        </w:rPr>
+        <w:t>Objectifs</w:t>
+      </w:r>
+      <w:proofErr w:type="spellEnd"/>
+      <w:r>
+        <w:rPr>
+          <w:rFonts w:ascii="Arial" w:eastAsia="Arial" w:hAnsi="Arial" w:cs="Arial"/>
+          <w:b/>
+          <w:sz w:val="22"/>
+          <w:szCs w:val="22"/>
+          <w:lang w:val="en-GB"/>
+        </w:rPr>
+        <w:t xml:space="preserve"> :</w:t>
+      </w:r>
+      <w:proofErr w:type="gramEnd"/>
+      <w:r>
+        <w:rPr>
+          <w:rFonts w:ascii="Arial" w:eastAsia="Arial" w:hAnsi="Arial" w:cs="Arial"/>
+          <w:sz w:val="22"/>
+          <w:szCs w:val="22"/>
+          <w:lang w:val="en-GB"/>
+        </w:rPr>
+        <w:t xml:space="preserve"> </w:t>
       </w:r>
     </w:p>
     <w:p>
       <w:pPr>
         <w:rPr>
-          <w:rFonts w:ascii="Arial" w:hAnsi="Arial" w:cs="Arial"/>
-          <w:sz w:val="26"/>
-          <w:szCs w:val="26"/>
-        </w:rPr>
-      </w:pPr>
+          <w:rFonts w:ascii="Arial" w:eastAsia="Arial" w:hAnsi="Arial" w:cs="Arial"/>
+          <w:b/>
+          <w:sz w:val="22"/>
+          <w:szCs w:val="22"/>
+        </w:rPr>
+      </w:pPr>
+      <w:proofErr w:type="gramStart"/>
+      <w:r>
+        <w:rPr>
+          <w:rFonts w:ascii="Arial" w:eastAsia="Arial" w:hAnsi="Arial" w:cs="Arial"/>
+          <w:sz w:val="22"/>
+          <w:szCs w:val="22"/>
+          <w:highlight w:val="yellow"/>
+        </w:rPr>
+        <w:t>TODO</w:t>
+      </w:r>
+      <w:r>
+        <w:rPr>
+          <w:rFonts w:ascii="Arial" w:eastAsia="Arial" w:hAnsi="Arial" w:cs="Arial"/>
+          <w:b/>
+          <w:sz w:val="22"/>
+          <w:szCs w:val="22"/>
+        </w:rPr>
+        <w:t>{</w:t>
+      </w:r>
+      <w:proofErr w:type="gramEnd"/>
+      <w:r>
+        <w:rPr>
+          <w:rFonts w:ascii="Arial" w:eastAsia="Arial" w:hAnsi="Arial" w:cs="Arial"/>
+          <w:b/>
+          <w:sz w:val="22"/>
+          <w:szCs w:val="22"/>
+        </w:rPr>
+        <w:t>%</w:t>
+      </w:r>
+      <w:proofErr w:type="spellStart"/>
+      <w:r>
+        <w:rPr>
+          <w:rFonts w:ascii="Arial" w:eastAsia="Arial" w:hAnsi="Arial" w:cs="Arial"/>
+          <w:b/>
+          <w:sz w:val="22"/>
+          <w:szCs w:val="22"/>
+        </w:rPr>
+        <w:t>endfor</w:t>
+      </w:r>
+      <w:proofErr w:type="spellEnd"/>
+      <w:r>
+        <w:rPr>
+          <w:rFonts w:ascii="Arial" w:eastAsia="Arial" w:hAnsi="Arial" w:cs="Arial"/>
+          <w:b/>
+          <w:sz w:val="22"/>
+          <w:szCs w:val="22"/>
+        </w:rPr>
+        <w:t>%}</w:t>
+      </w:r>
     </w:p>
     <w:p>
       <w:pPr>
-        <w:rPr>
-          <w:rFonts w:ascii="Arial" w:hAnsi="Arial" w:cs="Arial"/>
-          <w:i/>
-          <w:sz w:val="26"/>
-          <w:szCs w:val="26"/>
-        </w:rPr>
-      </w:pPr>
-      <w:r>
-        <w:rPr>
-          <w:rFonts w:ascii="Arial" w:hAnsi="Arial" w:cs="Arial"/>
-          <w:i/>
-          <w:sz w:val="26"/>
-          <w:szCs w:val="26"/>
-          <w:highlight w:val="yellow"/>
-        </w:rPr>
-        <w:t>[[Pour les livrables de types documents (exemple : spécifications fonctionnelles), abaisser la période de garantie à 15 jours.]]</w:t>
-      </w:r>
+        <w:pStyle w:val="Titre2"/>
+        <w:rPr>
+          <w:rFonts w:ascii="Arial" w:hAnsi="Arial"/>
+        </w:rPr>
+      </w:pPr>
+      <w:r>
+        <w:rPr>
+          <w:rFonts w:ascii="Arial" w:hAnsi="Arial"/>
+        </w:rPr>
+        <w:t xml:space="preserve"> </w:t>
+      </w:r>
+      <w:bookmarkStart w:id="17" w:name="_Toc491964562"/>
+      <w:r>
+        <w:rPr>
+          <w:rFonts w:ascii="Arial" w:eastAsia="Calibri" w:hAnsi="Arial"/>
+        </w:rPr>
+        <w:t>Garantie</w:t>
+      </w:r>
+      <w:bookmarkEnd w:id="14"/>
+      <w:bookmarkEnd w:id="15"/>
+      <w:bookmarkEnd w:id="17"/>
     </w:p>
     <w:p>
       <w:pPr>
         <w:rPr>
           <w:rFonts w:ascii="Arial" w:hAnsi="Arial" w:cs="Arial"/>
-        </w:rPr>
-      </w:pPr>
+          <w:sz w:val="26"/>
+          <w:szCs w:val="26"/>
+        </w:rPr>
+      </w:pPr>
+      <w:r>
+        <w:rPr>
+          <w:rFonts w:ascii="Arial" w:eastAsia="Calibri" w:hAnsi="Arial" w:cs="Arial"/>
+          <w:sz w:val="26"/>
+          <w:szCs w:val="26"/>
+        </w:rPr>
+        <w:t>L</w:t>
+      </w:r>
+      <w:r>
+        <w:rPr>
+          <w:rFonts w:ascii="Arial" w:hAnsi="Arial" w:cs="Arial"/>
+          <w:sz w:val="26"/>
+          <w:szCs w:val="26"/>
+        </w:rPr>
+        <w:t>’</w:t>
+      </w:r>
+      <w:r>
+        <w:rPr>
+          <w:rFonts w:ascii="Arial" w:eastAsia="Calibri" w:hAnsi="Arial" w:cs="Arial"/>
+          <w:sz w:val="26"/>
+          <w:szCs w:val="26"/>
+        </w:rPr>
+        <w:t>étude</w:t>
+      </w:r>
+      <w:r>
+        <w:rPr>
+          <w:rFonts w:ascii="Arial" w:hAnsi="Arial" w:cs="Arial"/>
+          <w:sz w:val="26"/>
+          <w:szCs w:val="26"/>
+        </w:rPr>
+        <w:t xml:space="preserve"> </w:t>
+      </w:r>
+      <w:r>
+        <w:rPr>
+          <w:rFonts w:ascii="Arial" w:eastAsia="Calibri" w:hAnsi="Arial" w:cs="Arial"/>
+          <w:sz w:val="26"/>
+          <w:szCs w:val="26"/>
+        </w:rPr>
+        <w:t>est</w:t>
+      </w:r>
+      <w:r>
+        <w:rPr>
+          <w:rFonts w:ascii="Arial" w:hAnsi="Arial" w:cs="Arial"/>
+          <w:sz w:val="26"/>
+          <w:szCs w:val="26"/>
+        </w:rPr>
+        <w:t xml:space="preserve"> </w:t>
+      </w:r>
+      <w:r>
+        <w:rPr>
+          <w:rFonts w:ascii="Arial" w:eastAsia="Calibri" w:hAnsi="Arial" w:cs="Arial"/>
+          <w:sz w:val="26"/>
+          <w:szCs w:val="26"/>
+        </w:rPr>
+        <w:t>garantie</w:t>
+      </w:r>
+      <w:r>
+        <w:rPr>
+          <w:rFonts w:ascii="Arial" w:hAnsi="Arial" w:cs="Arial"/>
+          <w:sz w:val="26"/>
+          <w:szCs w:val="26"/>
+        </w:rPr>
+        <w:t xml:space="preserve"> </w:t>
+      </w:r>
+      <w:r>
+        <w:rPr>
+          <w:rFonts w:ascii="Arial" w:eastAsia="Calibri" w:hAnsi="Arial" w:cs="Arial"/>
+          <w:sz w:val="26"/>
+          <w:szCs w:val="26"/>
+        </w:rPr>
+        <w:t>90</w:t>
+      </w:r>
+      <w:r>
+        <w:rPr>
+          <w:rFonts w:ascii="Arial" w:hAnsi="Arial" w:cs="Arial"/>
+          <w:sz w:val="26"/>
+          <w:szCs w:val="26"/>
+        </w:rPr>
+        <w:t xml:space="preserve"> </w:t>
+      </w:r>
+      <w:r>
+        <w:rPr>
+          <w:rFonts w:ascii="Arial" w:eastAsia="Calibri" w:hAnsi="Arial" w:cs="Arial"/>
+          <w:sz w:val="26"/>
+          <w:szCs w:val="26"/>
+        </w:rPr>
+        <w:t>jours</w:t>
+      </w:r>
+      <w:r>
+        <w:rPr>
+          <w:rFonts w:ascii="Arial" w:hAnsi="Arial" w:cs="Arial"/>
+          <w:sz w:val="26"/>
+          <w:szCs w:val="26"/>
+        </w:rPr>
+        <w:t xml:space="preserve"> </w:t>
+      </w:r>
+      <w:r>
+        <w:rPr>
+          <w:rFonts w:ascii="Arial" w:eastAsia="Calibri" w:hAnsi="Arial" w:cs="Arial"/>
+          <w:sz w:val="26"/>
+          <w:szCs w:val="26"/>
+        </w:rPr>
+        <w:t>à</w:t>
+      </w:r>
+      <w:r>
+        <w:rPr>
+          <w:rFonts w:ascii="Arial" w:hAnsi="Arial" w:cs="Arial"/>
+          <w:sz w:val="26"/>
+          <w:szCs w:val="26"/>
+        </w:rPr>
+        <w:t xml:space="preserve"> </w:t>
+      </w:r>
+      <w:r>
+        <w:rPr>
+          <w:rFonts w:ascii="Arial" w:eastAsia="Calibri" w:hAnsi="Arial" w:cs="Arial"/>
+          <w:sz w:val="26"/>
+          <w:szCs w:val="26"/>
+        </w:rPr>
+        <w:t>compter</w:t>
+      </w:r>
+      <w:r>
+        <w:rPr>
+          <w:rFonts w:ascii="Arial" w:hAnsi="Arial" w:cs="Arial"/>
+          <w:sz w:val="26"/>
+          <w:szCs w:val="26"/>
+        </w:rPr>
+        <w:t xml:space="preserve"> </w:t>
+      </w:r>
+      <w:r>
+        <w:rPr>
+          <w:rFonts w:ascii="Arial" w:eastAsia="Calibri" w:hAnsi="Arial" w:cs="Arial"/>
+          <w:sz w:val="26"/>
+          <w:szCs w:val="26"/>
+        </w:rPr>
+        <w:t>de</w:t>
+      </w:r>
+      <w:r>
+        <w:rPr>
+          <w:rFonts w:ascii="Arial" w:hAnsi="Arial" w:cs="Arial"/>
+          <w:sz w:val="26"/>
+          <w:szCs w:val="26"/>
+        </w:rPr>
+        <w:t xml:space="preserve"> </w:t>
+      </w:r>
+      <w:r>
+        <w:rPr>
+          <w:rFonts w:ascii="Arial" w:eastAsia="Calibri" w:hAnsi="Arial" w:cs="Arial"/>
+          <w:sz w:val="26"/>
+          <w:szCs w:val="26"/>
+        </w:rPr>
+        <w:t>sa</w:t>
+      </w:r>
+      <w:r>
+        <w:rPr>
+          <w:rFonts w:ascii="Arial" w:hAnsi="Arial" w:cs="Arial"/>
+          <w:sz w:val="26"/>
+          <w:szCs w:val="26"/>
+        </w:rPr>
+        <w:t xml:space="preserve"> </w:t>
+      </w:r>
+      <w:r>
+        <w:rPr>
+          <w:rFonts w:ascii="Arial" w:eastAsia="Calibri" w:hAnsi="Arial" w:cs="Arial"/>
+          <w:sz w:val="26"/>
+          <w:szCs w:val="26"/>
+        </w:rPr>
+        <w:t>réception</w:t>
+      </w:r>
+      <w:r>
+        <w:rPr>
+          <w:rFonts w:ascii="Arial" w:hAnsi="Arial" w:cs="Arial"/>
+          <w:sz w:val="26"/>
+          <w:szCs w:val="26"/>
+        </w:rPr>
+        <w:t xml:space="preserve"> </w:t>
+      </w:r>
+      <w:r>
+        <w:rPr>
+          <w:rFonts w:ascii="Arial" w:eastAsia="Calibri" w:hAnsi="Arial" w:cs="Arial"/>
+          <w:sz w:val="26"/>
+          <w:szCs w:val="26"/>
+        </w:rPr>
+        <w:t>par</w:t>
+      </w:r>
+      <w:r>
+        <w:rPr>
+          <w:rFonts w:ascii="Arial" w:hAnsi="Arial" w:cs="Arial"/>
+          <w:sz w:val="26"/>
+          <w:szCs w:val="26"/>
+        </w:rPr>
+        <w:t xml:space="preserve"> </w:t>
+      </w:r>
+      <w:r>
+        <w:rPr>
+          <w:rFonts w:ascii="Arial" w:eastAsia="Calibri" w:hAnsi="Arial" w:cs="Arial"/>
+          <w:sz w:val="26"/>
+          <w:szCs w:val="26"/>
+        </w:rPr>
+        <w:t>le</w:t>
+      </w:r>
+      <w:r>
+        <w:rPr>
+          <w:rFonts w:ascii="Arial" w:hAnsi="Arial" w:cs="Arial"/>
+          <w:sz w:val="26"/>
+          <w:szCs w:val="26"/>
+        </w:rPr>
+        <w:t xml:space="preserve"> </w:t>
+      </w:r>
+      <w:r>
+        <w:rPr>
+          <w:rFonts w:ascii="Arial" w:eastAsia="Calibri" w:hAnsi="Arial" w:cs="Arial"/>
+          <w:sz w:val="26"/>
+          <w:szCs w:val="26"/>
+        </w:rPr>
+        <w:t>client</w:t>
+      </w:r>
+      <w:r>
+        <w:rPr>
+          <w:rFonts w:ascii="Arial" w:hAnsi="Arial" w:cs="Arial"/>
+          <w:sz w:val="26"/>
+          <w:szCs w:val="26"/>
+        </w:rPr>
+        <w:t>.</w:t>
+      </w:r>
     </w:p>
     <w:p>
       <w:pPr>
-        <w:pStyle w:val="Titre2"/>
-        <w:rPr>
-          <w:rFonts w:ascii="Arial" w:hAnsi="Arial"/>
-        </w:rPr>
-      </w:pPr>
-      <w:r>
-        <w:rPr>
-          <w:rFonts w:ascii="Arial" w:hAnsi="Arial"/>
-        </w:rPr>
-        <w:t xml:space="preserve"> </w:t>
-      </w:r>
-      <w:r>
-        <w:rPr>
-          <w:rFonts w:ascii="Arial" w:eastAsia="Calibri" w:hAnsi="Arial"/>
-        </w:rPr>
-        <w:t>Livrable</w:t>
-      </w:r>
+        <w:rPr>
+          <w:rFonts w:ascii="Arial" w:hAnsi="Arial" w:cs="Arial"/>
+          <w:sz w:val="26"/>
+          <w:szCs w:val="26"/>
+        </w:rPr>
+      </w:pPr>
+      <w:bookmarkStart w:id="18" w:name="_GoBack"/>
+      <w:bookmarkEnd w:id="18"/>
     </w:p>
     <w:p>
       <w:pPr>
-        <w:ind w:firstLine="0"/>
         <w:rPr>
           <w:rFonts w:ascii="Arial" w:hAnsi="Arial" w:cs="Arial"/>
           <w:i/>
           <w:sz w:val="26"/>
           <w:szCs w:val="26"/>
+        </w:rPr>
+      </w:pPr>
+      <w:r>
+        <w:rPr>
+          <w:rFonts w:ascii="Arial" w:hAnsi="Arial" w:cs="Arial"/>
+          <w:i/>
+          <w:sz w:val="26"/>
+          <w:szCs w:val="26"/>
           <w:highlight w:val="yellow"/>
         </w:rPr>
-      </w:pPr>
-      <w:r>
-        <w:rPr>
-          <w:rFonts w:ascii="Arial" w:hAnsi="Arial" w:cs="Arial"/>
-          <w:i/>
-          <w:sz w:val="26"/>
-          <w:szCs w:val="26"/>
-          <w:highlight w:val="yellow"/>
-        </w:rPr>
-        <w:t xml:space="preserve">[[Résumé du projet, détail du livrable : </w:t>
+        <w:t>[[Pour les livrables de types documents (exemple : spécifications fonctionnelles), abaisser la période de garantie à 15 jours.]]</w:t>
       </w:r>
     </w:p>
     <w:p>
       <w:pPr>
         <w:rPr>
           <w:rFonts w:ascii="Arial" w:hAnsi="Arial" w:cs="Arial"/>
-          <w:i/>
-          <w:sz w:val="26"/>
-          <w:szCs w:val="26"/>
-          <w:highlight w:val="yellow"/>
-        </w:rPr>
-      </w:pPr>
-      <w:r>
-        <w:rPr>
-          <w:rFonts w:ascii="Arial" w:hAnsi="Arial" w:cs="Arial"/>
-          <w:i/>
-          <w:sz w:val="26"/>
-          <w:szCs w:val="26"/>
-          <w:highlight w:val="yellow"/>
-        </w:rPr>
-        <w:t>- sa nature</w:t>
-      </w:r>
+        </w:rPr>
+      </w:pPr>
     </w:p>
     <w:p>
       <w:pPr>
-        <w:rPr>
-          <w:rFonts w:ascii="Arial" w:hAnsi="Arial" w:cs="Arial"/>
-          <w:i/>
-          <w:sz w:val="26"/>
-          <w:szCs w:val="26"/>
-          <w:highlight w:val="yellow"/>
-        </w:rPr>
-      </w:pPr>
-      <w:r>
-        <w:rPr>
-          <w:rFonts w:ascii="Arial" w:hAnsi="Arial" w:cs="Arial"/>
-          <w:i/>
-          <w:sz w:val="26"/>
-          <w:szCs w:val="26"/>
-          <w:highlight w:val="yellow"/>
-        </w:rPr>
-        <w:t>- le nombre de livrable</w:t>
+        <w:pStyle w:val="Titre2"/>
+        <w:rPr>
+          <w:rFonts w:ascii="Arial" w:hAnsi="Arial"/>
+        </w:rPr>
+      </w:pPr>
+      <w:r>
+        <w:rPr>
+          <w:rFonts w:ascii="Arial" w:hAnsi="Arial"/>
+        </w:rPr>
+        <w:t xml:space="preserve"> </w:t>
+      </w:r>
+      <w:r>
+        <w:rPr>
+          <w:rFonts w:ascii="Arial" w:eastAsia="Calibri" w:hAnsi="Arial"/>
+        </w:rPr>
+        <w:t>Livrable</w:t>
       </w:r>
     </w:p>
     <w:p>
       <w:pPr>
+        <w:ind w:firstLine="0"/>
         <w:rPr>
           <w:rFonts w:ascii="Arial" w:hAnsi="Arial" w:cs="Arial"/>
           <w:i/>
@@ -8541,7 +8742,7 @@
           <w:szCs w:val="26"/>
           <w:highlight w:val="yellow"/>
         </w:rPr>
-        <w:t xml:space="preserve">- la forme (fichier zip, lien, objet …) </w:t>
+        <w:t xml:space="preserve">[[Résumé du projet, détail du livrable : </w:t>
       </w:r>
     </w:p>
     <w:p>
@@ -8562,1223 +8763,248 @@
           <w:szCs w:val="26"/>
           <w:highlight w:val="yellow"/>
         </w:rPr>
-        <w:t>- la transmission au client (par mail, en main propre …)</w:t>
+        <w:t>- sa nature</w:t>
       </w:r>
     </w:p>
     <w:p>
       <w:pPr>
         <w:rPr>
           <w:rFonts w:ascii="Arial" w:hAnsi="Arial" w:cs="Arial"/>
-          <w:sz w:val="26"/>
-          <w:szCs w:val="26"/>
-        </w:rPr>
-      </w:pPr>
-      <w:r>
-        <w:rPr>
-          <w:rFonts w:ascii="Arial" w:hAnsi="Arial" w:cs="Arial"/>
           <w:i/>
           <w:sz w:val="26"/>
           <w:szCs w:val="26"/>
           <w:highlight w:val="yellow"/>
         </w:rPr>
-        <w:t>- existence ou non d’un guide administrateur, manuel d’utilisateur …]]</w:t>
+      </w:pPr>
+      <w:r>
+        <w:rPr>
+          <w:rFonts w:ascii="Arial" w:hAnsi="Arial" w:cs="Arial"/>
+          <w:i/>
+          <w:sz w:val="26"/>
+          <w:szCs w:val="26"/>
+          <w:highlight w:val="yellow"/>
+        </w:rPr>
+        <w:t>- le nombre de livrable</w:t>
       </w:r>
     </w:p>
     <w:p>
       <w:pPr>
-        <w:pStyle w:val="Titre1"/>
-        <w:rPr>
-          <w:rFonts w:ascii="Arial" w:hAnsi="Arial" w:cs="Arial"/>
-        </w:rPr>
-      </w:pPr>
-      <w:bookmarkStart w:id="17" w:name="_Toc89784127"/>
-      <w:bookmarkStart w:id="18" w:name="_Toc90975044"/>
-      <w:bookmarkStart w:id="19" w:name="_Toc491964563"/>
-      <w:r>
-        <w:rPr>
-          <w:rFonts w:ascii="Arial" w:eastAsia="Calibri" w:hAnsi="Arial" w:cs="Arial"/>
-        </w:rPr>
-        <w:t>Mentions</w:t>
-      </w:r>
-      <w:r>
-        <w:rPr>
-          <w:rFonts w:ascii="Arial" w:hAnsi="Arial" w:cs="Arial"/>
-        </w:rPr>
-        <w:t xml:space="preserve"> </w:t>
-      </w:r>
-      <w:r>
-        <w:rPr>
-          <w:rFonts w:ascii="Arial" w:eastAsia="Calibri" w:hAnsi="Arial" w:cs="Arial"/>
-        </w:rPr>
-        <w:t>diverses</w:t>
-      </w:r>
-      <w:bookmarkEnd w:id="17"/>
-      <w:bookmarkEnd w:id="18"/>
-      <w:bookmarkEnd w:id="19"/>
+        <w:rPr>
+          <w:rFonts w:ascii="Arial" w:hAnsi="Arial" w:cs="Arial"/>
+          <w:i/>
+          <w:sz w:val="26"/>
+          <w:szCs w:val="26"/>
+          <w:highlight w:val="yellow"/>
+        </w:rPr>
+      </w:pPr>
+      <w:r>
+        <w:rPr>
+          <w:rFonts w:ascii="Arial" w:hAnsi="Arial" w:cs="Arial"/>
+          <w:i/>
+          <w:sz w:val="26"/>
+          <w:szCs w:val="26"/>
+          <w:highlight w:val="yellow"/>
+        </w:rPr>
+        <w:t xml:space="preserve">- la forme (fichier zip, lien, objet …) </w:t>
+      </w:r>
     </w:p>
     <w:p>
       <w:pPr>
-        <w:pStyle w:val="Titre2"/>
-        <w:rPr>
-          <w:rFonts w:ascii="Arial" w:hAnsi="Arial"/>
-        </w:rPr>
-      </w:pPr>
-      <w:bookmarkStart w:id="20" w:name="_Toc90975045"/>
-      <w:bookmarkStart w:id="21" w:name="_Toc89784128"/>
-      <w:r>
-        <w:rPr>
-          <w:rFonts w:ascii="Arial" w:hAnsi="Arial"/>
-        </w:rPr>
-        <w:t xml:space="preserve"> </w:t>
-      </w:r>
-      <w:bookmarkStart w:id="22" w:name="_Toc491964564"/>
-      <w:r>
-        <w:rPr>
-          <w:rFonts w:ascii="Arial" w:eastAsia="Calibri" w:hAnsi="Arial"/>
-        </w:rPr>
-        <w:t>Matériel</w:t>
-      </w:r>
+        <w:rPr>
+          <w:rFonts w:ascii="Arial" w:hAnsi="Arial" w:cs="Arial"/>
+          <w:i/>
+          <w:sz w:val="26"/>
+          <w:szCs w:val="26"/>
+          <w:highlight w:val="yellow"/>
+        </w:rPr>
+      </w:pPr>
+      <w:r>
+        <w:rPr>
+          <w:rFonts w:ascii="Arial" w:hAnsi="Arial" w:cs="Arial"/>
+          <w:i/>
+          <w:sz w:val="26"/>
+          <w:szCs w:val="26"/>
+          <w:highlight w:val="yellow"/>
+        </w:rPr>
+        <w:t>- la transmission au client (par mail, en main propre …)</w:t>
+      </w:r>
+    </w:p>
+    <w:p>
+      <w:pPr>
+        <w:rPr>
+          <w:rFonts w:ascii="Arial" w:hAnsi="Arial" w:cs="Arial"/>
+          <w:sz w:val="26"/>
+          <w:szCs w:val="26"/>
+        </w:rPr>
+      </w:pPr>
+      <w:r>
+        <w:rPr>
+          <w:rFonts w:ascii="Arial" w:hAnsi="Arial" w:cs="Arial"/>
+          <w:i/>
+          <w:sz w:val="26"/>
+          <w:szCs w:val="26"/>
+          <w:highlight w:val="yellow"/>
+        </w:rPr>
+        <w:t>- existence ou non d’un guide administrateur, manuel d’utilisateur …]]</w:t>
+      </w:r>
+    </w:p>
+    <w:p>
+      <w:pPr>
+        <w:pStyle w:val="Titre1"/>
+        <w:rPr>
+          <w:rFonts w:ascii="Arial" w:hAnsi="Arial" w:cs="Arial"/>
+        </w:rPr>
+      </w:pPr>
+      <w:bookmarkStart w:id="19" w:name="_Toc89784127"/>
+      <w:bookmarkStart w:id="20" w:name="_Toc90975044"/>
+      <w:bookmarkStart w:id="21" w:name="_Toc491964563"/>
+      <w:r>
+        <w:rPr>
+          <w:rFonts w:ascii="Arial" w:eastAsia="Calibri" w:hAnsi="Arial" w:cs="Arial"/>
+        </w:rPr>
+        <w:t>Mentions</w:t>
+      </w:r>
+      <w:r>
+        <w:rPr>
+          <w:rFonts w:ascii="Arial" w:hAnsi="Arial" w:cs="Arial"/>
+        </w:rPr>
+        <w:t xml:space="preserve"> </w:t>
+      </w:r>
+      <w:r>
+        <w:rPr>
+          <w:rFonts w:ascii="Arial" w:eastAsia="Calibri" w:hAnsi="Arial" w:cs="Arial"/>
+        </w:rPr>
+        <w:t>diverses</w:t>
+      </w:r>
+      <w:bookmarkEnd w:id="19"/>
       <w:bookmarkEnd w:id="20"/>
       <w:bookmarkEnd w:id="21"/>
-      <w:bookmarkEnd w:id="22"/>
     </w:p>
     <w:p>
       <w:pPr>
-        <w:pStyle w:val="Titre3"/>
+        <w:pStyle w:val="Titre2"/>
         <w:rPr>
           <w:rFonts w:ascii="Arial" w:hAnsi="Arial"/>
         </w:rPr>
       </w:pPr>
-      <w:bookmarkStart w:id="23" w:name="_Toc491964565"/>
+      <w:bookmarkStart w:id="22" w:name="_Toc90975045"/>
+      <w:bookmarkStart w:id="23" w:name="_Toc89784128"/>
+      <w:r>
+        <w:rPr>
+          <w:rFonts w:ascii="Arial" w:hAnsi="Arial"/>
+        </w:rPr>
+        <w:t xml:space="preserve"> </w:t>
+      </w:r>
+      <w:bookmarkStart w:id="24" w:name="_Toc491964564"/>
       <w:r>
         <w:rPr>
           <w:rFonts w:ascii="Arial" w:eastAsia="Calibri" w:hAnsi="Arial"/>
         </w:rPr>
-        <w:t>Prêt</w:t>
-      </w:r>
-      <w:r>
-        <w:rPr>
-          <w:rFonts w:ascii="Arial" w:hAnsi="Arial"/>
-        </w:rPr>
-        <w:t xml:space="preserve"> </w:t>
-      </w:r>
-      <w:r>
-        <w:rPr>
-          <w:rFonts w:ascii="Arial" w:eastAsia="Calibri" w:hAnsi="Arial"/>
-        </w:rPr>
-        <w:t>de</w:t>
-      </w:r>
-      <w:r>
-        <w:rPr>
-          <w:rFonts w:ascii="Arial" w:hAnsi="Arial"/>
-        </w:rPr>
-        <w:t xml:space="preserve"> </w:t>
-      </w:r>
-      <w:r>
-        <w:rPr>
-          <w:rFonts w:ascii="Arial" w:eastAsia="Calibri" w:hAnsi="Arial"/>
-        </w:rPr>
-        <w:t>matériel</w:t>
-      </w:r>
-      <w:r>
-        <w:rPr>
-          <w:rFonts w:ascii="Arial" w:hAnsi="Arial"/>
-        </w:rPr>
-        <w:t xml:space="preserve"> </w:t>
-      </w:r>
-      <w:r>
-        <w:rPr>
-          <w:rFonts w:ascii="Arial" w:eastAsia="Calibri" w:hAnsi="Arial"/>
-        </w:rPr>
-        <w:t>de</w:t>
-      </w:r>
-      <w:r>
-        <w:rPr>
-          <w:rFonts w:ascii="Arial" w:hAnsi="Arial"/>
-        </w:rPr>
-        <w:t xml:space="preserve"> </w:t>
-      </w:r>
-      <w:r>
-        <w:rPr>
-          <w:rFonts w:ascii="Arial" w:eastAsia="Calibri" w:hAnsi="Arial"/>
-        </w:rPr>
-        <w:t>la</w:t>
-      </w:r>
-      <w:r>
-        <w:rPr>
-          <w:rFonts w:ascii="Arial" w:hAnsi="Arial"/>
-        </w:rPr>
-        <w:t xml:space="preserve"> </w:t>
-      </w:r>
-      <w:r>
-        <w:rPr>
-          <w:rFonts w:ascii="Arial" w:eastAsia="Calibri" w:hAnsi="Arial"/>
-        </w:rPr>
-        <w:t>part</w:t>
-      </w:r>
-      <w:r>
-        <w:rPr>
-          <w:rFonts w:ascii="Arial" w:hAnsi="Arial"/>
-        </w:rPr>
-        <w:t xml:space="preserve"> </w:t>
-      </w:r>
-      <w:r>
-        <w:rPr>
-          <w:rFonts w:ascii="Arial" w:eastAsia="Calibri" w:hAnsi="Arial"/>
-        </w:rPr>
-        <w:t>du</w:t>
-      </w:r>
-      <w:r>
-        <w:rPr>
-          <w:rFonts w:ascii="Arial" w:hAnsi="Arial"/>
-        </w:rPr>
-        <w:t xml:space="preserve"> </w:t>
-      </w:r>
-      <w:r>
-        <w:rPr>
-          <w:rFonts w:ascii="Arial" w:eastAsia="Calibri" w:hAnsi="Arial"/>
-        </w:rPr>
-        <w:t>client</w:t>
-      </w:r>
+        <w:t>Matériel</w:t>
+      </w:r>
+      <w:bookmarkEnd w:id="22"/>
       <w:bookmarkEnd w:id="23"/>
-    </w:p>
-    <w:p>
-      <w:pPr>
-        <w:rPr>
-          <w:rFonts w:ascii="Arial" w:hAnsi="Arial" w:cs="Arial"/>
-          <w:sz w:val="26"/>
-          <w:szCs w:val="26"/>
-        </w:rPr>
-      </w:pPr>
-      <w:r>
-        <w:rPr>
-          <w:rFonts w:ascii="Arial" w:eastAsia="Calibri" w:hAnsi="Arial" w:cs="Arial"/>
-          <w:sz w:val="26"/>
-          <w:szCs w:val="26"/>
-        </w:rPr>
-        <w:t>Le</w:t>
-      </w:r>
-      <w:r>
-        <w:rPr>
-          <w:rFonts w:ascii="Arial" w:hAnsi="Arial" w:cs="Arial"/>
-          <w:sz w:val="26"/>
-          <w:szCs w:val="26"/>
-        </w:rPr>
-        <w:t xml:space="preserve"> </w:t>
-      </w:r>
-      <w:r>
-        <w:rPr>
-          <w:rFonts w:ascii="Arial" w:eastAsia="Calibri" w:hAnsi="Arial" w:cs="Arial"/>
-          <w:sz w:val="26"/>
-          <w:szCs w:val="26"/>
-        </w:rPr>
-        <w:t>client</w:t>
-      </w:r>
-      <w:r>
-        <w:rPr>
-          <w:rFonts w:ascii="Arial" w:hAnsi="Arial" w:cs="Arial"/>
-          <w:sz w:val="26"/>
-          <w:szCs w:val="26"/>
-        </w:rPr>
-        <w:t xml:space="preserve"> {</w:t>
-      </w:r>
-      <w:proofErr w:type="gramStart"/>
-      <w:r>
-        <w:rPr>
-          <w:rFonts w:ascii="Arial" w:hAnsi="Arial" w:cs="Arial"/>
-          <w:sz w:val="26"/>
-          <w:szCs w:val="26"/>
-        </w:rPr>
-        <w:t>{</w:t>
-      </w:r>
-      <w:r>
-        <w:rPr>
-          <w:rFonts w:ascii="Arial" w:hAnsi="Arial" w:cs="Arial"/>
-          <w:sz w:val="26"/>
-          <w:szCs w:val="26"/>
-        </w:rPr>
-        <w:t xml:space="preserve"> </w:t>
-      </w:r>
-      <w:r>
-        <w:rPr>
-          <w:rFonts w:ascii="Arial" w:hAnsi="Arial" w:cs="Arial"/>
-          <w:sz w:val="26"/>
-          <w:szCs w:val="26"/>
-        </w:rPr>
-        <w:t>etude.prospect.</w:t>
-      </w:r>
-      <w:r>
-        <w:rPr>
-          <w:rFonts w:ascii="Arial" w:hAnsi="Arial" w:cs="Arial"/>
-          <w:sz w:val="26"/>
-          <w:szCs w:val="26"/>
-        </w:rPr>
-        <w:t>name</w:t>
-      </w:r>
-      <w:proofErr w:type="gramEnd"/>
-      <w:r>
-        <w:rPr>
-          <w:rFonts w:ascii="Arial" w:hAnsi="Arial" w:cs="Arial"/>
-          <w:sz w:val="26"/>
-          <w:szCs w:val="26"/>
-        </w:rPr>
-        <w:t xml:space="preserve"> </w:t>
-      </w:r>
-      <w:r>
-        <w:rPr>
-          <w:rFonts w:ascii="Arial" w:hAnsi="Arial" w:cs="Arial"/>
-          <w:sz w:val="26"/>
-          <w:szCs w:val="26"/>
-        </w:rPr>
-        <w:t xml:space="preserve">}} </w:t>
-      </w:r>
-      <w:r>
-        <w:rPr>
-          <w:rFonts w:ascii="Arial" w:eastAsia="Calibri" w:hAnsi="Arial" w:cs="Arial"/>
-          <w:sz w:val="26"/>
-          <w:szCs w:val="26"/>
-        </w:rPr>
-        <w:t>s</w:t>
-      </w:r>
-      <w:r>
-        <w:rPr>
-          <w:rFonts w:ascii="Arial" w:hAnsi="Arial" w:cs="Arial"/>
-          <w:sz w:val="26"/>
-          <w:szCs w:val="26"/>
-        </w:rPr>
-        <w:t>’</w:t>
-      </w:r>
-      <w:r>
-        <w:rPr>
-          <w:rFonts w:ascii="Arial" w:eastAsia="Calibri" w:hAnsi="Arial" w:cs="Arial"/>
-          <w:sz w:val="26"/>
-          <w:szCs w:val="26"/>
-        </w:rPr>
-        <w:t>engage</w:t>
-      </w:r>
-      <w:r>
-        <w:rPr>
-          <w:rFonts w:ascii="Arial" w:hAnsi="Arial" w:cs="Arial"/>
-          <w:sz w:val="26"/>
-          <w:szCs w:val="26"/>
-        </w:rPr>
-        <w:t xml:space="preserve"> </w:t>
-      </w:r>
-      <w:r>
-        <w:rPr>
-          <w:rFonts w:ascii="Arial" w:eastAsia="Calibri" w:hAnsi="Arial" w:cs="Arial"/>
-          <w:sz w:val="26"/>
-          <w:szCs w:val="26"/>
-        </w:rPr>
-        <w:t>à</w:t>
-      </w:r>
-      <w:r>
-        <w:rPr>
-          <w:rFonts w:ascii="Arial" w:hAnsi="Arial" w:cs="Arial"/>
-          <w:sz w:val="26"/>
-          <w:szCs w:val="26"/>
-        </w:rPr>
-        <w:t xml:space="preserve"> </w:t>
-      </w:r>
-      <w:r>
-        <w:rPr>
-          <w:rFonts w:ascii="Arial" w:eastAsia="Calibri" w:hAnsi="Arial" w:cs="Arial"/>
-          <w:sz w:val="26"/>
-          <w:szCs w:val="26"/>
-        </w:rPr>
-        <w:t>prêter</w:t>
-      </w:r>
-      <w:r>
-        <w:rPr>
-          <w:rFonts w:ascii="Arial" w:hAnsi="Arial" w:cs="Arial"/>
-          <w:sz w:val="26"/>
-          <w:szCs w:val="26"/>
-        </w:rPr>
-        <w:t xml:space="preserve"> </w:t>
-      </w:r>
-      <w:r>
-        <w:rPr>
-          <w:rFonts w:ascii="Arial" w:eastAsia="Calibri" w:hAnsi="Arial" w:cs="Arial"/>
-          <w:sz w:val="26"/>
-          <w:szCs w:val="26"/>
-        </w:rPr>
-        <w:t>le</w:t>
-      </w:r>
-      <w:r>
-        <w:rPr>
-          <w:rFonts w:ascii="Arial" w:hAnsi="Arial" w:cs="Arial"/>
-          <w:sz w:val="26"/>
-          <w:szCs w:val="26"/>
-        </w:rPr>
-        <w:t xml:space="preserve"> </w:t>
-      </w:r>
-      <w:r>
-        <w:rPr>
-          <w:rFonts w:ascii="Arial" w:eastAsia="Calibri" w:hAnsi="Arial" w:cs="Arial"/>
-          <w:sz w:val="26"/>
-          <w:szCs w:val="26"/>
-        </w:rPr>
-        <w:t>matériel</w:t>
-      </w:r>
-      <w:r>
-        <w:rPr>
-          <w:rFonts w:ascii="Arial" w:hAnsi="Arial" w:cs="Arial"/>
-          <w:sz w:val="26"/>
-          <w:szCs w:val="26"/>
-        </w:rPr>
-        <w:t xml:space="preserve"> </w:t>
-      </w:r>
-      <w:r>
-        <w:rPr>
-          <w:rFonts w:ascii="Arial" w:eastAsia="Calibri" w:hAnsi="Arial" w:cs="Arial"/>
-          <w:sz w:val="26"/>
-          <w:szCs w:val="26"/>
-        </w:rPr>
-        <w:t>suivant</w:t>
-      </w:r>
-      <w:r>
-        <w:rPr>
-          <w:rFonts w:ascii="Arial" w:hAnsi="Arial" w:cs="Arial"/>
-          <w:sz w:val="26"/>
-          <w:szCs w:val="26"/>
-        </w:rPr>
-        <w:t xml:space="preserve"> </w:t>
-      </w:r>
-      <w:r>
-        <w:rPr>
-          <w:rFonts w:ascii="Arial" w:eastAsia="Calibri" w:hAnsi="Arial" w:cs="Arial"/>
-          <w:sz w:val="26"/>
-          <w:szCs w:val="26"/>
-        </w:rPr>
-        <w:t>dans</w:t>
-      </w:r>
-      <w:r>
-        <w:rPr>
-          <w:rFonts w:ascii="Arial" w:hAnsi="Arial" w:cs="Arial"/>
-          <w:sz w:val="26"/>
-          <w:szCs w:val="26"/>
-        </w:rPr>
-        <w:t xml:space="preserve"> </w:t>
-      </w:r>
-      <w:r>
-        <w:rPr>
-          <w:rFonts w:ascii="Arial" w:eastAsia="Calibri" w:hAnsi="Arial" w:cs="Arial"/>
-          <w:sz w:val="26"/>
-          <w:szCs w:val="26"/>
-        </w:rPr>
-        <w:t>les</w:t>
-      </w:r>
-      <w:r>
-        <w:rPr>
-          <w:rFonts w:ascii="Arial" w:hAnsi="Arial" w:cs="Arial"/>
-          <w:sz w:val="26"/>
-          <w:szCs w:val="26"/>
-        </w:rPr>
-        <w:t xml:space="preserve"> 5 </w:t>
-      </w:r>
-      <w:r>
-        <w:rPr>
-          <w:rFonts w:ascii="Arial" w:eastAsia="Calibri" w:hAnsi="Arial" w:cs="Arial"/>
-          <w:sz w:val="26"/>
-          <w:szCs w:val="26"/>
-        </w:rPr>
-        <w:t>jours</w:t>
-      </w:r>
-      <w:r>
-        <w:rPr>
-          <w:rFonts w:ascii="Arial" w:hAnsi="Arial" w:cs="Arial"/>
-          <w:sz w:val="26"/>
-          <w:szCs w:val="26"/>
-        </w:rPr>
-        <w:t xml:space="preserve"> </w:t>
-      </w:r>
-      <w:r>
-        <w:rPr>
-          <w:rFonts w:ascii="Arial" w:eastAsia="Calibri" w:hAnsi="Arial" w:cs="Arial"/>
-          <w:sz w:val="26"/>
-          <w:szCs w:val="26"/>
-        </w:rPr>
-        <w:t>suivant</w:t>
-      </w:r>
-      <w:r>
-        <w:rPr>
-          <w:rFonts w:ascii="Arial" w:hAnsi="Arial" w:cs="Arial"/>
-          <w:sz w:val="26"/>
-          <w:szCs w:val="26"/>
-        </w:rPr>
-        <w:t xml:space="preserve"> </w:t>
-      </w:r>
-      <w:r>
-        <w:rPr>
-          <w:rFonts w:ascii="Arial" w:eastAsia="Calibri" w:hAnsi="Arial" w:cs="Arial"/>
-          <w:sz w:val="26"/>
-          <w:szCs w:val="26"/>
-        </w:rPr>
-        <w:t>le</w:t>
-      </w:r>
-      <w:r>
-        <w:rPr>
-          <w:rFonts w:ascii="Arial" w:hAnsi="Arial" w:cs="Arial"/>
-          <w:sz w:val="26"/>
-          <w:szCs w:val="26"/>
-        </w:rPr>
-        <w:t xml:space="preserve"> </w:t>
-      </w:r>
-      <w:r>
-        <w:rPr>
-          <w:rFonts w:ascii="Arial" w:eastAsia="Calibri" w:hAnsi="Arial" w:cs="Arial"/>
-          <w:sz w:val="26"/>
-          <w:szCs w:val="26"/>
-        </w:rPr>
-        <w:t>début</w:t>
-      </w:r>
-      <w:r>
-        <w:rPr>
-          <w:rFonts w:ascii="Arial" w:hAnsi="Arial" w:cs="Arial"/>
-          <w:sz w:val="26"/>
-          <w:szCs w:val="26"/>
-        </w:rPr>
-        <w:t xml:space="preserve"> </w:t>
-      </w:r>
-      <w:r>
-        <w:rPr>
-          <w:rFonts w:ascii="Arial" w:eastAsia="Calibri" w:hAnsi="Arial" w:cs="Arial"/>
-          <w:sz w:val="26"/>
-          <w:szCs w:val="26"/>
-        </w:rPr>
-        <w:t>de</w:t>
-      </w:r>
-      <w:r>
-        <w:rPr>
-          <w:rFonts w:ascii="Arial" w:hAnsi="Arial" w:cs="Arial"/>
-          <w:sz w:val="26"/>
-          <w:szCs w:val="26"/>
-        </w:rPr>
-        <w:t xml:space="preserve"> </w:t>
-      </w:r>
-      <w:r>
-        <w:rPr>
-          <w:rFonts w:ascii="Arial" w:eastAsia="Calibri" w:hAnsi="Arial" w:cs="Arial"/>
-          <w:sz w:val="26"/>
-          <w:szCs w:val="26"/>
-        </w:rPr>
-        <w:t>l</w:t>
-      </w:r>
-      <w:r>
-        <w:rPr>
-          <w:rFonts w:ascii="Arial" w:hAnsi="Arial" w:cs="Arial"/>
-          <w:sz w:val="26"/>
-          <w:szCs w:val="26"/>
-        </w:rPr>
-        <w:t>’</w:t>
-      </w:r>
-      <w:r>
-        <w:rPr>
-          <w:rFonts w:ascii="Arial" w:eastAsia="Calibri" w:hAnsi="Arial" w:cs="Arial"/>
-          <w:sz w:val="26"/>
-          <w:szCs w:val="26"/>
-        </w:rPr>
-        <w:t>étude</w:t>
-      </w:r>
-      <w:r>
-        <w:rPr>
-          <w:rFonts w:ascii="Arial" w:hAnsi="Arial" w:cs="Arial"/>
-          <w:sz w:val="26"/>
-          <w:szCs w:val="26"/>
-        </w:rPr>
-        <w:t xml:space="preserve">. </w:t>
-      </w:r>
-      <w:r>
-        <w:rPr>
-          <w:rFonts w:ascii="Arial" w:eastAsia="Calibri" w:hAnsi="Arial" w:cs="Arial"/>
-          <w:sz w:val="26"/>
-          <w:szCs w:val="26"/>
-        </w:rPr>
-        <w:t>Il</w:t>
-      </w:r>
-      <w:r>
-        <w:rPr>
-          <w:rFonts w:ascii="Arial" w:hAnsi="Arial" w:cs="Arial"/>
-          <w:sz w:val="26"/>
-          <w:szCs w:val="26"/>
-        </w:rPr>
-        <w:t xml:space="preserve"> </w:t>
-      </w:r>
-      <w:r>
-        <w:rPr>
-          <w:rFonts w:ascii="Arial" w:eastAsia="Calibri" w:hAnsi="Arial" w:cs="Arial"/>
-          <w:sz w:val="26"/>
-          <w:szCs w:val="26"/>
-        </w:rPr>
-        <w:t>sera</w:t>
-      </w:r>
-      <w:r>
-        <w:rPr>
-          <w:rFonts w:ascii="Arial" w:hAnsi="Arial" w:cs="Arial"/>
-          <w:sz w:val="26"/>
-          <w:szCs w:val="26"/>
-        </w:rPr>
-        <w:t xml:space="preserve"> </w:t>
-      </w:r>
-      <w:r>
-        <w:rPr>
-          <w:rFonts w:ascii="Arial" w:eastAsia="Calibri" w:hAnsi="Arial" w:cs="Arial"/>
-          <w:sz w:val="26"/>
-          <w:szCs w:val="26"/>
-        </w:rPr>
-        <w:t>rendu</w:t>
-      </w:r>
-      <w:r>
-        <w:rPr>
-          <w:rFonts w:ascii="Arial" w:hAnsi="Arial" w:cs="Arial"/>
-          <w:sz w:val="26"/>
-          <w:szCs w:val="26"/>
-        </w:rPr>
-        <w:t xml:space="preserve"> </w:t>
-      </w:r>
-      <w:r>
-        <w:rPr>
-          <w:rFonts w:ascii="Arial" w:eastAsia="Calibri" w:hAnsi="Arial" w:cs="Arial"/>
-          <w:sz w:val="26"/>
-          <w:szCs w:val="26"/>
-        </w:rPr>
-        <w:t>lors</w:t>
-      </w:r>
-      <w:r>
-        <w:rPr>
-          <w:rFonts w:ascii="Arial" w:hAnsi="Arial" w:cs="Arial"/>
-          <w:sz w:val="26"/>
-          <w:szCs w:val="26"/>
-        </w:rPr>
-        <w:t xml:space="preserve"> </w:t>
-      </w:r>
-      <w:r>
-        <w:rPr>
-          <w:rFonts w:ascii="Arial" w:eastAsia="Calibri" w:hAnsi="Arial" w:cs="Arial"/>
-          <w:sz w:val="26"/>
-          <w:szCs w:val="26"/>
-        </w:rPr>
-        <w:t>de</w:t>
-      </w:r>
-      <w:r>
-        <w:rPr>
-          <w:rFonts w:ascii="Arial" w:hAnsi="Arial" w:cs="Arial"/>
-          <w:sz w:val="26"/>
-          <w:szCs w:val="26"/>
-        </w:rPr>
-        <w:t xml:space="preserve"> </w:t>
-      </w:r>
-      <w:r>
-        <w:rPr>
-          <w:rFonts w:ascii="Arial" w:eastAsia="Calibri" w:hAnsi="Arial" w:cs="Arial"/>
-          <w:sz w:val="26"/>
-          <w:szCs w:val="26"/>
-        </w:rPr>
-        <w:t>la</w:t>
-      </w:r>
-      <w:r>
-        <w:rPr>
-          <w:rFonts w:ascii="Arial" w:hAnsi="Arial" w:cs="Arial"/>
-          <w:sz w:val="26"/>
-          <w:szCs w:val="26"/>
-        </w:rPr>
-        <w:t xml:space="preserve"> </w:t>
-      </w:r>
-      <w:r>
-        <w:rPr>
-          <w:rFonts w:ascii="Arial" w:eastAsia="Calibri" w:hAnsi="Arial" w:cs="Arial"/>
-          <w:sz w:val="26"/>
-          <w:szCs w:val="26"/>
-        </w:rPr>
-        <w:t>réception</w:t>
-      </w:r>
-      <w:r>
-        <w:rPr>
-          <w:rFonts w:ascii="Arial" w:hAnsi="Arial" w:cs="Arial"/>
-          <w:sz w:val="26"/>
-          <w:szCs w:val="26"/>
-        </w:rPr>
-        <w:t xml:space="preserve"> </w:t>
-      </w:r>
-      <w:r>
-        <w:rPr>
-          <w:rFonts w:ascii="Arial" w:eastAsia="Calibri" w:hAnsi="Arial" w:cs="Arial"/>
-          <w:sz w:val="26"/>
-          <w:szCs w:val="26"/>
-        </w:rPr>
-        <w:t>finale</w:t>
-      </w:r>
-      <w:r>
-        <w:rPr>
-          <w:rFonts w:ascii="Arial" w:hAnsi="Arial" w:cs="Arial"/>
-          <w:sz w:val="26"/>
-          <w:szCs w:val="26"/>
-        </w:rPr>
-        <w:t xml:space="preserve"> </w:t>
-      </w:r>
-      <w:r>
-        <w:rPr>
-          <w:rFonts w:ascii="Arial" w:eastAsia="Calibri" w:hAnsi="Arial" w:cs="Arial"/>
-          <w:sz w:val="26"/>
-          <w:szCs w:val="26"/>
-        </w:rPr>
-        <w:t>de</w:t>
-      </w:r>
-      <w:r>
-        <w:rPr>
-          <w:rFonts w:ascii="Arial" w:hAnsi="Arial" w:cs="Arial"/>
-          <w:sz w:val="26"/>
-          <w:szCs w:val="26"/>
-        </w:rPr>
-        <w:t xml:space="preserve"> </w:t>
-      </w:r>
-      <w:r>
-        <w:rPr>
-          <w:rFonts w:ascii="Arial" w:eastAsia="Calibri" w:hAnsi="Arial" w:cs="Arial"/>
-          <w:sz w:val="26"/>
-          <w:szCs w:val="26"/>
-        </w:rPr>
-        <w:t>l</w:t>
-      </w:r>
-      <w:r>
-        <w:rPr>
-          <w:rFonts w:ascii="Arial" w:hAnsi="Arial" w:cs="Arial"/>
-          <w:sz w:val="26"/>
-          <w:szCs w:val="26"/>
-        </w:rPr>
-        <w:t>’</w:t>
-      </w:r>
-      <w:r>
-        <w:rPr>
-          <w:rFonts w:ascii="Arial" w:eastAsia="Calibri" w:hAnsi="Arial" w:cs="Arial"/>
-          <w:sz w:val="26"/>
-          <w:szCs w:val="26"/>
-        </w:rPr>
-        <w:t>étude</w:t>
-      </w:r>
-      <w:r>
-        <w:rPr>
-          <w:rFonts w:ascii="Arial" w:hAnsi="Arial" w:cs="Arial"/>
-          <w:sz w:val="26"/>
-          <w:szCs w:val="26"/>
-        </w:rPr>
-        <w:t> :</w:t>
-      </w:r>
-    </w:p>
-    <w:p>
-      <w:pPr>
-        <w:rPr>
-          <w:rFonts w:ascii="Arial" w:hAnsi="Arial" w:cs="Arial"/>
-          <w:sz w:val="26"/>
-          <w:szCs w:val="26"/>
-        </w:rPr>
-      </w:pPr>
-    </w:p>
-    <w:p>
-      <w:pPr>
-        <w:spacing w:before="120" w:after="120"/>
-        <w:rPr>
-          <w:rFonts w:ascii="Arial" w:hAnsi="Arial" w:cs="Arial"/>
-          <w:color w:val="000000" w:themeColor="text1"/>
-          <w:sz w:val="26"/>
-          <w:szCs w:val="26"/>
-        </w:rPr>
-      </w:pPr>
-      <w:r>
-        <w:rPr>
-          <w:rFonts w:ascii="Arial" w:hAnsi="Arial" w:cs="Arial"/>
-          <w:color w:val="000000" w:themeColor="text1"/>
-          <w:sz w:val="26"/>
-          <w:szCs w:val="26"/>
-          <w:highlight w:val="yellow"/>
-        </w:rPr>
-        <w:t>Aucun prêt de matériel n’est nécessaire à la réalisation de cette étude.</w:t>
-      </w:r>
-    </w:p>
-    <w:p>
-      <w:pPr>
-        <w:rPr>
-          <w:rFonts w:ascii="Arial" w:hAnsi="Arial" w:cs="Arial"/>
-        </w:rPr>
-      </w:pPr>
-    </w:p>
-    <w:p>
-      <w:pPr>
-        <w:pStyle w:val="Titre3"/>
-        <w:rPr>
-          <w:rFonts w:ascii="Arial" w:hAnsi="Arial"/>
-        </w:rPr>
-      </w:pPr>
-      <w:bookmarkStart w:id="24" w:name="_Toc491964566"/>
-      <w:r>
-        <w:rPr>
-          <w:rFonts w:ascii="Arial" w:eastAsia="Calibri" w:hAnsi="Arial"/>
-        </w:rPr>
-        <w:lastRenderedPageBreak/>
-        <w:t>Achat</w:t>
-      </w:r>
-      <w:r>
-        <w:rPr>
-          <w:rFonts w:ascii="Arial" w:hAnsi="Arial"/>
-        </w:rPr>
-        <w:t xml:space="preserve"> </w:t>
-      </w:r>
-      <w:r>
-        <w:rPr>
-          <w:rFonts w:ascii="Arial" w:eastAsia="Calibri" w:hAnsi="Arial"/>
-        </w:rPr>
-        <w:t>du</w:t>
-      </w:r>
-      <w:r>
-        <w:rPr>
-          <w:rFonts w:ascii="Arial" w:hAnsi="Arial"/>
-        </w:rPr>
-        <w:t xml:space="preserve"> </w:t>
-      </w:r>
-      <w:r>
-        <w:rPr>
-          <w:rFonts w:ascii="Arial" w:eastAsia="Calibri" w:hAnsi="Arial"/>
-        </w:rPr>
-        <w:t>matériel</w:t>
-      </w:r>
-      <w:r>
-        <w:rPr>
-          <w:rFonts w:ascii="Arial" w:hAnsi="Arial"/>
-        </w:rPr>
-        <w:t xml:space="preserve"> </w:t>
-      </w:r>
-      <w:r>
-        <w:rPr>
-          <w:rFonts w:ascii="Arial" w:eastAsia="Calibri" w:hAnsi="Arial"/>
-        </w:rPr>
-        <w:t>nécessaire</w:t>
-      </w:r>
-      <w:r>
-        <w:rPr>
-          <w:rFonts w:ascii="Arial" w:hAnsi="Arial"/>
-        </w:rPr>
-        <w:t xml:space="preserve"> </w:t>
-      </w:r>
-      <w:r>
-        <w:rPr>
-          <w:rFonts w:ascii="Arial" w:eastAsia="Calibri" w:hAnsi="Arial"/>
-        </w:rPr>
-        <w:t>pour</w:t>
-      </w:r>
-      <w:r>
-        <w:rPr>
-          <w:rFonts w:ascii="Arial" w:hAnsi="Arial"/>
-        </w:rPr>
-        <w:t xml:space="preserve"> </w:t>
-      </w:r>
-      <w:r>
-        <w:rPr>
-          <w:rFonts w:ascii="Arial" w:eastAsia="Calibri" w:hAnsi="Arial"/>
-        </w:rPr>
-        <w:t>réaliser</w:t>
-      </w:r>
-      <w:r>
-        <w:rPr>
-          <w:rFonts w:ascii="Arial" w:hAnsi="Arial"/>
-        </w:rPr>
-        <w:t xml:space="preserve"> </w:t>
-      </w:r>
-      <w:r>
-        <w:rPr>
-          <w:rFonts w:ascii="Arial" w:eastAsia="Calibri" w:hAnsi="Arial"/>
-        </w:rPr>
-        <w:t>l</w:t>
-      </w:r>
-      <w:r>
-        <w:rPr>
-          <w:rFonts w:ascii="Arial" w:hAnsi="Arial"/>
-        </w:rPr>
-        <w:t>’</w:t>
-      </w:r>
-      <w:r>
-        <w:rPr>
-          <w:rFonts w:ascii="Arial" w:eastAsia="Calibri" w:hAnsi="Arial"/>
-        </w:rPr>
-        <w:t>étude</w:t>
-      </w:r>
       <w:bookmarkEnd w:id="24"/>
     </w:p>
     <w:p>
       <w:pPr>
-        <w:rPr>
-          <w:rFonts w:ascii="Arial" w:hAnsi="Arial" w:cs="Arial"/>
-          <w:sz w:val="26"/>
-          <w:szCs w:val="26"/>
-        </w:rPr>
-      </w:pPr>
-      <w:r>
-        <w:rPr>
-          <w:rFonts w:ascii="Arial" w:eastAsia="Calibri" w:hAnsi="Arial" w:cs="Arial"/>
-          <w:sz w:val="26"/>
-          <w:szCs w:val="26"/>
-        </w:rPr>
-        <w:t>Le</w:t>
-      </w:r>
-      <w:r>
-        <w:rPr>
-          <w:rFonts w:ascii="Arial" w:hAnsi="Arial" w:cs="Arial"/>
-          <w:sz w:val="26"/>
-          <w:szCs w:val="26"/>
-        </w:rPr>
-        <w:t xml:space="preserve"> </w:t>
-      </w:r>
-      <w:r>
-        <w:rPr>
-          <w:rFonts w:ascii="Arial" w:eastAsia="Calibri" w:hAnsi="Arial" w:cs="Arial"/>
-          <w:sz w:val="26"/>
-          <w:szCs w:val="26"/>
+        <w:pStyle w:val="Titre3"/>
+        <w:rPr>
+          <w:rFonts w:ascii="Arial" w:hAnsi="Arial"/>
+        </w:rPr>
+      </w:pPr>
+      <w:bookmarkStart w:id="25" w:name="_Toc491964565"/>
+      <w:r>
+        <w:rPr>
+          <w:rFonts w:ascii="Arial" w:eastAsia="Calibri" w:hAnsi="Arial"/>
+        </w:rPr>
+        <w:t>Prêt</w:t>
+      </w:r>
+      <w:r>
+        <w:rPr>
+          <w:rFonts w:ascii="Arial" w:hAnsi="Arial"/>
+        </w:rPr>
+        <w:t xml:space="preserve"> </w:t>
+      </w:r>
+      <w:r>
+        <w:rPr>
+          <w:rFonts w:ascii="Arial" w:eastAsia="Calibri" w:hAnsi="Arial"/>
+        </w:rPr>
+        <w:t>de</w:t>
+      </w:r>
+      <w:r>
+        <w:rPr>
+          <w:rFonts w:ascii="Arial" w:hAnsi="Arial"/>
+        </w:rPr>
+        <w:t xml:space="preserve"> </w:t>
+      </w:r>
+      <w:r>
+        <w:rPr>
+          <w:rFonts w:ascii="Arial" w:eastAsia="Calibri" w:hAnsi="Arial"/>
         </w:rPr>
         <w:t>matériel</w:t>
       </w:r>
       <w:r>
         <w:rPr>
-          <w:rFonts w:ascii="Arial" w:hAnsi="Arial" w:cs="Arial"/>
-          <w:sz w:val="26"/>
-          <w:szCs w:val="26"/>
-        </w:rPr>
-        <w:t xml:space="preserve"> </w:t>
-      </w:r>
-      <w:r>
-        <w:rPr>
-          <w:rFonts w:ascii="Arial" w:eastAsia="Calibri" w:hAnsi="Arial" w:cs="Arial"/>
-          <w:sz w:val="26"/>
-          <w:szCs w:val="26"/>
-        </w:rPr>
-        <w:t>acheté</w:t>
-      </w:r>
-      <w:r>
-        <w:rPr>
-          <w:rFonts w:ascii="Arial" w:hAnsi="Arial" w:cs="Arial"/>
-          <w:sz w:val="26"/>
-          <w:szCs w:val="26"/>
-        </w:rPr>
-        <w:t xml:space="preserve"> </w:t>
-      </w:r>
-      <w:r>
-        <w:rPr>
-          <w:rFonts w:ascii="Arial" w:eastAsia="Calibri" w:hAnsi="Arial" w:cs="Arial"/>
-          <w:sz w:val="26"/>
-          <w:szCs w:val="26"/>
-        </w:rPr>
-        <w:t>pour</w:t>
-      </w:r>
-      <w:r>
-        <w:rPr>
-          <w:rFonts w:ascii="Arial" w:hAnsi="Arial" w:cs="Arial"/>
-          <w:sz w:val="26"/>
-          <w:szCs w:val="26"/>
-        </w:rPr>
-        <w:t xml:space="preserve"> </w:t>
-      </w:r>
-      <w:r>
-        <w:rPr>
-          <w:rFonts w:ascii="Arial" w:eastAsia="Calibri" w:hAnsi="Arial" w:cs="Arial"/>
-          <w:sz w:val="26"/>
-          <w:szCs w:val="26"/>
-        </w:rPr>
-        <w:t>réaliser</w:t>
-      </w:r>
-      <w:r>
-        <w:rPr>
-          <w:rFonts w:ascii="Arial" w:hAnsi="Arial" w:cs="Arial"/>
-          <w:sz w:val="26"/>
-          <w:szCs w:val="26"/>
-        </w:rPr>
-        <w:t xml:space="preserve"> </w:t>
-      </w:r>
-      <w:r>
-        <w:rPr>
-          <w:rFonts w:ascii="Arial" w:eastAsia="Calibri" w:hAnsi="Arial" w:cs="Arial"/>
-          <w:sz w:val="26"/>
-          <w:szCs w:val="26"/>
-        </w:rPr>
-        <w:t>l</w:t>
-      </w:r>
-      <w:r>
-        <w:rPr>
-          <w:rFonts w:ascii="Arial" w:hAnsi="Arial" w:cs="Arial"/>
-          <w:sz w:val="26"/>
-          <w:szCs w:val="26"/>
-        </w:rPr>
-        <w:t>’</w:t>
-      </w:r>
-      <w:r>
-        <w:rPr>
-          <w:rFonts w:ascii="Arial" w:eastAsia="Calibri" w:hAnsi="Arial" w:cs="Arial"/>
-          <w:sz w:val="26"/>
-          <w:szCs w:val="26"/>
-        </w:rPr>
-        <w:t>étude</w:t>
-      </w:r>
-      <w:r>
-        <w:rPr>
-          <w:rFonts w:ascii="Arial" w:hAnsi="Arial" w:cs="Arial"/>
-          <w:sz w:val="26"/>
-          <w:szCs w:val="26"/>
-        </w:rPr>
-        <w:t xml:space="preserve"> </w:t>
-      </w:r>
-      <w:r>
-        <w:rPr>
-          <w:rFonts w:ascii="Arial" w:eastAsia="Calibri" w:hAnsi="Arial" w:cs="Arial"/>
-          <w:sz w:val="26"/>
-          <w:szCs w:val="26"/>
-        </w:rPr>
-        <w:t>sera</w:t>
-      </w:r>
-      <w:r>
-        <w:rPr>
-          <w:rFonts w:ascii="Arial" w:hAnsi="Arial" w:cs="Arial"/>
-          <w:sz w:val="26"/>
-          <w:szCs w:val="26"/>
-        </w:rPr>
-        <w:t xml:space="preserve"> </w:t>
-      </w:r>
-      <w:r>
-        <w:rPr>
-          <w:rFonts w:ascii="Arial" w:eastAsia="Calibri" w:hAnsi="Arial" w:cs="Arial"/>
-          <w:sz w:val="26"/>
-          <w:szCs w:val="26"/>
-        </w:rPr>
-        <w:t>facturé</w:t>
-      </w:r>
-      <w:r>
-        <w:rPr>
-          <w:rFonts w:ascii="Arial" w:hAnsi="Arial" w:cs="Arial"/>
-          <w:sz w:val="26"/>
-          <w:szCs w:val="26"/>
-        </w:rPr>
-        <w:t xml:space="preserve"> </w:t>
-      </w:r>
-      <w:r>
-        <w:rPr>
-          <w:rFonts w:ascii="Arial" w:eastAsia="Calibri" w:hAnsi="Arial" w:cs="Arial"/>
-          <w:sz w:val="26"/>
-          <w:szCs w:val="26"/>
-        </w:rPr>
-        <w:t>à</w:t>
-      </w:r>
-      <w:r>
-        <w:rPr>
-          <w:rFonts w:ascii="Arial" w:hAnsi="Arial" w:cs="Arial"/>
-          <w:sz w:val="26"/>
-          <w:szCs w:val="26"/>
-        </w:rPr>
-        <w:t xml:space="preserve"> </w:t>
-      </w:r>
-      <w:r>
-        <w:rPr>
-          <w:rFonts w:ascii="Arial" w:eastAsia="Calibri" w:hAnsi="Arial" w:cs="Arial"/>
-          <w:sz w:val="26"/>
-          <w:szCs w:val="26"/>
-        </w:rPr>
-        <w:t>postériori</w:t>
-      </w:r>
-      <w:r>
-        <w:rPr>
-          <w:rFonts w:ascii="Arial" w:hAnsi="Arial" w:cs="Arial"/>
-          <w:sz w:val="26"/>
-          <w:szCs w:val="26"/>
-        </w:rPr>
-        <w:t xml:space="preserve">. </w:t>
-      </w:r>
-      <w:r>
-        <w:rPr>
-          <w:rFonts w:ascii="Arial" w:eastAsia="Calibri" w:hAnsi="Arial" w:cs="Arial"/>
-          <w:sz w:val="26"/>
-          <w:szCs w:val="26"/>
-        </w:rPr>
-        <w:t>Tout</w:t>
-      </w:r>
-      <w:r>
-        <w:rPr>
-          <w:rFonts w:ascii="Arial" w:hAnsi="Arial" w:cs="Arial"/>
-          <w:sz w:val="26"/>
-          <w:szCs w:val="26"/>
-        </w:rPr>
-        <w:t xml:space="preserve"> </w:t>
-      </w:r>
-      <w:r>
-        <w:rPr>
-          <w:rFonts w:ascii="Arial" w:eastAsia="Calibri" w:hAnsi="Arial" w:cs="Arial"/>
-          <w:sz w:val="26"/>
-          <w:szCs w:val="26"/>
-        </w:rPr>
-        <w:t>achat</w:t>
-      </w:r>
-      <w:r>
-        <w:rPr>
-          <w:rFonts w:ascii="Arial" w:hAnsi="Arial" w:cs="Arial"/>
-          <w:sz w:val="26"/>
-          <w:szCs w:val="26"/>
-        </w:rPr>
-        <w:t xml:space="preserve"> </w:t>
-      </w:r>
-      <w:r>
-        <w:rPr>
-          <w:rFonts w:ascii="Arial" w:eastAsia="Calibri" w:hAnsi="Arial" w:cs="Arial"/>
-          <w:sz w:val="26"/>
-          <w:szCs w:val="26"/>
-        </w:rPr>
-        <w:t>sera</w:t>
-      </w:r>
-      <w:r>
-        <w:rPr>
-          <w:rFonts w:ascii="Arial" w:hAnsi="Arial" w:cs="Arial"/>
-          <w:sz w:val="26"/>
-          <w:szCs w:val="26"/>
-        </w:rPr>
-        <w:t xml:space="preserve"> </w:t>
-      </w:r>
-      <w:r>
-        <w:rPr>
-          <w:rFonts w:ascii="Arial" w:eastAsia="Calibri" w:hAnsi="Arial" w:cs="Arial"/>
-          <w:sz w:val="26"/>
-          <w:szCs w:val="26"/>
+          <w:rFonts w:ascii="Arial" w:hAnsi="Arial"/>
+        </w:rPr>
+        <w:t xml:space="preserve"> </w:t>
+      </w:r>
+      <w:r>
+        <w:rPr>
+          <w:rFonts w:ascii="Arial" w:eastAsia="Calibri" w:hAnsi="Arial"/>
         </w:rPr>
         <w:t>de</w:t>
       </w:r>
       <w:r>
         <w:rPr>
-          <w:rFonts w:ascii="Arial" w:hAnsi="Arial" w:cs="Arial"/>
-          <w:sz w:val="26"/>
-          <w:szCs w:val="26"/>
-        </w:rPr>
-        <w:t xml:space="preserve"> </w:t>
-      </w:r>
-      <w:r>
-        <w:rPr>
-          <w:rFonts w:ascii="Arial" w:eastAsia="Calibri" w:hAnsi="Arial" w:cs="Arial"/>
-          <w:sz w:val="26"/>
-          <w:szCs w:val="26"/>
-        </w:rPr>
-        <w:t>ce</w:t>
-      </w:r>
-      <w:r>
-        <w:rPr>
-          <w:rFonts w:ascii="Arial" w:hAnsi="Arial" w:cs="Arial"/>
-          <w:sz w:val="26"/>
-          <w:szCs w:val="26"/>
-        </w:rPr>
-        <w:t xml:space="preserve"> </w:t>
-      </w:r>
-      <w:r>
-        <w:rPr>
-          <w:rFonts w:ascii="Arial" w:eastAsia="Calibri" w:hAnsi="Arial" w:cs="Arial"/>
-          <w:sz w:val="26"/>
-          <w:szCs w:val="26"/>
-        </w:rPr>
-        <w:t>fait</w:t>
-      </w:r>
-      <w:r>
-        <w:rPr>
-          <w:rFonts w:ascii="Arial" w:hAnsi="Arial" w:cs="Arial"/>
-          <w:sz w:val="26"/>
-          <w:szCs w:val="26"/>
-        </w:rPr>
-        <w:t xml:space="preserve"> </w:t>
-      </w:r>
-      <w:r>
-        <w:rPr>
-          <w:rFonts w:ascii="Arial" w:eastAsia="Calibri" w:hAnsi="Arial" w:cs="Arial"/>
-          <w:sz w:val="26"/>
-          <w:szCs w:val="26"/>
-        </w:rPr>
-        <w:t>soumis</w:t>
-      </w:r>
-      <w:r>
-        <w:rPr>
-          <w:rFonts w:ascii="Arial" w:hAnsi="Arial" w:cs="Arial"/>
-          <w:sz w:val="26"/>
-          <w:szCs w:val="26"/>
-        </w:rPr>
-        <w:t xml:space="preserve"> </w:t>
-      </w:r>
-      <w:r>
-        <w:rPr>
-          <w:rFonts w:ascii="Arial" w:eastAsia="Calibri" w:hAnsi="Arial" w:cs="Arial"/>
-          <w:sz w:val="26"/>
-          <w:szCs w:val="26"/>
-        </w:rPr>
-        <w:t>à</w:t>
-      </w:r>
-      <w:r>
-        <w:rPr>
-          <w:rFonts w:ascii="Arial" w:hAnsi="Arial" w:cs="Arial"/>
-          <w:sz w:val="26"/>
-          <w:szCs w:val="26"/>
-        </w:rPr>
-        <w:t xml:space="preserve"> </w:t>
-      </w:r>
-      <w:r>
-        <w:rPr>
-          <w:rFonts w:ascii="Arial" w:eastAsia="Calibri" w:hAnsi="Arial" w:cs="Arial"/>
-          <w:sz w:val="26"/>
-          <w:szCs w:val="26"/>
-        </w:rPr>
-        <w:t>l</w:t>
-      </w:r>
-      <w:r>
-        <w:rPr>
-          <w:rFonts w:ascii="Arial" w:hAnsi="Arial" w:cs="Arial"/>
-          <w:sz w:val="26"/>
-          <w:szCs w:val="26"/>
-        </w:rPr>
-        <w:t>’</w:t>
-      </w:r>
-      <w:r>
-        <w:rPr>
-          <w:rFonts w:ascii="Arial" w:eastAsia="Calibri" w:hAnsi="Arial" w:cs="Arial"/>
-          <w:sz w:val="26"/>
-          <w:szCs w:val="26"/>
-        </w:rPr>
-        <w:t>approbation</w:t>
-      </w:r>
-      <w:r>
-        <w:rPr>
-          <w:rFonts w:ascii="Arial" w:hAnsi="Arial" w:cs="Arial"/>
-          <w:sz w:val="26"/>
-          <w:szCs w:val="26"/>
-        </w:rPr>
-        <w:t xml:space="preserve"> </w:t>
-      </w:r>
-      <w:r>
-        <w:rPr>
-          <w:rFonts w:ascii="Arial" w:eastAsia="Calibri" w:hAnsi="Arial" w:cs="Arial"/>
-          <w:sz w:val="26"/>
-          <w:szCs w:val="26"/>
+          <w:rFonts w:ascii="Arial" w:hAnsi="Arial"/>
+        </w:rPr>
+        <w:t xml:space="preserve"> </w:t>
+      </w:r>
+      <w:r>
+        <w:rPr>
+          <w:rFonts w:ascii="Arial" w:eastAsia="Calibri" w:hAnsi="Arial"/>
+        </w:rPr>
+        <w:t>la</w:t>
+      </w:r>
+      <w:r>
+        <w:rPr>
+          <w:rFonts w:ascii="Arial" w:hAnsi="Arial"/>
+        </w:rPr>
+        <w:t xml:space="preserve"> </w:t>
+      </w:r>
+      <w:r>
+        <w:rPr>
+          <w:rFonts w:ascii="Arial" w:eastAsia="Calibri" w:hAnsi="Arial"/>
+        </w:rPr>
+        <w:t>part</w:t>
+      </w:r>
+      <w:r>
+        <w:rPr>
+          <w:rFonts w:ascii="Arial" w:hAnsi="Arial"/>
+        </w:rPr>
+        <w:t xml:space="preserve"> </w:t>
+      </w:r>
+      <w:r>
+        <w:rPr>
+          <w:rFonts w:ascii="Arial" w:eastAsia="Calibri" w:hAnsi="Arial"/>
         </w:rPr>
         <w:t>du</w:t>
       </w:r>
       <w:r>
         <w:rPr>
-          <w:rFonts w:ascii="Arial" w:hAnsi="Arial" w:cs="Arial"/>
-          <w:sz w:val="26"/>
-          <w:szCs w:val="26"/>
-        </w:rPr>
-        <w:t xml:space="preserve"> </w:t>
-      </w:r>
-      <w:r>
-        <w:rPr>
-          <w:rFonts w:ascii="Arial" w:eastAsia="Calibri" w:hAnsi="Arial" w:cs="Arial"/>
-          <w:sz w:val="26"/>
-          <w:szCs w:val="26"/>
+          <w:rFonts w:ascii="Arial" w:hAnsi="Arial"/>
+        </w:rPr>
+        <w:t xml:space="preserve"> </w:t>
+      </w:r>
+      <w:r>
+        <w:rPr>
+          <w:rFonts w:ascii="Arial" w:eastAsia="Calibri" w:hAnsi="Arial"/>
         </w:rPr>
         <w:t>client</w:t>
       </w:r>
-      <w:r>
-        <w:rPr>
-          <w:rFonts w:ascii="Arial" w:hAnsi="Arial" w:cs="Arial"/>
-          <w:sz w:val="26"/>
-          <w:szCs w:val="26"/>
-        </w:rPr>
-        <w:t>.</w:t>
-      </w:r>
+      <w:bookmarkEnd w:id="25"/>
     </w:p>
     <w:p>
       <w:pPr>
@@ -9788,50 +9014,1088 @@
           <w:szCs w:val="26"/>
         </w:rPr>
       </w:pPr>
+      <w:r>
+        <w:rPr>
+          <w:rFonts w:ascii="Arial" w:eastAsia="Calibri" w:hAnsi="Arial" w:cs="Arial"/>
+          <w:sz w:val="26"/>
+          <w:szCs w:val="26"/>
+        </w:rPr>
+        <w:t>Le</w:t>
+      </w:r>
+      <w:r>
+        <w:rPr>
+          <w:rFonts w:ascii="Arial" w:hAnsi="Arial" w:cs="Arial"/>
+          <w:sz w:val="26"/>
+          <w:szCs w:val="26"/>
+        </w:rPr>
+        <w:t xml:space="preserve"> </w:t>
+      </w:r>
+      <w:r>
+        <w:rPr>
+          <w:rFonts w:ascii="Arial" w:eastAsia="Calibri" w:hAnsi="Arial" w:cs="Arial"/>
+          <w:sz w:val="26"/>
+          <w:szCs w:val="26"/>
+        </w:rPr>
+        <w:t>client</w:t>
+      </w:r>
+      <w:r>
+        <w:rPr>
+          <w:rFonts w:ascii="Arial" w:hAnsi="Arial" w:cs="Arial"/>
+          <w:sz w:val="26"/>
+          <w:szCs w:val="26"/>
+        </w:rPr>
+        <w:t xml:space="preserve"> {</w:t>
+      </w:r>
+      <w:proofErr w:type="gramStart"/>
+      <w:r>
+        <w:rPr>
+          <w:rFonts w:ascii="Arial" w:hAnsi="Arial" w:cs="Arial"/>
+          <w:sz w:val="26"/>
+          <w:szCs w:val="26"/>
+        </w:rPr>
+        <w:t>{</w:t>
+      </w:r>
+      <w:r>
+        <w:rPr>
+          <w:rFonts w:ascii="Arial" w:hAnsi="Arial" w:cs="Arial"/>
+          <w:sz w:val="26"/>
+          <w:szCs w:val="26"/>
+        </w:rPr>
+        <w:t xml:space="preserve"> </w:t>
+      </w:r>
+      <w:r>
+        <w:rPr>
+          <w:rFonts w:ascii="Arial" w:hAnsi="Arial" w:cs="Arial"/>
+          <w:sz w:val="26"/>
+          <w:szCs w:val="26"/>
+        </w:rPr>
+        <w:t>etude.prospect.</w:t>
+      </w:r>
+      <w:r>
+        <w:rPr>
+          <w:rFonts w:ascii="Arial" w:hAnsi="Arial" w:cs="Arial"/>
+          <w:sz w:val="26"/>
+          <w:szCs w:val="26"/>
+        </w:rPr>
+        <w:t>name</w:t>
+      </w:r>
+      <w:proofErr w:type="gramEnd"/>
+      <w:r>
+        <w:rPr>
+          <w:rFonts w:ascii="Arial" w:hAnsi="Arial" w:cs="Arial"/>
+          <w:sz w:val="26"/>
+          <w:szCs w:val="26"/>
+        </w:rPr>
+        <w:t xml:space="preserve"> </w:t>
+      </w:r>
+      <w:r>
+        <w:rPr>
+          <w:rFonts w:ascii="Arial" w:hAnsi="Arial" w:cs="Arial"/>
+          <w:sz w:val="26"/>
+          <w:szCs w:val="26"/>
+        </w:rPr>
+        <w:t xml:space="preserve">}} </w:t>
+      </w:r>
+      <w:r>
+        <w:rPr>
+          <w:rFonts w:ascii="Arial" w:eastAsia="Calibri" w:hAnsi="Arial" w:cs="Arial"/>
+          <w:sz w:val="26"/>
+          <w:szCs w:val="26"/>
+        </w:rPr>
+        <w:t>s</w:t>
+      </w:r>
+      <w:r>
+        <w:rPr>
+          <w:rFonts w:ascii="Arial" w:hAnsi="Arial" w:cs="Arial"/>
+          <w:sz w:val="26"/>
+          <w:szCs w:val="26"/>
+        </w:rPr>
+        <w:t>’</w:t>
+      </w:r>
+      <w:r>
+        <w:rPr>
+          <w:rFonts w:ascii="Arial" w:eastAsia="Calibri" w:hAnsi="Arial" w:cs="Arial"/>
+          <w:sz w:val="26"/>
+          <w:szCs w:val="26"/>
+        </w:rPr>
+        <w:t>engage</w:t>
+      </w:r>
+      <w:r>
+        <w:rPr>
+          <w:rFonts w:ascii="Arial" w:hAnsi="Arial" w:cs="Arial"/>
+          <w:sz w:val="26"/>
+          <w:szCs w:val="26"/>
+        </w:rPr>
+        <w:t xml:space="preserve"> </w:t>
+      </w:r>
+      <w:r>
+        <w:rPr>
+          <w:rFonts w:ascii="Arial" w:eastAsia="Calibri" w:hAnsi="Arial" w:cs="Arial"/>
+          <w:sz w:val="26"/>
+          <w:szCs w:val="26"/>
+        </w:rPr>
+        <w:t>à</w:t>
+      </w:r>
+      <w:r>
+        <w:rPr>
+          <w:rFonts w:ascii="Arial" w:hAnsi="Arial" w:cs="Arial"/>
+          <w:sz w:val="26"/>
+          <w:szCs w:val="26"/>
+        </w:rPr>
+        <w:t xml:space="preserve"> </w:t>
+      </w:r>
+      <w:r>
+        <w:rPr>
+          <w:rFonts w:ascii="Arial" w:eastAsia="Calibri" w:hAnsi="Arial" w:cs="Arial"/>
+          <w:sz w:val="26"/>
+          <w:szCs w:val="26"/>
+        </w:rPr>
+        <w:t>prêter</w:t>
+      </w:r>
+      <w:r>
+        <w:rPr>
+          <w:rFonts w:ascii="Arial" w:hAnsi="Arial" w:cs="Arial"/>
+          <w:sz w:val="26"/>
+          <w:szCs w:val="26"/>
+        </w:rPr>
+        <w:t xml:space="preserve"> </w:t>
+      </w:r>
+      <w:r>
+        <w:rPr>
+          <w:rFonts w:ascii="Arial" w:eastAsia="Calibri" w:hAnsi="Arial" w:cs="Arial"/>
+          <w:sz w:val="26"/>
+          <w:szCs w:val="26"/>
+        </w:rPr>
+        <w:t>le</w:t>
+      </w:r>
+      <w:r>
+        <w:rPr>
+          <w:rFonts w:ascii="Arial" w:hAnsi="Arial" w:cs="Arial"/>
+          <w:sz w:val="26"/>
+          <w:szCs w:val="26"/>
+        </w:rPr>
+        <w:t xml:space="preserve"> </w:t>
+      </w:r>
+      <w:r>
+        <w:rPr>
+          <w:rFonts w:ascii="Arial" w:eastAsia="Calibri" w:hAnsi="Arial" w:cs="Arial"/>
+          <w:sz w:val="26"/>
+          <w:szCs w:val="26"/>
+        </w:rPr>
+        <w:t>matériel</w:t>
+      </w:r>
+      <w:r>
+        <w:rPr>
+          <w:rFonts w:ascii="Arial" w:hAnsi="Arial" w:cs="Arial"/>
+          <w:sz w:val="26"/>
+          <w:szCs w:val="26"/>
+        </w:rPr>
+        <w:t xml:space="preserve"> </w:t>
+      </w:r>
+      <w:r>
+        <w:rPr>
+          <w:rFonts w:ascii="Arial" w:eastAsia="Calibri" w:hAnsi="Arial" w:cs="Arial"/>
+          <w:sz w:val="26"/>
+          <w:szCs w:val="26"/>
+        </w:rPr>
+        <w:t>suivant</w:t>
+      </w:r>
+      <w:r>
+        <w:rPr>
+          <w:rFonts w:ascii="Arial" w:hAnsi="Arial" w:cs="Arial"/>
+          <w:sz w:val="26"/>
+          <w:szCs w:val="26"/>
+        </w:rPr>
+        <w:t xml:space="preserve"> </w:t>
+      </w:r>
+      <w:r>
+        <w:rPr>
+          <w:rFonts w:ascii="Arial" w:eastAsia="Calibri" w:hAnsi="Arial" w:cs="Arial"/>
+          <w:sz w:val="26"/>
+          <w:szCs w:val="26"/>
+        </w:rPr>
+        <w:t>dans</w:t>
+      </w:r>
+      <w:r>
+        <w:rPr>
+          <w:rFonts w:ascii="Arial" w:hAnsi="Arial" w:cs="Arial"/>
+          <w:sz w:val="26"/>
+          <w:szCs w:val="26"/>
+        </w:rPr>
+        <w:t xml:space="preserve"> </w:t>
+      </w:r>
+      <w:r>
+        <w:rPr>
+          <w:rFonts w:ascii="Arial" w:eastAsia="Calibri" w:hAnsi="Arial" w:cs="Arial"/>
+          <w:sz w:val="26"/>
+          <w:szCs w:val="26"/>
+        </w:rPr>
+        <w:t>les</w:t>
+      </w:r>
+      <w:r>
+        <w:rPr>
+          <w:rFonts w:ascii="Arial" w:hAnsi="Arial" w:cs="Arial"/>
+          <w:sz w:val="26"/>
+          <w:szCs w:val="26"/>
+        </w:rPr>
+        <w:t xml:space="preserve"> 5 </w:t>
+      </w:r>
+      <w:r>
+        <w:rPr>
+          <w:rFonts w:ascii="Arial" w:eastAsia="Calibri" w:hAnsi="Arial" w:cs="Arial"/>
+          <w:sz w:val="26"/>
+          <w:szCs w:val="26"/>
+        </w:rPr>
+        <w:t>jours</w:t>
+      </w:r>
+      <w:r>
+        <w:rPr>
+          <w:rFonts w:ascii="Arial" w:hAnsi="Arial" w:cs="Arial"/>
+          <w:sz w:val="26"/>
+          <w:szCs w:val="26"/>
+        </w:rPr>
+        <w:t xml:space="preserve"> </w:t>
+      </w:r>
+      <w:r>
+        <w:rPr>
+          <w:rFonts w:ascii="Arial" w:eastAsia="Calibri" w:hAnsi="Arial" w:cs="Arial"/>
+          <w:sz w:val="26"/>
+          <w:szCs w:val="26"/>
+        </w:rPr>
+        <w:t>suivant</w:t>
+      </w:r>
+      <w:r>
+        <w:rPr>
+          <w:rFonts w:ascii="Arial" w:hAnsi="Arial" w:cs="Arial"/>
+          <w:sz w:val="26"/>
+          <w:szCs w:val="26"/>
+        </w:rPr>
+        <w:t xml:space="preserve"> </w:t>
+      </w:r>
+      <w:r>
+        <w:rPr>
+          <w:rFonts w:ascii="Arial" w:eastAsia="Calibri" w:hAnsi="Arial" w:cs="Arial"/>
+          <w:sz w:val="26"/>
+          <w:szCs w:val="26"/>
+        </w:rPr>
+        <w:t>le</w:t>
+      </w:r>
+      <w:r>
+        <w:rPr>
+          <w:rFonts w:ascii="Arial" w:hAnsi="Arial" w:cs="Arial"/>
+          <w:sz w:val="26"/>
+          <w:szCs w:val="26"/>
+        </w:rPr>
+        <w:t xml:space="preserve"> </w:t>
+      </w:r>
+      <w:r>
+        <w:rPr>
+          <w:rFonts w:ascii="Arial" w:eastAsia="Calibri" w:hAnsi="Arial" w:cs="Arial"/>
+          <w:sz w:val="26"/>
+          <w:szCs w:val="26"/>
+        </w:rPr>
+        <w:t>début</w:t>
+      </w:r>
+      <w:r>
+        <w:rPr>
+          <w:rFonts w:ascii="Arial" w:hAnsi="Arial" w:cs="Arial"/>
+          <w:sz w:val="26"/>
+          <w:szCs w:val="26"/>
+        </w:rPr>
+        <w:t xml:space="preserve"> </w:t>
+      </w:r>
+      <w:r>
+        <w:rPr>
+          <w:rFonts w:ascii="Arial" w:eastAsia="Calibri" w:hAnsi="Arial" w:cs="Arial"/>
+          <w:sz w:val="26"/>
+          <w:szCs w:val="26"/>
+        </w:rPr>
+        <w:t>de</w:t>
+      </w:r>
+      <w:r>
+        <w:rPr>
+          <w:rFonts w:ascii="Arial" w:hAnsi="Arial" w:cs="Arial"/>
+          <w:sz w:val="26"/>
+          <w:szCs w:val="26"/>
+        </w:rPr>
+        <w:t xml:space="preserve"> </w:t>
+      </w:r>
+      <w:r>
+        <w:rPr>
+          <w:rFonts w:ascii="Arial" w:eastAsia="Calibri" w:hAnsi="Arial" w:cs="Arial"/>
+          <w:sz w:val="26"/>
+          <w:szCs w:val="26"/>
+        </w:rPr>
+        <w:t>l</w:t>
+      </w:r>
+      <w:r>
+        <w:rPr>
+          <w:rFonts w:ascii="Arial" w:hAnsi="Arial" w:cs="Arial"/>
+          <w:sz w:val="26"/>
+          <w:szCs w:val="26"/>
+        </w:rPr>
+        <w:t>’</w:t>
+      </w:r>
+      <w:r>
+        <w:rPr>
+          <w:rFonts w:ascii="Arial" w:eastAsia="Calibri" w:hAnsi="Arial" w:cs="Arial"/>
+          <w:sz w:val="26"/>
+          <w:szCs w:val="26"/>
+        </w:rPr>
+        <w:t>étude</w:t>
+      </w:r>
+      <w:r>
+        <w:rPr>
+          <w:rFonts w:ascii="Arial" w:hAnsi="Arial" w:cs="Arial"/>
+          <w:sz w:val="26"/>
+          <w:szCs w:val="26"/>
+        </w:rPr>
+        <w:t xml:space="preserve">. </w:t>
+      </w:r>
+      <w:r>
+        <w:rPr>
+          <w:rFonts w:ascii="Arial" w:eastAsia="Calibri" w:hAnsi="Arial" w:cs="Arial"/>
+          <w:sz w:val="26"/>
+          <w:szCs w:val="26"/>
+        </w:rPr>
+        <w:t>Il</w:t>
+      </w:r>
+      <w:r>
+        <w:rPr>
+          <w:rFonts w:ascii="Arial" w:hAnsi="Arial" w:cs="Arial"/>
+          <w:sz w:val="26"/>
+          <w:szCs w:val="26"/>
+        </w:rPr>
+        <w:t xml:space="preserve"> </w:t>
+      </w:r>
+      <w:r>
+        <w:rPr>
+          <w:rFonts w:ascii="Arial" w:eastAsia="Calibri" w:hAnsi="Arial" w:cs="Arial"/>
+          <w:sz w:val="26"/>
+          <w:szCs w:val="26"/>
+        </w:rPr>
+        <w:t>sera</w:t>
+      </w:r>
+      <w:r>
+        <w:rPr>
+          <w:rFonts w:ascii="Arial" w:hAnsi="Arial" w:cs="Arial"/>
+          <w:sz w:val="26"/>
+          <w:szCs w:val="26"/>
+        </w:rPr>
+        <w:t xml:space="preserve"> </w:t>
+      </w:r>
+      <w:r>
+        <w:rPr>
+          <w:rFonts w:ascii="Arial" w:eastAsia="Calibri" w:hAnsi="Arial" w:cs="Arial"/>
+          <w:sz w:val="26"/>
+          <w:szCs w:val="26"/>
+        </w:rPr>
+        <w:t>rendu</w:t>
+      </w:r>
+      <w:r>
+        <w:rPr>
+          <w:rFonts w:ascii="Arial" w:hAnsi="Arial" w:cs="Arial"/>
+          <w:sz w:val="26"/>
+          <w:szCs w:val="26"/>
+        </w:rPr>
+        <w:t xml:space="preserve"> </w:t>
+      </w:r>
+      <w:r>
+        <w:rPr>
+          <w:rFonts w:ascii="Arial" w:eastAsia="Calibri" w:hAnsi="Arial" w:cs="Arial"/>
+          <w:sz w:val="26"/>
+          <w:szCs w:val="26"/>
+        </w:rPr>
+        <w:t>lors</w:t>
+      </w:r>
+      <w:r>
+        <w:rPr>
+          <w:rFonts w:ascii="Arial" w:hAnsi="Arial" w:cs="Arial"/>
+          <w:sz w:val="26"/>
+          <w:szCs w:val="26"/>
+        </w:rPr>
+        <w:t xml:space="preserve"> </w:t>
+      </w:r>
+      <w:r>
+        <w:rPr>
+          <w:rFonts w:ascii="Arial" w:eastAsia="Calibri" w:hAnsi="Arial" w:cs="Arial"/>
+          <w:sz w:val="26"/>
+          <w:szCs w:val="26"/>
+        </w:rPr>
+        <w:t>de</w:t>
+      </w:r>
+      <w:r>
+        <w:rPr>
+          <w:rFonts w:ascii="Arial" w:hAnsi="Arial" w:cs="Arial"/>
+          <w:sz w:val="26"/>
+          <w:szCs w:val="26"/>
+        </w:rPr>
+        <w:t xml:space="preserve"> </w:t>
+      </w:r>
+      <w:r>
+        <w:rPr>
+          <w:rFonts w:ascii="Arial" w:eastAsia="Calibri" w:hAnsi="Arial" w:cs="Arial"/>
+          <w:sz w:val="26"/>
+          <w:szCs w:val="26"/>
+        </w:rPr>
+        <w:t>la</w:t>
+      </w:r>
+      <w:r>
+        <w:rPr>
+          <w:rFonts w:ascii="Arial" w:hAnsi="Arial" w:cs="Arial"/>
+          <w:sz w:val="26"/>
+          <w:szCs w:val="26"/>
+        </w:rPr>
+        <w:t xml:space="preserve"> </w:t>
+      </w:r>
+      <w:r>
+        <w:rPr>
+          <w:rFonts w:ascii="Arial" w:eastAsia="Calibri" w:hAnsi="Arial" w:cs="Arial"/>
+          <w:sz w:val="26"/>
+          <w:szCs w:val="26"/>
+        </w:rPr>
+        <w:t>réception</w:t>
+      </w:r>
+      <w:r>
+        <w:rPr>
+          <w:rFonts w:ascii="Arial" w:hAnsi="Arial" w:cs="Arial"/>
+          <w:sz w:val="26"/>
+          <w:szCs w:val="26"/>
+        </w:rPr>
+        <w:t xml:space="preserve"> </w:t>
+      </w:r>
+      <w:r>
+        <w:rPr>
+          <w:rFonts w:ascii="Arial" w:eastAsia="Calibri" w:hAnsi="Arial" w:cs="Arial"/>
+          <w:sz w:val="26"/>
+          <w:szCs w:val="26"/>
+        </w:rPr>
+        <w:t>finale</w:t>
+      </w:r>
+      <w:r>
+        <w:rPr>
+          <w:rFonts w:ascii="Arial" w:hAnsi="Arial" w:cs="Arial"/>
+          <w:sz w:val="26"/>
+          <w:szCs w:val="26"/>
+        </w:rPr>
+        <w:t xml:space="preserve"> </w:t>
+      </w:r>
+      <w:r>
+        <w:rPr>
+          <w:rFonts w:ascii="Arial" w:eastAsia="Calibri" w:hAnsi="Arial" w:cs="Arial"/>
+          <w:sz w:val="26"/>
+          <w:szCs w:val="26"/>
+        </w:rPr>
+        <w:t>de</w:t>
+      </w:r>
+      <w:r>
+        <w:rPr>
+          <w:rFonts w:ascii="Arial" w:hAnsi="Arial" w:cs="Arial"/>
+          <w:sz w:val="26"/>
+          <w:szCs w:val="26"/>
+        </w:rPr>
+        <w:t xml:space="preserve"> </w:t>
+      </w:r>
+      <w:r>
+        <w:rPr>
+          <w:rFonts w:ascii="Arial" w:eastAsia="Calibri" w:hAnsi="Arial" w:cs="Arial"/>
+          <w:sz w:val="26"/>
+          <w:szCs w:val="26"/>
+        </w:rPr>
+        <w:t>l</w:t>
+      </w:r>
+      <w:r>
+        <w:rPr>
+          <w:rFonts w:ascii="Arial" w:hAnsi="Arial" w:cs="Arial"/>
+          <w:sz w:val="26"/>
+          <w:szCs w:val="26"/>
+        </w:rPr>
+        <w:t>’</w:t>
+      </w:r>
+      <w:r>
+        <w:rPr>
+          <w:rFonts w:ascii="Arial" w:eastAsia="Calibri" w:hAnsi="Arial" w:cs="Arial"/>
+          <w:sz w:val="26"/>
+          <w:szCs w:val="26"/>
+        </w:rPr>
+        <w:t>étude</w:t>
+      </w:r>
+      <w:r>
+        <w:rPr>
+          <w:rFonts w:ascii="Arial" w:hAnsi="Arial" w:cs="Arial"/>
+          <w:sz w:val="26"/>
+          <w:szCs w:val="26"/>
+        </w:rPr>
+        <w:t> :</w:t>
+      </w:r>
     </w:p>
     <w:p>
       <w:pPr>
         <w:rPr>
           <w:rFonts w:ascii="Arial" w:hAnsi="Arial" w:cs="Arial"/>
-          <w:color w:val="000000" w:themeColor="text1"/>
-          <w:sz w:val="26"/>
-          <w:szCs w:val="26"/>
-        </w:rPr>
-      </w:pPr>
-      <w:r>
-        <w:rPr>
-          <w:rFonts w:ascii="Arial" w:hAnsi="Arial" w:cs="Arial"/>
-          <w:color w:val="000000" w:themeColor="text1"/>
-          <w:sz w:val="26"/>
-          <w:szCs w:val="26"/>
-          <w:highlight w:val="yellow"/>
-        </w:rPr>
-        <w:t>Aucun achat de matériel n’est nécessaire à la réalisation de cette étude.</w:t>
-      </w:r>
+          <w:sz w:val="26"/>
+          <w:szCs w:val="26"/>
+        </w:rPr>
+      </w:pPr>
     </w:p>
     <w:p>
       <w:pPr>
-        <w:rPr>
-          <w:rFonts w:ascii="Arial" w:hAnsi="Arial" w:cs="Arial"/>
-        </w:rPr>
-      </w:pPr>
+        <w:spacing w:before="120" w:after="120"/>
+        <w:rPr>
+          <w:rFonts w:ascii="Arial" w:hAnsi="Arial" w:cs="Arial"/>
+          <w:color w:val="000000" w:themeColor="text1"/>
+          <w:sz w:val="26"/>
+          <w:szCs w:val="26"/>
+        </w:rPr>
+      </w:pPr>
+      <w:r>
+        <w:rPr>
+          <w:rFonts w:ascii="Arial" w:hAnsi="Arial" w:cs="Arial"/>
+          <w:color w:val="000000" w:themeColor="text1"/>
+          <w:sz w:val="26"/>
+          <w:szCs w:val="26"/>
+          <w:highlight w:val="yellow"/>
+        </w:rPr>
+        <w:lastRenderedPageBreak/>
+        <w:t>Aucun prêt de matériel n’est nécessaire à la réalisation de cette étude.</w:t>
+      </w:r>
     </w:p>
     <w:p>
       <w:pPr>
+        <w:rPr>
+          <w:rFonts w:ascii="Arial" w:hAnsi="Arial" w:cs="Arial"/>
+        </w:rPr>
+      </w:pPr>
+    </w:p>
+    <w:p>
+      <w:pPr>
+        <w:pStyle w:val="Titre3"/>
+        <w:rPr>
+          <w:rFonts w:ascii="Arial" w:hAnsi="Arial"/>
+        </w:rPr>
+      </w:pPr>
+      <w:bookmarkStart w:id="26" w:name="_Toc491964566"/>
+      <w:r>
+        <w:rPr>
+          <w:rFonts w:ascii="Arial" w:eastAsia="Calibri" w:hAnsi="Arial"/>
+        </w:rPr>
+        <w:t>Achat</w:t>
+      </w:r>
+      <w:r>
+        <w:rPr>
+          <w:rFonts w:ascii="Arial" w:hAnsi="Arial"/>
+        </w:rPr>
+        <w:t xml:space="preserve"> </w:t>
+      </w:r>
+      <w:r>
+        <w:rPr>
+          <w:rFonts w:ascii="Arial" w:eastAsia="Calibri" w:hAnsi="Arial"/>
+        </w:rPr>
+        <w:t>du</w:t>
+      </w:r>
+      <w:r>
+        <w:rPr>
+          <w:rFonts w:ascii="Arial" w:hAnsi="Arial"/>
+        </w:rPr>
+        <w:t xml:space="preserve"> </w:t>
+      </w:r>
+      <w:r>
+        <w:rPr>
+          <w:rFonts w:ascii="Arial" w:eastAsia="Calibri" w:hAnsi="Arial"/>
+        </w:rPr>
+        <w:t>matériel</w:t>
+      </w:r>
+      <w:r>
+        <w:rPr>
+          <w:rFonts w:ascii="Arial" w:hAnsi="Arial"/>
+        </w:rPr>
+        <w:t xml:space="preserve"> </w:t>
+      </w:r>
+      <w:r>
+        <w:rPr>
+          <w:rFonts w:ascii="Arial" w:eastAsia="Calibri" w:hAnsi="Arial"/>
+        </w:rPr>
+        <w:t>nécessaire</w:t>
+      </w:r>
+      <w:r>
+        <w:rPr>
+          <w:rFonts w:ascii="Arial" w:hAnsi="Arial"/>
+        </w:rPr>
+        <w:t xml:space="preserve"> </w:t>
+      </w:r>
+      <w:r>
+        <w:rPr>
+          <w:rFonts w:ascii="Arial" w:eastAsia="Calibri" w:hAnsi="Arial"/>
+        </w:rPr>
+        <w:t>pour</w:t>
+      </w:r>
+      <w:r>
+        <w:rPr>
+          <w:rFonts w:ascii="Arial" w:hAnsi="Arial"/>
+        </w:rPr>
+        <w:t xml:space="preserve"> </w:t>
+      </w:r>
+      <w:r>
+        <w:rPr>
+          <w:rFonts w:ascii="Arial" w:eastAsia="Calibri" w:hAnsi="Arial"/>
+        </w:rPr>
+        <w:t>réaliser</w:t>
+      </w:r>
+      <w:r>
+        <w:rPr>
+          <w:rFonts w:ascii="Arial" w:hAnsi="Arial"/>
+        </w:rPr>
+        <w:t xml:space="preserve"> </w:t>
+      </w:r>
+      <w:r>
+        <w:rPr>
+          <w:rFonts w:ascii="Arial" w:eastAsia="Calibri" w:hAnsi="Arial"/>
+        </w:rPr>
+        <w:t>l</w:t>
+      </w:r>
+      <w:r>
+        <w:rPr>
+          <w:rFonts w:ascii="Arial" w:hAnsi="Arial"/>
+        </w:rPr>
+        <w:t>’</w:t>
+      </w:r>
+      <w:r>
+        <w:rPr>
+          <w:rFonts w:ascii="Arial" w:eastAsia="Calibri" w:hAnsi="Arial"/>
+        </w:rPr>
+        <w:t>étude</w:t>
+      </w:r>
+      <w:bookmarkEnd w:id="26"/>
+    </w:p>
+    <w:p>
+      <w:pPr>
+        <w:rPr>
+          <w:rFonts w:ascii="Arial" w:hAnsi="Arial" w:cs="Arial"/>
+          <w:sz w:val="26"/>
+          <w:szCs w:val="26"/>
+        </w:rPr>
+      </w:pPr>
+      <w:r>
+        <w:rPr>
+          <w:rFonts w:ascii="Arial" w:eastAsia="Calibri" w:hAnsi="Arial" w:cs="Arial"/>
+          <w:sz w:val="26"/>
+          <w:szCs w:val="26"/>
+        </w:rPr>
+        <w:t>Le</w:t>
+      </w:r>
+      <w:r>
+        <w:rPr>
+          <w:rFonts w:ascii="Arial" w:hAnsi="Arial" w:cs="Arial"/>
+          <w:sz w:val="26"/>
+          <w:szCs w:val="26"/>
+        </w:rPr>
+        <w:t xml:space="preserve"> </w:t>
+      </w:r>
+      <w:r>
+        <w:rPr>
+          <w:rFonts w:ascii="Arial" w:eastAsia="Calibri" w:hAnsi="Arial" w:cs="Arial"/>
+          <w:sz w:val="26"/>
+          <w:szCs w:val="26"/>
+        </w:rPr>
+        <w:t>matériel</w:t>
+      </w:r>
+      <w:r>
+        <w:rPr>
+          <w:rFonts w:ascii="Arial" w:hAnsi="Arial" w:cs="Arial"/>
+          <w:sz w:val="26"/>
+          <w:szCs w:val="26"/>
+        </w:rPr>
+        <w:t xml:space="preserve"> </w:t>
+      </w:r>
+      <w:r>
+        <w:rPr>
+          <w:rFonts w:ascii="Arial" w:eastAsia="Calibri" w:hAnsi="Arial" w:cs="Arial"/>
+          <w:sz w:val="26"/>
+          <w:szCs w:val="26"/>
+        </w:rPr>
+        <w:t>acheté</w:t>
+      </w:r>
+      <w:r>
+        <w:rPr>
+          <w:rFonts w:ascii="Arial" w:hAnsi="Arial" w:cs="Arial"/>
+          <w:sz w:val="26"/>
+          <w:szCs w:val="26"/>
+        </w:rPr>
+        <w:t xml:space="preserve"> </w:t>
+      </w:r>
+      <w:r>
+        <w:rPr>
+          <w:rFonts w:ascii="Arial" w:eastAsia="Calibri" w:hAnsi="Arial" w:cs="Arial"/>
+          <w:sz w:val="26"/>
+          <w:szCs w:val="26"/>
+        </w:rPr>
+        <w:t>pour</w:t>
+      </w:r>
+      <w:r>
+        <w:rPr>
+          <w:rFonts w:ascii="Arial" w:hAnsi="Arial" w:cs="Arial"/>
+          <w:sz w:val="26"/>
+          <w:szCs w:val="26"/>
+        </w:rPr>
+        <w:t xml:space="preserve"> </w:t>
+      </w:r>
+      <w:r>
+        <w:rPr>
+          <w:rFonts w:ascii="Arial" w:eastAsia="Calibri" w:hAnsi="Arial" w:cs="Arial"/>
+          <w:sz w:val="26"/>
+          <w:szCs w:val="26"/>
+        </w:rPr>
+        <w:t>réaliser</w:t>
+      </w:r>
+      <w:r>
+        <w:rPr>
+          <w:rFonts w:ascii="Arial" w:hAnsi="Arial" w:cs="Arial"/>
+          <w:sz w:val="26"/>
+          <w:szCs w:val="26"/>
+        </w:rPr>
+        <w:t xml:space="preserve"> </w:t>
+      </w:r>
+      <w:r>
+        <w:rPr>
+          <w:rFonts w:ascii="Arial" w:eastAsia="Calibri" w:hAnsi="Arial" w:cs="Arial"/>
+          <w:sz w:val="26"/>
+          <w:szCs w:val="26"/>
+        </w:rPr>
+        <w:t>l</w:t>
+      </w:r>
+      <w:r>
+        <w:rPr>
+          <w:rFonts w:ascii="Arial" w:hAnsi="Arial" w:cs="Arial"/>
+          <w:sz w:val="26"/>
+          <w:szCs w:val="26"/>
+        </w:rPr>
+        <w:t>’</w:t>
+      </w:r>
+      <w:r>
+        <w:rPr>
+          <w:rFonts w:ascii="Arial" w:eastAsia="Calibri" w:hAnsi="Arial" w:cs="Arial"/>
+          <w:sz w:val="26"/>
+          <w:szCs w:val="26"/>
+        </w:rPr>
+        <w:t>étude</w:t>
+      </w:r>
+      <w:r>
+        <w:rPr>
+          <w:rFonts w:ascii="Arial" w:hAnsi="Arial" w:cs="Arial"/>
+          <w:sz w:val="26"/>
+          <w:szCs w:val="26"/>
+        </w:rPr>
+        <w:t xml:space="preserve"> </w:t>
+      </w:r>
+      <w:r>
+        <w:rPr>
+          <w:rFonts w:ascii="Arial" w:eastAsia="Calibri" w:hAnsi="Arial" w:cs="Arial"/>
+          <w:sz w:val="26"/>
+          <w:szCs w:val="26"/>
+        </w:rPr>
+        <w:t>sera</w:t>
+      </w:r>
+      <w:r>
+        <w:rPr>
+          <w:rFonts w:ascii="Arial" w:hAnsi="Arial" w:cs="Arial"/>
+          <w:sz w:val="26"/>
+          <w:szCs w:val="26"/>
+        </w:rPr>
+        <w:t xml:space="preserve"> </w:t>
+      </w:r>
+      <w:r>
+        <w:rPr>
+          <w:rFonts w:ascii="Arial" w:eastAsia="Calibri" w:hAnsi="Arial" w:cs="Arial"/>
+          <w:sz w:val="26"/>
+          <w:szCs w:val="26"/>
+        </w:rPr>
+        <w:t>facturé</w:t>
+      </w:r>
+      <w:r>
+        <w:rPr>
+          <w:rFonts w:ascii="Arial" w:hAnsi="Arial" w:cs="Arial"/>
+          <w:sz w:val="26"/>
+          <w:szCs w:val="26"/>
+        </w:rPr>
+        <w:t xml:space="preserve"> </w:t>
+      </w:r>
+      <w:r>
+        <w:rPr>
+          <w:rFonts w:ascii="Arial" w:eastAsia="Calibri" w:hAnsi="Arial" w:cs="Arial"/>
+          <w:sz w:val="26"/>
+          <w:szCs w:val="26"/>
+        </w:rPr>
+        <w:t>à</w:t>
+      </w:r>
+      <w:r>
+        <w:rPr>
+          <w:rFonts w:ascii="Arial" w:hAnsi="Arial" w:cs="Arial"/>
+          <w:sz w:val="26"/>
+          <w:szCs w:val="26"/>
+        </w:rPr>
+        <w:t xml:space="preserve"> </w:t>
+      </w:r>
+      <w:r>
+        <w:rPr>
+          <w:rFonts w:ascii="Arial" w:eastAsia="Calibri" w:hAnsi="Arial" w:cs="Arial"/>
+          <w:sz w:val="26"/>
+          <w:szCs w:val="26"/>
+        </w:rPr>
+        <w:t>postériori</w:t>
+      </w:r>
+      <w:r>
+        <w:rPr>
+          <w:rFonts w:ascii="Arial" w:hAnsi="Arial" w:cs="Arial"/>
+          <w:sz w:val="26"/>
+          <w:szCs w:val="26"/>
+        </w:rPr>
+        <w:t xml:space="preserve">. </w:t>
+      </w:r>
+      <w:r>
+        <w:rPr>
+          <w:rFonts w:ascii="Arial" w:eastAsia="Calibri" w:hAnsi="Arial" w:cs="Arial"/>
+          <w:sz w:val="26"/>
+          <w:szCs w:val="26"/>
+        </w:rPr>
+        <w:t>Tout</w:t>
+      </w:r>
+      <w:r>
+        <w:rPr>
+          <w:rFonts w:ascii="Arial" w:hAnsi="Arial" w:cs="Arial"/>
+          <w:sz w:val="26"/>
+          <w:szCs w:val="26"/>
+        </w:rPr>
+        <w:t xml:space="preserve"> </w:t>
+      </w:r>
+      <w:r>
+        <w:rPr>
+          <w:rFonts w:ascii="Arial" w:eastAsia="Calibri" w:hAnsi="Arial" w:cs="Arial"/>
+          <w:sz w:val="26"/>
+          <w:szCs w:val="26"/>
+        </w:rPr>
+        <w:t>achat</w:t>
+      </w:r>
+      <w:r>
+        <w:rPr>
+          <w:rFonts w:ascii="Arial" w:hAnsi="Arial" w:cs="Arial"/>
+          <w:sz w:val="26"/>
+          <w:szCs w:val="26"/>
+        </w:rPr>
+        <w:t xml:space="preserve"> </w:t>
+      </w:r>
+      <w:r>
+        <w:rPr>
+          <w:rFonts w:ascii="Arial" w:eastAsia="Calibri" w:hAnsi="Arial" w:cs="Arial"/>
+          <w:sz w:val="26"/>
+          <w:szCs w:val="26"/>
+        </w:rPr>
+        <w:t>sera</w:t>
+      </w:r>
+      <w:r>
+        <w:rPr>
+          <w:rFonts w:ascii="Arial" w:hAnsi="Arial" w:cs="Arial"/>
+          <w:sz w:val="26"/>
+          <w:szCs w:val="26"/>
+        </w:rPr>
+        <w:t xml:space="preserve"> </w:t>
+      </w:r>
+      <w:r>
+        <w:rPr>
+          <w:rFonts w:ascii="Arial" w:eastAsia="Calibri" w:hAnsi="Arial" w:cs="Arial"/>
+          <w:sz w:val="26"/>
+          <w:szCs w:val="26"/>
+        </w:rPr>
+        <w:t>de</w:t>
+      </w:r>
+      <w:r>
+        <w:rPr>
+          <w:rFonts w:ascii="Arial" w:hAnsi="Arial" w:cs="Arial"/>
+          <w:sz w:val="26"/>
+          <w:szCs w:val="26"/>
+        </w:rPr>
+        <w:t xml:space="preserve"> </w:t>
+      </w:r>
+      <w:r>
+        <w:rPr>
+          <w:rFonts w:ascii="Arial" w:eastAsia="Calibri" w:hAnsi="Arial" w:cs="Arial"/>
+          <w:sz w:val="26"/>
+          <w:szCs w:val="26"/>
+        </w:rPr>
+        <w:t>ce</w:t>
+      </w:r>
+      <w:r>
+        <w:rPr>
+          <w:rFonts w:ascii="Arial" w:hAnsi="Arial" w:cs="Arial"/>
+          <w:sz w:val="26"/>
+          <w:szCs w:val="26"/>
+        </w:rPr>
+        <w:t xml:space="preserve"> </w:t>
+      </w:r>
+      <w:r>
+        <w:rPr>
+          <w:rFonts w:ascii="Arial" w:eastAsia="Calibri" w:hAnsi="Arial" w:cs="Arial"/>
+          <w:sz w:val="26"/>
+          <w:szCs w:val="26"/>
+        </w:rPr>
+        <w:t>fait</w:t>
+      </w:r>
+      <w:r>
+        <w:rPr>
+          <w:rFonts w:ascii="Arial" w:hAnsi="Arial" w:cs="Arial"/>
+          <w:sz w:val="26"/>
+          <w:szCs w:val="26"/>
+        </w:rPr>
+        <w:t xml:space="preserve"> </w:t>
+      </w:r>
+      <w:r>
+        <w:rPr>
+          <w:rFonts w:ascii="Arial" w:eastAsia="Calibri" w:hAnsi="Arial" w:cs="Arial"/>
+          <w:sz w:val="26"/>
+          <w:szCs w:val="26"/>
+        </w:rPr>
+        <w:t>soumis</w:t>
+      </w:r>
+      <w:r>
+        <w:rPr>
+          <w:rFonts w:ascii="Arial" w:hAnsi="Arial" w:cs="Arial"/>
+          <w:sz w:val="26"/>
+          <w:szCs w:val="26"/>
+        </w:rPr>
+        <w:t xml:space="preserve"> </w:t>
+      </w:r>
+      <w:r>
+        <w:rPr>
+          <w:rFonts w:ascii="Arial" w:eastAsia="Calibri" w:hAnsi="Arial" w:cs="Arial"/>
+          <w:sz w:val="26"/>
+          <w:szCs w:val="26"/>
+        </w:rPr>
+        <w:t>à</w:t>
+      </w:r>
+      <w:r>
+        <w:rPr>
+          <w:rFonts w:ascii="Arial" w:hAnsi="Arial" w:cs="Arial"/>
+          <w:sz w:val="26"/>
+          <w:szCs w:val="26"/>
+        </w:rPr>
+        <w:t xml:space="preserve"> </w:t>
+      </w:r>
+      <w:r>
+        <w:rPr>
+          <w:rFonts w:ascii="Arial" w:eastAsia="Calibri" w:hAnsi="Arial" w:cs="Arial"/>
+          <w:sz w:val="26"/>
+          <w:szCs w:val="26"/>
+        </w:rPr>
+        <w:t>l</w:t>
+      </w:r>
+      <w:r>
+        <w:rPr>
+          <w:rFonts w:ascii="Arial" w:hAnsi="Arial" w:cs="Arial"/>
+          <w:sz w:val="26"/>
+          <w:szCs w:val="26"/>
+        </w:rPr>
+        <w:t>’</w:t>
+      </w:r>
+      <w:r>
+        <w:rPr>
+          <w:rFonts w:ascii="Arial" w:eastAsia="Calibri" w:hAnsi="Arial" w:cs="Arial"/>
+          <w:sz w:val="26"/>
+          <w:szCs w:val="26"/>
+        </w:rPr>
+        <w:t>approbation</w:t>
+      </w:r>
+      <w:r>
+        <w:rPr>
+          <w:rFonts w:ascii="Arial" w:hAnsi="Arial" w:cs="Arial"/>
+          <w:sz w:val="26"/>
+          <w:szCs w:val="26"/>
+        </w:rPr>
+        <w:t xml:space="preserve"> </w:t>
+      </w:r>
+      <w:r>
+        <w:rPr>
+          <w:rFonts w:ascii="Arial" w:eastAsia="Calibri" w:hAnsi="Arial" w:cs="Arial"/>
+          <w:sz w:val="26"/>
+          <w:szCs w:val="26"/>
+        </w:rPr>
+        <w:t>du</w:t>
+      </w:r>
+      <w:r>
+        <w:rPr>
+          <w:rFonts w:ascii="Arial" w:hAnsi="Arial" w:cs="Arial"/>
+          <w:sz w:val="26"/>
+          <w:szCs w:val="26"/>
+        </w:rPr>
+        <w:t xml:space="preserve"> </w:t>
+      </w:r>
+      <w:r>
+        <w:rPr>
+          <w:rFonts w:ascii="Arial" w:eastAsia="Calibri" w:hAnsi="Arial" w:cs="Arial"/>
+          <w:sz w:val="26"/>
+          <w:szCs w:val="26"/>
+        </w:rPr>
+        <w:t>client</w:t>
+      </w:r>
+      <w:r>
+        <w:rPr>
+          <w:rFonts w:ascii="Arial" w:hAnsi="Arial" w:cs="Arial"/>
+          <w:sz w:val="26"/>
+          <w:szCs w:val="26"/>
+        </w:rPr>
+        <w:t>.</w:t>
+      </w:r>
+    </w:p>
+    <w:p>
+      <w:pPr>
+        <w:rPr>
+          <w:rFonts w:ascii="Arial" w:hAnsi="Arial" w:cs="Arial"/>
+          <w:sz w:val="26"/>
+          <w:szCs w:val="26"/>
+        </w:rPr>
+      </w:pPr>
+    </w:p>
+    <w:p>
+      <w:pPr>
+        <w:rPr>
+          <w:rFonts w:ascii="Arial" w:hAnsi="Arial" w:cs="Arial"/>
+          <w:color w:val="000000" w:themeColor="text1"/>
+          <w:sz w:val="26"/>
+          <w:szCs w:val="26"/>
+        </w:rPr>
+      </w:pPr>
+      <w:r>
+        <w:rPr>
+          <w:rFonts w:ascii="Arial" w:hAnsi="Arial" w:cs="Arial"/>
+          <w:color w:val="000000" w:themeColor="text1"/>
+          <w:sz w:val="26"/>
+          <w:szCs w:val="26"/>
+          <w:highlight w:val="yellow"/>
+        </w:rPr>
+        <w:t>Aucun achat de matériel n’est nécessaire à la réalisation de cette étude.</w:t>
+      </w:r>
+    </w:p>
+    <w:p>
+      <w:pPr>
+        <w:rPr>
+          <w:rFonts w:ascii="Arial" w:hAnsi="Arial" w:cs="Arial"/>
+        </w:rPr>
+      </w:pPr>
+    </w:p>
+    <w:p>
+      <w:pPr>
         <w:pStyle w:val="Titre2"/>
         <w:rPr>
           <w:rFonts w:ascii="Arial" w:hAnsi="Arial"/>
         </w:rPr>
       </w:pPr>
-      <w:bookmarkStart w:id="25" w:name="_Toc89784129"/>
-      <w:bookmarkStart w:id="26" w:name="_Toc90975046"/>
+      <w:bookmarkStart w:id="27" w:name="_Toc89784129"/>
+      <w:bookmarkStart w:id="28" w:name="_Toc90975046"/>
       <w:r>
         <w:rPr>
           <w:rFonts w:ascii="Arial" w:hAnsi="Arial"/>
         </w:rPr>
         <w:t xml:space="preserve"> </w:t>
       </w:r>
-      <w:bookmarkStart w:id="27" w:name="_Toc491964567"/>
+      <w:bookmarkStart w:id="29" w:name="_Toc491964567"/>
       <w:r>
         <w:rPr>
           <w:rFonts w:ascii="Arial" w:eastAsia="Calibri" w:hAnsi="Arial"/>
@@ -9850,9 +10114,9 @@
         </w:rPr>
         <w:t>logicielles</w:t>
       </w:r>
-      <w:bookmarkEnd w:id="25"/>
-      <w:bookmarkEnd w:id="26"/>
       <w:bookmarkEnd w:id="27"/>
+      <w:bookmarkEnd w:id="28"/>
+      <w:bookmarkEnd w:id="29"/>
     </w:p>
     <w:p>
       <w:pPr>
@@ -10206,7 +10470,7 @@
           <w:rFonts w:ascii="Arial" w:hAnsi="Arial"/>
         </w:rPr>
       </w:pPr>
-      <w:bookmarkStart w:id="28" w:name="_Toc491964568"/>
+      <w:bookmarkStart w:id="30" w:name="_Toc491964568"/>
       <w:r>
         <w:rPr>
           <w:rFonts w:ascii="Arial" w:eastAsia="Calibri" w:hAnsi="Arial"/>
@@ -10247,7 +10511,7 @@
         </w:rPr>
         <w:t>annexes</w:t>
       </w:r>
-      <w:bookmarkEnd w:id="28"/>
+      <w:bookmarkEnd w:id="30"/>
     </w:p>
     <w:p>
       <w:pPr>
@@ -10809,18 +11073,18 @@
           <w:rFonts w:ascii="Arial" w:hAnsi="Arial" w:cs="Arial"/>
         </w:rPr>
       </w:pPr>
-      <w:bookmarkStart w:id="29" w:name="_Toc89784130"/>
-      <w:bookmarkStart w:id="30" w:name="_Toc491964569"/>
-      <w:bookmarkStart w:id="31" w:name="_Toc90975047"/>
+      <w:bookmarkStart w:id="31" w:name="_Toc89784130"/>
+      <w:bookmarkStart w:id="32" w:name="_Toc491964569"/>
+      <w:bookmarkStart w:id="33" w:name="_Toc90975047"/>
       <w:r>
         <w:rPr>
           <w:rFonts w:ascii="Arial" w:eastAsia="Calibri" w:hAnsi="Arial" w:cs="Arial"/>
         </w:rPr>
         <w:t>Echéancier</w:t>
       </w:r>
-      <w:bookmarkEnd w:id="29"/>
-      <w:bookmarkEnd w:id="30"/>
       <w:bookmarkEnd w:id="31"/>
+      <w:bookmarkEnd w:id="32"/>
+      <w:bookmarkEnd w:id="33"/>
     </w:p>
     <w:p>
       <w:pPr>
@@ -10839,61 +11103,37 @@
           <w:sz w:val="26"/>
           <w:szCs w:val="26"/>
         </w:rPr>
-        <w:t xml:space="preserve">L’étude sera lancée le </w:t>
-      </w:r>
+        <w:t xml:space="preserve">L’étude sera lancée </w:t>
+      </w:r>
+      <w:proofErr w:type="gramStart"/>
       <w:r>
         <w:rPr>
           <w:rFonts w:ascii="Arial" w:hAnsi="Arial" w:cs="Arial"/>
           <w:color w:val="000000" w:themeColor="text1"/>
           <w:sz w:val="26"/>
           <w:szCs w:val="26"/>
+        </w:rPr>
+        <w:t>le</w:t>
+      </w:r>
+      <w:proofErr w:type="gramEnd"/>
+      <w:r>
+        <w:rPr>
+          <w:rFonts w:ascii="Arial" w:hAnsi="Arial" w:cs="Arial"/>
+          <w:color w:val="000000" w:themeColor="text1"/>
+          <w:sz w:val="26"/>
+          <w:szCs w:val="26"/>
+        </w:rPr>
+        <w:t xml:space="preserve"> </w:t>
+      </w:r>
+      <w:r>
+        <w:rPr>
+          <w:rFonts w:ascii="Arial" w:hAnsi="Arial" w:cs="Arial"/>
+          <w:color w:val="000000" w:themeColor="text1"/>
+          <w:sz w:val="26"/>
+          <w:szCs w:val="26"/>
           <w:highlight w:val="yellow"/>
         </w:rPr>
-        <w:t>{</w:t>
-      </w:r>
-      <w:proofErr w:type="gramStart"/>
-      <w:r>
-        <w:rPr>
-          <w:rFonts w:ascii="Arial" w:hAnsi="Arial" w:cs="Arial"/>
-          <w:color w:val="000000" w:themeColor="text1"/>
-          <w:sz w:val="26"/>
-          <w:szCs w:val="26"/>
-          <w:highlight w:val="yellow"/>
-        </w:rPr>
-        <w:t xml:space="preserve">{ </w:t>
-      </w:r>
-      <w:proofErr w:type="spellStart"/>
-      <w:r>
-        <w:rPr>
-          <w:rFonts w:ascii="Arial" w:hAnsi="Arial" w:cs="Arial"/>
-          <w:color w:val="000000" w:themeColor="text1"/>
-          <w:sz w:val="26"/>
-          <w:szCs w:val="26"/>
-          <w:highlight w:val="yellow"/>
-        </w:rPr>
-        <w:t>etude.dateLancement</w:t>
-      </w:r>
-      <w:proofErr w:type="spellEnd"/>
-      <w:proofErr w:type="gramEnd"/>
-      <w:r>
-        <w:rPr>
-          <w:rFonts w:ascii="Arial" w:hAnsi="Arial" w:cs="Arial"/>
-          <w:color w:val="000000" w:themeColor="text1"/>
-          <w:sz w:val="26"/>
-          <w:szCs w:val="26"/>
-          <w:highlight w:val="yellow"/>
-        </w:rPr>
-        <w:t xml:space="preserve"> </w:t>
-      </w:r>
-      <w:r>
-        <w:rPr>
-          <w:rFonts w:ascii="Arial" w:hAnsi="Arial" w:cs="Arial"/>
-          <w:color w:val="000000" w:themeColor="text1"/>
-          <w:sz w:val="26"/>
-          <w:szCs w:val="26"/>
-          <w:highlight w:val="yellow"/>
-        </w:rPr>
-        <w:t>}}</w:t>
+        <w:t>date de lancement</w:t>
       </w:r>
       <w:r>
         <w:rPr>
@@ -10903,8 +11143,9 @@
           <w:sz w:val="26"/>
           <w:szCs w:val="26"/>
         </w:rPr>
-        <w:t xml:space="preserve"> sous réserve de l’acceptation de la présente convention étude par le client. L’étude devra être terminée au plus tard le </w:t>
-      </w:r>
+        <w:t xml:space="preserve"> sous réserve de l’acceptation de la présente convention étude par le client. L’étude devra être terminée au plus tard </w:t>
+      </w:r>
+      <w:proofErr w:type="gramStart"/>
       <w:r>
         <w:rPr>
           <w:rFonts w:ascii="Arial" w:hAnsi="Arial" w:cs="Arial"/>
@@ -10912,11 +11153,10 @@
           <w:color w:val="000000" w:themeColor="text1"/>
           <w:sz w:val="26"/>
           <w:szCs w:val="26"/>
-          <w:highlight w:val="yellow"/>
-        </w:rPr>
-        <w:t>{</w:t>
-      </w:r>
-      <w:proofErr w:type="gramStart"/>
+        </w:rPr>
+        <w:t>le</w:t>
+      </w:r>
+      <w:proofErr w:type="gramEnd"/>
       <w:r>
         <w:rPr>
           <w:rFonts w:ascii="Arial" w:hAnsi="Arial" w:cs="Arial"/>
@@ -10924,11 +11164,9 @@
           <w:color w:val="000000" w:themeColor="text1"/>
           <w:sz w:val="26"/>
           <w:szCs w:val="26"/>
-          <w:highlight w:val="yellow"/>
-        </w:rPr>
-        <w:t xml:space="preserve">{ </w:t>
-      </w:r>
-      <w:proofErr w:type="spellStart"/>
+        </w:rPr>
+        <w:t xml:space="preserve"> </w:t>
+      </w:r>
       <w:r>
         <w:rPr>
           <w:rFonts w:ascii="Arial" w:hAnsi="Arial" w:cs="Arial"/>
@@ -10938,10 +11176,8 @@
           <w:szCs w:val="26"/>
           <w:highlight w:val="yellow"/>
         </w:rPr>
-        <w:t>etude.dateFin</w:t>
-      </w:r>
-      <w:proofErr w:type="spellEnd"/>
-      <w:proofErr w:type="gramEnd"/>
+        <w:t>date de fin</w:t>
+      </w:r>
       <w:r>
         <w:rPr>
           <w:rFonts w:ascii="Arial" w:hAnsi="Arial" w:cs="Arial"/>
@@ -10951,7 +11187,7 @@
           <w:szCs w:val="26"/>
           <w:highlight w:val="yellow"/>
         </w:rPr>
-        <w:t xml:space="preserve"> }}.</w:t>
+        <w:t>.</w:t>
       </w:r>
     </w:p>
     <w:p>
@@ -11030,8 +11266,6 @@
           <w:szCs w:val="26"/>
         </w:rPr>
       </w:pPr>
-      <w:bookmarkStart w:id="32" w:name="_GoBack"/>
-      <w:bookmarkEnd w:id="32"/>
     </w:p>
     <w:p>
       <w:pPr>
@@ -11047,6 +11281,7 @@
           <w:sz w:val="26"/>
           <w:szCs w:val="26"/>
         </w:rPr>
+        <w:lastRenderedPageBreak/>
         <w:t>Conformément</w:t>
       </w:r>
       <w:r>
@@ -11643,166 +11878,165 @@
           <w:rFonts w:ascii="Arial" w:hAnsi="Arial" w:cs="Arial"/>
         </w:rPr>
       </w:pPr>
-      <w:bookmarkStart w:id="33" w:name="_Toc491964570"/>
-      <w:r>
-        <w:rPr>
-          <w:rFonts w:ascii="Arial" w:eastAsia="Calibri" w:hAnsi="Arial" w:cs="Arial"/>
-        </w:rPr>
-        <w:lastRenderedPageBreak/>
+      <w:bookmarkStart w:id="34" w:name="_Toc491964570"/>
+      <w:r>
+        <w:rPr>
+          <w:rFonts w:ascii="Arial" w:eastAsia="Calibri" w:hAnsi="Arial" w:cs="Arial"/>
+        </w:rPr>
         <w:t>Conclusion</w:t>
-      </w:r>
-      <w:bookmarkEnd w:id="33"/>
-    </w:p>
-    <w:p>
-      <w:pPr>
-        <w:ind w:firstLine="0"/>
-        <w:rPr>
-          <w:rFonts w:ascii="Arial" w:hAnsi="Arial" w:cs="Arial"/>
-          <w:i/>
-          <w:sz w:val="26"/>
-          <w:szCs w:val="26"/>
-          <w:highlight w:val="yellow"/>
-        </w:rPr>
-      </w:pPr>
-      <w:bookmarkStart w:id="34" w:name="_Toc491964571"/>
-      <w:r>
-        <w:rPr>
-          <w:rFonts w:ascii="Arial" w:hAnsi="Arial" w:cs="Arial"/>
-          <w:i/>
-          <w:sz w:val="26"/>
-          <w:szCs w:val="26"/>
-          <w:highlight w:val="yellow"/>
-        </w:rPr>
-        <w:t xml:space="preserve">[[Résumé du projet, détail du livrable : </w:t>
-      </w:r>
-    </w:p>
-    <w:p>
-      <w:pPr>
-        <w:rPr>
-          <w:rFonts w:ascii="Arial" w:hAnsi="Arial" w:cs="Arial"/>
-          <w:i/>
-          <w:sz w:val="26"/>
-          <w:szCs w:val="26"/>
-          <w:highlight w:val="yellow"/>
-        </w:rPr>
-      </w:pPr>
-      <w:r>
-        <w:rPr>
-          <w:rFonts w:ascii="Arial" w:hAnsi="Arial" w:cs="Arial"/>
-          <w:i/>
-          <w:sz w:val="26"/>
-          <w:szCs w:val="26"/>
-          <w:highlight w:val="yellow"/>
-        </w:rPr>
-        <w:t>- sa nature</w:t>
-      </w:r>
-    </w:p>
-    <w:p>
-      <w:pPr>
-        <w:rPr>
-          <w:rFonts w:ascii="Arial" w:hAnsi="Arial" w:cs="Arial"/>
-          <w:i/>
-          <w:sz w:val="26"/>
-          <w:szCs w:val="26"/>
-          <w:highlight w:val="yellow"/>
-        </w:rPr>
-      </w:pPr>
-      <w:r>
-        <w:rPr>
-          <w:rFonts w:ascii="Arial" w:hAnsi="Arial" w:cs="Arial"/>
-          <w:i/>
-          <w:sz w:val="26"/>
-          <w:szCs w:val="26"/>
-          <w:highlight w:val="yellow"/>
-        </w:rPr>
-        <w:t>- le nombre de livrable</w:t>
-      </w:r>
-    </w:p>
-    <w:p>
-      <w:pPr>
-        <w:rPr>
-          <w:rFonts w:ascii="Arial" w:hAnsi="Arial" w:cs="Arial"/>
-          <w:i/>
-          <w:sz w:val="26"/>
-          <w:szCs w:val="26"/>
-          <w:highlight w:val="yellow"/>
-        </w:rPr>
-      </w:pPr>
-      <w:r>
-        <w:rPr>
-          <w:rFonts w:ascii="Arial" w:hAnsi="Arial" w:cs="Arial"/>
-          <w:i/>
-          <w:sz w:val="26"/>
-          <w:szCs w:val="26"/>
-          <w:highlight w:val="yellow"/>
-        </w:rPr>
-        <w:t xml:space="preserve">- la forme (fichier zip, lien, objet …) </w:t>
-      </w:r>
-    </w:p>
-    <w:p>
-      <w:pPr>
-        <w:rPr>
-          <w:rFonts w:ascii="Arial" w:hAnsi="Arial" w:cs="Arial"/>
-          <w:i/>
-          <w:sz w:val="26"/>
-          <w:szCs w:val="26"/>
-          <w:highlight w:val="yellow"/>
-        </w:rPr>
-      </w:pPr>
-      <w:r>
-        <w:rPr>
-          <w:rFonts w:ascii="Arial" w:hAnsi="Arial" w:cs="Arial"/>
-          <w:i/>
-          <w:sz w:val="26"/>
-          <w:szCs w:val="26"/>
-          <w:highlight w:val="yellow"/>
-        </w:rPr>
-        <w:t>- la transmission au client (par mail, en main propre …)</w:t>
-      </w:r>
-    </w:p>
-    <w:p>
-      <w:pPr>
-        <w:rPr>
-          <w:rFonts w:ascii="Arial" w:hAnsi="Arial" w:cs="Arial"/>
-          <w:i/>
-          <w:sz w:val="26"/>
-          <w:szCs w:val="26"/>
-        </w:rPr>
-      </w:pPr>
-      <w:r>
-        <w:rPr>
-          <w:rFonts w:ascii="Arial" w:hAnsi="Arial" w:cs="Arial"/>
-          <w:i/>
-          <w:sz w:val="26"/>
-          <w:szCs w:val="26"/>
-          <w:highlight w:val="yellow"/>
-        </w:rPr>
-        <w:t>- existence ou non d’un guide administrateur, manuel d’utilisateur …]]</w:t>
-      </w:r>
-    </w:p>
-    <w:p>
-      <w:pPr>
-        <w:pStyle w:val="Titre1"/>
-        <w:rPr>
-          <w:rFonts w:ascii="Arial" w:hAnsi="Arial" w:cs="Arial"/>
-        </w:rPr>
-      </w:pPr>
-      <w:r>
-        <w:rPr>
-          <w:rFonts w:ascii="Arial" w:hAnsi="Arial" w:cs="Arial"/>
-        </w:rPr>
-        <w:t xml:space="preserve"> </w:t>
-      </w:r>
-      <w:r>
-        <w:rPr>
-          <w:rFonts w:ascii="Arial" w:eastAsia="Calibri" w:hAnsi="Arial" w:cs="Arial"/>
-        </w:rPr>
-        <w:t>Glossaire</w:t>
       </w:r>
       <w:bookmarkEnd w:id="34"/>
     </w:p>
     <w:p>
       <w:pPr>
+        <w:ind w:firstLine="0"/>
+        <w:rPr>
+          <w:rFonts w:ascii="Arial" w:hAnsi="Arial" w:cs="Arial"/>
+          <w:i/>
+          <w:sz w:val="26"/>
+          <w:szCs w:val="26"/>
+          <w:highlight w:val="yellow"/>
+        </w:rPr>
+      </w:pPr>
+      <w:bookmarkStart w:id="35" w:name="_Toc491964571"/>
+      <w:r>
+        <w:rPr>
+          <w:rFonts w:ascii="Arial" w:hAnsi="Arial" w:cs="Arial"/>
+          <w:i/>
+          <w:sz w:val="26"/>
+          <w:szCs w:val="26"/>
+          <w:highlight w:val="yellow"/>
+        </w:rPr>
+        <w:t xml:space="preserve">[[Résumé du projet, détail du livrable : </w:t>
+      </w:r>
+    </w:p>
+    <w:p>
+      <w:pPr>
+        <w:rPr>
+          <w:rFonts w:ascii="Arial" w:hAnsi="Arial" w:cs="Arial"/>
+          <w:i/>
+          <w:sz w:val="26"/>
+          <w:szCs w:val="26"/>
+          <w:highlight w:val="yellow"/>
+        </w:rPr>
+      </w:pPr>
+      <w:r>
+        <w:rPr>
+          <w:rFonts w:ascii="Arial" w:hAnsi="Arial" w:cs="Arial"/>
+          <w:i/>
+          <w:sz w:val="26"/>
+          <w:szCs w:val="26"/>
+          <w:highlight w:val="yellow"/>
+        </w:rPr>
+        <w:t>- sa nature</w:t>
+      </w:r>
+    </w:p>
+    <w:p>
+      <w:pPr>
+        <w:rPr>
+          <w:rFonts w:ascii="Arial" w:hAnsi="Arial" w:cs="Arial"/>
+          <w:i/>
+          <w:sz w:val="26"/>
+          <w:szCs w:val="26"/>
+          <w:highlight w:val="yellow"/>
+        </w:rPr>
+      </w:pPr>
+      <w:r>
+        <w:rPr>
+          <w:rFonts w:ascii="Arial" w:hAnsi="Arial" w:cs="Arial"/>
+          <w:i/>
+          <w:sz w:val="26"/>
+          <w:szCs w:val="26"/>
+          <w:highlight w:val="yellow"/>
+        </w:rPr>
+        <w:t>- le nombre de livrable</w:t>
+      </w:r>
+    </w:p>
+    <w:p>
+      <w:pPr>
+        <w:rPr>
+          <w:rFonts w:ascii="Arial" w:hAnsi="Arial" w:cs="Arial"/>
+          <w:i/>
+          <w:sz w:val="26"/>
+          <w:szCs w:val="26"/>
+          <w:highlight w:val="yellow"/>
+        </w:rPr>
+      </w:pPr>
+      <w:r>
+        <w:rPr>
+          <w:rFonts w:ascii="Arial" w:hAnsi="Arial" w:cs="Arial"/>
+          <w:i/>
+          <w:sz w:val="26"/>
+          <w:szCs w:val="26"/>
+          <w:highlight w:val="yellow"/>
+        </w:rPr>
+        <w:t xml:space="preserve">- la forme (fichier zip, lien, objet …) </w:t>
+      </w:r>
+    </w:p>
+    <w:p>
+      <w:pPr>
+        <w:rPr>
+          <w:rFonts w:ascii="Arial" w:hAnsi="Arial" w:cs="Arial"/>
+          <w:i/>
+          <w:sz w:val="26"/>
+          <w:szCs w:val="26"/>
+          <w:highlight w:val="yellow"/>
+        </w:rPr>
+      </w:pPr>
+      <w:r>
+        <w:rPr>
+          <w:rFonts w:ascii="Arial" w:hAnsi="Arial" w:cs="Arial"/>
+          <w:i/>
+          <w:sz w:val="26"/>
+          <w:szCs w:val="26"/>
+          <w:highlight w:val="yellow"/>
+        </w:rPr>
+        <w:t>- la transmission au client (par mail, en main propre …)</w:t>
+      </w:r>
+    </w:p>
+    <w:p>
+      <w:pPr>
+        <w:rPr>
+          <w:rFonts w:ascii="Arial" w:hAnsi="Arial" w:cs="Arial"/>
+          <w:i/>
+          <w:sz w:val="26"/>
+          <w:szCs w:val="26"/>
+        </w:rPr>
+      </w:pPr>
+      <w:r>
+        <w:rPr>
+          <w:rFonts w:ascii="Arial" w:hAnsi="Arial" w:cs="Arial"/>
+          <w:i/>
+          <w:sz w:val="26"/>
+          <w:szCs w:val="26"/>
+          <w:highlight w:val="yellow"/>
+        </w:rPr>
+        <w:t>- existence ou non d’un guide administrateur, manuel d’utilisateur …]]</w:t>
+      </w:r>
+    </w:p>
+    <w:p>
+      <w:pPr>
+        <w:pStyle w:val="Titre1"/>
+        <w:rPr>
+          <w:rFonts w:ascii="Arial" w:hAnsi="Arial" w:cs="Arial"/>
+        </w:rPr>
+      </w:pPr>
+      <w:r>
+        <w:rPr>
+          <w:rFonts w:ascii="Arial" w:hAnsi="Arial" w:cs="Arial"/>
+        </w:rPr>
+        <w:t xml:space="preserve"> </w:t>
+      </w:r>
+      <w:r>
+        <w:rPr>
+          <w:rFonts w:ascii="Arial" w:eastAsia="Calibri" w:hAnsi="Arial" w:cs="Arial"/>
+        </w:rPr>
+        <w:t>Glossaire</w:t>
+      </w:r>
+      <w:bookmarkEnd w:id="35"/>
+    </w:p>
+    <w:p>
+      <w:pPr>
         <w:rPr>
           <w:rFonts w:ascii="Arial" w:hAnsi="Arial" w:cs="Arial"/>
           <w:sz w:val="26"/>
@@ -12395,7 +12629,7 @@
         </w:rPr>
         <w:br w:type="page"/>
       </w:r>
-      <w:bookmarkStart w:id="35" w:name="_Toc491964573"/>
+      <w:bookmarkStart w:id="36" w:name="_Toc491964573"/>
       <w:r>
         <w:rPr>
           <w:rFonts w:ascii="Arial" w:eastAsia="Calibri" w:hAnsi="Arial" w:cs="Arial"/>
@@ -12415,7 +12649,7 @@
         </w:rPr>
         <w:t>financière</w:t>
       </w:r>
-      <w:bookmarkEnd w:id="35"/>
+      <w:bookmarkEnd w:id="36"/>
     </w:p>
     <w:tbl>
       <w:tblPr>
@@ -15217,14 +15451,14 @@
           <w:rFonts w:ascii="Arial" w:hAnsi="Arial" w:cs="Arial"/>
         </w:rPr>
       </w:pPr>
-      <w:bookmarkStart w:id="36" w:name="_Toc491964574"/>
+      <w:bookmarkStart w:id="37" w:name="_Toc491964574"/>
       <w:r>
         <w:rPr>
           <w:rFonts w:ascii="Arial" w:eastAsia="Calibri" w:hAnsi="Arial" w:cs="Arial"/>
         </w:rPr>
         <w:t>Confidentialité</w:t>
       </w:r>
-      <w:bookmarkEnd w:id="36"/>
+      <w:bookmarkEnd w:id="37"/>
     </w:p>
     <w:p>
       <w:pPr>
@@ -21124,7 +21358,7 @@
               <w:noProof/>
               <w:sz w:val="24"/>
             </w:rPr>
-            <w:t>18</w:t>
+            <w:t>8</w:t>
           </w:r>
           <w:r>
             <w:rPr>

</xml_diff>

<commit_message>
Added methodologie in CE
</commit_message>
<xml_diff>
--- a/flower_backend/doctypes/CETUDE.docx
+++ b/flower_backend/doctypes/CETUDE.docx
@@ -628,7 +628,6 @@
                 <w:rFonts w:ascii="Arial" w:eastAsia="Calibri" w:hAnsi="Arial" w:cs="Arial"/>
                 <w:color w:val="000000" w:themeColor="text1"/>
                 <w:szCs w:val="28"/>
-                <w:lang w:val="en-GB"/>
               </w:rPr>
             </w:pPr>
             <w:r>
@@ -636,54 +635,58 @@
                 <w:rFonts w:ascii="Arial" w:eastAsia="Calibri" w:hAnsi="Arial" w:cs="Arial"/>
                 <w:color w:val="000000" w:themeColor="text1"/>
                 <w:szCs w:val="28"/>
-                <w:lang w:val="en-GB"/>
-              </w:rPr>
-              <w:t>{{</w:t>
-            </w:r>
+              </w:rPr>
+              <w:t>{</w:t>
+            </w:r>
+            <w:proofErr w:type="gramStart"/>
             <w:r>
               <w:rPr>
                 <w:rFonts w:ascii="Arial" w:eastAsia="Calibri" w:hAnsi="Arial" w:cs="Arial"/>
                 <w:color w:val="000000" w:themeColor="text1"/>
                 <w:szCs w:val="28"/>
-                <w:lang w:val="en-GB"/>
-              </w:rPr>
-              <w:t xml:space="preserve"> </w:t>
-            </w:r>
-            <w:proofErr w:type="spellStart"/>
+              </w:rPr>
+              <w:t>{</w:t>
+            </w:r>
             <w:r>
               <w:rPr>
                 <w:rFonts w:ascii="Arial" w:eastAsia="Calibri" w:hAnsi="Arial" w:cs="Arial"/>
                 <w:color w:val="000000" w:themeColor="text1"/>
                 <w:szCs w:val="28"/>
-                <w:lang w:val="en-GB"/>
-              </w:rPr>
-              <w:t>etude.</w:t>
-            </w:r>
+              </w:rPr>
+              <w:t xml:space="preserve"> </w:t>
+            </w:r>
+            <w:proofErr w:type="spellStart"/>
             <w:r>
               <w:rPr>
                 <w:rFonts w:ascii="Arial" w:eastAsia="Calibri" w:hAnsi="Arial" w:cs="Arial"/>
                 <w:color w:val="000000" w:themeColor="text1"/>
                 <w:szCs w:val="28"/>
-                <w:lang w:val="en-GB"/>
-              </w:rPr>
-              <w:t>projectManager</w:t>
-            </w:r>
-            <w:proofErr w:type="spellEnd"/>
+              </w:rPr>
+              <w:t>etude.</w:t>
+            </w:r>
             <w:r>
               <w:rPr>
                 <w:rFonts w:ascii="Arial" w:eastAsia="Calibri" w:hAnsi="Arial" w:cs="Arial"/>
                 <w:color w:val="000000" w:themeColor="text1"/>
                 <w:szCs w:val="28"/>
-                <w:lang w:val="en-GB"/>
-              </w:rPr>
-              <w:t xml:space="preserve"> </w:t>
-            </w:r>
+              </w:rPr>
+              <w:t>projectManager</w:t>
+            </w:r>
+            <w:proofErr w:type="spellEnd"/>
+            <w:proofErr w:type="gramEnd"/>
             <w:r>
               <w:rPr>
                 <w:rFonts w:ascii="Arial" w:eastAsia="Calibri" w:hAnsi="Arial" w:cs="Arial"/>
                 <w:color w:val="000000" w:themeColor="text1"/>
                 <w:szCs w:val="28"/>
-                <w:lang w:val="en-GB"/>
+              </w:rPr>
+              <w:t xml:space="preserve"> </w:t>
+            </w:r>
+            <w:r>
+              <w:rPr>
+                <w:rFonts w:ascii="Arial" w:eastAsia="Calibri" w:hAnsi="Arial" w:cs="Arial"/>
+                <w:color w:val="000000" w:themeColor="text1"/>
+                <w:szCs w:val="28"/>
               </w:rPr>
               <w:t>}}</w:t>
             </w:r>
@@ -1216,7 +1219,6 @@
                 <w:color w:val="000000"/>
                 <w:sz w:val="22"/>
                 <w:szCs w:val="22"/>
-                <w:lang w:val="en-GB"/>
               </w:rPr>
             </w:pPr>
             <w:r>
@@ -1236,7 +1238,6 @@
                 <w:color w:val="000000" w:themeColor="text1"/>
                 <w:sz w:val="22"/>
                 <w:szCs w:val="22"/>
-                <w:lang w:val="en-GB"/>
               </w:rPr>
               <w:t xml:space="preserve">  </w:t>
             </w:r>
@@ -1245,7 +1246,6 @@
                 <w:rFonts w:ascii="Arial" w:hAnsi="Arial" w:cs="Arial"/>
                 <w:sz w:val="22"/>
                 <w:szCs w:val="22"/>
-                <w:lang w:val="en-GB"/>
               </w:rPr>
               <w:t>{</w:t>
             </w:r>
@@ -1255,7 +1255,6 @@
                 <w:rFonts w:ascii="Arial" w:hAnsi="Arial" w:cs="Arial"/>
                 <w:sz w:val="22"/>
                 <w:szCs w:val="22"/>
-                <w:lang w:val="en-GB"/>
               </w:rPr>
               <w:t xml:space="preserve">{ </w:t>
             </w:r>
@@ -1265,7 +1264,6 @@
                 <w:rFonts w:ascii="Arial" w:hAnsi="Arial" w:cs="Arial"/>
                 <w:sz w:val="22"/>
                 <w:szCs w:val="22"/>
-                <w:lang w:val="en-GB"/>
               </w:rPr>
               <w:t>param</w:t>
             </w:r>
@@ -1276,7 +1274,6 @@
                 <w:rFonts w:ascii="Arial" w:hAnsi="Arial" w:cs="Arial"/>
                 <w:sz w:val="22"/>
                 <w:szCs w:val="22"/>
-                <w:lang w:val="en-GB"/>
               </w:rPr>
               <w:t>(</w:t>
             </w:r>
@@ -1286,7 +1283,6 @@
                 <w:color w:val="000000"/>
                 <w:sz w:val="22"/>
                 <w:szCs w:val="22"/>
-                <w:lang w:val="en-GB"/>
               </w:rPr>
               <w:t>'</w:t>
             </w:r>
@@ -1297,7 +1293,6 @@
                 <w:color w:val="000000"/>
                 <w:sz w:val="22"/>
                 <w:szCs w:val="22"/>
-                <w:lang w:val="en-GB"/>
               </w:rPr>
               <w:t>je_contact</w:t>
             </w:r>
@@ -1308,7 +1303,6 @@
                 <w:color w:val="000000"/>
                 <w:sz w:val="22"/>
                 <w:szCs w:val="22"/>
-                <w:lang w:val="en-GB"/>
               </w:rPr>
               <w:t>') }}</w:t>
             </w:r>
@@ -1322,7 +1316,6 @@
                 <w:color w:val="000000"/>
                 <w:sz w:val="22"/>
                 <w:szCs w:val="22"/>
-                <w:lang w:val="en-GB"/>
               </w:rPr>
             </w:pPr>
             <w:r>
@@ -1342,7 +1335,6 @@
                 <w:color w:val="000000" w:themeColor="text1"/>
                 <w:sz w:val="22"/>
                 <w:szCs w:val="22"/>
-                <w:lang w:val="en-GB"/>
               </w:rPr>
               <w:t xml:space="preserve">  </w:t>
             </w:r>
@@ -1352,7 +1344,6 @@
                 <w:sz w:val="22"/>
                 <w:szCs w:val="22"/>
                 <w:u w:val="single"/>
-                <w:lang w:val="en-GB"/>
               </w:rPr>
               <w:t>{</w:t>
             </w:r>
@@ -1363,7 +1354,6 @@
                 <w:sz w:val="22"/>
                 <w:szCs w:val="22"/>
                 <w:u w:val="single"/>
-                <w:lang w:val="en-GB"/>
               </w:rPr>
               <w:t xml:space="preserve">{ </w:t>
             </w:r>
@@ -1374,7 +1364,6 @@
                 <w:sz w:val="22"/>
                 <w:szCs w:val="22"/>
                 <w:u w:val="single"/>
-                <w:lang w:val="en-GB"/>
               </w:rPr>
               <w:t>param</w:t>
             </w:r>
@@ -1386,7 +1375,6 @@
                 <w:sz w:val="22"/>
                 <w:szCs w:val="22"/>
                 <w:u w:val="single"/>
-                <w:lang w:val="en-GB"/>
               </w:rPr>
               <w:t>(</w:t>
             </w:r>
@@ -1397,7 +1385,6 @@
                 <w:sz w:val="22"/>
                 <w:szCs w:val="22"/>
                 <w:u w:val="single"/>
-                <w:lang w:val="en-GB"/>
               </w:rPr>
               <w:t>'</w:t>
             </w:r>
@@ -1409,7 +1396,6 @@
                 <w:sz w:val="22"/>
                 <w:szCs w:val="22"/>
                 <w:u w:val="single"/>
-                <w:lang w:val="en-GB"/>
               </w:rPr>
               <w:t>je_url</w:t>
             </w:r>
@@ -1421,7 +1407,6 @@
                 <w:sz w:val="22"/>
                 <w:szCs w:val="22"/>
                 <w:u w:val="single"/>
-                <w:lang w:val="en-GB"/>
               </w:rPr>
               <w:t>') }}</w:t>
             </w:r>
@@ -1435,7 +1420,6 @@
                 <w:color w:val="000000" w:themeColor="text1"/>
                 <w:sz w:val="22"/>
                 <w:szCs w:val="22"/>
-                <w:lang w:val="en-GB"/>
               </w:rPr>
             </w:pPr>
           </w:p>
@@ -1448,7 +1432,6 @@
                 <w:color w:val="000000" w:themeColor="text1"/>
                 <w:sz w:val="22"/>
                 <w:szCs w:val="22"/>
-                <w:lang w:val="en-GB"/>
               </w:rPr>
             </w:pPr>
           </w:p>
@@ -1469,7 +1452,6 @@
                 <w:color w:val="000000" w:themeColor="text1"/>
                 <w:sz w:val="22"/>
                 <w:szCs w:val="22"/>
-                <w:lang w:val="en-GB"/>
               </w:rPr>
               <w:t>SIRE</w:t>
             </w:r>
@@ -8064,11 +8046,322 @@
         <w:rPr>
           <w:rFonts w:ascii="Arial" w:eastAsia="Arial" w:hAnsi="Arial" w:cs="Arial"/>
           <w:b/>
+          <w:sz w:val="24"/>
+          <w:szCs w:val="22"/>
+        </w:rPr>
+      </w:pPr>
+      <w:r>
+        <w:rPr>
+          <w:rFonts w:ascii="Arial" w:eastAsia="Arial" w:hAnsi="Arial" w:cs="Arial"/>
+          <w:b/>
+          <w:sz w:val="22"/>
+          <w:szCs w:val="22"/>
+        </w:rPr>
+        <w:t xml:space="preserve">{%for groupe in </w:t>
+      </w:r>
+      <w:proofErr w:type="spellStart"/>
+      <w:r>
+        <w:rPr>
+          <w:rFonts w:ascii="Arial" w:eastAsia="Arial" w:hAnsi="Arial" w:cs="Arial"/>
+          <w:b/>
+          <w:sz w:val="22"/>
+          <w:szCs w:val="22"/>
+        </w:rPr>
+        <w:t>etude.groupe_</w:t>
+      </w:r>
+      <w:proofErr w:type="gramStart"/>
+      <w:r>
+        <w:rPr>
+          <w:rFonts w:ascii="Arial" w:eastAsia="Arial" w:hAnsi="Arial" w:cs="Arial"/>
+          <w:b/>
+          <w:sz w:val="22"/>
+          <w:szCs w:val="22"/>
+        </w:rPr>
+        <w:t>set.iterator</w:t>
+      </w:r>
+      <w:proofErr w:type="spellEnd"/>
+      <w:r>
+        <w:rPr>
+          <w:rFonts w:ascii="Arial" w:eastAsia="Arial" w:hAnsi="Arial" w:cs="Arial"/>
+          <w:b/>
+          <w:sz w:val="22"/>
+          <w:szCs w:val="22"/>
+        </w:rPr>
+        <w:t>(</w:t>
+      </w:r>
+      <w:proofErr w:type="gramEnd"/>
+      <w:r>
+        <w:rPr>
+          <w:rFonts w:ascii="Arial" w:eastAsia="Arial" w:hAnsi="Arial" w:cs="Arial"/>
+          <w:b/>
+          <w:sz w:val="22"/>
+          <w:szCs w:val="22"/>
+        </w:rPr>
+        <w:t>) | sort(</w:t>
+      </w:r>
+      <w:proofErr w:type="spellStart"/>
+      <w:r>
+        <w:rPr>
+          <w:rFonts w:ascii="Arial" w:eastAsia="Arial" w:hAnsi="Arial" w:cs="Arial"/>
+          <w:b/>
+          <w:sz w:val="22"/>
+          <w:szCs w:val="22"/>
+        </w:rPr>
+        <w:t>attribute</w:t>
+      </w:r>
+      <w:proofErr w:type="spellEnd"/>
+      <w:r>
+        <w:rPr>
+          <w:rFonts w:ascii="Arial" w:eastAsia="Arial" w:hAnsi="Arial" w:cs="Arial"/>
+          <w:b/>
+          <w:sz w:val="22"/>
+          <w:szCs w:val="22"/>
+        </w:rPr>
+        <w:t>=’index’) %}</w:t>
+      </w:r>
+      <w:r>
+        <w:rPr>
+          <w:rFonts w:ascii="Arial" w:eastAsia="Arial" w:hAnsi="Arial" w:cs="Arial"/>
+          <w:b/>
+          <w:sz w:val="24"/>
+          <w:szCs w:val="22"/>
+        </w:rPr>
+        <w:t>Groupe</w:t>
+      </w:r>
+      <w:r>
+        <w:rPr>
+          <w:rFonts w:ascii="Arial" w:eastAsia="Arial" w:hAnsi="Arial" w:cs="Arial"/>
+          <w:b/>
+          <w:sz w:val="24"/>
+          <w:szCs w:val="22"/>
+        </w:rPr>
+        <w:t xml:space="preserve"> {{</w:t>
+      </w:r>
+      <w:proofErr w:type="spellStart"/>
+      <w:r>
+        <w:rPr>
+          <w:rFonts w:ascii="Arial" w:eastAsia="Arial" w:hAnsi="Arial" w:cs="Arial"/>
+          <w:b/>
+          <w:sz w:val="24"/>
+          <w:szCs w:val="22"/>
+        </w:rPr>
+        <w:t>loop.index</w:t>
+      </w:r>
+      <w:proofErr w:type="spellEnd"/>
+      <w:r>
+        <w:rPr>
+          <w:rFonts w:ascii="Arial" w:eastAsia="Arial" w:hAnsi="Arial" w:cs="Arial"/>
+          <w:b/>
+          <w:sz w:val="24"/>
+          <w:szCs w:val="22"/>
+        </w:rPr>
+        <w:t>}} : {</w:t>
+      </w:r>
+      <w:proofErr w:type="gramStart"/>
+      <w:r>
+        <w:rPr>
+          <w:rFonts w:ascii="Arial" w:eastAsia="Arial" w:hAnsi="Arial" w:cs="Arial"/>
+          <w:b/>
+          <w:sz w:val="24"/>
+          <w:szCs w:val="22"/>
+        </w:rPr>
+        <w:t xml:space="preserve">{ </w:t>
+      </w:r>
+      <w:proofErr w:type="spellStart"/>
+      <w:r>
+        <w:rPr>
+          <w:rFonts w:ascii="Arial" w:eastAsia="Arial" w:hAnsi="Arial" w:cs="Arial"/>
+          <w:b/>
+          <w:sz w:val="24"/>
+          <w:szCs w:val="22"/>
+        </w:rPr>
+        <w:t>groupe.title</w:t>
+      </w:r>
+      <w:proofErr w:type="spellEnd"/>
+      <w:proofErr w:type="gramEnd"/>
+      <w:r>
+        <w:rPr>
+          <w:rFonts w:ascii="Arial" w:eastAsia="Arial" w:hAnsi="Arial" w:cs="Arial"/>
+          <w:b/>
+          <w:sz w:val="24"/>
+          <w:szCs w:val="22"/>
+        </w:rPr>
+        <w:t xml:space="preserve"> }}</w:t>
+      </w:r>
+    </w:p>
+    <w:p>
+      <w:pPr>
+        <w:rPr>
+          <w:rFonts w:ascii="Arial" w:eastAsia="Arial" w:hAnsi="Arial" w:cs="Arial"/>
+          <w:sz w:val="22"/>
+          <w:szCs w:val="22"/>
+        </w:rPr>
+      </w:pPr>
+      <w:r>
+        <w:rPr>
+          <w:rFonts w:ascii="Arial" w:eastAsia="Arial" w:hAnsi="Arial" w:cs="Arial"/>
+          <w:b/>
+          <w:sz w:val="22"/>
+          <w:szCs w:val="22"/>
+        </w:rPr>
+        <w:t>Description :</w:t>
+      </w:r>
+      <w:r>
+        <w:rPr>
+          <w:rFonts w:ascii="Arial" w:eastAsia="Arial" w:hAnsi="Arial" w:cs="Arial"/>
+          <w:sz w:val="22"/>
+          <w:szCs w:val="22"/>
+        </w:rPr>
+        <w:t xml:space="preserve"> {</w:t>
+      </w:r>
+      <w:proofErr w:type="gramStart"/>
+      <w:r>
+        <w:rPr>
+          <w:rFonts w:ascii="Arial" w:eastAsia="Arial" w:hAnsi="Arial" w:cs="Arial"/>
+          <w:sz w:val="22"/>
+          <w:szCs w:val="22"/>
+        </w:rPr>
+        <w:t xml:space="preserve">{ </w:t>
+      </w:r>
+      <w:proofErr w:type="spellStart"/>
+      <w:r>
+        <w:rPr>
+          <w:rFonts w:ascii="Arial" w:eastAsia="Arial" w:hAnsi="Arial" w:cs="Arial"/>
+          <w:sz w:val="22"/>
+          <w:szCs w:val="22"/>
+        </w:rPr>
+        <w:t>groupe.description</w:t>
+      </w:r>
+      <w:proofErr w:type="spellEnd"/>
+      <w:proofErr w:type="gramEnd"/>
+      <w:r>
+        <w:rPr>
+          <w:rFonts w:ascii="Arial" w:eastAsia="Arial" w:hAnsi="Arial" w:cs="Arial"/>
+          <w:sz w:val="22"/>
+          <w:szCs w:val="22"/>
+        </w:rPr>
+        <w:t xml:space="preserve"> }}</w:t>
+      </w:r>
+      <w:bookmarkStart w:id="16" w:name="_gjdgxs" w:colFirst="0" w:colLast="0"/>
+      <w:bookmarkEnd w:id="16"/>
+    </w:p>
+    <w:p>
+      <w:pPr>
+        <w:rPr>
+          <w:rFonts w:ascii="Arial" w:eastAsia="Arial" w:hAnsi="Arial" w:cs="Arial"/>
           <w:sz w:val="22"/>
           <w:szCs w:val="22"/>
           <w:lang w:val="en-GB"/>
         </w:rPr>
       </w:pPr>
+      <w:r>
+        <w:rPr>
+          <w:rFonts w:ascii="Arial" w:eastAsia="Arial" w:hAnsi="Arial" w:cs="Arial"/>
+          <w:b/>
+          <w:sz w:val="22"/>
+          <w:szCs w:val="22"/>
+        </w:rPr>
+        <w:t>Objectifs :</w:t>
+      </w:r>
+      <w:r>
+        <w:rPr>
+          <w:rFonts w:ascii="Arial" w:eastAsia="Arial" w:hAnsi="Arial" w:cs="Arial"/>
+          <w:sz w:val="22"/>
+          <w:szCs w:val="22"/>
+        </w:rPr>
+        <w:t xml:space="preserve"> </w:t>
+      </w:r>
+      <w:r>
+        <w:rPr>
+          <w:rFonts w:ascii="Arial" w:eastAsia="Arial" w:hAnsi="Arial" w:cs="Arial"/>
+          <w:sz w:val="22"/>
+          <w:szCs w:val="22"/>
+          <w:highlight w:val="yellow"/>
+          <w:lang w:val="en-GB"/>
+        </w:rPr>
+        <w:t>TODO</w:t>
+      </w:r>
+      <w:r>
+        <w:rPr>
+          <w:rFonts w:ascii="Arial" w:eastAsia="Arial" w:hAnsi="Arial" w:cs="Arial"/>
+          <w:sz w:val="22"/>
+          <w:szCs w:val="22"/>
+          <w:highlight w:val="yellow"/>
+          <w:lang w:val="en-GB"/>
+        </w:rPr>
+        <w:t> !!</w:t>
+      </w:r>
+    </w:p>
+    <w:p>
+      <w:pPr>
+        <w:rPr>
+          <w:rFonts w:ascii="Arial" w:eastAsia="Arial" w:hAnsi="Arial" w:cs="Arial"/>
+          <w:sz w:val="22"/>
+          <w:szCs w:val="22"/>
+          <w:lang w:val="en-GB"/>
+        </w:rPr>
+      </w:pPr>
+      <w:bookmarkStart w:id="17" w:name="_GoBack"/>
+      <w:bookmarkEnd w:id="17"/>
+    </w:p>
+    <w:p>
+      <w:pPr>
+        <w:rPr>
+          <w:rFonts w:ascii="Arial" w:eastAsia="Arial" w:hAnsi="Arial" w:cs="Arial"/>
+          <w:sz w:val="22"/>
+          <w:szCs w:val="22"/>
+          <w:lang w:val="en-GB"/>
+        </w:rPr>
+      </w:pPr>
+      <w:r>
+        <w:rPr>
+          <w:rFonts w:ascii="Arial" w:eastAsia="Arial" w:hAnsi="Arial" w:cs="Arial"/>
+          <w:sz w:val="22"/>
+          <w:szCs w:val="22"/>
+          <w:lang w:val="en-GB"/>
+        </w:rPr>
+        <w:t xml:space="preserve">{% for phase in </w:t>
+      </w:r>
+      <w:proofErr w:type="spellStart"/>
+      <w:r>
+        <w:rPr>
+          <w:rFonts w:ascii="Arial" w:eastAsia="Arial" w:hAnsi="Arial" w:cs="Arial"/>
+          <w:sz w:val="22"/>
+          <w:szCs w:val="22"/>
+          <w:lang w:val="en-GB"/>
+        </w:rPr>
+        <w:t>groupe.phase_</w:t>
+      </w:r>
+      <w:proofErr w:type="gramStart"/>
+      <w:r>
+        <w:rPr>
+          <w:rFonts w:ascii="Arial" w:eastAsia="Arial" w:hAnsi="Arial" w:cs="Arial"/>
+          <w:sz w:val="22"/>
+          <w:szCs w:val="22"/>
+          <w:lang w:val="en-GB"/>
+        </w:rPr>
+        <w:t>set.iterator</w:t>
+      </w:r>
+      <w:proofErr w:type="spellEnd"/>
+      <w:r>
+        <w:rPr>
+          <w:rFonts w:ascii="Arial" w:eastAsia="Arial" w:hAnsi="Arial" w:cs="Arial"/>
+          <w:sz w:val="22"/>
+          <w:szCs w:val="22"/>
+          <w:lang w:val="en-GB"/>
+        </w:rPr>
+        <w:t>(</w:t>
+      </w:r>
+      <w:proofErr w:type="gramEnd"/>
+      <w:r>
+        <w:rPr>
+          <w:rFonts w:ascii="Arial" w:eastAsia="Arial" w:hAnsi="Arial" w:cs="Arial"/>
+          <w:sz w:val="22"/>
+          <w:szCs w:val="22"/>
+          <w:lang w:val="en-GB"/>
+        </w:rPr>
+        <w:t>) %}</w:t>
+      </w:r>
       <w:r>
         <w:rPr>
           <w:rFonts w:ascii="Arial" w:eastAsia="Arial" w:hAnsi="Arial" w:cs="Arial"/>
@@ -8077,7 +8370,7 @@
           <w:szCs w:val="22"/>
           <w:lang w:val="en-GB"/>
         </w:rPr>
-        <w:t xml:space="preserve">{%for </w:t>
+        <w:t>Phase {{</w:t>
       </w:r>
       <w:proofErr w:type="spellStart"/>
       <w:r>
@@ -8088,7 +8381,7 @@
           <w:szCs w:val="22"/>
           <w:lang w:val="en-GB"/>
         </w:rPr>
-        <w:t>groupe</w:t>
+        <w:t>loop.index</w:t>
       </w:r>
       <w:proofErr w:type="spellEnd"/>
       <w:r>
@@ -8099,9 +8392,9 @@
           <w:szCs w:val="22"/>
           <w:lang w:val="en-GB"/>
         </w:rPr>
-        <w:t xml:space="preserve"> in </w:t>
-      </w:r>
-      <w:proofErr w:type="spellStart"/>
+        <w:t>}</w:t>
+      </w:r>
+      <w:proofErr w:type="gramStart"/>
       <w:r>
         <w:rPr>
           <w:rFonts w:ascii="Arial" w:eastAsia="Arial" w:hAnsi="Arial" w:cs="Arial"/>
@@ -8110,9 +8403,9 @@
           <w:szCs w:val="22"/>
           <w:lang w:val="en-GB"/>
         </w:rPr>
-        <w:t>etude.groupe_</w:t>
-      </w:r>
-      <w:proofErr w:type="gramStart"/>
+        <w:t>} :</w:t>
+      </w:r>
+      <w:proofErr w:type="gramEnd"/>
       <w:r>
         <w:rPr>
           <w:rFonts w:ascii="Arial" w:eastAsia="Arial" w:hAnsi="Arial" w:cs="Arial"/>
@@ -8121,9 +8414,9 @@
           <w:szCs w:val="22"/>
           <w:lang w:val="en-GB"/>
         </w:rPr>
-        <w:t>set.iterator</w:t>
-      </w:r>
-      <w:proofErr w:type="spellEnd"/>
+        <w:t xml:space="preserve"> {{</w:t>
+      </w:r>
+      <w:proofErr w:type="spellStart"/>
       <w:r>
         <w:rPr>
           <w:rFonts w:ascii="Arial" w:eastAsia="Arial" w:hAnsi="Arial" w:cs="Arial"/>
@@ -8132,9 +8425,8 @@
           <w:szCs w:val="22"/>
           <w:lang w:val="en-GB"/>
         </w:rPr>
-        <w:t>(</w:t>
-      </w:r>
-      <w:proofErr w:type="gramEnd"/>
+        <w:t>phase.</w:t>
+      </w:r>
       <w:r>
         <w:rPr>
           <w:rFonts w:ascii="Arial" w:eastAsia="Arial" w:hAnsi="Arial" w:cs="Arial"/>
@@ -8143,9 +8435,9 @@
           <w:szCs w:val="22"/>
           <w:lang w:val="en-GB"/>
         </w:rPr>
-        <w:t>) | sort(attribute=’index’) %}Phase {{</w:t>
-      </w:r>
-      <w:proofErr w:type="spellStart"/>
+        <w:t>title</w:t>
+      </w:r>
+      <w:proofErr w:type="spellEnd"/>
       <w:r>
         <w:rPr>
           <w:rFonts w:ascii="Arial" w:eastAsia="Arial" w:hAnsi="Arial" w:cs="Arial"/>
@@ -8154,134 +8446,298 @@
           <w:szCs w:val="22"/>
           <w:lang w:val="en-GB"/>
         </w:rPr>
-        <w:t>loop.index</w:t>
+        <w:t>}}</w:t>
+      </w:r>
+    </w:p>
+    <w:p>
+      <w:pPr>
+        <w:rPr>
+          <w:rFonts w:ascii="Arial" w:eastAsia="Arial" w:hAnsi="Arial" w:cs="Arial"/>
+          <w:sz w:val="22"/>
+          <w:szCs w:val="22"/>
+          <w:lang w:val="en-GB"/>
+        </w:rPr>
+      </w:pPr>
+      <w:r>
+        <w:rPr>
+          <w:rFonts w:ascii="Arial" w:eastAsia="Arial" w:hAnsi="Arial" w:cs="Arial"/>
+          <w:sz w:val="22"/>
+          <w:szCs w:val="22"/>
+          <w:lang w:val="en-GB"/>
+        </w:rPr>
+        <w:t>{</w:t>
+      </w:r>
+      <w:proofErr w:type="gramStart"/>
+      <w:r>
+        <w:rPr>
+          <w:rFonts w:ascii="Arial" w:eastAsia="Arial" w:hAnsi="Arial" w:cs="Arial"/>
+          <w:sz w:val="22"/>
+          <w:szCs w:val="22"/>
+          <w:lang w:val="en-GB"/>
+        </w:rPr>
+        <w:t xml:space="preserve">{ </w:t>
+      </w:r>
+      <w:proofErr w:type="spellStart"/>
+      <w:r>
+        <w:rPr>
+          <w:rFonts w:ascii="Arial" w:eastAsia="Arial" w:hAnsi="Arial" w:cs="Arial"/>
+          <w:sz w:val="22"/>
+          <w:szCs w:val="22"/>
+          <w:lang w:val="en-GB"/>
+        </w:rPr>
+        <w:t>phase.description</w:t>
       </w:r>
       <w:proofErr w:type="spellEnd"/>
-      <w:r>
+      <w:proofErr w:type="gramEnd"/>
+      <w:r>
+        <w:rPr>
+          <w:rFonts w:ascii="Arial" w:eastAsia="Arial" w:hAnsi="Arial" w:cs="Arial"/>
+          <w:sz w:val="22"/>
+          <w:szCs w:val="22"/>
+          <w:lang w:val="en-GB"/>
+        </w:rPr>
+        <w:t xml:space="preserve"> }}</w:t>
+      </w:r>
+    </w:p>
+    <w:p>
+      <w:pPr>
+        <w:rPr>
+          <w:rFonts w:ascii="Arial" w:eastAsia="Arial" w:hAnsi="Arial" w:cs="Arial"/>
+          <w:sz w:val="22"/>
+          <w:szCs w:val="22"/>
+        </w:rPr>
+      </w:pPr>
+      <w:r>
+        <w:rPr>
+          <w:rFonts w:ascii="Arial" w:eastAsia="Arial" w:hAnsi="Arial" w:cs="Arial"/>
+          <w:sz w:val="22"/>
+          <w:szCs w:val="22"/>
+        </w:rPr>
+        <w:t xml:space="preserve">{% if </w:t>
+      </w:r>
+      <w:proofErr w:type="spellStart"/>
+      <w:r>
+        <w:rPr>
+          <w:rFonts w:ascii="Arial" w:eastAsia="Arial" w:hAnsi="Arial" w:cs="Arial"/>
+          <w:sz w:val="22"/>
+          <w:szCs w:val="22"/>
+        </w:rPr>
+        <w:t>phase.</w:t>
+      </w:r>
+      <w:r>
+        <w:rPr>
+          <w:rFonts w:ascii="Arial" w:eastAsia="Arial" w:hAnsi="Arial" w:cs="Arial"/>
+          <w:sz w:val="22"/>
+          <w:szCs w:val="22"/>
+        </w:rPr>
+        <w:t>methodologie</w:t>
+      </w:r>
+      <w:proofErr w:type="spellEnd"/>
+      <w:r>
+        <w:rPr>
+          <w:rFonts w:ascii="Arial" w:eastAsia="Arial" w:hAnsi="Arial" w:cs="Arial"/>
+          <w:sz w:val="22"/>
+          <w:szCs w:val="22"/>
+        </w:rPr>
+        <w:t xml:space="preserve"> </w:t>
+      </w:r>
+      <w:r>
+        <w:rPr>
+          <w:rFonts w:ascii="Arial" w:eastAsia="Arial" w:hAnsi="Arial" w:cs="Arial"/>
+          <w:sz w:val="22"/>
+          <w:szCs w:val="22"/>
+        </w:rPr>
+        <w:t>!</w:t>
+      </w:r>
+      <w:r>
+        <w:rPr>
+          <w:rFonts w:ascii="Arial" w:eastAsia="Arial" w:hAnsi="Arial" w:cs="Arial"/>
+          <w:sz w:val="22"/>
+          <w:szCs w:val="22"/>
+        </w:rPr>
+        <w:t>=</w:t>
+      </w:r>
+      <w:r>
+        <w:rPr>
+          <w:rFonts w:ascii="Arial" w:eastAsia="Arial" w:hAnsi="Arial" w:cs="Arial"/>
+          <w:sz w:val="22"/>
+          <w:szCs w:val="22"/>
+        </w:rPr>
+        <w:t xml:space="preserve"> </w:t>
+      </w:r>
+      <w:r>
+        <w:rPr>
+          <w:rFonts w:ascii="Arial" w:eastAsia="Arial" w:hAnsi="Arial" w:cs="Arial"/>
+          <w:color w:val="000000"/>
+          <w:sz w:val="22"/>
+          <w:szCs w:val="22"/>
+        </w:rPr>
+        <w:t>''</w:t>
+      </w:r>
+      <w:r>
+        <w:rPr>
+          <w:rFonts w:ascii="Arial" w:eastAsia="Arial" w:hAnsi="Arial" w:cs="Arial"/>
+          <w:sz w:val="22"/>
+          <w:szCs w:val="22"/>
+        </w:rPr>
+        <w:t xml:space="preserve"> %}</w:t>
+      </w:r>
+      <w:r>
+        <w:rPr>
+          <w:rFonts w:ascii="Arial" w:eastAsia="Arial" w:hAnsi="Arial" w:cs="Arial"/>
+          <w:sz w:val="22"/>
+          <w:szCs w:val="22"/>
+          <w:u w:val="single"/>
+        </w:rPr>
+        <w:t>Méthodologie :</w:t>
+      </w:r>
+    </w:p>
+    <w:p>
+      <w:pPr>
+        <w:rPr>
+          <w:rFonts w:ascii="Arial" w:eastAsia="Arial" w:hAnsi="Arial" w:cs="Arial"/>
+          <w:sz w:val="22"/>
+          <w:szCs w:val="22"/>
+        </w:rPr>
+      </w:pPr>
+      <w:r>
+        <w:rPr>
+          <w:rFonts w:ascii="Arial" w:eastAsia="Arial" w:hAnsi="Arial" w:cs="Arial"/>
+          <w:sz w:val="22"/>
+          <w:szCs w:val="22"/>
+        </w:rPr>
+        <w:t>{</w:t>
+      </w:r>
+      <w:proofErr w:type="gramStart"/>
+      <w:r>
+        <w:rPr>
+          <w:rFonts w:ascii="Arial" w:eastAsia="Arial" w:hAnsi="Arial" w:cs="Arial"/>
+          <w:sz w:val="22"/>
+          <w:szCs w:val="22"/>
+        </w:rPr>
+        <w:t xml:space="preserve">{ </w:t>
+      </w:r>
+      <w:proofErr w:type="spellStart"/>
+      <w:r>
+        <w:rPr>
+          <w:rFonts w:ascii="Arial" w:eastAsia="Arial" w:hAnsi="Arial" w:cs="Arial"/>
+          <w:sz w:val="22"/>
+          <w:szCs w:val="22"/>
+        </w:rPr>
+        <w:t>phase.</w:t>
+      </w:r>
+      <w:r>
+        <w:rPr>
+          <w:rFonts w:ascii="Arial" w:eastAsia="Arial" w:hAnsi="Arial" w:cs="Arial"/>
+          <w:sz w:val="22"/>
+          <w:szCs w:val="22"/>
+        </w:rPr>
+        <w:t>methodologie</w:t>
+      </w:r>
+      <w:proofErr w:type="spellEnd"/>
+      <w:proofErr w:type="gramEnd"/>
+      <w:r>
+        <w:rPr>
+          <w:rFonts w:ascii="Arial" w:eastAsia="Arial" w:hAnsi="Arial" w:cs="Arial"/>
+          <w:sz w:val="22"/>
+          <w:szCs w:val="22"/>
+        </w:rPr>
+        <w:t xml:space="preserve"> }}</w:t>
+      </w:r>
+      <w:r>
+        <w:rPr>
+          <w:rFonts w:ascii="Arial" w:eastAsia="Arial" w:hAnsi="Arial" w:cs="Arial"/>
+          <w:sz w:val="22"/>
+          <w:szCs w:val="22"/>
+        </w:rPr>
+        <w:tab/>
+      </w:r>
+    </w:p>
+    <w:p>
+      <w:pPr>
+        <w:rPr>
+          <w:rFonts w:ascii="Arial" w:eastAsia="Arial" w:hAnsi="Arial" w:cs="Arial"/>
+          <w:sz w:val="22"/>
+          <w:szCs w:val="22"/>
+        </w:rPr>
+      </w:pPr>
+      <w:r>
+        <w:rPr>
+          <w:rFonts w:ascii="Arial" w:eastAsia="Arial" w:hAnsi="Arial" w:cs="Arial"/>
+          <w:sz w:val="22"/>
+          <w:szCs w:val="22"/>
+        </w:rPr>
+        <w:t xml:space="preserve">{% </w:t>
+      </w:r>
+      <w:proofErr w:type="spellStart"/>
+      <w:r>
+        <w:rPr>
+          <w:rFonts w:ascii="Arial" w:eastAsia="Arial" w:hAnsi="Arial" w:cs="Arial"/>
+          <w:sz w:val="22"/>
+          <w:szCs w:val="22"/>
+        </w:rPr>
+        <w:t>endif</w:t>
+      </w:r>
+      <w:proofErr w:type="spellEnd"/>
+      <w:r>
+        <w:rPr>
+          <w:rFonts w:ascii="Arial" w:eastAsia="Arial" w:hAnsi="Arial" w:cs="Arial"/>
+          <w:sz w:val="22"/>
+          <w:szCs w:val="22"/>
+        </w:rPr>
+        <w:t xml:space="preserve"> %}</w:t>
+      </w:r>
+    </w:p>
+    <w:p>
+      <w:pPr>
         <w:rPr>
           <w:rFonts w:ascii="Arial" w:eastAsia="Arial" w:hAnsi="Arial" w:cs="Arial"/>
           <w:b/>
           <w:sz w:val="22"/>
           <w:szCs w:val="22"/>
-          <w:lang w:val="en-GB"/>
-        </w:rPr>
-        <w:t>}</w:t>
-      </w:r>
-      <w:proofErr w:type="gramStart"/>
-      <w:r>
-        <w:rPr>
-          <w:rFonts w:ascii="Arial" w:eastAsia="Arial" w:hAnsi="Arial" w:cs="Arial"/>
-          <w:b/>
-          <w:sz w:val="22"/>
-          <w:szCs w:val="22"/>
-          <w:lang w:val="en-GB"/>
-        </w:rPr>
-        <w:t>} :</w:t>
-      </w:r>
-      <w:proofErr w:type="gramEnd"/>
-      <w:r>
-        <w:rPr>
-          <w:rFonts w:ascii="Arial" w:eastAsia="Arial" w:hAnsi="Arial" w:cs="Arial"/>
-          <w:b/>
-          <w:sz w:val="22"/>
-          <w:szCs w:val="22"/>
-          <w:lang w:val="en-GB"/>
-        </w:rPr>
-        <w:t xml:space="preserve"> {{ </w:t>
-      </w:r>
-      <w:proofErr w:type="spellStart"/>
-      <w:r>
-        <w:rPr>
-          <w:rFonts w:ascii="Arial" w:eastAsia="Arial" w:hAnsi="Arial" w:cs="Arial"/>
-          <w:b/>
-          <w:sz w:val="22"/>
-          <w:szCs w:val="22"/>
-          <w:lang w:val="en-GB"/>
-        </w:rPr>
-        <w:t>groupe.title</w:t>
-      </w:r>
-      <w:proofErr w:type="spellEnd"/>
-      <w:r>
-        <w:rPr>
-          <w:rFonts w:ascii="Arial" w:eastAsia="Arial" w:hAnsi="Arial" w:cs="Arial"/>
-          <w:b/>
-          <w:sz w:val="22"/>
-          <w:szCs w:val="22"/>
-          <w:lang w:val="en-GB"/>
-        </w:rPr>
-        <w:t xml:space="preserve"> }}</w:t>
-      </w:r>
-    </w:p>
-    <w:p>
-      <w:pPr>
-        <w:rPr>
-          <w:rFonts w:ascii="Arial" w:eastAsia="Arial" w:hAnsi="Arial" w:cs="Arial"/>
-          <w:b/>
-          <w:sz w:val="22"/>
-          <w:szCs w:val="22"/>
-          <w:lang w:val="en-GB"/>
-        </w:rPr>
-      </w:pPr>
-    </w:p>
-    <w:p>
-      <w:pPr>
+        </w:rPr>
+      </w:pPr>
+      <w:r>
         <w:rPr>
           <w:rFonts w:ascii="Arial" w:eastAsia="Arial" w:hAnsi="Arial" w:cs="Arial"/>
           <w:sz w:val="22"/>
           <w:szCs w:val="22"/>
-          <w:lang w:val="en-GB"/>
-        </w:rPr>
-      </w:pPr>
-      <w:proofErr w:type="gramStart"/>
-      <w:r>
-        <w:rPr>
-          <w:rFonts w:ascii="Arial" w:eastAsia="Arial" w:hAnsi="Arial" w:cs="Arial"/>
-          <w:b/>
-          <w:sz w:val="22"/>
-          <w:szCs w:val="22"/>
-          <w:lang w:val="en-GB"/>
-        </w:rPr>
-        <w:t>Description :</w:t>
-      </w:r>
-      <w:proofErr w:type="gramEnd"/>
+        </w:rPr>
+        <w:t xml:space="preserve">{% </w:t>
+      </w:r>
+      <w:proofErr w:type="spellStart"/>
       <w:r>
         <w:rPr>
           <w:rFonts w:ascii="Arial" w:eastAsia="Arial" w:hAnsi="Arial" w:cs="Arial"/>
           <w:sz w:val="22"/>
           <w:szCs w:val="22"/>
-          <w:lang w:val="en-GB"/>
-        </w:rPr>
-        <w:t xml:space="preserve"> </w:t>
-      </w:r>
-    </w:p>
-    <w:p>
-      <w:pPr>
+        </w:rPr>
+        <w:t>endfor</w:t>
+      </w:r>
+      <w:proofErr w:type="spellEnd"/>
+      <w:r>
         <w:rPr>
           <w:rFonts w:ascii="Arial" w:eastAsia="Arial" w:hAnsi="Arial" w:cs="Arial"/>
           <w:sz w:val="22"/>
           <w:szCs w:val="22"/>
-          <w:lang w:val="en-GB"/>
-        </w:rPr>
-      </w:pPr>
+        </w:rPr>
+        <w:t xml:space="preserve"> %}</w:t>
+      </w:r>
       <w:r>
         <w:rPr>
           <w:rFonts w:ascii="Arial" w:eastAsia="Arial" w:hAnsi="Arial" w:cs="Arial"/>
           <w:sz w:val="22"/>
           <w:szCs w:val="22"/>
-          <w:lang w:val="en-GB"/>
-        </w:rPr>
-        <w:lastRenderedPageBreak/>
-        <w:t>{</w:t>
-      </w:r>
-      <w:proofErr w:type="gramStart"/>
+        </w:rPr>
+        <w:t>{%</w:t>
+      </w:r>
       <w:r>
         <w:rPr>
           <w:rFonts w:ascii="Arial" w:eastAsia="Arial" w:hAnsi="Arial" w:cs="Arial"/>
           <w:sz w:val="22"/>
           <w:szCs w:val="22"/>
-          <w:lang w:val="en-GB"/>
-        </w:rPr>
-        <w:t xml:space="preserve">{ </w:t>
+        </w:rPr>
+        <w:t xml:space="preserve"> </w:t>
       </w:r>
       <w:proofErr w:type="spellStart"/>
       <w:r>
@@ -8289,148 +8745,283 @@
           <w:rFonts w:ascii="Arial" w:eastAsia="Arial" w:hAnsi="Arial" w:cs="Arial"/>
           <w:sz w:val="22"/>
           <w:szCs w:val="22"/>
-          <w:lang w:val="en-GB"/>
-        </w:rPr>
-        <w:t>groupe.description</w:t>
+        </w:rPr>
+        <w:t>endfor</w:t>
       </w:r>
       <w:proofErr w:type="spellEnd"/>
-      <w:proofErr w:type="gramEnd"/>
       <w:r>
         <w:rPr>
           <w:rFonts w:ascii="Arial" w:eastAsia="Arial" w:hAnsi="Arial" w:cs="Arial"/>
           <w:sz w:val="22"/>
           <w:szCs w:val="22"/>
-          <w:lang w:val="en-GB"/>
-        </w:rPr>
-        <w:t xml:space="preserve"> }}</w:t>
-      </w:r>
-      <w:bookmarkStart w:id="16" w:name="_gjdgxs" w:colFirst="0" w:colLast="0"/>
-      <w:bookmarkEnd w:id="16"/>
-    </w:p>
-    <w:p>
-      <w:pPr>
+        </w:rPr>
+        <w:t xml:space="preserve"> </w:t>
+      </w:r>
+      <w:r>
         <w:rPr>
           <w:rFonts w:ascii="Arial" w:eastAsia="Arial" w:hAnsi="Arial" w:cs="Arial"/>
           <w:sz w:val="22"/>
           <w:szCs w:val="22"/>
         </w:rPr>
-      </w:pPr>
-      <w:proofErr w:type="spellStart"/>
-      <w:proofErr w:type="gramStart"/>
-      <w:r>
-        <w:rPr>
-          <w:rFonts w:ascii="Arial" w:eastAsia="Arial" w:hAnsi="Arial" w:cs="Arial"/>
-          <w:b/>
-          <w:sz w:val="22"/>
-          <w:szCs w:val="22"/>
-          <w:lang w:val="en-GB"/>
-        </w:rPr>
-        <w:t>Objectifs</w:t>
-      </w:r>
-      <w:proofErr w:type="spellEnd"/>
-      <w:r>
-        <w:rPr>
-          <w:rFonts w:ascii="Arial" w:eastAsia="Arial" w:hAnsi="Arial" w:cs="Arial"/>
-          <w:b/>
-          <w:sz w:val="22"/>
-          <w:szCs w:val="22"/>
-          <w:lang w:val="en-GB"/>
-        </w:rPr>
-        <w:t xml:space="preserve"> :</w:t>
-      </w:r>
-      <w:proofErr w:type="gramEnd"/>
-      <w:r>
-        <w:rPr>
-          <w:rFonts w:ascii="Arial" w:eastAsia="Arial" w:hAnsi="Arial" w:cs="Arial"/>
-          <w:sz w:val="22"/>
-          <w:szCs w:val="22"/>
-          <w:lang w:val="en-GB"/>
-        </w:rPr>
-        <w:t xml:space="preserve"> </w:t>
+        <w:t>%}</w:t>
       </w:r>
     </w:p>
     <w:p>
       <w:pPr>
-        <w:rPr>
-          <w:rFonts w:ascii="Arial" w:eastAsia="Arial" w:hAnsi="Arial" w:cs="Arial"/>
-          <w:b/>
-          <w:sz w:val="22"/>
-          <w:szCs w:val="22"/>
-        </w:rPr>
-      </w:pPr>
-      <w:proofErr w:type="gramStart"/>
-      <w:r>
-        <w:rPr>
-          <w:rFonts w:ascii="Arial" w:eastAsia="Arial" w:hAnsi="Arial" w:cs="Arial"/>
-          <w:sz w:val="22"/>
-          <w:szCs w:val="22"/>
-          <w:highlight w:val="yellow"/>
-        </w:rPr>
-        <w:t>TODO</w:t>
-      </w:r>
-      <w:r>
-        <w:rPr>
-          <w:rFonts w:ascii="Arial" w:eastAsia="Arial" w:hAnsi="Arial" w:cs="Arial"/>
-          <w:b/>
-          <w:sz w:val="22"/>
-          <w:szCs w:val="22"/>
-        </w:rPr>
-        <w:t>{</w:t>
-      </w:r>
-      <w:proofErr w:type="gramEnd"/>
-      <w:r>
-        <w:rPr>
-          <w:rFonts w:ascii="Arial" w:eastAsia="Arial" w:hAnsi="Arial" w:cs="Arial"/>
-          <w:b/>
-          <w:sz w:val="22"/>
-          <w:szCs w:val="22"/>
-        </w:rPr>
-        <w:t>%</w:t>
-      </w:r>
-      <w:proofErr w:type="spellStart"/>
-      <w:r>
-        <w:rPr>
-          <w:rFonts w:ascii="Arial" w:eastAsia="Arial" w:hAnsi="Arial" w:cs="Arial"/>
-          <w:b/>
-          <w:sz w:val="22"/>
-          <w:szCs w:val="22"/>
-        </w:rPr>
-        <w:t>endfor</w:t>
-      </w:r>
-      <w:proofErr w:type="spellEnd"/>
-      <w:r>
-        <w:rPr>
-          <w:rFonts w:ascii="Arial" w:eastAsia="Arial" w:hAnsi="Arial" w:cs="Arial"/>
-          <w:b/>
-          <w:sz w:val="22"/>
-          <w:szCs w:val="22"/>
-        </w:rPr>
-        <w:t>%}</w:t>
-      </w:r>
+        <w:pStyle w:val="Titre2"/>
+        <w:rPr>
+          <w:rFonts w:ascii="Arial" w:hAnsi="Arial"/>
+        </w:rPr>
+      </w:pPr>
+      <w:r>
+        <w:rPr>
+          <w:rFonts w:ascii="Arial" w:hAnsi="Arial"/>
+        </w:rPr>
+        <w:t xml:space="preserve"> </w:t>
+      </w:r>
+      <w:bookmarkStart w:id="18" w:name="_Toc491964562"/>
+      <w:r>
+        <w:rPr>
+          <w:rFonts w:ascii="Arial" w:eastAsia="Calibri" w:hAnsi="Arial"/>
+        </w:rPr>
+        <w:t>Garantie</w:t>
+      </w:r>
+      <w:bookmarkEnd w:id="14"/>
+      <w:bookmarkEnd w:id="15"/>
+      <w:bookmarkEnd w:id="18"/>
     </w:p>
     <w:p>
       <w:pPr>
-        <w:pStyle w:val="Titre2"/>
-        <w:rPr>
-          <w:rFonts w:ascii="Arial" w:hAnsi="Arial"/>
-        </w:rPr>
-      </w:pPr>
-      <w:r>
-        <w:rPr>
-          <w:rFonts w:ascii="Arial" w:hAnsi="Arial"/>
-        </w:rPr>
-        <w:t xml:space="preserve"> </w:t>
-      </w:r>
-      <w:bookmarkStart w:id="17" w:name="_Toc491964562"/>
-      <w:r>
-        <w:rPr>
-          <w:rFonts w:ascii="Arial" w:eastAsia="Calibri" w:hAnsi="Arial"/>
-        </w:rPr>
-        <w:t>Garantie</w:t>
-      </w:r>
-      <w:bookmarkEnd w:id="14"/>
-      <w:bookmarkEnd w:id="15"/>
-      <w:bookmarkEnd w:id="17"/>
+        <w:rPr>
+          <w:rFonts w:ascii="Arial" w:hAnsi="Arial" w:cs="Arial"/>
+          <w:sz w:val="26"/>
+          <w:szCs w:val="26"/>
+        </w:rPr>
+      </w:pPr>
+      <w:r>
+        <w:rPr>
+          <w:rFonts w:ascii="Arial" w:eastAsia="Calibri" w:hAnsi="Arial" w:cs="Arial"/>
+          <w:sz w:val="26"/>
+          <w:szCs w:val="26"/>
+        </w:rPr>
+        <w:t>L</w:t>
+      </w:r>
+      <w:r>
+        <w:rPr>
+          <w:rFonts w:ascii="Arial" w:hAnsi="Arial" w:cs="Arial"/>
+          <w:sz w:val="26"/>
+          <w:szCs w:val="26"/>
+        </w:rPr>
+        <w:t>’</w:t>
+      </w:r>
+      <w:r>
+        <w:rPr>
+          <w:rFonts w:ascii="Arial" w:eastAsia="Calibri" w:hAnsi="Arial" w:cs="Arial"/>
+          <w:sz w:val="26"/>
+          <w:szCs w:val="26"/>
+        </w:rPr>
+        <w:t>étude</w:t>
+      </w:r>
+      <w:r>
+        <w:rPr>
+          <w:rFonts w:ascii="Arial" w:hAnsi="Arial" w:cs="Arial"/>
+          <w:sz w:val="26"/>
+          <w:szCs w:val="26"/>
+        </w:rPr>
+        <w:t xml:space="preserve"> </w:t>
+      </w:r>
+      <w:r>
+        <w:rPr>
+          <w:rFonts w:ascii="Arial" w:eastAsia="Calibri" w:hAnsi="Arial" w:cs="Arial"/>
+          <w:sz w:val="26"/>
+          <w:szCs w:val="26"/>
+        </w:rPr>
+        <w:t>est</w:t>
+      </w:r>
+      <w:r>
+        <w:rPr>
+          <w:rFonts w:ascii="Arial" w:hAnsi="Arial" w:cs="Arial"/>
+          <w:sz w:val="26"/>
+          <w:szCs w:val="26"/>
+        </w:rPr>
+        <w:t xml:space="preserve"> </w:t>
+      </w:r>
+      <w:r>
+        <w:rPr>
+          <w:rFonts w:ascii="Arial" w:eastAsia="Calibri" w:hAnsi="Arial" w:cs="Arial"/>
+          <w:sz w:val="26"/>
+          <w:szCs w:val="26"/>
+        </w:rPr>
+        <w:t>garantie</w:t>
+      </w:r>
+      <w:r>
+        <w:rPr>
+          <w:rFonts w:ascii="Arial" w:hAnsi="Arial" w:cs="Arial"/>
+          <w:sz w:val="26"/>
+          <w:szCs w:val="26"/>
+        </w:rPr>
+        <w:t xml:space="preserve"> </w:t>
+      </w:r>
+      <w:r>
+        <w:rPr>
+          <w:rFonts w:ascii="Arial" w:eastAsia="Calibri" w:hAnsi="Arial" w:cs="Arial"/>
+          <w:sz w:val="26"/>
+          <w:szCs w:val="26"/>
+        </w:rPr>
+        <w:t>90</w:t>
+      </w:r>
+      <w:r>
+        <w:rPr>
+          <w:rFonts w:ascii="Arial" w:hAnsi="Arial" w:cs="Arial"/>
+          <w:sz w:val="26"/>
+          <w:szCs w:val="26"/>
+        </w:rPr>
+        <w:t xml:space="preserve"> </w:t>
+      </w:r>
+      <w:r>
+        <w:rPr>
+          <w:rFonts w:ascii="Arial" w:eastAsia="Calibri" w:hAnsi="Arial" w:cs="Arial"/>
+          <w:sz w:val="26"/>
+          <w:szCs w:val="26"/>
+        </w:rPr>
+        <w:t>jours</w:t>
+      </w:r>
+      <w:r>
+        <w:rPr>
+          <w:rFonts w:ascii="Arial" w:hAnsi="Arial" w:cs="Arial"/>
+          <w:sz w:val="26"/>
+          <w:szCs w:val="26"/>
+        </w:rPr>
+        <w:t xml:space="preserve"> </w:t>
+      </w:r>
+      <w:r>
+        <w:rPr>
+          <w:rFonts w:ascii="Arial" w:eastAsia="Calibri" w:hAnsi="Arial" w:cs="Arial"/>
+          <w:sz w:val="26"/>
+          <w:szCs w:val="26"/>
+        </w:rPr>
+        <w:t>à</w:t>
+      </w:r>
+      <w:r>
+        <w:rPr>
+          <w:rFonts w:ascii="Arial" w:hAnsi="Arial" w:cs="Arial"/>
+          <w:sz w:val="26"/>
+          <w:szCs w:val="26"/>
+        </w:rPr>
+        <w:t xml:space="preserve"> </w:t>
+      </w:r>
+      <w:r>
+        <w:rPr>
+          <w:rFonts w:ascii="Arial" w:eastAsia="Calibri" w:hAnsi="Arial" w:cs="Arial"/>
+          <w:sz w:val="26"/>
+          <w:szCs w:val="26"/>
+        </w:rPr>
+        <w:t>compter</w:t>
+      </w:r>
+      <w:r>
+        <w:rPr>
+          <w:rFonts w:ascii="Arial" w:hAnsi="Arial" w:cs="Arial"/>
+          <w:sz w:val="26"/>
+          <w:szCs w:val="26"/>
+        </w:rPr>
+        <w:t xml:space="preserve"> </w:t>
+      </w:r>
+      <w:r>
+        <w:rPr>
+          <w:rFonts w:ascii="Arial" w:eastAsia="Calibri" w:hAnsi="Arial" w:cs="Arial"/>
+          <w:sz w:val="26"/>
+          <w:szCs w:val="26"/>
+        </w:rPr>
+        <w:t>de</w:t>
+      </w:r>
+      <w:r>
+        <w:rPr>
+          <w:rFonts w:ascii="Arial" w:hAnsi="Arial" w:cs="Arial"/>
+          <w:sz w:val="26"/>
+          <w:szCs w:val="26"/>
+        </w:rPr>
+        <w:t xml:space="preserve"> </w:t>
+      </w:r>
+      <w:r>
+        <w:rPr>
+          <w:rFonts w:ascii="Arial" w:eastAsia="Calibri" w:hAnsi="Arial" w:cs="Arial"/>
+          <w:sz w:val="26"/>
+          <w:szCs w:val="26"/>
+        </w:rPr>
+        <w:t>sa</w:t>
+      </w:r>
+      <w:r>
+        <w:rPr>
+          <w:rFonts w:ascii="Arial" w:hAnsi="Arial" w:cs="Arial"/>
+          <w:sz w:val="26"/>
+          <w:szCs w:val="26"/>
+        </w:rPr>
+        <w:t xml:space="preserve"> </w:t>
+      </w:r>
+      <w:r>
+        <w:rPr>
+          <w:rFonts w:ascii="Arial" w:eastAsia="Calibri" w:hAnsi="Arial" w:cs="Arial"/>
+          <w:sz w:val="26"/>
+          <w:szCs w:val="26"/>
+        </w:rPr>
+        <w:t>réception</w:t>
+      </w:r>
+      <w:r>
+        <w:rPr>
+          <w:rFonts w:ascii="Arial" w:hAnsi="Arial" w:cs="Arial"/>
+          <w:sz w:val="26"/>
+          <w:szCs w:val="26"/>
+        </w:rPr>
+        <w:t xml:space="preserve"> </w:t>
+      </w:r>
+      <w:r>
+        <w:rPr>
+          <w:rFonts w:ascii="Arial" w:eastAsia="Calibri" w:hAnsi="Arial" w:cs="Arial"/>
+          <w:sz w:val="26"/>
+          <w:szCs w:val="26"/>
+        </w:rPr>
+        <w:t>par</w:t>
+      </w:r>
+      <w:r>
+        <w:rPr>
+          <w:rFonts w:ascii="Arial" w:hAnsi="Arial" w:cs="Arial"/>
+          <w:sz w:val="26"/>
+          <w:szCs w:val="26"/>
+        </w:rPr>
+        <w:t xml:space="preserve"> </w:t>
+      </w:r>
+      <w:r>
+        <w:rPr>
+          <w:rFonts w:ascii="Arial" w:eastAsia="Calibri" w:hAnsi="Arial" w:cs="Arial"/>
+          <w:sz w:val="26"/>
+          <w:szCs w:val="26"/>
+        </w:rPr>
+        <w:t>le</w:t>
+      </w:r>
+      <w:r>
+        <w:rPr>
+          <w:rFonts w:ascii="Arial" w:hAnsi="Arial" w:cs="Arial"/>
+          <w:sz w:val="26"/>
+          <w:szCs w:val="26"/>
+        </w:rPr>
+        <w:t xml:space="preserve"> </w:t>
+      </w:r>
+      <w:r>
+        <w:rPr>
+          <w:rFonts w:ascii="Arial" w:eastAsia="Calibri" w:hAnsi="Arial" w:cs="Arial"/>
+          <w:sz w:val="26"/>
+          <w:szCs w:val="26"/>
+        </w:rPr>
+        <w:t>client</w:t>
+      </w:r>
+      <w:r>
+        <w:rPr>
+          <w:rFonts w:ascii="Arial" w:hAnsi="Arial" w:cs="Arial"/>
+          <w:sz w:val="26"/>
+          <w:szCs w:val="26"/>
+        </w:rPr>
+        <w:t>.</w:t>
+      </w:r>
     </w:p>
     <w:p>
       <w:pPr>
@@ -8440,241 +9031,6 @@
           <w:szCs w:val="26"/>
         </w:rPr>
       </w:pPr>
-      <w:r>
-        <w:rPr>
-          <w:rFonts w:ascii="Arial" w:eastAsia="Calibri" w:hAnsi="Arial" w:cs="Arial"/>
-          <w:sz w:val="26"/>
-          <w:szCs w:val="26"/>
-        </w:rPr>
-        <w:t>L</w:t>
-      </w:r>
-      <w:r>
-        <w:rPr>
-          <w:rFonts w:ascii="Arial" w:hAnsi="Arial" w:cs="Arial"/>
-          <w:sz w:val="26"/>
-          <w:szCs w:val="26"/>
-        </w:rPr>
-        <w:t>’</w:t>
-      </w:r>
-      <w:r>
-        <w:rPr>
-          <w:rFonts w:ascii="Arial" w:eastAsia="Calibri" w:hAnsi="Arial" w:cs="Arial"/>
-          <w:sz w:val="26"/>
-          <w:szCs w:val="26"/>
-        </w:rPr>
-        <w:t>étude</w:t>
-      </w:r>
-      <w:r>
-        <w:rPr>
-          <w:rFonts w:ascii="Arial" w:hAnsi="Arial" w:cs="Arial"/>
-          <w:sz w:val="26"/>
-          <w:szCs w:val="26"/>
-        </w:rPr>
-        <w:t xml:space="preserve"> </w:t>
-      </w:r>
-      <w:r>
-        <w:rPr>
-          <w:rFonts w:ascii="Arial" w:eastAsia="Calibri" w:hAnsi="Arial" w:cs="Arial"/>
-          <w:sz w:val="26"/>
-          <w:szCs w:val="26"/>
-        </w:rPr>
-        <w:t>est</w:t>
-      </w:r>
-      <w:r>
-        <w:rPr>
-          <w:rFonts w:ascii="Arial" w:hAnsi="Arial" w:cs="Arial"/>
-          <w:sz w:val="26"/>
-          <w:szCs w:val="26"/>
-        </w:rPr>
-        <w:t xml:space="preserve"> </w:t>
-      </w:r>
-      <w:r>
-        <w:rPr>
-          <w:rFonts w:ascii="Arial" w:eastAsia="Calibri" w:hAnsi="Arial" w:cs="Arial"/>
-          <w:sz w:val="26"/>
-          <w:szCs w:val="26"/>
-        </w:rPr>
-        <w:t>garantie</w:t>
-      </w:r>
-      <w:r>
-        <w:rPr>
-          <w:rFonts w:ascii="Arial" w:hAnsi="Arial" w:cs="Arial"/>
-          <w:sz w:val="26"/>
-          <w:szCs w:val="26"/>
-        </w:rPr>
-        <w:t xml:space="preserve"> </w:t>
-      </w:r>
-      <w:r>
-        <w:rPr>
-          <w:rFonts w:ascii="Arial" w:eastAsia="Calibri" w:hAnsi="Arial" w:cs="Arial"/>
-          <w:sz w:val="26"/>
-          <w:szCs w:val="26"/>
-        </w:rPr>
-        <w:t>90</w:t>
-      </w:r>
-      <w:r>
-        <w:rPr>
-          <w:rFonts w:ascii="Arial" w:hAnsi="Arial" w:cs="Arial"/>
-          <w:sz w:val="26"/>
-          <w:szCs w:val="26"/>
-        </w:rPr>
-        <w:t xml:space="preserve"> </w:t>
-      </w:r>
-      <w:r>
-        <w:rPr>
-          <w:rFonts w:ascii="Arial" w:eastAsia="Calibri" w:hAnsi="Arial" w:cs="Arial"/>
-          <w:sz w:val="26"/>
-          <w:szCs w:val="26"/>
-        </w:rPr>
-        <w:t>jours</w:t>
-      </w:r>
-      <w:r>
-        <w:rPr>
-          <w:rFonts w:ascii="Arial" w:hAnsi="Arial" w:cs="Arial"/>
-          <w:sz w:val="26"/>
-          <w:szCs w:val="26"/>
-        </w:rPr>
-        <w:t xml:space="preserve"> </w:t>
-      </w:r>
-      <w:r>
-        <w:rPr>
-          <w:rFonts w:ascii="Arial" w:eastAsia="Calibri" w:hAnsi="Arial" w:cs="Arial"/>
-          <w:sz w:val="26"/>
-          <w:szCs w:val="26"/>
-        </w:rPr>
-        <w:t>à</w:t>
-      </w:r>
-      <w:r>
-        <w:rPr>
-          <w:rFonts w:ascii="Arial" w:hAnsi="Arial" w:cs="Arial"/>
-          <w:sz w:val="26"/>
-          <w:szCs w:val="26"/>
-        </w:rPr>
-        <w:t xml:space="preserve"> </w:t>
-      </w:r>
-      <w:r>
-        <w:rPr>
-          <w:rFonts w:ascii="Arial" w:eastAsia="Calibri" w:hAnsi="Arial" w:cs="Arial"/>
-          <w:sz w:val="26"/>
-          <w:szCs w:val="26"/>
-        </w:rPr>
-        <w:t>compter</w:t>
-      </w:r>
-      <w:r>
-        <w:rPr>
-          <w:rFonts w:ascii="Arial" w:hAnsi="Arial" w:cs="Arial"/>
-          <w:sz w:val="26"/>
-          <w:szCs w:val="26"/>
-        </w:rPr>
-        <w:t xml:space="preserve"> </w:t>
-      </w:r>
-      <w:r>
-        <w:rPr>
-          <w:rFonts w:ascii="Arial" w:eastAsia="Calibri" w:hAnsi="Arial" w:cs="Arial"/>
-          <w:sz w:val="26"/>
-          <w:szCs w:val="26"/>
-        </w:rPr>
-        <w:t>de</w:t>
-      </w:r>
-      <w:r>
-        <w:rPr>
-          <w:rFonts w:ascii="Arial" w:hAnsi="Arial" w:cs="Arial"/>
-          <w:sz w:val="26"/>
-          <w:szCs w:val="26"/>
-        </w:rPr>
-        <w:t xml:space="preserve"> </w:t>
-      </w:r>
-      <w:r>
-        <w:rPr>
-          <w:rFonts w:ascii="Arial" w:eastAsia="Calibri" w:hAnsi="Arial" w:cs="Arial"/>
-          <w:sz w:val="26"/>
-          <w:szCs w:val="26"/>
-        </w:rPr>
-        <w:t>sa</w:t>
-      </w:r>
-      <w:r>
-        <w:rPr>
-          <w:rFonts w:ascii="Arial" w:hAnsi="Arial" w:cs="Arial"/>
-          <w:sz w:val="26"/>
-          <w:szCs w:val="26"/>
-        </w:rPr>
-        <w:t xml:space="preserve"> </w:t>
-      </w:r>
-      <w:r>
-        <w:rPr>
-          <w:rFonts w:ascii="Arial" w:eastAsia="Calibri" w:hAnsi="Arial" w:cs="Arial"/>
-          <w:sz w:val="26"/>
-          <w:szCs w:val="26"/>
-        </w:rPr>
-        <w:t>réception</w:t>
-      </w:r>
-      <w:r>
-        <w:rPr>
-          <w:rFonts w:ascii="Arial" w:hAnsi="Arial" w:cs="Arial"/>
-          <w:sz w:val="26"/>
-          <w:szCs w:val="26"/>
-        </w:rPr>
-        <w:t xml:space="preserve"> </w:t>
-      </w:r>
-      <w:r>
-        <w:rPr>
-          <w:rFonts w:ascii="Arial" w:eastAsia="Calibri" w:hAnsi="Arial" w:cs="Arial"/>
-          <w:sz w:val="26"/>
-          <w:szCs w:val="26"/>
-        </w:rPr>
-        <w:t>par</w:t>
-      </w:r>
-      <w:r>
-        <w:rPr>
-          <w:rFonts w:ascii="Arial" w:hAnsi="Arial" w:cs="Arial"/>
-          <w:sz w:val="26"/>
-          <w:szCs w:val="26"/>
-        </w:rPr>
-        <w:t xml:space="preserve"> </w:t>
-      </w:r>
-      <w:r>
-        <w:rPr>
-          <w:rFonts w:ascii="Arial" w:eastAsia="Calibri" w:hAnsi="Arial" w:cs="Arial"/>
-          <w:sz w:val="26"/>
-          <w:szCs w:val="26"/>
-        </w:rPr>
-        <w:t>le</w:t>
-      </w:r>
-      <w:r>
-        <w:rPr>
-          <w:rFonts w:ascii="Arial" w:hAnsi="Arial" w:cs="Arial"/>
-          <w:sz w:val="26"/>
-          <w:szCs w:val="26"/>
-        </w:rPr>
-        <w:t xml:space="preserve"> </w:t>
-      </w:r>
-      <w:r>
-        <w:rPr>
-          <w:rFonts w:ascii="Arial" w:eastAsia="Calibri" w:hAnsi="Arial" w:cs="Arial"/>
-          <w:sz w:val="26"/>
-          <w:szCs w:val="26"/>
-        </w:rPr>
-        <w:t>client</w:t>
-      </w:r>
-      <w:r>
-        <w:rPr>
-          <w:rFonts w:ascii="Arial" w:hAnsi="Arial" w:cs="Arial"/>
-          <w:sz w:val="26"/>
-          <w:szCs w:val="26"/>
-        </w:rPr>
-        <w:t>.</w:t>
-      </w:r>
-    </w:p>
-    <w:p>
-      <w:pPr>
-        <w:rPr>
-          <w:rFonts w:ascii="Arial" w:hAnsi="Arial" w:cs="Arial"/>
-          <w:sz w:val="26"/>
-          <w:szCs w:val="26"/>
-        </w:rPr>
-      </w:pPr>
-      <w:bookmarkStart w:id="18" w:name="_GoBack"/>
-      <w:bookmarkEnd w:id="18"/>
     </w:p>
     <w:p>
       <w:pPr>
@@ -8893,6 +9249,7 @@
         <w:rPr>
           <w:rFonts w:ascii="Arial" w:hAnsi="Arial"/>
         </w:rPr>
+        <w:lastRenderedPageBreak/>
         <w:t xml:space="preserve"> </w:t>
       </w:r>
       <w:bookmarkStart w:id="24" w:name="_Toc491964564"/>
@@ -9556,7 +9913,6 @@
           <w:szCs w:val="26"/>
           <w:highlight w:val="yellow"/>
         </w:rPr>
-        <w:lastRenderedPageBreak/>
         <w:t>Aucun prêt de matériel n’est nécessaire à la réalisation de cette étude.</w:t>
       </w:r>
     </w:p>
@@ -11103,6 +11459,7 @@
           <w:sz w:val="26"/>
           <w:szCs w:val="26"/>
         </w:rPr>
+        <w:lastRenderedPageBreak/>
         <w:t xml:space="preserve">L’étude sera lancée </w:t>
       </w:r>
       <w:proofErr w:type="gramStart"/>
@@ -11281,7 +11638,6 @@
           <w:sz w:val="26"/>
           <w:szCs w:val="26"/>
         </w:rPr>
-        <w:lastRenderedPageBreak/>
         <w:t>Conformément</w:t>
       </w:r>
       <w:r>
@@ -21358,7 +21714,7 @@
               <w:noProof/>
               <w:sz w:val="24"/>
             </w:rPr>
-            <w:t>8</w:t>
+            <w:t>6</w:t>
           </w:r>
           <w:r>
             <w:rPr>

</xml_diff>

<commit_message>
Fixed all issues with doctypes
</commit_message>
<xml_diff>
--- a/flower_backend/doctypes/CETUDE.docx
+++ b/flower_backend/doctypes/CETUDE.docx
@@ -699,7 +699,6 @@
                 <w:rFonts w:ascii="Arial" w:eastAsia="Calibri" w:hAnsi="Arial" w:cs="Arial"/>
                 <w:color w:val="000000" w:themeColor="text1"/>
                 <w:szCs w:val="28"/>
-                <w:lang w:val="en-GB"/>
               </w:rPr>
             </w:pPr>
             <w:r>
@@ -707,72 +706,74 @@
                 <w:rFonts w:ascii="Arial" w:eastAsia="Calibri" w:hAnsi="Arial" w:cs="Arial"/>
                 <w:color w:val="000000" w:themeColor="text1"/>
                 <w:szCs w:val="28"/>
-                <w:lang w:val="en-GB"/>
-              </w:rPr>
-              <w:t>{{</w:t>
-            </w:r>
+              </w:rPr>
+              <w:t>{</w:t>
+            </w:r>
+            <w:proofErr w:type="gramStart"/>
             <w:r>
               <w:rPr>
                 <w:rFonts w:ascii="Arial" w:eastAsia="Calibri" w:hAnsi="Arial" w:cs="Arial"/>
                 <w:color w:val="000000" w:themeColor="text1"/>
                 <w:szCs w:val="28"/>
-                <w:lang w:val="en-GB"/>
-              </w:rPr>
-              <w:t xml:space="preserve"> </w:t>
-            </w:r>
-            <w:proofErr w:type="spellStart"/>
+              </w:rPr>
+              <w:t>{</w:t>
+            </w:r>
             <w:r>
               <w:rPr>
                 <w:rFonts w:ascii="Arial" w:eastAsia="Calibri" w:hAnsi="Arial" w:cs="Arial"/>
                 <w:color w:val="000000" w:themeColor="text1"/>
                 <w:szCs w:val="28"/>
-                <w:lang w:val="en-GB"/>
-              </w:rPr>
-              <w:t>e</w:t>
-            </w:r>
+              </w:rPr>
+              <w:t xml:space="preserve"> </w:t>
+            </w:r>
+            <w:proofErr w:type="spellStart"/>
             <w:r>
               <w:rPr>
                 <w:rFonts w:ascii="Arial" w:eastAsia="Calibri" w:hAnsi="Arial" w:cs="Arial"/>
                 <w:color w:val="000000" w:themeColor="text1"/>
                 <w:szCs w:val="28"/>
-                <w:lang w:val="en-GB"/>
-              </w:rPr>
-              <w:t>tude.</w:t>
+              </w:rPr>
+              <w:t>e</w:t>
             </w:r>
             <w:r>
               <w:rPr>
                 <w:rFonts w:ascii="Arial" w:eastAsia="Calibri" w:hAnsi="Arial" w:cs="Arial"/>
                 <w:color w:val="000000" w:themeColor="text1"/>
                 <w:szCs w:val="28"/>
-                <w:lang w:val="en-GB"/>
-              </w:rPr>
-              <w:t>projectManager</w:t>
+              </w:rPr>
+              <w:t>tude.</w:t>
             </w:r>
             <w:r>
               <w:rPr>
                 <w:rFonts w:ascii="Arial" w:eastAsia="Calibri" w:hAnsi="Arial" w:cs="Arial"/>
                 <w:color w:val="000000" w:themeColor="text1"/>
                 <w:szCs w:val="28"/>
-                <w:lang w:val="en-GB"/>
-              </w:rPr>
-              <w:t>.mail</w:t>
-            </w:r>
-            <w:proofErr w:type="spellEnd"/>
+              </w:rPr>
+              <w:t>projectManager</w:t>
+            </w:r>
             <w:r>
               <w:rPr>
                 <w:rFonts w:ascii="Arial" w:eastAsia="Calibri" w:hAnsi="Arial" w:cs="Arial"/>
                 <w:color w:val="000000" w:themeColor="text1"/>
                 <w:szCs w:val="28"/>
-                <w:lang w:val="en-GB"/>
-              </w:rPr>
-              <w:t xml:space="preserve"> </w:t>
-            </w:r>
+              </w:rPr>
+              <w:t>.mail</w:t>
+            </w:r>
+            <w:proofErr w:type="spellEnd"/>
+            <w:proofErr w:type="gramEnd"/>
             <w:r>
               <w:rPr>
                 <w:rFonts w:ascii="Arial" w:eastAsia="Calibri" w:hAnsi="Arial" w:cs="Arial"/>
                 <w:color w:val="000000" w:themeColor="text1"/>
                 <w:szCs w:val="28"/>
-                <w:lang w:val="en-GB"/>
+              </w:rPr>
+              <w:t xml:space="preserve"> </w:t>
+            </w:r>
+            <w:r>
+              <w:rPr>
+                <w:rFonts w:ascii="Arial" w:eastAsia="Calibri" w:hAnsi="Arial" w:cs="Arial"/>
+                <w:color w:val="000000" w:themeColor="text1"/>
+                <w:szCs w:val="28"/>
               </w:rPr>
               <w:t>}}</w:t>
             </w:r>
@@ -7669,296 +7670,21 @@
     <w:p>
       <w:pPr>
         <w:rPr>
-          <w:rFonts w:ascii="Arial" w:hAnsi="Arial" w:cs="Arial"/>
-          <w:sz w:val="26"/>
-          <w:szCs w:val="26"/>
-        </w:rPr>
-      </w:pPr>
-      <w:r>
-        <w:rPr>
-          <w:rFonts w:ascii="Arial" w:eastAsia="Calibri" w:hAnsi="Arial" w:cs="Arial"/>
-          <w:sz w:val="26"/>
-          <w:szCs w:val="26"/>
-        </w:rPr>
-        <w:t>La</w:t>
-      </w:r>
-      <w:r>
-        <w:rPr>
-          <w:rFonts w:ascii="Arial" w:hAnsi="Arial" w:cs="Arial"/>
-          <w:sz w:val="26"/>
-          <w:szCs w:val="26"/>
-        </w:rPr>
-        <w:t xml:space="preserve"> </w:t>
-      </w:r>
-      <w:r>
-        <w:rPr>
-          <w:rFonts w:ascii="Arial" w:eastAsia="Calibri" w:hAnsi="Arial" w:cs="Arial"/>
-          <w:sz w:val="26"/>
-          <w:szCs w:val="26"/>
-        </w:rPr>
-        <w:t>réalisation</w:t>
-      </w:r>
-      <w:r>
-        <w:rPr>
-          <w:rFonts w:ascii="Arial" w:hAnsi="Arial" w:cs="Arial"/>
-          <w:sz w:val="26"/>
-          <w:szCs w:val="26"/>
-        </w:rPr>
-        <w:t xml:space="preserve"> </w:t>
-      </w:r>
-      <w:r>
-        <w:rPr>
-          <w:rFonts w:ascii="Arial" w:eastAsia="Calibri" w:hAnsi="Arial" w:cs="Arial"/>
-          <w:sz w:val="26"/>
-          <w:szCs w:val="26"/>
-        </w:rPr>
-        <w:t>de</w:t>
-      </w:r>
-      <w:r>
-        <w:rPr>
-          <w:rFonts w:ascii="Arial" w:hAnsi="Arial" w:cs="Arial"/>
-          <w:sz w:val="26"/>
-          <w:szCs w:val="26"/>
-        </w:rPr>
-        <w:t xml:space="preserve"> </w:t>
-      </w:r>
-      <w:r>
-        <w:rPr>
-          <w:rFonts w:ascii="Arial" w:eastAsia="Calibri" w:hAnsi="Arial" w:cs="Arial"/>
-          <w:sz w:val="26"/>
-          <w:szCs w:val="26"/>
-        </w:rPr>
-        <w:t>cette</w:t>
-      </w:r>
-      <w:r>
-        <w:rPr>
-          <w:rFonts w:ascii="Arial" w:hAnsi="Arial" w:cs="Arial"/>
-          <w:sz w:val="26"/>
-          <w:szCs w:val="26"/>
-        </w:rPr>
-        <w:t xml:space="preserve"> </w:t>
-      </w:r>
-      <w:r>
-        <w:rPr>
-          <w:rFonts w:ascii="Arial" w:eastAsia="Calibri" w:hAnsi="Arial" w:cs="Arial"/>
-          <w:sz w:val="26"/>
-          <w:szCs w:val="26"/>
-        </w:rPr>
-        <w:t>étude</w:t>
-      </w:r>
-      <w:r>
-        <w:rPr>
-          <w:rFonts w:ascii="Arial" w:hAnsi="Arial" w:cs="Arial"/>
-          <w:sz w:val="26"/>
-          <w:szCs w:val="26"/>
-        </w:rPr>
-        <w:t xml:space="preserve"> </w:t>
-      </w:r>
-      <w:r>
-        <w:rPr>
-          <w:rFonts w:ascii="Arial" w:eastAsia="Calibri" w:hAnsi="Arial" w:cs="Arial"/>
-          <w:sz w:val="26"/>
-          <w:szCs w:val="26"/>
-        </w:rPr>
-        <w:t>se</w:t>
-      </w:r>
-      <w:r>
-        <w:rPr>
-          <w:rFonts w:ascii="Arial" w:hAnsi="Arial" w:cs="Arial"/>
-          <w:sz w:val="26"/>
-          <w:szCs w:val="26"/>
-        </w:rPr>
-        <w:t xml:space="preserve"> </w:t>
-      </w:r>
-      <w:r>
-        <w:rPr>
-          <w:rFonts w:ascii="Arial" w:eastAsia="Calibri" w:hAnsi="Arial" w:cs="Arial"/>
-          <w:sz w:val="26"/>
-          <w:szCs w:val="26"/>
-        </w:rPr>
-        <w:t>décompose</w:t>
-      </w:r>
-      <w:r>
-        <w:rPr>
-          <w:rFonts w:ascii="Arial" w:hAnsi="Arial" w:cs="Arial"/>
-          <w:sz w:val="26"/>
-          <w:szCs w:val="26"/>
-        </w:rPr>
-        <w:t xml:space="preserve"> </w:t>
-      </w:r>
-      <w:r>
-        <w:rPr>
-          <w:rFonts w:ascii="Arial" w:eastAsia="Calibri" w:hAnsi="Arial" w:cs="Arial"/>
-          <w:sz w:val="26"/>
-          <w:szCs w:val="26"/>
-        </w:rPr>
-        <w:t>en</w:t>
-      </w:r>
-      <w:r>
-        <w:rPr>
-          <w:rFonts w:ascii="Arial" w:hAnsi="Arial" w:cs="Arial"/>
-          <w:sz w:val="26"/>
-          <w:szCs w:val="26"/>
-        </w:rPr>
-        <w:t xml:space="preserve"> {</w:t>
-      </w:r>
-      <w:proofErr w:type="gramStart"/>
-      <w:r>
-        <w:rPr>
-          <w:rFonts w:ascii="Arial" w:hAnsi="Arial" w:cs="Arial"/>
-          <w:sz w:val="26"/>
-          <w:szCs w:val="26"/>
-        </w:rPr>
-        <w:t>{</w:t>
-      </w:r>
-      <w:r>
-        <w:rPr>
-          <w:rFonts w:ascii="Arial" w:hAnsi="Arial" w:cs="Arial"/>
-          <w:sz w:val="26"/>
-          <w:szCs w:val="26"/>
-        </w:rPr>
-        <w:t xml:space="preserve"> </w:t>
-      </w:r>
-      <w:proofErr w:type="spellStart"/>
-      <w:r>
-        <w:rPr>
-          <w:rFonts w:ascii="Arial" w:hAnsi="Arial" w:cs="Arial"/>
-          <w:sz w:val="26"/>
-          <w:szCs w:val="26"/>
-        </w:rPr>
-        <w:t>etude.</w:t>
-      </w:r>
-      <w:r>
-        <w:rPr>
-          <w:rFonts w:ascii="Arial" w:hAnsi="Arial" w:cs="Arial"/>
-          <w:sz w:val="26"/>
-          <w:szCs w:val="26"/>
-        </w:rPr>
-        <w:t>groupe</w:t>
-      </w:r>
-      <w:proofErr w:type="gramEnd"/>
-      <w:r>
-        <w:rPr>
-          <w:rFonts w:ascii="Arial" w:hAnsi="Arial" w:cs="Arial"/>
-          <w:sz w:val="26"/>
-          <w:szCs w:val="26"/>
-        </w:rPr>
-        <w:t>_set.</w:t>
-      </w:r>
-      <w:r>
-        <w:rPr>
-          <w:rFonts w:ascii="Arial" w:hAnsi="Arial" w:cs="Arial"/>
-          <w:sz w:val="26"/>
-          <w:szCs w:val="26"/>
-        </w:rPr>
-        <w:t>all</w:t>
-      </w:r>
-      <w:proofErr w:type="spellEnd"/>
-      <w:r>
-        <w:rPr>
-          <w:rFonts w:ascii="Arial" w:hAnsi="Arial" w:cs="Arial"/>
-          <w:sz w:val="26"/>
-          <w:szCs w:val="26"/>
-        </w:rPr>
-        <w:t>()</w:t>
-      </w:r>
-      <w:r>
-        <w:rPr>
-          <w:rFonts w:ascii="Arial" w:hAnsi="Arial" w:cs="Arial"/>
-          <w:sz w:val="26"/>
-          <w:szCs w:val="26"/>
-        </w:rPr>
-        <w:t xml:space="preserve"> | </w:t>
-      </w:r>
-      <w:proofErr w:type="spellStart"/>
-      <w:r>
-        <w:rPr>
-          <w:rFonts w:ascii="Arial" w:hAnsi="Arial" w:cs="Arial"/>
-          <w:sz w:val="26"/>
-          <w:szCs w:val="26"/>
-        </w:rPr>
-        <w:t>length</w:t>
-      </w:r>
-      <w:proofErr w:type="spellEnd"/>
-      <w:r>
-        <w:rPr>
-          <w:rFonts w:ascii="Arial" w:hAnsi="Arial" w:cs="Arial"/>
-          <w:sz w:val="26"/>
-          <w:szCs w:val="26"/>
-        </w:rPr>
-        <w:t xml:space="preserve"> </w:t>
-      </w:r>
-      <w:r>
-        <w:rPr>
-          <w:rFonts w:ascii="Arial" w:hAnsi="Arial" w:cs="Arial"/>
-          <w:sz w:val="26"/>
-          <w:szCs w:val="26"/>
-        </w:rPr>
-        <w:t xml:space="preserve">}} </w:t>
-      </w:r>
-      <w:r>
-        <w:rPr>
-          <w:rFonts w:ascii="Arial" w:eastAsia="Calibri" w:hAnsi="Arial" w:cs="Arial"/>
-          <w:sz w:val="26"/>
-          <w:szCs w:val="26"/>
-        </w:rPr>
-        <w:t>phases</w:t>
-      </w:r>
-      <w:r>
-        <w:rPr>
-          <w:rFonts w:ascii="Arial" w:hAnsi="Arial" w:cs="Arial"/>
-          <w:sz w:val="26"/>
-          <w:szCs w:val="26"/>
-        </w:rPr>
-        <w:t>.</w:t>
-      </w:r>
-      <w:bookmarkStart w:id="14" w:name="_Toc90975048"/>
-      <w:bookmarkStart w:id="15" w:name="_Toc89784131"/>
-    </w:p>
-    <w:p>
-      <w:pPr>
-        <w:rPr>
-          <w:rFonts w:ascii="Arial" w:hAnsi="Arial" w:cs="Arial"/>
-          <w:szCs w:val="28"/>
-        </w:rPr>
-      </w:pPr>
-    </w:p>
-    <w:p>
-      <w:pPr>
-        <w:pStyle w:val="Titre2"/>
-        <w:rPr>
-          <w:rFonts w:ascii="Arial" w:hAnsi="Arial"/>
-        </w:rPr>
-      </w:pPr>
-      <w:r>
-        <w:rPr>
-          <w:rFonts w:ascii="Arial" w:hAnsi="Arial"/>
-        </w:rPr>
-        <w:t xml:space="preserve"> </w:t>
-      </w:r>
-      <w:r>
-        <w:rPr>
-          <w:rFonts w:ascii="Arial" w:eastAsia="Calibri" w:hAnsi="Arial"/>
-        </w:rPr>
-        <w:t>Phases</w:t>
-      </w:r>
-    </w:p>
-    <w:p>
-      <w:pPr>
-        <w:rPr>
           <w:rFonts w:ascii="Arial" w:eastAsia="Arial" w:hAnsi="Arial" w:cs="Arial"/>
           <w:b/>
           <w:i/>
           <w:color w:val="021A32"/>
-          <w:sz w:val="22"/>
-          <w:szCs w:val="22"/>
-        </w:rPr>
-      </w:pPr>
+          <w:sz w:val="26"/>
+          <w:szCs w:val="26"/>
+        </w:rPr>
+      </w:pPr>
+      <w:bookmarkStart w:id="14" w:name="_Toc90975048"/>
+      <w:bookmarkStart w:id="15" w:name="_Toc89784131"/>
       <w:r>
         <w:rPr>
           <w:rFonts w:ascii="Arial" w:eastAsia="Helvetica Neue" w:hAnsi="Arial" w:cs="Arial"/>
-          <w:sz w:val="22"/>
-          <w:szCs w:val="22"/>
+          <w:sz w:val="26"/>
+          <w:szCs w:val="26"/>
         </w:rPr>
         <w:t>La réalisation de cette étude se décompose en {</w:t>
       </w:r>
@@ -7966,100 +7692,138 @@
       <w:r>
         <w:rPr>
           <w:rFonts w:ascii="Arial" w:eastAsia="Helvetica Neue" w:hAnsi="Arial" w:cs="Arial"/>
-          <w:sz w:val="22"/>
-          <w:szCs w:val="22"/>
-        </w:rPr>
-        <w:t>{</w:t>
-      </w:r>
+          <w:sz w:val="26"/>
+          <w:szCs w:val="26"/>
+        </w:rPr>
+        <w:t xml:space="preserve">{ </w:t>
+      </w:r>
+      <w:proofErr w:type="spellStart"/>
       <w:r>
         <w:rPr>
           <w:rFonts w:ascii="Arial" w:eastAsia="Helvetica Neue" w:hAnsi="Arial" w:cs="Arial"/>
-          <w:sz w:val="22"/>
-          <w:szCs w:val="22"/>
-        </w:rPr>
-        <w:t xml:space="preserve"> </w:t>
+          <w:sz w:val="26"/>
+          <w:szCs w:val="26"/>
+        </w:rPr>
+        <w:t>etude.currentGroupes.groupe</w:t>
+      </w:r>
+      <w:proofErr w:type="gramEnd"/>
+      <w:r>
+        <w:rPr>
+          <w:rFonts w:ascii="Arial" w:eastAsia="Helvetica Neue" w:hAnsi="Arial" w:cs="Arial"/>
+          <w:sz w:val="26"/>
+          <w:szCs w:val="26"/>
+        </w:rPr>
+        <w:t>_set.values</w:t>
+      </w:r>
+      <w:proofErr w:type="spellEnd"/>
+      <w:r>
+        <w:rPr>
+          <w:rFonts w:ascii="Arial" w:eastAsia="Helvetica Neue" w:hAnsi="Arial" w:cs="Arial"/>
+          <w:sz w:val="26"/>
+          <w:szCs w:val="26"/>
+        </w:rPr>
+        <w:t xml:space="preserve">() | </w:t>
       </w:r>
       <w:proofErr w:type="spellStart"/>
       <w:r>
         <w:rPr>
           <w:rFonts w:ascii="Arial" w:eastAsia="Helvetica Neue" w:hAnsi="Arial" w:cs="Arial"/>
-          <w:sz w:val="22"/>
-          <w:szCs w:val="22"/>
-        </w:rPr>
-        <w:t>etude.group</w:t>
-      </w:r>
+          <w:sz w:val="26"/>
+          <w:szCs w:val="26"/>
+        </w:rPr>
+        <w:t>length</w:t>
+      </w:r>
+      <w:proofErr w:type="spellEnd"/>
       <w:r>
         <w:rPr>
           <w:rFonts w:ascii="Arial" w:eastAsia="Helvetica Neue" w:hAnsi="Arial" w:cs="Arial"/>
-          <w:sz w:val="22"/>
-          <w:szCs w:val="22"/>
-        </w:rPr>
-        <w:t>e</w:t>
-      </w:r>
-      <w:proofErr w:type="gramEnd"/>
+          <w:sz w:val="26"/>
+          <w:szCs w:val="26"/>
+        </w:rPr>
+        <w:t xml:space="preserve"> }} groupe</w:t>
+      </w:r>
       <w:r>
         <w:rPr>
           <w:rFonts w:ascii="Arial" w:eastAsia="Helvetica Neue" w:hAnsi="Arial" w:cs="Arial"/>
-          <w:sz w:val="22"/>
-          <w:szCs w:val="22"/>
-        </w:rPr>
-        <w:t>_set.values</w:t>
+          <w:sz w:val="26"/>
+          <w:szCs w:val="26"/>
+          <w:highlight w:val="yellow"/>
+        </w:rPr>
+        <w:t>s</w:t>
+      </w:r>
+      <w:r>
+        <w:rPr>
+          <w:rFonts w:ascii="Arial" w:eastAsia="Helvetica Neue" w:hAnsi="Arial" w:cs="Arial"/>
+          <w:sz w:val="26"/>
+          <w:szCs w:val="26"/>
+        </w:rPr>
+        <w:t xml:space="preserve"> pour un total de {{ </w:t>
+      </w:r>
+      <w:proofErr w:type="spellStart"/>
+      <w:r>
+        <w:rPr>
+          <w:rFonts w:ascii="Arial" w:eastAsia="Helvetica Neue" w:hAnsi="Arial" w:cs="Arial"/>
+          <w:sz w:val="26"/>
+          <w:szCs w:val="26"/>
+        </w:rPr>
+        <w:t>etude.nbPhases</w:t>
       </w:r>
       <w:proofErr w:type="spellEnd"/>
       <w:r>
         <w:rPr>
           <w:rFonts w:ascii="Arial" w:eastAsia="Helvetica Neue" w:hAnsi="Arial" w:cs="Arial"/>
-          <w:sz w:val="22"/>
-          <w:szCs w:val="22"/>
-        </w:rPr>
-        <w:t xml:space="preserve">() | </w:t>
-      </w:r>
-      <w:proofErr w:type="spellStart"/>
+          <w:sz w:val="26"/>
+          <w:szCs w:val="26"/>
+        </w:rPr>
+        <w:t xml:space="preserve"> }} phase</w:t>
+      </w:r>
       <w:r>
         <w:rPr>
           <w:rFonts w:ascii="Arial" w:eastAsia="Helvetica Neue" w:hAnsi="Arial" w:cs="Arial"/>
-          <w:sz w:val="22"/>
-          <w:szCs w:val="22"/>
-        </w:rPr>
-        <w:t>length</w:t>
-      </w:r>
-      <w:proofErr w:type="spellEnd"/>
+          <w:sz w:val="26"/>
+          <w:szCs w:val="26"/>
+          <w:highlight w:val="yellow"/>
+        </w:rPr>
+        <w:t>s</w:t>
+      </w:r>
       <w:r>
         <w:rPr>
           <w:rFonts w:ascii="Arial" w:eastAsia="Helvetica Neue" w:hAnsi="Arial" w:cs="Arial"/>
-          <w:sz w:val="22"/>
-          <w:szCs w:val="22"/>
-        </w:rPr>
-        <w:t xml:space="preserve"> </w:t>
-      </w:r>
-      <w:r>
-        <w:rPr>
-          <w:rFonts w:ascii="Arial" w:eastAsia="Helvetica Neue" w:hAnsi="Arial" w:cs="Arial"/>
-          <w:sz w:val="22"/>
-          <w:szCs w:val="22"/>
-        </w:rPr>
-        <w:t>}} phases :</w:t>
+          <w:sz w:val="26"/>
+          <w:szCs w:val="26"/>
+        </w:rPr>
+        <w:t xml:space="preserve"> :</w:t>
       </w:r>
     </w:p>
     <w:p>
       <w:pPr>
-        <w:rPr>
-          <w:rFonts w:ascii="Arial" w:eastAsia="Arial" w:hAnsi="Arial" w:cs="Arial"/>
-          <w:b/>
-          <w:sz w:val="24"/>
-          <w:szCs w:val="22"/>
-        </w:rPr>
-      </w:pPr>
-      <w:r>
+        <w:pStyle w:val="Titre2"/>
+        <w:rPr>
+          <w:rFonts w:ascii="Arial" w:hAnsi="Arial"/>
+        </w:rPr>
+      </w:pPr>
+      <w:r>
+        <w:rPr>
+          <w:rFonts w:ascii="Arial" w:hAnsi="Arial"/>
+        </w:rPr>
+        <w:t xml:space="preserve"> </w:t>
+      </w:r>
+      <w:r>
+        <w:rPr>
+          <w:rFonts w:ascii="Arial" w:eastAsia="Calibri" w:hAnsi="Arial"/>
+        </w:rPr>
+        <w:t>Phases</w:t>
+      </w:r>
+    </w:p>
+    <w:p>
+      <w:pPr>
         <w:rPr>
           <w:rFonts w:ascii="Arial" w:eastAsia="Arial" w:hAnsi="Arial" w:cs="Arial"/>
           <w:b/>
           <w:sz w:val="22"/>
           <w:szCs w:val="22"/>
         </w:rPr>
-        <w:t xml:space="preserve">{%for groupe in </w:t>
-      </w:r>
-      <w:proofErr w:type="spellStart"/>
+      </w:pPr>
       <w:r>
         <w:rPr>
           <w:rFonts w:ascii="Arial" w:eastAsia="Arial" w:hAnsi="Arial" w:cs="Arial"/>
@@ -8067,9 +7831,9 @@
           <w:sz w:val="22"/>
           <w:szCs w:val="22"/>
         </w:rPr>
-        <w:t>etude.groupe_</w:t>
-      </w:r>
-      <w:proofErr w:type="gramStart"/>
+        <w:t xml:space="preserve">{%for groupe in </w:t>
+      </w:r>
+      <w:proofErr w:type="spellStart"/>
       <w:r>
         <w:rPr>
           <w:rFonts w:ascii="Arial" w:eastAsia="Arial" w:hAnsi="Arial" w:cs="Arial"/>
@@ -8077,9 +7841,9 @@
           <w:sz w:val="22"/>
           <w:szCs w:val="22"/>
         </w:rPr>
-        <w:t>set.iterator</w:t>
-      </w:r>
-      <w:proofErr w:type="spellEnd"/>
+        <w:t>etude.currentGroupes.groupe_</w:t>
+      </w:r>
+      <w:proofErr w:type="gramStart"/>
       <w:r>
         <w:rPr>
           <w:rFonts w:ascii="Arial" w:eastAsia="Arial" w:hAnsi="Arial" w:cs="Arial"/>
@@ -8087,9 +7851,9 @@
           <w:sz w:val="22"/>
           <w:szCs w:val="22"/>
         </w:rPr>
-        <w:t>(</w:t>
-      </w:r>
-      <w:proofErr w:type="gramEnd"/>
+        <w:t>set.iterator</w:t>
+      </w:r>
+      <w:proofErr w:type="spellEnd"/>
       <w:r>
         <w:rPr>
           <w:rFonts w:ascii="Arial" w:eastAsia="Arial" w:hAnsi="Arial" w:cs="Arial"/>
@@ -8097,9 +7861,9 @@
           <w:sz w:val="22"/>
           <w:szCs w:val="22"/>
         </w:rPr>
-        <w:t>) | sort(</w:t>
-      </w:r>
-      <w:proofErr w:type="spellStart"/>
+        <w:t>(</w:t>
+      </w:r>
+      <w:proofErr w:type="gramEnd"/>
       <w:r>
         <w:rPr>
           <w:rFonts w:ascii="Arial" w:eastAsia="Arial" w:hAnsi="Arial" w:cs="Arial"/>
@@ -8107,9 +7871,9 @@
           <w:sz w:val="22"/>
           <w:szCs w:val="22"/>
         </w:rPr>
-        <w:t>attribute</w:t>
-      </w:r>
-      <w:proofErr w:type="spellEnd"/>
+        <w:t>) | sort(</w:t>
+      </w:r>
+      <w:proofErr w:type="spellStart"/>
       <w:r>
         <w:rPr>
           <w:rFonts w:ascii="Arial" w:eastAsia="Arial" w:hAnsi="Arial" w:cs="Arial"/>
@@ -8117,86 +7881,9 @@
           <w:sz w:val="22"/>
           <w:szCs w:val="22"/>
         </w:rPr>
-        <w:t>=’index’) %}</w:t>
-      </w:r>
-      <w:r>
-        <w:rPr>
-          <w:rFonts w:ascii="Arial" w:eastAsia="Arial" w:hAnsi="Arial" w:cs="Arial"/>
-          <w:b/>
-          <w:sz w:val="24"/>
-          <w:szCs w:val="22"/>
-        </w:rPr>
-        <w:t>Groupe</w:t>
-      </w:r>
-      <w:r>
-        <w:rPr>
-          <w:rFonts w:ascii="Arial" w:eastAsia="Arial" w:hAnsi="Arial" w:cs="Arial"/>
-          <w:b/>
-          <w:sz w:val="24"/>
-          <w:szCs w:val="22"/>
-        </w:rPr>
-        <w:t xml:space="preserve"> {{</w:t>
-      </w:r>
-      <w:proofErr w:type="spellStart"/>
-      <w:r>
-        <w:rPr>
-          <w:rFonts w:ascii="Arial" w:eastAsia="Arial" w:hAnsi="Arial" w:cs="Arial"/>
-          <w:b/>
-          <w:sz w:val="24"/>
-          <w:szCs w:val="22"/>
-        </w:rPr>
-        <w:t>loop.index</w:t>
+        <w:t>attribute</w:t>
       </w:r>
       <w:proofErr w:type="spellEnd"/>
-      <w:r>
-        <w:rPr>
-          <w:rFonts w:ascii="Arial" w:eastAsia="Arial" w:hAnsi="Arial" w:cs="Arial"/>
-          <w:b/>
-          <w:sz w:val="24"/>
-          <w:szCs w:val="22"/>
-        </w:rPr>
-        <w:t>}} : {</w:t>
-      </w:r>
-      <w:proofErr w:type="gramStart"/>
-      <w:r>
-        <w:rPr>
-          <w:rFonts w:ascii="Arial" w:eastAsia="Arial" w:hAnsi="Arial" w:cs="Arial"/>
-          <w:b/>
-          <w:sz w:val="24"/>
-          <w:szCs w:val="22"/>
-        </w:rPr>
-        <w:t xml:space="preserve">{ </w:t>
-      </w:r>
-      <w:proofErr w:type="spellStart"/>
-      <w:r>
-        <w:rPr>
-          <w:rFonts w:ascii="Arial" w:eastAsia="Arial" w:hAnsi="Arial" w:cs="Arial"/>
-          <w:b/>
-          <w:sz w:val="24"/>
-          <w:szCs w:val="22"/>
-        </w:rPr>
-        <w:t>groupe.title</w:t>
-      </w:r>
-      <w:proofErr w:type="spellEnd"/>
-      <w:proofErr w:type="gramEnd"/>
-      <w:r>
-        <w:rPr>
-          <w:rFonts w:ascii="Arial" w:eastAsia="Arial" w:hAnsi="Arial" w:cs="Arial"/>
-          <w:b/>
-          <w:sz w:val="24"/>
-          <w:szCs w:val="22"/>
-        </w:rPr>
-        <w:t xml:space="preserve"> }}</w:t>
-      </w:r>
-    </w:p>
-    <w:p>
-      <w:pPr>
-        <w:rPr>
-          <w:rFonts w:ascii="Arial" w:eastAsia="Arial" w:hAnsi="Arial" w:cs="Arial"/>
-          <w:sz w:val="22"/>
-          <w:szCs w:val="22"/>
-        </w:rPr>
-      </w:pPr>
       <w:r>
         <w:rPr>
           <w:rFonts w:ascii="Arial" w:eastAsia="Arial" w:hAnsi="Arial" w:cs="Arial"/>
@@ -8204,46 +7891,100 @@
           <w:sz w:val="22"/>
           <w:szCs w:val="22"/>
         </w:rPr>
-        <w:t>Description :</w:t>
+        <w:t>=’index’) %}</w:t>
       </w:r>
       <w:r>
         <w:rPr>
           <w:rFonts w:ascii="Arial" w:eastAsia="Arial" w:hAnsi="Arial" w:cs="Arial"/>
+          <w:b/>
+          <w:szCs w:val="22"/>
+        </w:rPr>
+        <w:t>Groupe {{</w:t>
+      </w:r>
+      <w:proofErr w:type="spellStart"/>
+      <w:r>
+        <w:rPr>
+          <w:rFonts w:ascii="Arial" w:eastAsia="Arial" w:hAnsi="Arial" w:cs="Arial"/>
+          <w:b/>
+          <w:szCs w:val="22"/>
+        </w:rPr>
+        <w:t>loop.index</w:t>
+      </w:r>
+      <w:proofErr w:type="spellEnd"/>
+      <w:r>
+        <w:rPr>
+          <w:rFonts w:ascii="Arial" w:eastAsia="Arial" w:hAnsi="Arial" w:cs="Arial"/>
+          <w:b/>
+          <w:szCs w:val="22"/>
+        </w:rPr>
+        <w:t>}} : {</w:t>
+      </w:r>
+      <w:proofErr w:type="gramStart"/>
+      <w:r>
+        <w:rPr>
+          <w:rFonts w:ascii="Arial" w:eastAsia="Arial" w:hAnsi="Arial" w:cs="Arial"/>
+          <w:b/>
+          <w:szCs w:val="22"/>
+        </w:rPr>
+        <w:t xml:space="preserve">{ </w:t>
+      </w:r>
+      <w:proofErr w:type="spellStart"/>
+      <w:r>
+        <w:rPr>
+          <w:rFonts w:ascii="Arial" w:eastAsia="Arial" w:hAnsi="Arial" w:cs="Arial"/>
+          <w:b/>
+          <w:szCs w:val="22"/>
+        </w:rPr>
+        <w:t>groupe.title</w:t>
+      </w:r>
+      <w:proofErr w:type="spellEnd"/>
+      <w:proofErr w:type="gramEnd"/>
+      <w:r>
+        <w:rPr>
+          <w:rFonts w:ascii="Arial" w:eastAsia="Arial" w:hAnsi="Arial" w:cs="Arial"/>
+          <w:b/>
+          <w:szCs w:val="22"/>
+        </w:rPr>
+        <w:t xml:space="preserve"> }}</w:t>
+      </w:r>
+    </w:p>
+    <w:p>
+      <w:pPr>
+        <w:rPr>
+          <w:rFonts w:ascii="Arial" w:eastAsia="Arial" w:hAnsi="Arial" w:cs="Arial"/>
+          <w:b/>
           <w:sz w:val="22"/>
           <w:szCs w:val="22"/>
         </w:rPr>
-        <w:t xml:space="preserve"> {</w:t>
-      </w:r>
+      </w:pPr>
+    </w:p>
+    <w:p>
+      <w:pPr>
+        <w:rPr>
+          <w:rFonts w:ascii="Arial" w:eastAsia="Arial" w:hAnsi="Arial" w:cs="Arial"/>
+          <w:szCs w:val="22"/>
+          <w:lang w:val="en-GB"/>
+        </w:rPr>
+      </w:pPr>
       <w:proofErr w:type="gramStart"/>
       <w:r>
         <w:rPr>
           <w:rFonts w:ascii="Arial" w:eastAsia="Arial" w:hAnsi="Arial" w:cs="Arial"/>
-          <w:sz w:val="22"/>
+          <w:b/>
           <w:szCs w:val="22"/>
-        </w:rPr>
-        <w:t xml:space="preserve">{ </w:t>
-      </w:r>
-      <w:proofErr w:type="spellStart"/>
+          <w:lang w:val="en-GB"/>
+        </w:rPr>
+        <w:t>Description :</w:t>
+      </w:r>
+      <w:proofErr w:type="gramEnd"/>
       <w:r>
         <w:rPr>
           <w:rFonts w:ascii="Arial" w:eastAsia="Arial" w:hAnsi="Arial" w:cs="Arial"/>
-          <w:sz w:val="22"/>
           <w:szCs w:val="22"/>
-        </w:rPr>
-        <w:t>groupe.description</w:t>
-      </w:r>
-      <w:proofErr w:type="spellEnd"/>
-      <w:proofErr w:type="gramEnd"/>
-      <w:r>
-        <w:rPr>
-          <w:rFonts w:ascii="Arial" w:eastAsia="Arial" w:hAnsi="Arial" w:cs="Arial"/>
-          <w:sz w:val="22"/>
-          <w:szCs w:val="22"/>
-        </w:rPr>
-        <w:t xml:space="preserve"> }}</w:t>
-      </w:r>
-      <w:bookmarkStart w:id="16" w:name="_gjdgxs" w:colFirst="0" w:colLast="0"/>
-      <w:bookmarkEnd w:id="16"/>
+          <w:lang w:val="en-GB"/>
+        </w:rPr>
+        <w:t xml:space="preserve"> </w:t>
+      </w:r>
     </w:p>
     <w:p>
       <w:pPr>
@@ -8257,62 +7998,32 @@
       <w:r>
         <w:rPr>
           <w:rFonts w:ascii="Arial" w:eastAsia="Arial" w:hAnsi="Arial" w:cs="Arial"/>
-          <w:b/>
           <w:sz w:val="22"/>
           <w:szCs w:val="22"/>
-        </w:rPr>
-        <w:t>Objectifs :</w:t>
-      </w:r>
-      <w:r>
-        <w:rPr>
-          <w:rFonts w:ascii="Arial" w:eastAsia="Arial" w:hAnsi="Arial" w:cs="Arial"/>
-          <w:sz w:val="22"/>
-          <w:szCs w:val="22"/>
-        </w:rPr>
-        <w:t xml:space="preserve"> </w:t>
-      </w:r>
-      <w:r>
-        <w:rPr>
-          <w:rFonts w:ascii="Arial" w:eastAsia="Arial" w:hAnsi="Arial" w:cs="Arial"/>
-          <w:sz w:val="22"/>
-          <w:szCs w:val="22"/>
-          <w:highlight w:val="yellow"/>
           <w:lang w:val="en-GB"/>
         </w:rPr>
-        <w:t>TODO</w:t>
-      </w:r>
-      <w:r>
-        <w:rPr>
-          <w:rFonts w:ascii="Arial" w:eastAsia="Arial" w:hAnsi="Arial" w:cs="Arial"/>
-          <w:sz w:val="22"/>
-          <w:szCs w:val="22"/>
-          <w:highlight w:val="yellow"/>
-          <w:lang w:val="en-GB"/>
-        </w:rPr>
-        <w:t> !!</w:t>
-      </w:r>
-    </w:p>
-    <w:p>
-      <w:pPr>
+        <w:tab/>
+      </w:r>
+      <w:r>
         <w:rPr>
           <w:rFonts w:ascii="Arial" w:eastAsia="Arial" w:hAnsi="Arial" w:cs="Arial"/>
           <w:sz w:val="22"/>
           <w:szCs w:val="22"/>
           <w:lang w:val="en-GB"/>
         </w:rPr>
-      </w:pPr>
-      <w:bookmarkStart w:id="17" w:name="_GoBack"/>
-      <w:bookmarkEnd w:id="17"/>
-    </w:p>
-    <w:p>
-      <w:pPr>
+        <w:t>{</w:t>
+      </w:r>
+      <w:proofErr w:type="gramStart"/>
+      <w:r>
         <w:rPr>
           <w:rFonts w:ascii="Arial" w:eastAsia="Arial" w:hAnsi="Arial" w:cs="Arial"/>
           <w:sz w:val="22"/>
           <w:szCs w:val="22"/>
           <w:lang w:val="en-GB"/>
         </w:rPr>
-      </w:pPr>
+        <w:t xml:space="preserve">{ </w:t>
+      </w:r>
+      <w:proofErr w:type="spellStart"/>
       <w:r>
         <w:rPr>
           <w:rFonts w:ascii="Arial" w:eastAsia="Arial" w:hAnsi="Arial" w:cs="Arial"/>
@@ -8320,9 +8031,10 @@
           <w:szCs w:val="22"/>
           <w:lang w:val="en-GB"/>
         </w:rPr>
-        <w:t xml:space="preserve">{% for phase in </w:t>
-      </w:r>
-      <w:proofErr w:type="spellStart"/>
+        <w:t>groupe.description</w:t>
+      </w:r>
+      <w:proofErr w:type="spellEnd"/>
+      <w:proofErr w:type="gramEnd"/>
       <w:r>
         <w:rPr>
           <w:rFonts w:ascii="Arial" w:eastAsia="Arial" w:hAnsi="Arial" w:cs="Arial"/>
@@ -8330,19 +8042,20 @@
           <w:szCs w:val="22"/>
           <w:lang w:val="en-GB"/>
         </w:rPr>
-        <w:t>groupe.phase_</w:t>
-      </w:r>
-      <w:proofErr w:type="gramStart"/>
-      <w:r>
+        <w:t xml:space="preserve"> }}</w:t>
+      </w:r>
+    </w:p>
+    <w:p>
+      <w:pPr>
         <w:rPr>
           <w:rFonts w:ascii="Arial" w:eastAsia="Arial" w:hAnsi="Arial" w:cs="Arial"/>
           <w:sz w:val="22"/>
           <w:szCs w:val="22"/>
           <w:lang w:val="en-GB"/>
         </w:rPr>
-        <w:t>set.iterator</w:t>
-      </w:r>
-      <w:proofErr w:type="spellEnd"/>
+      </w:pPr>
+      <w:bookmarkStart w:id="16" w:name="_gjdgxs" w:colFirst="0" w:colLast="0"/>
+      <w:bookmarkEnd w:id="16"/>
       <w:r>
         <w:rPr>
           <w:rFonts w:ascii="Arial" w:eastAsia="Arial" w:hAnsi="Arial" w:cs="Arial"/>
@@ -8350,9 +8063,9 @@
           <w:szCs w:val="22"/>
           <w:lang w:val="en-GB"/>
         </w:rPr>
-        <w:t>(</w:t>
-      </w:r>
-      <w:proofErr w:type="gramEnd"/>
+        <w:t xml:space="preserve">{%for phase in </w:t>
+      </w:r>
+      <w:proofErr w:type="spellStart"/>
       <w:r>
         <w:rPr>
           <w:rFonts w:ascii="Arial" w:eastAsia="Arial" w:hAnsi="Arial" w:cs="Arial"/>
@@ -8360,8 +8073,48 @@
           <w:szCs w:val="22"/>
           <w:lang w:val="en-GB"/>
         </w:rPr>
-        <w:t>) %}</w:t>
-      </w:r>
+        <w:t>groupe.phase_</w:t>
+      </w:r>
+      <w:proofErr w:type="gramStart"/>
+      <w:r>
+        <w:rPr>
+          <w:rFonts w:ascii="Arial" w:eastAsia="Arial" w:hAnsi="Arial" w:cs="Arial"/>
+          <w:sz w:val="22"/>
+          <w:szCs w:val="22"/>
+          <w:lang w:val="en-GB"/>
+        </w:rPr>
+        <w:t>set.values</w:t>
+      </w:r>
+      <w:proofErr w:type="spellEnd"/>
+      <w:r>
+        <w:rPr>
+          <w:rFonts w:ascii="Arial" w:eastAsia="Arial" w:hAnsi="Arial" w:cs="Arial"/>
+          <w:sz w:val="22"/>
+          <w:szCs w:val="22"/>
+          <w:lang w:val="en-GB"/>
+        </w:rPr>
+        <w:t>(</w:t>
+      </w:r>
+      <w:proofErr w:type="gramEnd"/>
+      <w:r>
+        <w:rPr>
+          <w:rFonts w:ascii="Arial" w:eastAsia="Arial" w:hAnsi="Arial" w:cs="Arial"/>
+          <w:sz w:val="22"/>
+          <w:szCs w:val="22"/>
+          <w:lang w:val="en-GB"/>
+        </w:rPr>
+        <w:t>) | sort(attribute=’index’) %}</w:t>
+      </w:r>
+    </w:p>
+    <w:p>
+      <w:pPr>
+        <w:rPr>
+          <w:rFonts w:ascii="Arial" w:eastAsia="Arial" w:hAnsi="Arial" w:cs="Arial"/>
+          <w:sz w:val="22"/>
+          <w:szCs w:val="22"/>
+          <w:lang w:val="en-GB"/>
+        </w:rPr>
+      </w:pPr>
       <w:r>
         <w:rPr>
           <w:rFonts w:ascii="Arial" w:eastAsia="Arial" w:hAnsi="Arial" w:cs="Arial"/>
@@ -8370,9 +8123,9 @@
           <w:szCs w:val="22"/>
           <w:lang w:val="en-GB"/>
         </w:rPr>
-        <w:t>Phase {{</w:t>
-      </w:r>
-      <w:proofErr w:type="spellStart"/>
+        <w:lastRenderedPageBreak/>
+        <w:t>Phase</w:t>
+      </w:r>
       <w:r>
         <w:rPr>
           <w:rFonts w:ascii="Arial" w:eastAsia="Arial" w:hAnsi="Arial" w:cs="Arial"/>
@@ -8381,9 +8134,8 @@
           <w:szCs w:val="22"/>
           <w:lang w:val="en-GB"/>
         </w:rPr>
-        <w:t>loop.index</w:t>
-      </w:r>
-      <w:proofErr w:type="spellEnd"/>
+        <w:t xml:space="preserve"> </w:t>
+      </w:r>
       <w:r>
         <w:rPr>
           <w:rFonts w:ascii="Arial" w:eastAsia="Arial" w:hAnsi="Arial" w:cs="Arial"/>
@@ -8392,9 +8144,9 @@
           <w:szCs w:val="22"/>
           <w:lang w:val="en-GB"/>
         </w:rPr>
-        <w:t>}</w:t>
-      </w:r>
-      <w:proofErr w:type="gramStart"/>
+        <w:t>{{</w:t>
+      </w:r>
+      <w:proofErr w:type="spellStart"/>
       <w:r>
         <w:rPr>
           <w:rFonts w:ascii="Arial" w:eastAsia="Arial" w:hAnsi="Arial" w:cs="Arial"/>
@@ -8403,9 +8155,9 @@
           <w:szCs w:val="22"/>
           <w:lang w:val="en-GB"/>
         </w:rPr>
-        <w:t>} :</w:t>
-      </w:r>
-      <w:proofErr w:type="gramEnd"/>
+        <w:t>phase.title</w:t>
+      </w:r>
+      <w:proofErr w:type="spellEnd"/>
       <w:r>
         <w:rPr>
           <w:rFonts w:ascii="Arial" w:eastAsia="Arial" w:hAnsi="Arial" w:cs="Arial"/>
@@ -8414,9 +8166,9 @@
           <w:szCs w:val="22"/>
           <w:lang w:val="en-GB"/>
         </w:rPr>
-        <w:t xml:space="preserve"> {{</w:t>
-      </w:r>
-      <w:proofErr w:type="spellStart"/>
+        <w:t>}</w:t>
+      </w:r>
+      <w:proofErr w:type="gramStart"/>
       <w:r>
         <w:rPr>
           <w:rFonts w:ascii="Arial" w:eastAsia="Arial" w:hAnsi="Arial" w:cs="Arial"/>
@@ -8425,7 +8177,7 @@
           <w:szCs w:val="22"/>
           <w:lang w:val="en-GB"/>
         </w:rPr>
-        <w:t>phase.</w:t>
+        <w:t xml:space="preserve">} </w:t>
       </w:r>
       <w:r>
         <w:rPr>
@@ -8435,10 +8187,21 @@
           <w:szCs w:val="22"/>
           <w:lang w:val="en-GB"/>
         </w:rPr>
-        <w:t>title</w:t>
-      </w:r>
-      <w:proofErr w:type="spellEnd"/>
-      <w:r>
+        <w:t>:</w:t>
+      </w:r>
+      <w:proofErr w:type="gramEnd"/>
+      <w:r>
+        <w:rPr>
+          <w:rFonts w:ascii="Arial" w:eastAsia="Arial" w:hAnsi="Arial" w:cs="Arial"/>
+          <w:sz w:val="22"/>
+          <w:szCs w:val="22"/>
+          <w:lang w:val="en-GB"/>
+        </w:rPr>
+        <w:t xml:space="preserve"> </w:t>
+      </w:r>
+    </w:p>
+    <w:p>
+      <w:pPr>
         <w:rPr>
           <w:rFonts w:ascii="Arial" w:eastAsia="Arial" w:hAnsi="Arial" w:cs="Arial"/>
           <w:b/>
@@ -8446,8 +8209,19 @@
           <w:szCs w:val="22"/>
           <w:lang w:val="en-GB"/>
         </w:rPr>
-        <w:t>}}</w:t>
-      </w:r>
+      </w:pPr>
+      <w:proofErr w:type="gramStart"/>
+      <w:r>
+        <w:rPr>
+          <w:rFonts w:ascii="Arial" w:eastAsia="Arial" w:hAnsi="Arial" w:cs="Arial"/>
+          <w:b/>
+          <w:sz w:val="22"/>
+          <w:szCs w:val="22"/>
+          <w:lang w:val="en-GB"/>
+        </w:rPr>
+        <w:t>Description :</w:t>
+      </w:r>
+      <w:proofErr w:type="gramEnd"/>
     </w:p>
     <w:p>
       <w:pPr>
@@ -8465,9 +8239,8 @@
           <w:szCs w:val="22"/>
           <w:lang w:val="en-GB"/>
         </w:rPr>
-        <w:t>{</w:t>
-      </w:r>
-      <w:proofErr w:type="gramStart"/>
+        <w:tab/>
+      </w:r>
       <w:r>
         <w:rPr>
           <w:rFonts w:ascii="Arial" w:eastAsia="Arial" w:hAnsi="Arial" w:cs="Arial"/>
@@ -8475,9 +8248,9 @@
           <w:szCs w:val="22"/>
           <w:lang w:val="en-GB"/>
         </w:rPr>
-        <w:t xml:space="preserve">{ </w:t>
-      </w:r>
-      <w:proofErr w:type="spellStart"/>
+        <w:t>{</w:t>
+      </w:r>
+      <w:proofErr w:type="gramStart"/>
       <w:r>
         <w:rPr>
           <w:rFonts w:ascii="Arial" w:eastAsia="Arial" w:hAnsi="Arial" w:cs="Arial"/>
@@ -8485,10 +8258,9 @@
           <w:szCs w:val="22"/>
           <w:lang w:val="en-GB"/>
         </w:rPr>
-        <w:t>phase.description</w:t>
-      </w:r>
-      <w:proofErr w:type="spellEnd"/>
-      <w:proofErr w:type="gramEnd"/>
+        <w:t xml:space="preserve">{ </w:t>
+      </w:r>
+      <w:proofErr w:type="spellStart"/>
       <w:r>
         <w:rPr>
           <w:rFonts w:ascii="Arial" w:eastAsia="Arial" w:hAnsi="Arial" w:cs="Arial"/>
@@ -8496,197 +8268,47 @@
           <w:szCs w:val="22"/>
           <w:lang w:val="en-GB"/>
         </w:rPr>
-        <w:t xml:space="preserve"> }}</w:t>
-      </w:r>
-    </w:p>
-    <w:p>
-      <w:pPr>
+        <w:t>phase.</w:t>
+      </w:r>
+      <w:r>
         <w:rPr>
           <w:rFonts w:ascii="Arial" w:eastAsia="Arial" w:hAnsi="Arial" w:cs="Arial"/>
           <w:sz w:val="22"/>
           <w:szCs w:val="22"/>
-        </w:rPr>
-      </w:pPr>
+          <w:lang w:val="en-GB"/>
+        </w:rPr>
+        <w:t>description</w:t>
+      </w:r>
+      <w:proofErr w:type="spellEnd"/>
+      <w:proofErr w:type="gramEnd"/>
       <w:r>
         <w:rPr>
           <w:rFonts w:ascii="Arial" w:eastAsia="Arial" w:hAnsi="Arial" w:cs="Arial"/>
           <w:sz w:val="22"/>
           <w:szCs w:val="22"/>
-        </w:rPr>
-        <w:t xml:space="preserve">{% if </w:t>
-      </w:r>
-      <w:proofErr w:type="spellStart"/>
+          <w:lang w:val="en-GB"/>
+        </w:rPr>
+        <w:t xml:space="preserve"> }}</w:t>
+      </w:r>
       <w:r>
         <w:rPr>
           <w:rFonts w:ascii="Arial" w:eastAsia="Arial" w:hAnsi="Arial" w:cs="Arial"/>
           <w:sz w:val="22"/>
           <w:szCs w:val="22"/>
-        </w:rPr>
-        <w:t>phase.</w:t>
-      </w:r>
-      <w:r>
+          <w:lang w:val="en-GB"/>
+        </w:rPr>
+        <w:t xml:space="preserve"> </w:t>
+      </w:r>
+    </w:p>
+    <w:p>
+      <w:pPr>
         <w:rPr>
           <w:rFonts w:ascii="Arial" w:eastAsia="Arial" w:hAnsi="Arial" w:cs="Arial"/>
           <w:sz w:val="22"/>
           <w:szCs w:val="22"/>
-        </w:rPr>
-        <w:t>methodologie</w:t>
-      </w:r>
-      <w:proofErr w:type="spellEnd"/>
-      <w:r>
-        <w:rPr>
-          <w:rFonts w:ascii="Arial" w:eastAsia="Arial" w:hAnsi="Arial" w:cs="Arial"/>
-          <w:sz w:val="22"/>
-          <w:szCs w:val="22"/>
-        </w:rPr>
-        <w:t xml:space="preserve"> </w:t>
-      </w:r>
-      <w:r>
-        <w:rPr>
-          <w:rFonts w:ascii="Arial" w:eastAsia="Arial" w:hAnsi="Arial" w:cs="Arial"/>
-          <w:sz w:val="22"/>
-          <w:szCs w:val="22"/>
-        </w:rPr>
-        <w:t>!</w:t>
-      </w:r>
-      <w:r>
-        <w:rPr>
-          <w:rFonts w:ascii="Arial" w:eastAsia="Arial" w:hAnsi="Arial" w:cs="Arial"/>
-          <w:sz w:val="22"/>
-          <w:szCs w:val="22"/>
-        </w:rPr>
-        <w:t>=</w:t>
-      </w:r>
-      <w:r>
-        <w:rPr>
-          <w:rFonts w:ascii="Arial" w:eastAsia="Arial" w:hAnsi="Arial" w:cs="Arial"/>
-          <w:sz w:val="22"/>
-          <w:szCs w:val="22"/>
-        </w:rPr>
-        <w:t xml:space="preserve"> </w:t>
-      </w:r>
-      <w:r>
-        <w:rPr>
-          <w:rFonts w:ascii="Arial" w:eastAsia="Arial" w:hAnsi="Arial" w:cs="Arial"/>
-          <w:color w:val="000000"/>
-          <w:sz w:val="22"/>
-          <w:szCs w:val="22"/>
-        </w:rPr>
-        <w:t>''</w:t>
-      </w:r>
-      <w:r>
-        <w:rPr>
-          <w:rFonts w:ascii="Arial" w:eastAsia="Arial" w:hAnsi="Arial" w:cs="Arial"/>
-          <w:sz w:val="22"/>
-          <w:szCs w:val="22"/>
-        </w:rPr>
-        <w:t xml:space="preserve"> %}</w:t>
-      </w:r>
-      <w:r>
-        <w:rPr>
-          <w:rFonts w:ascii="Arial" w:eastAsia="Arial" w:hAnsi="Arial" w:cs="Arial"/>
-          <w:sz w:val="22"/>
-          <w:szCs w:val="22"/>
-          <w:u w:val="single"/>
-        </w:rPr>
-        <w:t>Méthodologie :</w:t>
-      </w:r>
-    </w:p>
-    <w:p>
-      <w:pPr>
-        <w:rPr>
-          <w:rFonts w:ascii="Arial" w:eastAsia="Arial" w:hAnsi="Arial" w:cs="Arial"/>
-          <w:sz w:val="22"/>
-          <w:szCs w:val="22"/>
-        </w:rPr>
-      </w:pPr>
-      <w:r>
-        <w:rPr>
-          <w:rFonts w:ascii="Arial" w:eastAsia="Arial" w:hAnsi="Arial" w:cs="Arial"/>
-          <w:sz w:val="22"/>
-          <w:szCs w:val="22"/>
-        </w:rPr>
-        <w:t>{</w:t>
-      </w:r>
-      <w:proofErr w:type="gramStart"/>
-      <w:r>
-        <w:rPr>
-          <w:rFonts w:ascii="Arial" w:eastAsia="Arial" w:hAnsi="Arial" w:cs="Arial"/>
-          <w:sz w:val="22"/>
-          <w:szCs w:val="22"/>
-        </w:rPr>
-        <w:t xml:space="preserve">{ </w:t>
-      </w:r>
-      <w:proofErr w:type="spellStart"/>
-      <w:r>
-        <w:rPr>
-          <w:rFonts w:ascii="Arial" w:eastAsia="Arial" w:hAnsi="Arial" w:cs="Arial"/>
-          <w:sz w:val="22"/>
-          <w:szCs w:val="22"/>
-        </w:rPr>
-        <w:t>phase.</w:t>
-      </w:r>
-      <w:r>
-        <w:rPr>
-          <w:rFonts w:ascii="Arial" w:eastAsia="Arial" w:hAnsi="Arial" w:cs="Arial"/>
-          <w:sz w:val="22"/>
-          <w:szCs w:val="22"/>
-        </w:rPr>
-        <w:t>methodologie</w:t>
-      </w:r>
-      <w:proofErr w:type="spellEnd"/>
-      <w:proofErr w:type="gramEnd"/>
-      <w:r>
-        <w:rPr>
-          <w:rFonts w:ascii="Arial" w:eastAsia="Arial" w:hAnsi="Arial" w:cs="Arial"/>
-          <w:sz w:val="22"/>
-          <w:szCs w:val="22"/>
-        </w:rPr>
-        <w:t xml:space="preserve"> }}</w:t>
-      </w:r>
-      <w:r>
-        <w:rPr>
-          <w:rFonts w:ascii="Arial" w:eastAsia="Arial" w:hAnsi="Arial" w:cs="Arial"/>
-          <w:sz w:val="22"/>
-          <w:szCs w:val="22"/>
-        </w:rPr>
-        <w:tab/>
-      </w:r>
-    </w:p>
-    <w:p>
-      <w:pPr>
-        <w:rPr>
-          <w:rFonts w:ascii="Arial" w:eastAsia="Arial" w:hAnsi="Arial" w:cs="Arial"/>
-          <w:sz w:val="22"/>
-          <w:szCs w:val="22"/>
-        </w:rPr>
-      </w:pPr>
-      <w:r>
-        <w:rPr>
-          <w:rFonts w:ascii="Arial" w:eastAsia="Arial" w:hAnsi="Arial" w:cs="Arial"/>
-          <w:sz w:val="22"/>
-          <w:szCs w:val="22"/>
-        </w:rPr>
-        <w:t xml:space="preserve">{% </w:t>
-      </w:r>
-      <w:proofErr w:type="spellStart"/>
-      <w:r>
-        <w:rPr>
-          <w:rFonts w:ascii="Arial" w:eastAsia="Arial" w:hAnsi="Arial" w:cs="Arial"/>
-          <w:sz w:val="22"/>
-          <w:szCs w:val="22"/>
-        </w:rPr>
-        <w:t>endif</w:t>
-      </w:r>
-      <w:proofErr w:type="spellEnd"/>
-      <w:r>
-        <w:rPr>
-          <w:rFonts w:ascii="Arial" w:eastAsia="Arial" w:hAnsi="Arial" w:cs="Arial"/>
-          <w:sz w:val="22"/>
-          <w:szCs w:val="22"/>
-        </w:rPr>
-        <w:t xml:space="preserve"> %}</w:t>
-      </w:r>
+          <w:lang w:val="en-GB"/>
+        </w:rPr>
+      </w:pPr>
     </w:p>
     <w:p>
       <w:pPr>
@@ -8695,79 +8317,211 @@
           <w:b/>
           <w:sz w:val="22"/>
           <w:szCs w:val="22"/>
-        </w:rPr>
-      </w:pPr>
-      <w:r>
+          <w:lang w:val="en-GB"/>
+        </w:rPr>
+      </w:pPr>
+      <w:proofErr w:type="spellStart"/>
+      <w:proofErr w:type="gramStart"/>
+      <w:r>
+        <w:rPr>
+          <w:rFonts w:ascii="Arial" w:eastAsia="Arial" w:hAnsi="Arial" w:cs="Arial"/>
+          <w:b/>
+          <w:sz w:val="22"/>
+          <w:szCs w:val="22"/>
+          <w:lang w:val="en-GB"/>
+        </w:rPr>
+        <w:t>Méthodologie</w:t>
+      </w:r>
+      <w:proofErr w:type="spellEnd"/>
+      <w:r>
+        <w:rPr>
+          <w:rFonts w:ascii="Arial" w:eastAsia="Arial" w:hAnsi="Arial" w:cs="Arial"/>
+          <w:b/>
+          <w:sz w:val="22"/>
+          <w:szCs w:val="22"/>
+          <w:lang w:val="en-GB"/>
+        </w:rPr>
+        <w:t xml:space="preserve"> :</w:t>
+      </w:r>
+      <w:proofErr w:type="gramEnd"/>
+    </w:p>
+    <w:p>
+      <w:pPr>
         <w:rPr>
           <w:rFonts w:ascii="Arial" w:eastAsia="Arial" w:hAnsi="Arial" w:cs="Arial"/>
           <w:sz w:val="22"/>
           <w:szCs w:val="22"/>
-        </w:rPr>
-        <w:t xml:space="preserve">{% </w:t>
-      </w:r>
-      <w:proofErr w:type="spellStart"/>
+          <w:lang w:val="en-GB"/>
+        </w:rPr>
+      </w:pPr>
       <w:r>
         <w:rPr>
           <w:rFonts w:ascii="Arial" w:eastAsia="Arial" w:hAnsi="Arial" w:cs="Arial"/>
           <w:sz w:val="22"/>
           <w:szCs w:val="22"/>
-        </w:rPr>
-        <w:t>endfor</w:t>
-      </w:r>
-      <w:proofErr w:type="spellEnd"/>
+          <w:lang w:val="en-GB"/>
+        </w:rPr>
+        <w:tab/>
+      </w:r>
       <w:r>
         <w:rPr>
           <w:rFonts w:ascii="Arial" w:eastAsia="Arial" w:hAnsi="Arial" w:cs="Arial"/>
           <w:sz w:val="22"/>
           <w:szCs w:val="22"/>
-        </w:rPr>
-        <w:t xml:space="preserve"> %}</w:t>
-      </w:r>
+          <w:lang w:val="en-GB"/>
+        </w:rPr>
+        <w:t>{</w:t>
+      </w:r>
+      <w:proofErr w:type="gramStart"/>
       <w:r>
         <w:rPr>
           <w:rFonts w:ascii="Arial" w:eastAsia="Arial" w:hAnsi="Arial" w:cs="Arial"/>
           <w:sz w:val="22"/>
           <w:szCs w:val="22"/>
-        </w:rPr>
-        <w:t>{%</w:t>
-      </w:r>
+          <w:lang w:val="en-GB"/>
+        </w:rPr>
+        <w:t xml:space="preserve">{ </w:t>
+      </w:r>
+      <w:proofErr w:type="spellStart"/>
       <w:r>
         <w:rPr>
           <w:rFonts w:ascii="Arial" w:eastAsia="Arial" w:hAnsi="Arial" w:cs="Arial"/>
           <w:sz w:val="22"/>
           <w:szCs w:val="22"/>
-        </w:rPr>
-        <w:t xml:space="preserve"> </w:t>
-      </w:r>
-      <w:proofErr w:type="spellStart"/>
+          <w:lang w:val="en-GB"/>
+        </w:rPr>
+        <w:t>phase.</w:t>
+      </w:r>
       <w:r>
         <w:rPr>
           <w:rFonts w:ascii="Arial" w:eastAsia="Arial" w:hAnsi="Arial" w:cs="Arial"/>
           <w:sz w:val="22"/>
           <w:szCs w:val="22"/>
-        </w:rPr>
-        <w:t>endfor</w:t>
+          <w:lang w:val="en-GB"/>
+        </w:rPr>
+        <w:t>methodologie</w:t>
       </w:r>
       <w:proofErr w:type="spellEnd"/>
+      <w:proofErr w:type="gramEnd"/>
       <w:r>
         <w:rPr>
           <w:rFonts w:ascii="Arial" w:eastAsia="Arial" w:hAnsi="Arial" w:cs="Arial"/>
           <w:sz w:val="22"/>
           <w:szCs w:val="22"/>
-        </w:rPr>
-        <w:t xml:space="preserve"> </w:t>
-      </w:r>
-      <w:r>
+          <w:lang w:val="en-GB"/>
+        </w:rPr>
+        <w:t xml:space="preserve"> }}</w:t>
+      </w:r>
+    </w:p>
+    <w:p>
+      <w:pPr>
         <w:rPr>
           <w:rFonts w:ascii="Arial" w:eastAsia="Arial" w:hAnsi="Arial" w:cs="Arial"/>
           <w:sz w:val="22"/>
           <w:szCs w:val="22"/>
-        </w:rPr>
-        <w:t>%}</w:t>
+          <w:lang w:val="en-GB"/>
+        </w:rPr>
+      </w:pPr>
+      <w:r>
+        <w:rPr>
+          <w:rFonts w:ascii="Arial" w:eastAsia="Arial" w:hAnsi="Arial" w:cs="Arial"/>
+          <w:sz w:val="22"/>
+          <w:szCs w:val="22"/>
+          <w:lang w:val="en-GB"/>
+        </w:rPr>
+        <w:t>{%</w:t>
+      </w:r>
+      <w:proofErr w:type="spellStart"/>
+      <w:proofErr w:type="gramStart"/>
+      <w:r>
+        <w:rPr>
+          <w:rFonts w:ascii="Arial" w:eastAsia="Arial" w:hAnsi="Arial" w:cs="Arial"/>
+          <w:sz w:val="22"/>
+          <w:szCs w:val="22"/>
+          <w:lang w:val="en-GB"/>
+        </w:rPr>
+        <w:t>endfor</w:t>
+      </w:r>
+      <w:proofErr w:type="spellEnd"/>
+      <w:r>
+        <w:rPr>
+          <w:rFonts w:ascii="Arial" w:eastAsia="Arial" w:hAnsi="Arial" w:cs="Arial"/>
+          <w:sz w:val="22"/>
+          <w:szCs w:val="22"/>
+          <w:lang w:val="en-GB"/>
+        </w:rPr>
+        <w:t>%</w:t>
+      </w:r>
+      <w:proofErr w:type="gramEnd"/>
+      <w:r>
+        <w:rPr>
+          <w:rFonts w:ascii="Arial" w:eastAsia="Arial" w:hAnsi="Arial" w:cs="Arial"/>
+          <w:sz w:val="22"/>
+          <w:szCs w:val="22"/>
+          <w:lang w:val="en-GB"/>
+        </w:rPr>
+        <w:t>}</w:t>
+      </w:r>
+      <w:r>
+        <w:rPr>
+          <w:rFonts w:ascii="Arial" w:eastAsia="Arial" w:hAnsi="Arial" w:cs="Arial"/>
+          <w:b/>
+          <w:sz w:val="22"/>
+          <w:szCs w:val="22"/>
+          <w:lang w:val="en-GB"/>
+        </w:rPr>
+        <w:t>{%</w:t>
+      </w:r>
+      <w:proofErr w:type="spellStart"/>
+      <w:proofErr w:type="gramStart"/>
+      <w:r>
+        <w:rPr>
+          <w:rFonts w:ascii="Arial" w:eastAsia="Arial" w:hAnsi="Arial" w:cs="Arial"/>
+          <w:b/>
+          <w:sz w:val="22"/>
+          <w:szCs w:val="22"/>
+          <w:lang w:val="en-GB"/>
+        </w:rPr>
+        <w:t>endfor</w:t>
+      </w:r>
+      <w:proofErr w:type="spellEnd"/>
+      <w:r>
+        <w:rPr>
+          <w:rFonts w:ascii="Arial" w:eastAsia="Arial" w:hAnsi="Arial" w:cs="Arial"/>
+          <w:b/>
+          <w:sz w:val="22"/>
+          <w:szCs w:val="22"/>
+          <w:lang w:val="en-GB"/>
+        </w:rPr>
+        <w:t>%</w:t>
+      </w:r>
+      <w:proofErr w:type="gramEnd"/>
+      <w:r>
+        <w:rPr>
+          <w:rFonts w:ascii="Arial" w:eastAsia="Arial" w:hAnsi="Arial" w:cs="Arial"/>
+          <w:b/>
+          <w:sz w:val="22"/>
+          <w:szCs w:val="22"/>
+          <w:lang w:val="en-GB"/>
+        </w:rPr>
+        <w:t>}</w:t>
       </w:r>
     </w:p>
     <w:p>
       <w:pPr>
+        <w:rPr>
+          <w:rFonts w:ascii="Arial" w:eastAsia="Arial" w:hAnsi="Arial" w:cs="Arial"/>
+          <w:b/>
+          <w:sz w:val="22"/>
+          <w:szCs w:val="22"/>
+          <w:lang w:val="en-GB"/>
+        </w:rPr>
+      </w:pPr>
+      <w:bookmarkStart w:id="17" w:name="_GoBack"/>
+      <w:bookmarkEnd w:id="17"/>
+    </w:p>
+    <w:p>
+      <w:pPr>
         <w:pStyle w:val="Titre2"/>
         <w:rPr>
           <w:rFonts w:ascii="Arial" w:hAnsi="Arial"/>
@@ -8776,6 +8530,7 @@
       <w:r>
         <w:rPr>
           <w:rFonts w:ascii="Arial" w:hAnsi="Arial"/>
+          <w:lang w:val="en-GB"/>
         </w:rPr>
         <w:t xml:space="preserve"> </w:t>
       </w:r>
@@ -21714,7 +21469,7 @@
               <w:noProof/>
               <w:sz w:val="24"/>
             </w:rPr>
-            <w:t>6</w:t>
+            <w:t>8</w:t>
           </w:r>
           <w:r>
             <w:rPr>

</xml_diff>

<commit_message>
Missing '}' in CETUDE doctype
</commit_message>
<xml_diff>
--- a/flower_backend/doctypes/CETUDE.docx
+++ b/flower_backend/doctypes/CETUDE.docx
@@ -1201,22 +1201,7 @@
                 <w:szCs w:val="16"/>
                 <w:shd w:fill="auto" w:val="clear"/>
               </w:rPr>
-              <w:t xml:space="preserve">Numéro TVA intracommunautaire : </w:t>
-            </w:r>
-            <w:r>
-              <w:rPr>
-                <w:rFonts w:ascii="Montserrat SemiBold" w:hAnsi="Montserrat SemiBold"/>
-                <w:b w:val="false"/>
-                <w:i w:val="false"/>
-                <w:caps w:val="false"/>
-                <w:smallCaps w:val="false"/>
-                <w:color w:val="000000"/>
-                <w:spacing w:val="0"/>
-                <w:sz w:val="16"/>
-                <w:szCs w:val="16"/>
-                <w:shd w:fill="auto" w:val="clear"/>
-              </w:rPr>
-              <w:t>FR1433246811500016</w:t>
+              <w:t>Numéro TVA intracommunautaire : FR1433246811500016</w:t>
             </w:r>
             <w:r>
               <w:rPr>
@@ -8065,7 +8050,7 @@
           <w:sz w:val="24"/>
           <w:szCs w:val="24"/>
         </w:rPr>
-        <w:t>) }</w:t>
+        <w:t>) }}</w:t>
       </w:r>
       <w:r>
         <w:rPr>
@@ -11641,7 +11626,7 @@
           <w:szCs w:val="24"/>
           <w:rFonts w:cs="Arial" w:ascii="Montserrat SemiBold" w:hAnsi="Montserrat SemiBold"/>
         </w:rPr>
-        <w:t>21</w:t>
+        <w:t>22</w:t>
       </w:r>
       <w:r>
         <w:rPr>

</xml_diff>

<commit_message>
Removing a non-existing reference to the database
</commit_message>
<xml_diff>
--- a/flower_backend/doctypes/CETUDE.docx
+++ b/flower_backend/doctypes/CETUDE.docx
@@ -1550,8 +1550,8 @@
         <w:rPr/>
       </w:pPr>
       <w:bookmarkStart w:id="0" w:name="__RefHeading___Toc9345_1642054164"/>
-      <w:bookmarkStart w:id="1" w:name="_Toc122269978"/>
-      <w:bookmarkStart w:id="2" w:name="_Toc125544072"/>
+      <w:bookmarkStart w:id="1" w:name="_Toc125544072"/>
+      <w:bookmarkStart w:id="2" w:name="_Toc122269978"/>
       <w:bookmarkEnd w:id="0"/>
       <w:r>
         <w:rPr>
@@ -2006,8 +2006,8 @@
       </w:r>
       <w:bookmarkStart w:id="4" w:name="_Toc90975050"/>
       <w:bookmarkStart w:id="5" w:name="_Toc125544073"/>
-      <w:bookmarkStart w:id="6" w:name="_Toc1222699791"/>
-      <w:bookmarkStart w:id="7" w:name="_Toc4919645571"/>
+      <w:bookmarkStart w:id="6" w:name="_Toc4919645571"/>
+      <w:bookmarkStart w:id="7" w:name="_Toc1222699791"/>
       <w:r>
         <w:rPr>
           <w:rFonts w:eastAsia="Calibri" w:cs="Arial" w:ascii="Montserrat SemiBold" w:hAnsi="Montserrat SemiBold"/>
@@ -3453,8 +3453,8 @@
         <w:t xml:space="preserve">II. </w:t>
       </w:r>
       <w:bookmarkStart w:id="9" w:name="_Toc125544074"/>
-      <w:bookmarkStart w:id="10" w:name="_Toc122269979"/>
-      <w:bookmarkStart w:id="11" w:name="_Toc491964557"/>
+      <w:bookmarkStart w:id="10" w:name="_Toc491964557"/>
+      <w:bookmarkStart w:id="11" w:name="_Toc122269979"/>
       <w:r>
         <w:rPr>
           <w:rFonts w:eastAsia="Calibri" w:cs="Arial" w:ascii="Montserrat SemiBold" w:hAnsi="Montserrat SemiBold"/>
@@ -3854,9 +3854,9 @@
         </w:rPr>
         <w:t xml:space="preserve">IV. </w:t>
       </w:r>
-      <w:bookmarkStart w:id="14" w:name="_Toc122269980"/>
+      <w:bookmarkStart w:id="14" w:name="_Toc125544076"/>
       <w:bookmarkStart w:id="15" w:name="_Toc491964558"/>
-      <w:bookmarkStart w:id="16" w:name="_Toc125544076"/>
+      <w:bookmarkStart w:id="16" w:name="_Toc122269980"/>
       <w:r>
         <w:rPr>
           <w:rFonts w:eastAsia="Calibri" w:cs="Arial" w:ascii="Montserrat SemiBold" w:hAnsi="Montserrat SemiBold"/>
@@ -4054,9 +4054,9 @@
         </w:rPr>
         <w:t xml:space="preserve">V. </w:t>
       </w:r>
-      <w:bookmarkStart w:id="18" w:name="_Toc122269981"/>
+      <w:bookmarkStart w:id="18" w:name="_Toc125544077"/>
       <w:bookmarkStart w:id="19" w:name="_Toc491964559"/>
-      <w:bookmarkStart w:id="20" w:name="_Toc125544077"/>
+      <w:bookmarkStart w:id="20" w:name="_Toc122269981"/>
       <w:r>
         <w:rPr>
           <w:rFonts w:eastAsia="Calibri" w:cs="Arial" w:ascii="Montserrat SemiBold" w:hAnsi="Montserrat SemiBold"/>
@@ -4169,9 +4169,9 @@
         </w:rPr>
         <w:t>VI. Méthodologie de l’étude</w:t>
       </w:r>
-      <w:bookmarkStart w:id="21" w:name="_Toc125544078"/>
+      <w:bookmarkStart w:id="21" w:name="_Toc491964560"/>
       <w:bookmarkStart w:id="22" w:name="_Toc122269982"/>
-      <w:bookmarkStart w:id="23" w:name="_Toc491964560"/>
+      <w:bookmarkStart w:id="23" w:name="_Toc125544078"/>
       <w:bookmarkEnd w:id="21"/>
       <w:bookmarkEnd w:id="22"/>
       <w:bookmarkEnd w:id="23"/>
@@ -4197,11 +4197,11 @@
         </w:rPr>
         <w:t>1 - Ordonnancement et durée des phases</w:t>
       </w:r>
-      <w:bookmarkStart w:id="24" w:name="_Toc122269983"/>
-      <w:bookmarkStart w:id="25" w:name="_Toc491964561"/>
+      <w:bookmarkStart w:id="24" w:name="_Toc90975043"/>
+      <w:bookmarkStart w:id="25" w:name="_Toc89784126"/>
       <w:bookmarkStart w:id="26" w:name="_Toc125544079"/>
-      <w:bookmarkStart w:id="27" w:name="_Toc89784126"/>
-      <w:bookmarkStart w:id="28" w:name="_Toc90975043"/>
+      <w:bookmarkStart w:id="27" w:name="_Toc491964561"/>
+      <w:bookmarkStart w:id="28" w:name="_Toc122269983"/>
       <w:bookmarkEnd w:id="24"/>
       <w:bookmarkEnd w:id="25"/>
       <w:bookmarkEnd w:id="26"/>
@@ -4390,7 +4390,6 @@
         </w:rPr>
         <w:t xml:space="preserve">Sous -phase {{phase.title}} – </w:t>
       </w:r>
-      <w:commentRangeStart w:id="2"/>
       <w:r>
         <w:rPr>
           <w:rFonts w:eastAsia="Arial" w:cs="Arial" w:ascii="Montserrat SemiBold" w:hAnsi="Montserrat SemiBold"/>
@@ -4399,20 +4398,7 @@
           <w:szCs w:val="24"/>
           <w:lang w:val="en-GB"/>
         </w:rPr>
-        <w:t>{{nombre.JEH}}</w:t>
-      </w:r>
-      <w:r>
-        <w:rPr>
-          <w:rFonts w:eastAsia="Arial" w:cs="Arial" w:ascii="Montserrat SemiBold" w:hAnsi="Montserrat SemiBold"/>
-          <w:b/>
-          <w:sz w:val="24"/>
-          <w:szCs w:val="24"/>
-          <w:lang w:val="en-GB"/>
-        </w:rPr>
-      </w:r>
-      <w:commentRangeEnd w:id="2"/>
-      <w:r>
-        <w:commentReference w:id="2"/>
+        <w:t>(nombre jeh à compléter)</w:t>
       </w:r>
       <w:r>
         <w:rPr>
@@ -5294,8 +5280,8 @@
           <w:rFonts w:ascii="Montserrat SemiBold" w:hAnsi="Montserrat SemiBold"/>
         </w:rPr>
       </w:pPr>
-      <w:bookmarkStart w:id="33" w:name="_Toc90975048"/>
-      <w:bookmarkStart w:id="34" w:name="_Toc89784131"/>
+      <w:bookmarkStart w:id="33" w:name="_Toc89784131"/>
+      <w:bookmarkStart w:id="34" w:name="_Toc90975048"/>
       <w:r>
         <w:rPr>
           <w:rFonts w:eastAsia="DIN-Rg" w:cs="DIN-Rg" w:ascii="Montserrat SemiBold" w:hAnsi="Montserrat SemiBold"/>
@@ -5304,11 +5290,11 @@
         </w:rPr>
         <w:t xml:space="preserve">Chaque intervenant peut ainsi bénéficier de moyens pédagogiques comme le soutien d’enseignants-chercheurs lors des missions, </w:t>
       </w:r>
-      <w:bookmarkStart w:id="35" w:name="_Toc122269993"/>
-      <w:bookmarkStart w:id="36" w:name="_Toc89784130"/>
+      <w:bookmarkStart w:id="35" w:name="_Toc125544088"/>
+      <w:bookmarkStart w:id="36" w:name="_Toc90975047"/>
       <w:bookmarkStart w:id="37" w:name="_Toc491964569"/>
-      <w:bookmarkStart w:id="38" w:name="_Toc90975047"/>
-      <w:bookmarkStart w:id="39" w:name="_Toc125544088"/>
+      <w:bookmarkStart w:id="38" w:name="_Toc89784130"/>
+      <w:bookmarkStart w:id="39" w:name="_Toc122269993"/>
       <w:bookmarkEnd w:id="33"/>
       <w:bookmarkEnd w:id="34"/>
       <w:bookmarkEnd w:id="35"/>
@@ -5407,9 +5393,9 @@
         </w:rPr>
         <w:t xml:space="preserve">VIII. </w:t>
       </w:r>
-      <w:bookmarkStart w:id="42" w:name="_Toc1255440782"/>
+      <w:bookmarkStart w:id="42" w:name="_Toc4919645602"/>
       <w:bookmarkStart w:id="43" w:name="_Toc1222699822"/>
-      <w:bookmarkStart w:id="44" w:name="_Toc4919645602"/>
+      <w:bookmarkStart w:id="44" w:name="_Toc1255440782"/>
       <w:bookmarkEnd w:id="42"/>
       <w:bookmarkEnd w:id="43"/>
       <w:bookmarkEnd w:id="44"/>
@@ -5561,8 +5547,8 @@
         <w:t xml:space="preserve">IX. </w:t>
       </w:r>
       <w:bookmarkStart w:id="46" w:name="_Toc125544092"/>
-      <w:bookmarkStart w:id="47" w:name="_Toc122269997"/>
-      <w:bookmarkStart w:id="48" w:name="_Toc491964573"/>
+      <w:bookmarkStart w:id="47" w:name="_Toc491964573"/>
+      <w:bookmarkStart w:id="48" w:name="_Toc122269997"/>
       <w:r>
         <w:rPr>
           <w:rFonts w:eastAsia="Calibri" w:cs="Arial" w:ascii="Montserrat SemiBold" w:hAnsi="Montserrat SemiBold"/>
@@ -8414,8 +8400,8 @@
         </w:rPr>
       </w:pPr>
       <w:bookmarkStart w:id="51" w:name="__RefHeading___Toc9373_1642054164"/>
-      <w:bookmarkStart w:id="52" w:name="_Toc122270000"/>
-      <w:bookmarkStart w:id="53" w:name="_Toc125544094"/>
+      <w:bookmarkStart w:id="52" w:name="_Toc125544094"/>
+      <w:bookmarkStart w:id="53" w:name="_Toc122270000"/>
       <w:bookmarkEnd w:id="51"/>
       <w:r>
         <w:rPr>
@@ -8560,8 +8546,8 @@
         </w:rPr>
       </w:pPr>
       <w:bookmarkStart w:id="54" w:name="__RefHeading___Toc9375_1642054164"/>
-      <w:bookmarkStart w:id="55" w:name="_Toc122270001"/>
-      <w:bookmarkStart w:id="56" w:name="_Toc125544095"/>
+      <w:bookmarkStart w:id="55" w:name="_Toc125544095"/>
+      <w:bookmarkStart w:id="56" w:name="_Toc122270001"/>
       <w:bookmarkEnd w:id="54"/>
       <w:r>
         <w:rPr>
@@ -8674,8 +8660,8 @@
         </w:rPr>
       </w:pPr>
       <w:bookmarkStart w:id="57" w:name="__RefHeading___Toc9377_1642054164"/>
-      <w:bookmarkStart w:id="58" w:name="_Toc122270002"/>
-      <w:bookmarkStart w:id="59" w:name="_Toc125544096"/>
+      <w:bookmarkStart w:id="58" w:name="_Toc125544096"/>
+      <w:bookmarkStart w:id="59" w:name="_Toc122270002"/>
       <w:bookmarkEnd w:id="57"/>
       <w:r>
         <w:rPr>
@@ -8764,8 +8750,8 @@
         </w:rPr>
       </w:pPr>
       <w:bookmarkStart w:id="60" w:name="__RefHeading___Toc9379_1642054164"/>
-      <w:bookmarkStart w:id="61" w:name="_Toc122270003"/>
-      <w:bookmarkStart w:id="62" w:name="_Toc125544097"/>
+      <w:bookmarkStart w:id="61" w:name="_Toc125544097"/>
+      <w:bookmarkStart w:id="62" w:name="_Toc122270003"/>
       <w:bookmarkEnd w:id="60"/>
       <w:r>
         <w:rPr>
@@ -8816,8 +8802,8 @@
         </w:rPr>
         <w:t xml:space="preserve">Le délai de réalisation de l’étude est précisé dans la partie « Planning » de la présente Convention d'Étude. L’étude débute à la signature de la présente Convention d'Étude sauf cas de force majeure ou cause imputable au Client et sous réserve de réception de l’acompte éventuellement prévu, ainsi que sous réserve de réception des éléments nécessaires à la réalisation de l’étude tels que mentionnés dans la partie « Cahier des charges » de la présente Convention d'Étude. </w:t>
       </w:r>
-      <w:bookmarkStart w:id="63" w:name="_Toc4919645641"/>
-      <w:bookmarkStart w:id="64" w:name="_Toc1222699881"/>
+      <w:bookmarkStart w:id="63" w:name="_Toc1222699881"/>
+      <w:bookmarkStart w:id="64" w:name="_Toc4919645641"/>
       <w:bookmarkEnd w:id="63"/>
       <w:bookmarkEnd w:id="64"/>
     </w:p>
@@ -8854,8 +8840,8 @@
         </w:rPr>
       </w:pPr>
       <w:bookmarkStart w:id="65" w:name="__RefHeading___Toc9387_1642054164"/>
-      <w:bookmarkStart w:id="66" w:name="_Toc122270004"/>
-      <w:bookmarkStart w:id="67" w:name="_Toc125544098"/>
+      <w:bookmarkStart w:id="66" w:name="_Toc125544098"/>
+      <w:bookmarkStart w:id="67" w:name="_Toc122270004"/>
       <w:bookmarkEnd w:id="65"/>
       <w:r>
         <w:rPr>
@@ -9002,8 +8988,8 @@
         </w:rPr>
         <w:t>Matériel</w:t>
       </w:r>
-      <w:bookmarkStart w:id="68" w:name="_Toc4919645651"/>
-      <w:bookmarkStart w:id="69" w:name="_Toc1222699891"/>
+      <w:bookmarkStart w:id="68" w:name="_Toc1222699891"/>
+      <w:bookmarkStart w:id="69" w:name="_Toc4919645651"/>
       <w:bookmarkEnd w:id="68"/>
       <w:bookmarkEnd w:id="69"/>
     </w:p>
@@ -9145,8 +9131,8 @@
         </w:rPr>
         <w:t>Aucun prêt de matériel n’est nécessaire à la réalisation de cette étude.</w:t>
       </w:r>
-      <w:bookmarkStart w:id="70" w:name="_Toc4919645661"/>
-      <w:bookmarkStart w:id="71" w:name="_Toc1222699901"/>
+      <w:bookmarkStart w:id="70" w:name="_Toc1222699901"/>
+      <w:bookmarkStart w:id="71" w:name="_Toc4919645661"/>
       <w:bookmarkEnd w:id="70"/>
       <w:bookmarkEnd w:id="71"/>
     </w:p>
@@ -9670,8 +9656,8 @@
           <w:szCs w:val="24"/>
         </w:rPr>
       </w:pPr>
-      <w:bookmarkStart w:id="72" w:name="_Toc491964564"/>
-      <w:bookmarkStart w:id="73" w:name="_Toc122269988"/>
+      <w:bookmarkStart w:id="72" w:name="_Toc122269988"/>
+      <w:bookmarkStart w:id="73" w:name="_Toc491964564"/>
       <w:r>
         <w:rPr>
           <w:rFonts w:eastAsia="Arial" w:cs="Arial" w:ascii="Montserrat SemiBold" w:hAnsi="Montserrat SemiBold"/>
@@ -9717,8 +9703,8 @@
         </w:rPr>
       </w:pPr>
       <w:bookmarkStart w:id="74" w:name="__RefHeading___Toc9389_1642054164"/>
-      <w:bookmarkStart w:id="75" w:name="_Toc122270005"/>
-      <w:bookmarkStart w:id="76" w:name="_Toc125544099"/>
+      <w:bookmarkStart w:id="75" w:name="_Toc125544099"/>
+      <w:bookmarkStart w:id="76" w:name="_Toc122270005"/>
       <w:bookmarkEnd w:id="74"/>
       <w:r>
         <w:rPr>
@@ -10146,8 +10132,8 @@
         </w:rPr>
       </w:pPr>
       <w:bookmarkStart w:id="77" w:name="__RefHeading___Toc9391_1642054164"/>
-      <w:bookmarkStart w:id="78" w:name="_Toc122270006"/>
-      <w:bookmarkStart w:id="79" w:name="_Toc125544100"/>
+      <w:bookmarkStart w:id="78" w:name="_Toc125544100"/>
+      <w:bookmarkStart w:id="79" w:name="_Toc122270006"/>
       <w:bookmarkEnd w:id="77"/>
       <w:r>
         <w:rPr>
@@ -10266,8 +10252,8 @@
         </w:rPr>
       </w:pPr>
       <w:bookmarkStart w:id="80" w:name="__RefHeading___Toc9393_1642054164"/>
-      <w:bookmarkStart w:id="81" w:name="_Toc122270007"/>
-      <w:bookmarkStart w:id="82" w:name="_Toc125544101"/>
+      <w:bookmarkStart w:id="81" w:name="_Toc125544101"/>
+      <w:bookmarkStart w:id="82" w:name="_Toc122270007"/>
       <w:bookmarkEnd w:id="80"/>
       <w:r>
         <w:rPr>
@@ -10350,8 +10336,8 @@
         </w:rPr>
       </w:pPr>
       <w:bookmarkStart w:id="83" w:name="__RefHeading___Toc9395_1642054164"/>
-      <w:bookmarkStart w:id="84" w:name="_Toc122270008"/>
-      <w:bookmarkStart w:id="85" w:name="_Toc125544102"/>
+      <w:bookmarkStart w:id="84" w:name="_Toc125544102"/>
+      <w:bookmarkStart w:id="85" w:name="_Toc122270008"/>
       <w:bookmarkEnd w:id="83"/>
       <w:r>
         <w:rPr>
@@ -10436,8 +10422,8 @@
         </w:rPr>
       </w:pPr>
       <w:bookmarkStart w:id="86" w:name="__RefHeading___Toc9397_1642054164"/>
-      <w:bookmarkStart w:id="87" w:name="_Toc122270009"/>
-      <w:bookmarkStart w:id="88" w:name="_Toc125544103"/>
+      <w:bookmarkStart w:id="87" w:name="_Toc125544103"/>
+      <w:bookmarkStart w:id="88" w:name="_Toc122270009"/>
       <w:bookmarkEnd w:id="86"/>
       <w:r>
         <w:rPr>
@@ -10528,8 +10514,8 @@
         </w:rPr>
       </w:pPr>
       <w:bookmarkStart w:id="89" w:name="__RefHeading___Toc9399_1642054164"/>
-      <w:bookmarkStart w:id="90" w:name="_Toc122270010"/>
-      <w:bookmarkStart w:id="91" w:name="_Toc125544104"/>
+      <w:bookmarkStart w:id="90" w:name="_Toc125544104"/>
+      <w:bookmarkStart w:id="91" w:name="_Toc122270010"/>
       <w:bookmarkEnd w:id="89"/>
       <w:r>
         <w:rPr>
@@ -10678,8 +10664,8 @@
         </w:rPr>
       </w:pPr>
       <w:bookmarkStart w:id="92" w:name="__RefHeading___Toc9401_1642054164"/>
-      <w:bookmarkStart w:id="93" w:name="_Toc122270011"/>
-      <w:bookmarkStart w:id="94" w:name="_Toc125544105"/>
+      <w:bookmarkStart w:id="93" w:name="_Toc125544105"/>
+      <w:bookmarkStart w:id="94" w:name="_Toc122270011"/>
       <w:bookmarkEnd w:id="92"/>
       <w:r>
         <w:rPr>
@@ -10817,7 +10803,7 @@
       </w:r>
       <w:r>
         <w:rPr/>
-        <w:commentReference w:id="3"/>
+        <w:commentReference w:id="2"/>
       </w:r>
       <w:r>
         <w:rPr>
@@ -10925,8 +10911,8 @@
         </w:rPr>
       </w:pPr>
       <w:bookmarkStart w:id="95" w:name="__RefHeading___Toc9403_1642054164"/>
-      <w:bookmarkStart w:id="96" w:name="_Toc122270012"/>
-      <w:bookmarkStart w:id="97" w:name="_Toc125544106"/>
+      <w:bookmarkStart w:id="96" w:name="_Toc125544106"/>
+      <w:bookmarkStart w:id="97" w:name="_Toc122270012"/>
       <w:bookmarkEnd w:id="95"/>
       <w:r>
         <w:rPr>
@@ -11128,8 +11114,8 @@
         </w:rPr>
       </w:pPr>
       <w:bookmarkStart w:id="98" w:name="__RefHeading___Toc9405_1642054164"/>
-      <w:bookmarkStart w:id="99" w:name="_Toc122270013"/>
-      <w:bookmarkStart w:id="100" w:name="_Toc125544107"/>
+      <w:bookmarkStart w:id="99" w:name="_Toc125544107"/>
+      <w:bookmarkStart w:id="100" w:name="_Toc122270013"/>
       <w:bookmarkEnd w:id="98"/>
       <w:r>
         <w:rPr>
@@ -11266,8 +11252,8 @@
         </w:rPr>
       </w:pPr>
       <w:bookmarkStart w:id="101" w:name="__RefHeading___Toc9407_1642054164"/>
-      <w:bookmarkStart w:id="102" w:name="_Toc1222700141"/>
-      <w:bookmarkStart w:id="103" w:name="_Toc1255441081"/>
+      <w:bookmarkStart w:id="102" w:name="_Toc1255441081"/>
+      <w:bookmarkStart w:id="103" w:name="_Toc1222700141"/>
       <w:bookmarkEnd w:id="101"/>
       <w:r>
         <w:rPr>
@@ -11493,8 +11479,8 @@
         </w:rPr>
       </w:pPr>
       <w:bookmarkStart w:id="104" w:name="__RefHeading___Toc9409_1642054164"/>
-      <w:bookmarkStart w:id="105" w:name="_Toc122270014"/>
-      <w:bookmarkStart w:id="106" w:name="_Toc125544108"/>
+      <w:bookmarkStart w:id="105" w:name="_Toc125544108"/>
+      <w:bookmarkStart w:id="106" w:name="_Toc122270014"/>
       <w:bookmarkEnd w:id="104"/>
       <w:r>
         <w:rPr>
@@ -12135,19 +12121,7 @@
       </w:r>
     </w:p>
   </w:comment>
-  <w:comment w:id="2" w:author="DELL" w:date="2023-01-25T11:44:00Z" w:initials="D">
-    <w:p>
-      <w:r>
-        <w:rPr>
-          <w:rFonts w:ascii="Liberation Serif" w:hAnsi="Liberation Serif" w:eastAsia="Segoe UI" w:cs="Tahoma"/>
-          <w:sz w:val="24"/>
-          <w:lang w:val="en-US" w:eastAsia="en-US" w:bidi="en-US"/>
-        </w:rPr>
-        <w:t>Jsp si ça fonctionne dans le code est ce qu’on peut l’ajouter ?</w:t>
-      </w:r>
-    </w:p>
-  </w:comment>
-  <w:comment w:id="3" w:author="Marie Quélo" w:date="2022-12-18T15:28:00Z" w:initials="MQ">
+  <w:comment w:id="2" w:author="Marie Quélo" w:date="2022-12-18T15:28:00Z" w:initials="MQ">
     <w:p>
       <w:r>
         <w:rPr>
@@ -12538,7 +12512,7 @@
               <w:sz w:val="24"/>
               <w:rFonts w:cs="Arial" w:ascii="Arial" w:hAnsi="Arial"/>
             </w:rPr>
-            <w:t>21</w:t>
+            <w:t>22</w:t>
           </w:r>
           <w:r>
             <w:rPr>

</xml_diff>